<commit_message>
Replace remaining 늘푸른바다 branding in hero copy and OG description
메인 화면 히어로 설명 문구, OG description, package.json description 교체.
회사 선택지와 리본문구 보내는분 예시는 실제 법인명이므로 유지.

Co-Authored-By: Claude Fable 5 <noreply@anthropic.com>
</commit_message>
<xml_diff>
--- a/Front_Update.docx
+++ b/Front_Update.docx
@@ -651,6 +651,95 @@
                 <w:sz w:val="18"/>
                 <w:szCs w:val="18"/>
               </w:rPr>
+              <w:t xml:space="preserve">package.json</w:t>
+            </w:r>
+          </w:p>
+        </w:tc>
+        <w:tc>
+          <w:tcPr>
+            <w:tcW w:type="dxa" w:w="1300"/>
+            <w:tcBorders>
+              <w:top w:val="single" w:color="D0D5DD" w:sz="4"/>
+              <w:left w:val="single" w:color="D0D5DD" w:sz="4"/>
+              <w:bottom w:val="single" w:color="D0D5DD" w:sz="4"/>
+              <w:right w:val="single" w:color="D0D5DD" w:sz="4"/>
+            </w:tcBorders>
+            <w:tcMar>
+              <w:top w:type="dxa" w:w="60"/>
+              <w:left w:type="dxa" w:w="100"/>
+              <w:bottom w:type="dxa" w:w="60"/>
+              <w:right w:type="dxa" w:w="100"/>
+            </w:tcMar>
+          </w:tcPr>
+          <w:p>
+            <w:r>
+              <w:rPr>
+                <w:rFonts w:ascii="Malgun Gothic" w:cs="Malgun Gothic" w:eastAsia="Malgun Gothic" w:hAnsi="Malgun Gothic"/>
+                <w:b w:val="false"/>
+                <w:bCs w:val="false"/>
+                <w:sz w:val="18"/>
+                <w:szCs w:val="18"/>
+              </w:rPr>
+              <w:t xml:space="preserve">수정</w:t>
+            </w:r>
+          </w:p>
+        </w:tc>
+        <w:tc>
+          <w:tcPr>
+            <w:tcW w:type="dxa" w:w="5960"/>
+            <w:tcBorders>
+              <w:top w:val="single" w:color="D0D5DD" w:sz="4"/>
+              <w:left w:val="single" w:color="D0D5DD" w:sz="4"/>
+              <w:bottom w:val="single" w:color="D0D5DD" w:sz="4"/>
+              <w:right w:val="single" w:color="D0D5DD" w:sz="4"/>
+            </w:tcBorders>
+            <w:tcMar>
+              <w:top w:type="dxa" w:w="60"/>
+              <w:left w:type="dxa" w:w="100"/>
+              <w:bottom w:type="dxa" w:w="60"/>
+              <w:right w:type="dxa" w:w="100"/>
+            </w:tcMar>
+          </w:tcPr>
+          <w:p>
+            <w:r>
+              <w:rPr>
+                <w:rFonts w:ascii="Malgun Gothic" w:cs="Malgun Gothic" w:eastAsia="Malgun Gothic" w:hAnsi="Malgun Gothic"/>
+                <w:b w:val="false"/>
+                <w:bCs w:val="false"/>
+                <w:sz w:val="18"/>
+                <w:szCs w:val="18"/>
+              </w:rPr>
+              <w:t xml:space="preserve">패키지 description 문구 변경</w:t>
+            </w:r>
+          </w:p>
+        </w:tc>
+      </w:tr>
+      <w:tr>
+        <w:tc>
+          <w:tcPr>
+            <w:tcW w:type="dxa" w:w="2100"/>
+            <w:tcBorders>
+              <w:top w:val="single" w:color="D0D5DD" w:sz="4"/>
+              <w:left w:val="single" w:color="D0D5DD" w:sz="4"/>
+              <w:bottom w:val="single" w:color="D0D5DD" w:sz="4"/>
+              <w:right w:val="single" w:color="D0D5DD" w:sz="4"/>
+            </w:tcBorders>
+            <w:tcMar>
+              <w:top w:type="dxa" w:w="60"/>
+              <w:left w:type="dxa" w:w="100"/>
+              <w:bottom w:type="dxa" w:w="60"/>
+              <w:right w:type="dxa" w:w="100"/>
+            </w:tcMar>
+          </w:tcPr>
+          <w:p>
+            <w:r>
+              <w:rPr>
+                <w:rFonts w:ascii="Consolas" w:cs="Consolas" w:eastAsia="Consolas" w:hAnsi="Consolas"/>
+                <w:b w:val="false"/>
+                <w:bCs w:val="false"/>
+                <w:sz w:val="18"/>
+                <w:szCs w:val="18"/>
+              </w:rPr>
               <w:t xml:space="preserve">img/</w:t>
             </w:r>
           </w:p>
@@ -755,7 +844,7 @@
           <w:sz w:val="18"/>
           <w:szCs w:val="18"/>
         </w:rPr>
-        <w:t xml:space="preserve">  수정 3곳</w:t>
+        <w:t xml:space="preserve">  수정 4곳</w:t>
       </w:r>
     </w:p>
     <w:tbl>
@@ -955,6 +1044,66 @@
                 <w:szCs w:val="18"/>
               </w:rPr>
               <w:t xml:space="preserve">카카오톡 등 공유 미리보기 제목 동일하게 변경</w:t>
+            </w:r>
+          </w:p>
+        </w:tc>
+      </w:tr>
+      <w:tr>
+        <w:tc>
+          <w:tcPr>
+            <w:tcW w:type="dxa" w:w="2600"/>
+            <w:tcBorders>
+              <w:top w:val="single" w:color="D0D5DD" w:sz="4"/>
+              <w:left w:val="single" w:color="D0D5DD" w:sz="4"/>
+              <w:bottom w:val="single" w:color="D0D5DD" w:sz="4"/>
+              <w:right w:val="single" w:color="D0D5DD" w:sz="4"/>
+            </w:tcBorders>
+            <w:tcMar>
+              <w:top w:type="dxa" w:w="60"/>
+              <w:left w:type="dxa" w:w="100"/>
+              <w:bottom w:type="dxa" w:w="60"/>
+              <w:right w:type="dxa" w:w="100"/>
+            </w:tcMar>
+          </w:tcPr>
+          <w:p>
+            <w:r>
+              <w:rPr>
+                <w:rFonts w:ascii="Consolas" w:cs="Consolas" w:eastAsia="Consolas" w:hAnsi="Consolas"/>
+                <w:b w:val="false"/>
+                <w:bCs w:val="false"/>
+                <w:sz w:val="18"/>
+                <w:szCs w:val="18"/>
+              </w:rPr>
+              <w:t xml:space="preserve">8행 og:description</w:t>
+            </w:r>
+          </w:p>
+        </w:tc>
+        <w:tc>
+          <w:tcPr>
+            <w:tcW w:type="dxa" w:w="6760"/>
+            <w:tcBorders>
+              <w:top w:val="single" w:color="D0D5DD" w:sz="4"/>
+              <w:left w:val="single" w:color="D0D5DD" w:sz="4"/>
+              <w:bottom w:val="single" w:color="D0D5DD" w:sz="4"/>
+              <w:right w:val="single" w:color="D0D5DD" w:sz="4"/>
+            </w:tcBorders>
+            <w:tcMar>
+              <w:top w:type="dxa" w:w="60"/>
+              <w:left w:type="dxa" w:w="100"/>
+              <w:bottom w:type="dxa" w:w="60"/>
+              <w:right w:type="dxa" w:w="100"/>
+            </w:tcMar>
+          </w:tcPr>
+          <w:p>
+            <w:r>
+              <w:rPr>
+                <w:rFonts w:ascii="Malgun Gothic" w:cs="Malgun Gothic" w:eastAsia="Malgun Gothic" w:hAnsi="Malgun Gothic"/>
+                <w:b w:val="false"/>
+                <w:bCs w:val="false"/>
+                <w:sz w:val="18"/>
+                <w:szCs w:val="18"/>
+              </w:rPr>
+              <w:t xml:space="preserve">「늘푸른바다 임직원의 영업 서포트, 거래처 관계 형성을 위한 경조사 지원센터 입니다.」 → 「임직원의 영업 서포트, EBS/GRS 거래처 관계 형성을 위한 경조사 접수센터 입니다.」</w:t>
             </w:r>
           </w:p>
         </w:tc>
@@ -1271,7 +1420,7 @@
           <w:sz w:val="18"/>
           <w:szCs w:val="18"/>
         </w:rPr>
-        <w:t xml:space="preserve">  수정 3곳</w:t>
+        <w:t xml:space="preserve">  수정 4곳</w:t>
       </w:r>
     </w:p>
     <w:tbl>
@@ -1441,7 +1590,7 @@
                 <w:sz w:val="18"/>
                 <w:szCs w:val="18"/>
               </w:rPr>
-              <w:t xml:space="preserve">45행 HOME_SECTIONS</w:t>
+              <w:t xml:space="preserve">45행 HOME_SECTIONS · storeName</w:t>
             </w:r>
           </w:p>
         </w:tc>
@@ -1470,7 +1619,7 @@
                 <w:sz w:val="18"/>
                 <w:szCs w:val="18"/>
               </w:rPr>
-              <w:t xml:space="preserve">홈 히어로 타이틀 storeName: 「늘푸른바다(고래사)\n경조사 지원센터」 → 「EBS/GRS 거래처\n경조사 접수센터」</w:t>
+              <w:t xml:space="preserve">홈 히어로 타이틀: 「늘푸른바다(고래사)\n경조사 지원센터」 → 「EBS/GRS 거래처\n경조사 접수센터」</w:t>
             </w:r>
           </w:p>
         </w:tc>
@@ -1501,6 +1650,66 @@
                 <w:sz w:val="18"/>
                 <w:szCs w:val="18"/>
               </w:rPr>
+              <w:t xml:space="preserve">45행 HOME_SECTIONS · storeDesc</w:t>
+            </w:r>
+          </w:p>
+        </w:tc>
+        <w:tc>
+          <w:tcPr>
+            <w:tcW w:type="dxa" w:w="6760"/>
+            <w:tcBorders>
+              <w:top w:val="single" w:color="D0D5DD" w:sz="4"/>
+              <w:left w:val="single" w:color="D0D5DD" w:sz="4"/>
+              <w:bottom w:val="single" w:color="D0D5DD" w:sz="4"/>
+              <w:right w:val="single" w:color="D0D5DD" w:sz="4"/>
+            </w:tcBorders>
+            <w:tcMar>
+              <w:top w:type="dxa" w:w="60"/>
+              <w:left w:type="dxa" w:w="100"/>
+              <w:bottom w:type="dxa" w:w="60"/>
+              <w:right w:type="dxa" w:w="100"/>
+            </w:tcMar>
+          </w:tcPr>
+          <w:p>
+            <w:r>
+              <w:rPr>
+                <w:rFonts w:ascii="Malgun Gothic" w:cs="Malgun Gothic" w:eastAsia="Malgun Gothic" w:hAnsi="Malgun Gothic"/>
+                <w:b w:val="false"/>
+                <w:bCs w:val="false"/>
+                <w:sz w:val="18"/>
+                <w:szCs w:val="18"/>
+              </w:rPr>
+              <w:t xml:space="preserve">홈 히어로 본문(타이틀 아래 설명 문구): 「늘푸른바다 임직원의 영업 서포트, 거래처 관계 형성을 위한 경조사 지원센터 입니다.」 → 「임직원의 영업 서포트, EBS/GRS 거래처 관계 형성을 위한 경조사 접수센터 입니다.」</w:t>
+            </w:r>
+          </w:p>
+        </w:tc>
+      </w:tr>
+      <w:tr>
+        <w:tc>
+          <w:tcPr>
+            <w:tcW w:type="dxa" w:w="2600"/>
+            <w:tcBorders>
+              <w:top w:val="single" w:color="D0D5DD" w:sz="4"/>
+              <w:left w:val="single" w:color="D0D5DD" w:sz="4"/>
+              <w:bottom w:val="single" w:color="D0D5DD" w:sz="4"/>
+              <w:right w:val="single" w:color="D0D5DD" w:sz="4"/>
+            </w:tcBorders>
+            <w:tcMar>
+              <w:top w:type="dxa" w:w="60"/>
+              <w:left w:type="dxa" w:w="100"/>
+              <w:bottom w:type="dxa" w:w="60"/>
+              <w:right w:type="dxa" w:w="100"/>
+            </w:tcMar>
+          </w:tcPr>
+          <w:p>
+            <w:r>
+              <w:rPr>
+                <w:rFonts w:ascii="Consolas" w:cs="Consolas" w:eastAsia="Consolas" w:hAnsi="Consolas"/>
+                <w:b w:val="false"/>
+                <w:bCs w:val="false"/>
+                <w:sz w:val="18"/>
+                <w:szCs w:val="18"/>
+              </w:rPr>
               <w:t xml:space="preserve">81행 SITE_INFO</w:t>
             </w:r>
           </w:p>
@@ -1530,7 +1739,7 @@
                 <w:sz w:val="18"/>
                 <w:szCs w:val="18"/>
               </w:rPr>
-              <w:t xml:space="preserve">ogTitle 변경 — 런타임에 document.title(브라우저 탭)을 덮어쓰는 값</w:t>
+              <w:t xml:space="preserve">ogTitle·ogDescription 변경 — 런타임에 document.title(브라우저 탭)과 공유 미리보기 설명을 덮어쓰는 값</w:t>
             </w:r>
           </w:p>
         </w:tc>
@@ -2527,6 +2736,174 @@
                 <w:szCs w:val="18"/>
               </w:rPr>
               <w:t xml:space="preserve">지역 안내 배너 스타일 신규 — info(파란색)/warn(빨간색) 2종, 바텀시트 내부·다크 테마 대응, 배너 없을 때 빈 영역 숨김 처리</w:t>
+            </w:r>
+          </w:p>
+        </w:tc>
+      </w:tr>
+    </w:tbl>
+    <w:p>
+      <w:pPr>
+        <w:pStyle w:val="Heading2"/>
+        <w:shd w:fill="F5F5F7" w:val="clear"/>
+        <w:spacing w:after="100" w:before="280"/>
+      </w:pPr>
+      <w:r>
+        <w:rPr>
+          <w:rFonts w:ascii="Consolas" w:cs="Consolas" w:eastAsia="Consolas" w:hAnsi="Consolas"/>
+          <w:b/>
+          <w:bCs/>
+          <w:sz w:val="22"/>
+          <w:szCs w:val="22"/>
+        </w:rPr>
+        <w:t xml:space="preserve"> package.json </w:t>
+      </w:r>
+      <w:r>
+        <w:rPr>
+          <w:rFonts w:ascii="Malgun Gothic" w:cs="Malgun Gothic" w:eastAsia="Malgun Gothic" w:hAnsi="Malgun Gothic"/>
+          <w:color w:val="667085"/>
+          <w:sz w:val="18"/>
+          <w:szCs w:val="18"/>
+        </w:rPr>
+        <w:t xml:space="preserve">  수정 1곳</w:t>
+      </w:r>
+    </w:p>
+    <w:tbl>
+      <w:tblPr>
+        <w:tblW w:type="dxa" w:w="9360"/>
+        <w:tblBorders>
+          <w:top w:val="single" w:color="auto" w:sz="4"/>
+          <w:left w:val="single" w:color="auto" w:sz="4"/>
+          <w:bottom w:val="single" w:color="auto" w:sz="4"/>
+          <w:right w:val="single" w:color="auto" w:sz="4"/>
+          <w:insideH w:val="single" w:color="auto" w:sz="4"/>
+          <w:insideV w:val="single" w:color="auto" w:sz="4"/>
+        </w:tblBorders>
+      </w:tblPr>
+      <w:tblGrid>
+        <w:gridCol w:w="2600"/>
+        <w:gridCol w:w="6760"/>
+      </w:tblGrid>
+      <w:tr>
+        <w:trPr>
+          <w:tblHeader/>
+        </w:trPr>
+        <w:tc>
+          <w:tcPr>
+            <w:tcW w:type="dxa" w:w="2600"/>
+            <w:tcBorders>
+              <w:top w:val="single" w:color="D0D5DD" w:sz="4"/>
+              <w:left w:val="single" w:color="D0D5DD" w:sz="4"/>
+              <w:bottom w:val="single" w:color="D0D5DD" w:sz="4"/>
+              <w:right w:val="single" w:color="D0D5DD" w:sz="4"/>
+            </w:tcBorders>
+            <w:shd w:fill="EEF2FF" w:val="clear"/>
+            <w:tcMar>
+              <w:top w:type="dxa" w:w="60"/>
+              <w:left w:type="dxa" w:w="100"/>
+              <w:bottom w:type="dxa" w:w="60"/>
+              <w:right w:type="dxa" w:w="100"/>
+            </w:tcMar>
+          </w:tcPr>
+          <w:p>
+            <w:r>
+              <w:rPr>
+                <w:rFonts w:ascii="Malgun Gothic" w:cs="Malgun Gothic" w:eastAsia="Malgun Gothic" w:hAnsi="Malgun Gothic"/>
+                <w:b/>
+                <w:bCs/>
+                <w:sz w:val="18"/>
+                <w:szCs w:val="18"/>
+              </w:rPr>
+              <w:t xml:space="preserve">위치 (라인 · 함수)</w:t>
+            </w:r>
+          </w:p>
+        </w:tc>
+        <w:tc>
+          <w:tcPr>
+            <w:tcW w:type="dxa" w:w="6760"/>
+            <w:tcBorders>
+              <w:top w:val="single" w:color="D0D5DD" w:sz="4"/>
+              <w:left w:val="single" w:color="D0D5DD" w:sz="4"/>
+              <w:bottom w:val="single" w:color="D0D5DD" w:sz="4"/>
+              <w:right w:val="single" w:color="D0D5DD" w:sz="4"/>
+            </w:tcBorders>
+            <w:shd w:fill="EEF2FF" w:val="clear"/>
+            <w:tcMar>
+              <w:top w:type="dxa" w:w="60"/>
+              <w:left w:type="dxa" w:w="100"/>
+              <w:bottom w:type="dxa" w:w="60"/>
+              <w:right w:type="dxa" w:w="100"/>
+            </w:tcMar>
+          </w:tcPr>
+          <w:p>
+            <w:r>
+              <w:rPr>
+                <w:rFonts w:ascii="Malgun Gothic" w:cs="Malgun Gothic" w:eastAsia="Malgun Gothic" w:hAnsi="Malgun Gothic"/>
+                <w:b/>
+                <w:bCs/>
+                <w:sz w:val="18"/>
+                <w:szCs w:val="18"/>
+              </w:rPr>
+              <w:t xml:space="preserve">수정 내용</w:t>
+            </w:r>
+          </w:p>
+        </w:tc>
+      </w:tr>
+      <w:tr>
+        <w:tc>
+          <w:tcPr>
+            <w:tcW w:type="dxa" w:w="2600"/>
+            <w:tcBorders>
+              <w:top w:val="single" w:color="D0D5DD" w:sz="4"/>
+              <w:left w:val="single" w:color="D0D5DD" w:sz="4"/>
+              <w:bottom w:val="single" w:color="D0D5DD" w:sz="4"/>
+              <w:right w:val="single" w:color="D0D5DD" w:sz="4"/>
+            </w:tcBorders>
+            <w:tcMar>
+              <w:top w:type="dxa" w:w="60"/>
+              <w:left w:type="dxa" w:w="100"/>
+              <w:bottom w:type="dxa" w:w="60"/>
+              <w:right w:type="dxa" w:w="100"/>
+            </w:tcMar>
+          </w:tcPr>
+          <w:p>
+            <w:r>
+              <w:rPr>
+                <w:rFonts w:ascii="Consolas" w:cs="Consolas" w:eastAsia="Consolas" w:hAnsi="Consolas"/>
+                <w:b w:val="false"/>
+                <w:bCs w:val="false"/>
+                <w:sz w:val="18"/>
+                <w:szCs w:val="18"/>
+              </w:rPr>
+              <w:t xml:space="preserve">5행 description</w:t>
+            </w:r>
+          </w:p>
+        </w:tc>
+        <w:tc>
+          <w:tcPr>
+            <w:tcW w:type="dxa" w:w="6760"/>
+            <w:tcBorders>
+              <w:top w:val="single" w:color="D0D5DD" w:sz="4"/>
+              <w:left w:val="single" w:color="D0D5DD" w:sz="4"/>
+              <w:bottom w:val="single" w:color="D0D5DD" w:sz="4"/>
+              <w:right w:val="single" w:color="D0D5DD" w:sz="4"/>
+            </w:tcBorders>
+            <w:tcMar>
+              <w:top w:type="dxa" w:w="60"/>
+              <w:left w:type="dxa" w:w="100"/>
+              <w:bottom w:type="dxa" w:w="60"/>
+              <w:right w:type="dxa" w:w="100"/>
+            </w:tcMar>
+          </w:tcPr>
+          <w:p>
+            <w:r>
+              <w:rPr>
+                <w:rFonts w:ascii="Malgun Gothic" w:cs="Malgun Gothic" w:eastAsia="Malgun Gothic" w:hAnsi="Malgun Gothic"/>
+                <w:b w:val="false"/>
+                <w:bCs w:val="false"/>
+                <w:sz w:val="18"/>
+                <w:szCs w:val="18"/>
+              </w:rPr>
+              <w:t xml:space="preserve">「늘푸른바다 경조사 지원센터 (무빌드 정적 사이트)」 → 「EBS/GRS 거래처 경조사 접수센터 (무빌드 정적 사이트)」</w:t>
             </w:r>
           </w:p>
         </w:tc>
@@ -3027,7 +3404,7 @@
           <w:sz w:val="20"/>
           <w:szCs w:val="20"/>
         </w:rPr>
-        <w:t xml:space="preserve">브라우저 탭 제목·카카오톡 공유(OG) 제목</w:t>
+        <w:t xml:space="preserve">브라우저 탭 제목·카카오톡 공유(OG) 제목 및 설명</w:t>
       </w:r>
     </w:p>
     <w:p>
@@ -3063,7 +3440,58 @@
           <w:sz w:val="20"/>
           <w:szCs w:val="20"/>
         </w:rPr>
-        <w:t xml:space="preserve">홈 히어로 타이틀 및 상단 앱바 기본 타이틀 (경조사 접수센터)</w:t>
+        <w:t xml:space="preserve">홈 히어로 타이틀 및 그 아래 설명 문구, 상단 앱바 기본 타이틀 (경조사 접수센터)</w:t>
+      </w:r>
+    </w:p>
+    <w:p>
+      <w:pPr>
+        <w:spacing w:after="60" w:before="160"/>
+      </w:pPr>
+      <w:r>
+        <w:rPr>
+          <w:rFonts w:ascii="Malgun Gothic" w:cs="Malgun Gothic" w:eastAsia="Malgun Gothic" w:hAnsi="Malgun Gothic"/>
+          <w:b/>
+          <w:bCs/>
+          <w:sz w:val="20"/>
+          <w:szCs w:val="20"/>
+        </w:rPr>
+        <w:t xml:space="preserve">다음 항목은 실제 법인명이므로 의도적으로 유지했습니다.</w:t>
+      </w:r>
+    </w:p>
+    <w:p>
+      <w:pPr>
+        <w:pStyle w:val="ListParagraph"/>
+        <w:numPr>
+          <w:ilvl w:val="0"/>
+          <w:numId w:val="2"/>
+        </w:numPr>
+        <w:spacing w:after="60"/>
+      </w:pPr>
+      <w:r>
+        <w:rPr>
+          <w:rFonts w:ascii="Malgun Gothic" w:cs="Malgun Gothic" w:eastAsia="Malgun Gothic" w:hAnsi="Malgun Gothic"/>
+          <w:sz w:val="20"/>
+          <w:szCs w:val="20"/>
+        </w:rPr>
+        <w:t xml:space="preserve">신청인 정보의 회사 선택지 — 늘푸른바다 / 고래사</w:t>
+      </w:r>
+    </w:p>
+    <w:p>
+      <w:pPr>
+        <w:pStyle w:val="ListParagraph"/>
+        <w:numPr>
+          <w:ilvl w:val="0"/>
+          <w:numId w:val="2"/>
+        </w:numPr>
+        <w:spacing w:after="60"/>
+      </w:pPr>
+      <w:r>
+        <w:rPr>
+          <w:rFonts w:ascii="Malgun Gothic" w:cs="Malgun Gothic" w:eastAsia="Malgun Gothic" w:hAnsi="Malgun Gothic"/>
+          <w:sz w:val="20"/>
+          <w:szCs w:val="20"/>
+        </w:rPr>
+        <w:t xml:space="preserve">리본문구 '보내는분' 예시 및 신청내역 데모 데이터 — (주)늘푸른바다 임직원 일동, (주)고래사 영업본부 일동 등</w:t>
       </w:r>
     </w:p>
     <w:p>

</xml_diff>

<commit_message>
Make product field a selection that navigates to 상품목록
- 2. 상품 분류 및 이름: 직접 입력 → 선택형(.field.selectable), 누르면 상품목록으로 이동
- 주문서 입력값을 S.orderForm으로 이관해 화면 이동 간 유지
- 상품 선택 모드(S.pickMode): 앱바 타이틀 '상품 선택', 뒤로가기는 주문서로,
  안내 배너 표시, 시트 버튼 '이 상품으로 선택'
- 선택 모드에서 주소의 지역 반입 규칙을 상품목록에도 적용 (바텀시트 우회 방지)

Co-Authored-By: Claude Fable 5 <noreply@anthropic.com>
</commit_message>
<xml_diff>
--- a/Front_Update.docx
+++ b/Front_Update.docx
@@ -1768,7 +1768,7 @@
           <w:sz w:val="18"/>
           <w:szCs w:val="18"/>
         </w:rPr>
-        <w:t xml:space="preserve">  수정 10곳</w:t>
+        <w:t xml:space="preserve">  수정 15곳</w:t>
       </w:r>
     </w:p>
     <w:tbl>
@@ -1878,7 +1878,7 @@
                 <w:sz w:val="18"/>
                 <w:szCs w:val="18"/>
               </w:rPr>
-              <w:t xml:space="preserve">163·178행 buildAppBar / updateAppBar</w:t>
+              <w:t xml:space="preserve">104~105행 앱 상태 S</w:t>
             </w:r>
           </w:p>
         </w:tc>
@@ -1907,7 +1907,7 @@
                 <w:sz w:val="18"/>
                 <w:szCs w:val="18"/>
               </w:rPr>
-              <w:t xml:space="preserve">상단 앱바 기본 타이틀 「경조사 지원센터」 → 「경조사 접수센터」</w:t>
+              <w:t xml:space="preserve">주문서 입력값을 화면 밖 상태(S.orderForm)로 이관 — 상품 선택을 위해 상품목록에 다녀와도 이미 입력한 배송일시·주소·리본문구가 유지됨. 기존 S.orderSeed(상품명만 전달) 제거. 상품 선택 모드 플래그 S.pickMode 추가</w:t>
             </w:r>
           </w:p>
         </w:tc>
@@ -1938,7 +1938,7 @@
                 <w:sz w:val="18"/>
                 <w:szCs w:val="18"/>
               </w:rPr>
-              <w:t xml:space="preserve">208행 buildApplicantCard</w:t>
+              <w:t xml:space="preserve">163·177행 buildAppBar / updateAppBar</w:t>
             </w:r>
           </w:p>
         </w:tc>
@@ -1967,7 +1967,7 @@
                 <w:sz w:val="18"/>
                 <w:szCs w:val="18"/>
               </w:rPr>
-              <w:t xml:space="preserve">홈 신청인 카드 meta에 회사(company) 표시 추가 → 「회사 · 부서」 형식</w:t>
+              <w:t xml:space="preserve">상단 앱바 기본 타이틀 「경조사 지원센터」 → 「경조사 접수센터」. 상품 선택 모드일 때 상품목록 화면의 타이틀을 「상품 선택」으로, 뒤로가기를 홈이 아닌 주문서로 이동하도록 변경</w:t>
             </w:r>
           </w:p>
         </w:tc>
@@ -1998,7 +1998,7 @@
                 <w:sz w:val="18"/>
                 <w:szCs w:val="18"/>
               </w:rPr>
-              <w:t xml:space="preserve">258행 buildHomeScreen</w:t>
+              <w:t xml:space="preserve">210행 buildApplicantCard</w:t>
             </w:r>
           </w:p>
         </w:tc>
@@ -2027,7 +2027,7 @@
                 <w:sz w:val="18"/>
                 <w:szCs w:val="18"/>
               </w:rPr>
-              <w:t xml:space="preserve">히어로 h2 타이틀의 줄바꿈(\n)이 &lt;br&gt;로 변환되지 않던 기존 버그 수정</w:t>
+              <w:t xml:space="preserve">홈 신청인 카드 meta에 회사(company) 표시 추가 → 「회사 · 부서」 형식</w:t>
             </w:r>
           </w:p>
         </w:tc>
@@ -2058,7 +2058,7 @@
                 <w:sz w:val="18"/>
                 <w:szCs w:val="18"/>
               </w:rPr>
-              <w:t xml:space="preserve">268·320행 buildHomeScreen / buildItemsScreen</w:t>
+              <w:t xml:space="preserve">260행 buildHomeScreen</w:t>
             </w:r>
           </w:p>
         </w:tc>
@@ -2087,7 +2087,7 @@
                 <w:sz w:val="18"/>
                 <w:szCs w:val="18"/>
               </w:rPr>
-              <w:t xml:space="preserve">홈 카테고리 상품 개수 계산과 상품목록 화면에서 regionOnly(지역 한정) 섹션 제외 — 일반 화면에는 대체상품 미노출</w:t>
+              <w:t xml:space="preserve">히어로 h2 타이틀의 줄바꿈(\n)이 &lt;br&gt;로 변환되지 않던 기존 버그 수정</w:t>
             </w:r>
           </w:p>
         </w:tc>
@@ -2118,7 +2118,7 @@
                 <w:sz w:val="18"/>
                 <w:szCs w:val="18"/>
               </w:rPr>
-              <w:t xml:space="preserve">621행 openProductPicker</w:t>
+              <w:t xml:space="preserve">270행 buildHomeScreen</w:t>
             </w:r>
           </w:p>
         </w:tc>
@@ -2147,7 +2147,7 @@
                 <w:sz w:val="18"/>
                 <w:szCs w:val="18"/>
               </w:rPr>
-              <w:t xml:space="preserve">3번째 인자 opts.rule 추가. 배송불가 규칙이면 상품 대신 「배송 불가 지역이에요」 안내 표시. 제한 규칙이면 근조화환(tab5)에 한해 반입 가능 kind의 대체상품만 노출(3단 허용 지역은 일반 화환도 함께), 시트 상단에 지역 안내 배너 표시. 규칙 없으면 기존과 동일하되 regionOnly 섹션 제외</w:t>
+              <w:t xml:space="preserve">홈 카테고리 상품 개수 계산에서 regionOnly(지역 한정) 섹션 제외</w:t>
             </w:r>
           </w:p>
         </w:tc>
@@ -2178,7 +2178,7 @@
                 <w:sz w:val="18"/>
                 <w:szCs w:val="18"/>
               </w:rPr>
-              <w:t xml:space="preserve">689~712행 openApplicantModal</w:t>
+              <w:t xml:space="preserve">320~334행 buildItemsScreen</w:t>
             </w:r>
           </w:p>
         </w:tc>
@@ -2207,7 +2207,7 @@
                 <w:sz w:val="18"/>
                 <w:szCs w:val="18"/>
               </w:rPr>
-              <w:t xml:space="preserve">부서·직책 자유입력 &lt;input&gt; 삭제 → 회사 &lt;select&gt;(늘푸른바다/고래사) + 부서 &lt;select&gt;(리테일채널 영업팀 외 6개) 추가. 저장 조건이 성함·연락처 2개 → 회사·부서·성함·연락처 4개 필수로 강화. 저장 데이터가 {name, contact, dept, position} → {company, dept, name, contact}로 변경</w:t>
+              <w:t xml:space="preserve">상품목록에서 지역 한정 대체상품 숨김. 단 상품 선택 모드에서는 주문서 주소의 지역 규칙(matchRegionRule)을 근조화환에 적용해 반입 가능한 상품만 노출 — 바텀시트를 우회해 제한 상품이 선택되는 것을 방지</w:t>
             </w:r>
           </w:p>
         </w:tc>
@@ -2238,7 +2238,7 @@
                 <w:sz w:val="18"/>
                 <w:szCs w:val="18"/>
               </w:rPr>
-              <w:t xml:space="preserve">734·741행 buildOrderScreen</w:t>
+              <w:t xml:space="preserve">343~352행 buildItemsScreen</w:t>
             </w:r>
           </w:p>
         </w:tc>
@@ -2267,7 +2267,7 @@
                 <w:sz w:val="18"/>
                 <w:szCs w:val="18"/>
               </w:rPr>
-              <w:t xml:space="preserve">폼 상태에 reason 추가, 입력 항목 배열에 「7. 신청사유」(여러 줄) 추가 — 항목 번호·진행바(7칸) 자동 반영</w:t>
+              <w:t xml:space="preserve">상품 선택 모드 안내 배너 추가 — 일반 시 「주문서에 넣을 상품을 선택해주세요」, 제한 지역은 반입 안내, 배송불가 지역은 빨간 경고</w:t>
             </w:r>
           </w:p>
         </w:tc>
@@ -2298,7 +2298,7 @@
                 <w:sz w:val="18"/>
                 <w:szCs w:val="18"/>
               </w:rPr>
-              <w:t xml:space="preserve">797·822·828~840행 buildOrderScreen</w:t>
+              <w:t xml:space="preserve">644행 openProductPicker</w:t>
             </w:r>
           </w:p>
         </w:tc>
@@ -2327,7 +2327,7 @@
                 <w:sz w:val="18"/>
                 <w:szCs w:val="18"/>
               </w:rPr>
-              <w:t xml:space="preserve">주소 입력란 바로 아래 지역 안내 배너 영역(regionNoteHost) 추가. updateRegionNote(): 주소 변경 시 matchRegionRule로 판정해 제한 지역은 파란 안내, 배송불가는 빨간 경고 배너 표시 + 신청 버튼 비활성화</w:t>
+              <w:t xml:space="preserve">3번째 인자 opts.rule 추가. 배송불가 규칙이면 상품 대신 「배송 불가 지역이에요」 안내 표시. 제한 규칙이면 근조화환(tab5)에 한해 반입 가능 kind의 대체상품만 노출(3단 허용 지역은 일반 화환도 함께), 시트 상단에 지역 안내 배너 표시</w:t>
             </w:r>
           </w:p>
         </w:tc>
@@ -2358,7 +2358,7 @@
                 <w:sz w:val="18"/>
                 <w:szCs w:val="18"/>
               </w:rPr>
-              <w:t xml:space="preserve">851행 send()</w:t>
+              <w:t xml:space="preserve">707행 openItemSheet</w:t>
             </w:r>
           </w:p>
         </w:tc>
@@ -2387,7 +2387,7 @@
                 <w:sz w:val="18"/>
                 <w:szCs w:val="18"/>
               </w:rPr>
-              <w:t xml:space="preserve">신청 시 배송불가 지역이면 「배송 불가 지역이라 신청할 수 없어요」 토스트 후 차단</w:t>
+              <w:t xml:space="preserve">상품 선택 모드일 때 하단 버튼 문구를 「이 상품으로 주문하기」 → 「이 상품으로 선택」으로 변경</w:t>
             </w:r>
           </w:p>
         </w:tc>
@@ -2418,7 +2418,7 @@
                 <w:sz w:val="18"/>
                 <w:szCs w:val="18"/>
               </w:rPr>
-              <w:t xml:space="preserve">856~875행 handleIntake</w:t>
+              <w:t xml:space="preserve">712~735행 openApplicantModal</w:t>
             </w:r>
           </w:p>
         </w:tc>
@@ -2447,7 +2447,7 @@
                 <w:sz w:val="18"/>
                 <w:szCs w:val="18"/>
               </w:rPr>
-              <w:t xml:space="preserve">간편접수로 불러온 주소의 지역 규칙을 상품선택 바텀시트에 전달(부고장만 적용). 배송불가 지역이면 시트 미오픈 + 차단 안내. 바텀시트 오픈을 setTimeout으로 지연 — 간편접수 시트 닫힘과 겹치며 화면 스크롤 잠금이 풀리던 버그 수정</w:t>
+              <w:t xml:space="preserve">부서·직책 자유입력 &lt;input&gt; 삭제 → 회사 &lt;select&gt;(늘푸른바다/고래사) + 부서 &lt;select&gt;(리테일채널 영업팀 외 6개) 추가. 저장 조건이 성함·연락처 2개 → 회사·부서·성함·연락처 4개 필수로 강화. 저장 데이터가 {name, contact, dept, position} → {company, dept, name, contact}로 변경</w:t>
             </w:r>
           </w:p>
         </w:tc>
@@ -2478,7 +2478,427 @@
                 <w:sz w:val="18"/>
                 <w:szCs w:val="18"/>
               </w:rPr>
-              <w:t xml:space="preserve">944·958~959행 mountSplash</w:t>
+              <w:t xml:space="preserve">760행 buildOrderScreen · 상품 항목</w:t>
+            </w:r>
+          </w:p>
+        </w:tc>
+        <w:tc>
+          <w:tcPr>
+            <w:tcW w:type="dxa" w:w="6760"/>
+            <w:tcBorders>
+              <w:top w:val="single" w:color="D0D5DD" w:sz="4"/>
+              <w:left w:val="single" w:color="D0D5DD" w:sz="4"/>
+              <w:bottom w:val="single" w:color="D0D5DD" w:sz="4"/>
+              <w:right w:val="single" w:color="D0D5DD" w:sz="4"/>
+            </w:tcBorders>
+            <w:tcMar>
+              <w:top w:type="dxa" w:w="60"/>
+              <w:left w:type="dxa" w:w="100"/>
+              <w:bottom w:type="dxa" w:w="60"/>
+              <w:right w:type="dxa" w:w="100"/>
+            </w:tcMar>
+          </w:tcPr>
+          <w:p>
+            <w:r>
+              <w:rPr>
+                <w:rFonts w:ascii="Malgun Gothic" w:cs="Malgun Gothic" w:eastAsia="Malgun Gothic" w:hAnsi="Malgun Gothic"/>
+                <w:b w:val="false"/>
+                <w:bCs w:val="false"/>
+                <w:sz w:val="18"/>
+                <w:szCs w:val="18"/>
+              </w:rPr>
+              <w:t xml:space="preserve">「2. 상품 분류 및 이름」을 직접 입력에서 선택형으로 전환 (select: true). 누르면 상품목록 화면으로 이동하며, 상품 선택 시 자동으로 주문서에 채워짐</w:t>
+            </w:r>
+          </w:p>
+        </w:tc>
+      </w:tr>
+      <w:tr>
+        <w:tc>
+          <w:tcPr>
+            <w:tcW w:type="dxa" w:w="2600"/>
+            <w:tcBorders>
+              <w:top w:val="single" w:color="D0D5DD" w:sz="4"/>
+              <w:left w:val="single" w:color="D0D5DD" w:sz="4"/>
+              <w:bottom w:val="single" w:color="D0D5DD" w:sz="4"/>
+              <w:right w:val="single" w:color="D0D5DD" w:sz="4"/>
+            </w:tcBorders>
+            <w:tcMar>
+              <w:top w:type="dxa" w:w="60"/>
+              <w:left w:type="dxa" w:w="100"/>
+              <w:bottom w:type="dxa" w:w="60"/>
+              <w:right w:type="dxa" w:w="100"/>
+            </w:tcMar>
+          </w:tcPr>
+          <w:p>
+            <w:r>
+              <w:rPr>
+                <w:rFonts w:ascii="Consolas" w:cs="Consolas" w:eastAsia="Consolas" w:hAnsi="Consolas"/>
+                <w:b w:val="false"/>
+                <w:bCs w:val="false"/>
+                <w:sz w:val="18"/>
+                <w:szCs w:val="18"/>
+              </w:rPr>
+              <w:t xml:space="preserve">765행 buildOrderScreen · 신청사유</w:t>
+            </w:r>
+          </w:p>
+        </w:tc>
+        <w:tc>
+          <w:tcPr>
+            <w:tcW w:type="dxa" w:w="6760"/>
+            <w:tcBorders>
+              <w:top w:val="single" w:color="D0D5DD" w:sz="4"/>
+              <w:left w:val="single" w:color="D0D5DD" w:sz="4"/>
+              <w:bottom w:val="single" w:color="D0D5DD" w:sz="4"/>
+              <w:right w:val="single" w:color="D0D5DD" w:sz="4"/>
+            </w:tcBorders>
+            <w:tcMar>
+              <w:top w:type="dxa" w:w="60"/>
+              <w:left w:type="dxa" w:w="100"/>
+              <w:bottom w:type="dxa" w:w="60"/>
+              <w:right w:type="dxa" w:w="100"/>
+            </w:tcMar>
+          </w:tcPr>
+          <w:p>
+            <w:r>
+              <w:rPr>
+                <w:rFonts w:ascii="Malgun Gothic" w:cs="Malgun Gothic" w:eastAsia="Malgun Gothic" w:hAnsi="Malgun Gothic"/>
+                <w:b w:val="false"/>
+                <w:bCs w:val="false"/>
+                <w:sz w:val="18"/>
+                <w:szCs w:val="18"/>
+              </w:rPr>
+              <w:t xml:space="preserve">입력 항목 배열에 「7. 신청사유」(여러 줄) 추가 — 항목 번호·진행바 자동 반영</w:t>
+            </w:r>
+          </w:p>
+        </w:tc>
+      </w:tr>
+      <w:tr>
+        <w:tc>
+          <w:tcPr>
+            <w:tcW w:type="dxa" w:w="2600"/>
+            <w:tcBorders>
+              <w:top w:val="single" w:color="D0D5DD" w:sz="4"/>
+              <w:left w:val="single" w:color="D0D5DD" w:sz="4"/>
+              <w:bottom w:val="single" w:color="D0D5DD" w:sz="4"/>
+              <w:right w:val="single" w:color="D0D5DD" w:sz="4"/>
+            </w:tcBorders>
+            <w:tcMar>
+              <w:top w:type="dxa" w:w="60"/>
+              <w:left w:type="dxa" w:w="100"/>
+              <w:bottom w:type="dxa" w:w="60"/>
+              <w:right w:type="dxa" w:w="100"/>
+            </w:tcMar>
+          </w:tcPr>
+          <w:p>
+            <w:r>
+              <w:rPr>
+                <w:rFonts w:ascii="Consolas" w:cs="Consolas" w:eastAsia="Consolas" w:hAnsi="Consolas"/>
+                <w:b w:val="false"/>
+                <w:bCs w:val="false"/>
+                <w:sz w:val="18"/>
+                <w:szCs w:val="18"/>
+              </w:rPr>
+              <w:t xml:space="preserve">812~822·843~857행 buildOrderScreen</w:t>
+            </w:r>
+          </w:p>
+        </w:tc>
+        <w:tc>
+          <w:tcPr>
+            <w:tcW w:type="dxa" w:w="6760"/>
+            <w:tcBorders>
+              <w:top w:val="single" w:color="D0D5DD" w:sz="4"/>
+              <w:left w:val="single" w:color="D0D5DD" w:sz="4"/>
+              <w:bottom w:val="single" w:color="D0D5DD" w:sz="4"/>
+              <w:right w:val="single" w:color="D0D5DD" w:sz="4"/>
+            </w:tcBorders>
+            <w:tcMar>
+              <w:top w:type="dxa" w:w="60"/>
+              <w:left w:type="dxa" w:w="100"/>
+              <w:bottom w:type="dxa" w:w="60"/>
+              <w:right w:type="dxa" w:w="100"/>
+            </w:tcMar>
+          </w:tcPr>
+          <w:p>
+            <w:r>
+              <w:rPr>
+                <w:rFonts w:ascii="Malgun Gothic" w:cs="Malgun Gothic" w:eastAsia="Malgun Gothic" w:hAnsi="Malgun Gothic"/>
+                <w:b w:val="false"/>
+                <w:bCs w:val="false"/>
+                <w:sz w:val="18"/>
+                <w:szCs w:val="18"/>
+              </w:rPr>
+              <w:t xml:space="preserve">선택형 항목 렌더링 분기 추가 — 입력창 대신 화살표가 달린 선택 버튼(.field.selectable / .field-trigger) 생성. setFieldValue()가 입력창과 선택 버튼 표시값을 모두 갱신하도록 확장</w:t>
+            </w:r>
+          </w:p>
+        </w:tc>
+      </w:tr>
+      <w:tr>
+        <w:tc>
+          <w:tcPr>
+            <w:tcW w:type="dxa" w:w="2600"/>
+            <w:tcBorders>
+              <w:top w:val="single" w:color="D0D5DD" w:sz="4"/>
+              <w:left w:val="single" w:color="D0D5DD" w:sz="4"/>
+              <w:bottom w:val="single" w:color="D0D5DD" w:sz="4"/>
+              <w:right w:val="single" w:color="D0D5DD" w:sz="4"/>
+            </w:tcBorders>
+            <w:tcMar>
+              <w:top w:type="dxa" w:w="60"/>
+              <w:left w:type="dxa" w:w="100"/>
+              <w:bottom w:type="dxa" w:w="60"/>
+              <w:right w:type="dxa" w:w="100"/>
+            </w:tcMar>
+          </w:tcPr>
+          <w:p>
+            <w:r>
+              <w:rPr>
+                <w:rFonts w:ascii="Consolas" w:cs="Consolas" w:eastAsia="Consolas" w:hAnsi="Consolas"/>
+                <w:b w:val="false"/>
+                <w:bCs w:val="false"/>
+                <w:sz w:val="18"/>
+                <w:szCs w:val="18"/>
+              </w:rPr>
+              <w:t xml:space="preserve">823·862·864~876행 buildOrderScreen</w:t>
+            </w:r>
+          </w:p>
+        </w:tc>
+        <w:tc>
+          <w:tcPr>
+            <w:tcW w:type="dxa" w:w="6760"/>
+            <w:tcBorders>
+              <w:top w:val="single" w:color="D0D5DD" w:sz="4"/>
+              <w:left w:val="single" w:color="D0D5DD" w:sz="4"/>
+              <w:bottom w:val="single" w:color="D0D5DD" w:sz="4"/>
+              <w:right w:val="single" w:color="D0D5DD" w:sz="4"/>
+            </w:tcBorders>
+            <w:tcMar>
+              <w:top w:type="dxa" w:w="60"/>
+              <w:left w:type="dxa" w:w="100"/>
+              <w:bottom w:type="dxa" w:w="60"/>
+              <w:right w:type="dxa" w:w="100"/>
+            </w:tcMar>
+          </w:tcPr>
+          <w:p>
+            <w:r>
+              <w:rPr>
+                <w:rFonts w:ascii="Malgun Gothic" w:cs="Malgun Gothic" w:eastAsia="Malgun Gothic" w:hAnsi="Malgun Gothic"/>
+                <w:b w:val="false"/>
+                <w:bCs w:val="false"/>
+                <w:sz w:val="18"/>
+                <w:szCs w:val="18"/>
+              </w:rPr>
+              <w:t xml:space="preserve">주소 입력란 바로 아래 지역 안내 배너 영역(regionNoteHost) 추가. updateRegionNote(): 주소 변경 시 matchRegionRule로 판정해 제한 지역은 파란 안내, 배송불가는 빨간 경고 배너 표시 + 신청 버튼 비활성화</w:t>
+            </w:r>
+          </w:p>
+        </w:tc>
+      </w:tr>
+      <w:tr>
+        <w:tc>
+          <w:tcPr>
+            <w:tcW w:type="dxa" w:w="2600"/>
+            <w:tcBorders>
+              <w:top w:val="single" w:color="D0D5DD" w:sz="4"/>
+              <w:left w:val="single" w:color="D0D5DD" w:sz="4"/>
+              <w:bottom w:val="single" w:color="D0D5DD" w:sz="4"/>
+              <w:right w:val="single" w:color="D0D5DD" w:sz="4"/>
+            </w:tcBorders>
+            <w:tcMar>
+              <w:top w:type="dxa" w:w="60"/>
+              <w:left w:type="dxa" w:w="100"/>
+              <w:bottom w:type="dxa" w:w="60"/>
+              <w:right w:type="dxa" w:w="100"/>
+            </w:tcMar>
+          </w:tcPr>
+          <w:p>
+            <w:r>
+              <w:rPr>
+                <w:rFonts w:ascii="Consolas" w:cs="Consolas" w:eastAsia="Consolas" w:hAnsi="Consolas"/>
+                <w:b w:val="false"/>
+                <w:bCs w:val="false"/>
+                <w:sz w:val="18"/>
+                <w:szCs w:val="18"/>
+              </w:rPr>
+              <w:t xml:space="preserve">887행 send()</w:t>
+            </w:r>
+          </w:p>
+        </w:tc>
+        <w:tc>
+          <w:tcPr>
+            <w:tcW w:type="dxa" w:w="6760"/>
+            <w:tcBorders>
+              <w:top w:val="single" w:color="D0D5DD" w:sz="4"/>
+              <w:left w:val="single" w:color="D0D5DD" w:sz="4"/>
+              <w:bottom w:val="single" w:color="D0D5DD" w:sz="4"/>
+              <w:right w:val="single" w:color="D0D5DD" w:sz="4"/>
+            </w:tcBorders>
+            <w:tcMar>
+              <w:top w:type="dxa" w:w="60"/>
+              <w:left w:type="dxa" w:w="100"/>
+              <w:bottom w:type="dxa" w:w="60"/>
+              <w:right w:type="dxa" w:w="100"/>
+            </w:tcMar>
+          </w:tcPr>
+          <w:p>
+            <w:r>
+              <w:rPr>
+                <w:rFonts w:ascii="Malgun Gothic" w:cs="Malgun Gothic" w:eastAsia="Malgun Gothic" w:hAnsi="Malgun Gothic"/>
+                <w:b w:val="false"/>
+                <w:bCs w:val="false"/>
+                <w:sz w:val="18"/>
+                <w:szCs w:val="18"/>
+              </w:rPr>
+              <w:t xml:space="preserve">신청 시 배송불가 지역이면 「배송 불가 지역이라 신청할 수 없어요」 토스트 후 차단</w:t>
+            </w:r>
+          </w:p>
+        </w:tc>
+      </w:tr>
+      <w:tr>
+        <w:tc>
+          <w:tcPr>
+            <w:tcW w:type="dxa" w:w="2600"/>
+            <w:tcBorders>
+              <w:top w:val="single" w:color="D0D5DD" w:sz="4"/>
+              <w:left w:val="single" w:color="D0D5DD" w:sz="4"/>
+              <w:bottom w:val="single" w:color="D0D5DD" w:sz="4"/>
+              <w:right w:val="single" w:color="D0D5DD" w:sz="4"/>
+            </w:tcBorders>
+            <w:tcMar>
+              <w:top w:type="dxa" w:w="60"/>
+              <w:left w:type="dxa" w:w="100"/>
+              <w:bottom w:type="dxa" w:w="60"/>
+              <w:right w:type="dxa" w:w="100"/>
+            </w:tcMar>
+          </w:tcPr>
+          <w:p>
+            <w:r>
+              <w:rPr>
+                <w:rFonts w:ascii="Consolas" w:cs="Consolas" w:eastAsia="Consolas" w:hAnsi="Consolas"/>
+                <w:b w:val="false"/>
+                <w:bCs w:val="false"/>
+                <w:sz w:val="18"/>
+                <w:szCs w:val="18"/>
+              </w:rPr>
+              <w:t xml:space="preserve">892~911행 handleIntake</w:t>
+            </w:r>
+          </w:p>
+        </w:tc>
+        <w:tc>
+          <w:tcPr>
+            <w:tcW w:type="dxa" w:w="6760"/>
+            <w:tcBorders>
+              <w:top w:val="single" w:color="D0D5DD" w:sz="4"/>
+              <w:left w:val="single" w:color="D0D5DD" w:sz="4"/>
+              <w:bottom w:val="single" w:color="D0D5DD" w:sz="4"/>
+              <w:right w:val="single" w:color="D0D5DD" w:sz="4"/>
+            </w:tcBorders>
+            <w:tcMar>
+              <w:top w:type="dxa" w:w="60"/>
+              <w:left w:type="dxa" w:w="100"/>
+              <w:bottom w:type="dxa" w:w="60"/>
+              <w:right w:type="dxa" w:w="100"/>
+            </w:tcMar>
+          </w:tcPr>
+          <w:p>
+            <w:r>
+              <w:rPr>
+                <w:rFonts w:ascii="Malgun Gothic" w:cs="Malgun Gothic" w:eastAsia="Malgun Gothic" w:hAnsi="Malgun Gothic"/>
+                <w:b w:val="false"/>
+                <w:bCs w:val="false"/>
+                <w:sz w:val="18"/>
+                <w:szCs w:val="18"/>
+              </w:rPr>
+              <w:t xml:space="preserve">간편접수로 불러온 주소의 지역 규칙을 상품선택 바텀시트에 전달(부고장만 적용). 배송불가 지역이면 시트 미오픈 + 차단 안내. 바텀시트 오픈을 setTimeout으로 지연 — 간편접수 시트 닫힘과 겹치며 화면 스크롤 잠금이 풀리던 버그 수정</w:t>
+            </w:r>
+          </w:p>
+        </w:tc>
+      </w:tr>
+      <w:tr>
+        <w:tc>
+          <w:tcPr>
+            <w:tcW w:type="dxa" w:w="2600"/>
+            <w:tcBorders>
+              <w:top w:val="single" w:color="D0D5DD" w:sz="4"/>
+              <w:left w:val="single" w:color="D0D5DD" w:sz="4"/>
+              <w:bottom w:val="single" w:color="D0D5DD" w:sz="4"/>
+              <w:right w:val="single" w:color="D0D5DD" w:sz="4"/>
+            </w:tcBorders>
+            <w:tcMar>
+              <w:top w:type="dxa" w:w="60"/>
+              <w:left w:type="dxa" w:w="100"/>
+              <w:bottom w:type="dxa" w:w="60"/>
+              <w:right w:type="dxa" w:w="100"/>
+            </w:tcMar>
+          </w:tcPr>
+          <w:p>
+            <w:r>
+              <w:rPr>
+                <w:rFonts w:ascii="Consolas" w:cs="Consolas" w:eastAsia="Consolas" w:hAnsi="Consolas"/>
+                <w:b w:val="false"/>
+                <w:bCs w:val="false"/>
+                <w:sz w:val="18"/>
+                <w:szCs w:val="18"/>
+              </w:rPr>
+              <w:t xml:space="preserve">946~958행 go() / orderProduct()</w:t>
+            </w:r>
+          </w:p>
+        </w:tc>
+        <w:tc>
+          <w:tcPr>
+            <w:tcW w:type="dxa" w:w="6760"/>
+            <w:tcBorders>
+              <w:top w:val="single" w:color="D0D5DD" w:sz="4"/>
+              <w:left w:val="single" w:color="D0D5DD" w:sz="4"/>
+              <w:bottom w:val="single" w:color="D0D5DD" w:sz="4"/>
+              <w:right w:val="single" w:color="D0D5DD" w:sz="4"/>
+            </w:tcBorders>
+            <w:tcMar>
+              <w:top w:type="dxa" w:w="60"/>
+              <w:left w:type="dxa" w:w="100"/>
+              <w:bottom w:type="dxa" w:w="60"/>
+              <w:right w:type="dxa" w:w="100"/>
+            </w:tcMar>
+          </w:tcPr>
+          <w:p>
+            <w:r>
+              <w:rPr>
+                <w:rFonts w:ascii="Malgun Gothic" w:cs="Malgun Gothic" w:eastAsia="Malgun Gothic" w:hAnsi="Malgun Gothic"/>
+                <w:b w:val="false"/>
+                <w:bCs w:val="false"/>
+                <w:sz w:val="18"/>
+                <w:szCs w:val="18"/>
+              </w:rPr>
+              <w:t xml:space="preserve">화면 이동 시 상품목록을 벗어나면 선택 모드 해제. 상품 선택 결과를 S.orderForm.product에 저장 후 주문서로 복귀</w:t>
+            </w:r>
+          </w:p>
+        </w:tc>
+      </w:tr>
+      <w:tr>
+        <w:tc>
+          <w:tcPr>
+            <w:tcW w:type="dxa" w:w="2600"/>
+            <w:tcBorders>
+              <w:top w:val="single" w:color="D0D5DD" w:sz="4"/>
+              <w:left w:val="single" w:color="D0D5DD" w:sz="4"/>
+              <w:bottom w:val="single" w:color="D0D5DD" w:sz="4"/>
+              <w:right w:val="single" w:color="D0D5DD" w:sz="4"/>
+            </w:tcBorders>
+            <w:tcMar>
+              <w:top w:type="dxa" w:w="60"/>
+              <w:left w:type="dxa" w:w="100"/>
+              <w:bottom w:type="dxa" w:w="60"/>
+              <w:right w:type="dxa" w:w="100"/>
+            </w:tcMar>
+          </w:tcPr>
+          <w:p>
+            <w:r>
+              <w:rPr>
+                <w:rFonts w:ascii="Consolas" w:cs="Consolas" w:eastAsia="Consolas" w:hAnsi="Consolas"/>
+                <w:b w:val="false"/>
+                <w:bCs w:val="false"/>
+                <w:sz w:val="18"/>
+                <w:szCs w:val="18"/>
+              </w:rPr>
+              <w:t xml:space="preserve">981·995~996행 mountSplash</w:t>
             </w:r>
           </w:p>
         </w:tc>
@@ -7082,20 +7502,23 @@
           <w:sz w:val="28"/>
           <w:szCs w:val="28"/>
         </w:rPr>
-        <w:t xml:space="preserve">6. '신청하기' 탭 — 신청사유 입력란 추가</w:t>
+        <w:t xml:space="preserve">6. '신청하기' 탭 항목 구성 변경</w:t>
       </w:r>
     </w:p>
     <w:p>
       <w:pPr>
-        <w:spacing w:after="120"/>
+        <w:pStyle w:val="Heading2"/>
+        <w:spacing w:after="120" w:before="240"/>
       </w:pPr>
       <w:r>
         <w:rPr>
           <w:rFonts w:ascii="Malgun Gothic" w:cs="Malgun Gothic" w:eastAsia="Malgun Gothic" w:hAnsi="Malgun Gothic"/>
-          <w:sz w:val="20"/>
-          <w:szCs w:val="20"/>
+          <w:b/>
+          <w:bCs/>
+          <w:sz w:val="23"/>
+          <w:szCs w:val="23"/>
         </w:rPr>
-        <w:t xml:space="preserve">기존 6개 항목 뒤에 '7. 신청사유' 항목(여러 줄 입력)을 추가했습니다. 입력 진행바에도 자동 반영됩니다.</w:t>
+        <w:t xml:space="preserve">6-1. 항목 순서</w:t>
       </w:r>
     </w:p>
     <w:p>
@@ -7113,7 +7536,7 @@
           <w:sz w:val="20"/>
           <w:szCs w:val="20"/>
         </w:rPr>
-        <w:t xml:space="preserve">1. 희망 배송일시  →  2. 상품 분류 및 이름  →  3. 보내는 장소(상세주소)  →  4. 받는 분 정보</w:t>
+        <w:t xml:space="preserve">1. 희망 배송일시  →  2. 상품 분류 및 이름 (선택형으로 변경)  →  3. 보내는 장소(상세주소)  →  4. 받는 분 정보</w:t>
       </w:r>
     </w:p>
     <w:p>
@@ -7132,6 +7555,154 @@
           <w:szCs w:val="20"/>
         </w:rPr>
         <w:t xml:space="preserve">5. 리본문구 좌측(보내는분)  →  6. 리본문구 우측(경조사어)  →  7. 신청사유 (신규)</w:t>
+      </w:r>
+    </w:p>
+    <w:p>
+      <w:pPr>
+        <w:pStyle w:val="Heading2"/>
+        <w:spacing w:after="120" w:before="240"/>
+      </w:pPr>
+      <w:r>
+        <w:rPr>
+          <w:rFonts w:ascii="Malgun Gothic" w:cs="Malgun Gothic" w:eastAsia="Malgun Gothic" w:hAnsi="Malgun Gothic"/>
+          <w:b/>
+          <w:bCs/>
+          <w:sz w:val="23"/>
+          <w:szCs w:val="23"/>
+        </w:rPr>
+        <w:t xml:space="preserve">6-2. '2. 상품 분류 및 이름' — 직접 입력 → 선택형</w:t>
+      </w:r>
+    </w:p>
+    <w:p>
+      <w:pPr>
+        <w:spacing w:after="120"/>
+      </w:pPr>
+      <w:r>
+        <w:rPr>
+          <w:rFonts w:ascii="Malgun Gothic" w:cs="Malgun Gothic" w:eastAsia="Malgun Gothic" w:hAnsi="Malgun Gothic"/>
+          <w:sz w:val="20"/>
+          <w:szCs w:val="20"/>
+        </w:rPr>
+        <w:t xml:space="preserve">상품명을 직접 타이핑하던 방식을 없애고, 항목을 누르면 상품목록 화면으로 이동해 실제 상품을 고르는 방식으로 바꿨습니다.</w:t>
+      </w:r>
+    </w:p>
+    <w:p>
+      <w:pPr>
+        <w:pStyle w:val="ListParagraph"/>
+        <w:numPr>
+          <w:ilvl w:val="0"/>
+          <w:numId w:val="2"/>
+        </w:numPr>
+        <w:spacing w:after="60"/>
+      </w:pPr>
+      <w:r>
+        <w:rPr>
+          <w:rFonts w:ascii="Malgun Gothic" w:cs="Malgun Gothic" w:eastAsia="Malgun Gothic" w:hAnsi="Malgun Gothic"/>
+          <w:sz w:val="20"/>
+          <w:szCs w:val="20"/>
+        </w:rPr>
+        <w:t xml:space="preserve">항목을 누르면 → 상품목록 화면으로 이동 (상단 타이틀 '상품 선택', 상품을 고르라는 안내 배너 표시)</w:t>
+      </w:r>
+    </w:p>
+    <w:p>
+      <w:pPr>
+        <w:pStyle w:val="ListParagraph"/>
+        <w:numPr>
+          <w:ilvl w:val="0"/>
+          <w:numId w:val="2"/>
+        </w:numPr>
+        <w:spacing w:after="60"/>
+      </w:pPr>
+      <w:r>
+        <w:rPr>
+          <w:rFonts w:ascii="Malgun Gothic" w:cs="Malgun Gothic" w:eastAsia="Malgun Gothic" w:hAnsi="Malgun Gothic"/>
+          <w:sz w:val="20"/>
+          <w:szCs w:val="20"/>
+        </w:rPr>
+        <w:t xml:space="preserve">상품을 누르고 '이 상품으로 선택'을 누르면 → 주문서로 돌아오며 상품명과 가격이 자동 입력</w:t>
+      </w:r>
+    </w:p>
+    <w:p>
+      <w:pPr>
+        <w:pStyle w:val="ListParagraph"/>
+        <w:numPr>
+          <w:ilvl w:val="0"/>
+          <w:numId w:val="2"/>
+        </w:numPr>
+        <w:spacing w:after="60"/>
+      </w:pPr>
+      <w:r>
+        <w:rPr>
+          <w:rFonts w:ascii="Malgun Gothic" w:cs="Malgun Gothic" w:eastAsia="Malgun Gothic" w:hAnsi="Malgun Gothic"/>
+          <w:sz w:val="20"/>
+          <w:szCs w:val="20"/>
+        </w:rPr>
+        <w:t xml:space="preserve">뒤로가기를 누르면 상품을 고르지 않고 주문서로 복귀</w:t>
+      </w:r>
+    </w:p>
+    <w:p>
+      <w:pPr>
+        <w:pStyle w:val="ListParagraph"/>
+        <w:numPr>
+          <w:ilvl w:val="0"/>
+          <w:numId w:val="2"/>
+        </w:numPr>
+        <w:spacing w:after="60"/>
+      </w:pPr>
+      <w:r>
+        <w:rPr>
+          <w:rFonts w:ascii="Malgun Gothic" w:cs="Malgun Gothic" w:eastAsia="Malgun Gothic" w:hAnsi="Malgun Gothic"/>
+          <w:sz w:val="20"/>
+          <w:szCs w:val="20"/>
+        </w:rPr>
+        <w:t xml:space="preserve">상품목록에 다녀와도 이미 입력한 배송일시·주소·리본문구 등 다른 항목은 그대로 유지됩니다.</w:t>
+      </w:r>
+    </w:p>
+    <w:p>
+      <w:pPr>
+        <w:pStyle w:val="ListParagraph"/>
+        <w:numPr>
+          <w:ilvl w:val="0"/>
+          <w:numId w:val="2"/>
+        </w:numPr>
+        <w:spacing w:after="60"/>
+      </w:pPr>
+      <w:r>
+        <w:rPr>
+          <w:rFonts w:ascii="Malgun Gothic" w:cs="Malgun Gothic" w:eastAsia="Malgun Gothic" w:hAnsi="Malgun Gothic"/>
+          <w:sz w:val="20"/>
+          <w:szCs w:val="20"/>
+        </w:rPr>
+        <w:t xml:space="preserve">보내는 장소가 반입 제한 지역이면 상품목록에도 반입 가능한 상품만 표시되어, 제한 상품이 선택되는 것을 막습니다.</w:t>
+      </w:r>
+    </w:p>
+    <w:p>
+      <w:pPr>
+        <w:pStyle w:val="Heading2"/>
+        <w:spacing w:after="120" w:before="240"/>
+      </w:pPr>
+      <w:r>
+        <w:rPr>
+          <w:rFonts w:ascii="Malgun Gothic" w:cs="Malgun Gothic" w:eastAsia="Malgun Gothic" w:hAnsi="Malgun Gothic"/>
+          <w:b/>
+          <w:bCs/>
+          <w:sz w:val="23"/>
+          <w:szCs w:val="23"/>
+        </w:rPr>
+        <w:t xml:space="preserve">6-3. '7. 신청사유' 신규 추가</w:t>
+      </w:r>
+    </w:p>
+    <w:p>
+      <w:pPr>
+        <w:spacing w:after="120"/>
+      </w:pPr>
+      <w:r>
+        <w:rPr>
+          <w:rFonts w:ascii="Malgun Gothic" w:cs="Malgun Gothic" w:eastAsia="Malgun Gothic" w:hAnsi="Malgun Gothic"/>
+          <w:sz w:val="20"/>
+          <w:szCs w:val="20"/>
+        </w:rPr>
+        <w:t xml:space="preserve">기존 6개 항목 뒤에 여러 줄 입력이 가능한 '신청사유' 항목을 추가했습니다. 입력 진행바에도 자동 반영됩니다.</w:t>
       </w:r>
     </w:p>
     <w:p>

</xml_diff>

<commit_message>
Replace native selects with a custom dropdown in the applicant modal
- buildDropdown(): 인라인 확장형 커스텀 드롭다운 (시트 본문이 스크롤 영역이라
  떠 있는 목록은 잘리므로 아래 내용을 밀어내는 방식)
- 바깥 클릭 닫기, 동시에 하나만 열림, 화살표키 이동 / Esc 닫기(시트까지 닫히지 않도록 소비)
- 여는 즉시 instant 스크롤 — smooth 스크롤은 이동 중 오탭을 유발
- 옵션 7개가 중첩 스크롤 없이 모두 보이도록 패널 높이 조정
- icons.js: Chevron 추가

Co-Authored-By: Claude Fable 5 <noreply@anthropic.com>
</commit_message>
<xml_diff>
--- a/Front_Update.docx
+++ b/Front_Update.docx
@@ -562,6 +562,95 @@
                 <w:sz w:val="18"/>
                 <w:szCs w:val="18"/>
               </w:rPr>
+              <w:t xml:space="preserve">js/icons.js</w:t>
+            </w:r>
+          </w:p>
+        </w:tc>
+        <w:tc>
+          <w:tcPr>
+            <w:tcW w:type="dxa" w:w="1300"/>
+            <w:tcBorders>
+              <w:top w:val="single" w:color="D0D5DD" w:sz="4"/>
+              <w:left w:val="single" w:color="D0D5DD" w:sz="4"/>
+              <w:bottom w:val="single" w:color="D0D5DD" w:sz="4"/>
+              <w:right w:val="single" w:color="D0D5DD" w:sz="4"/>
+            </w:tcBorders>
+            <w:tcMar>
+              <w:top w:type="dxa" w:w="60"/>
+              <w:left w:type="dxa" w:w="100"/>
+              <w:bottom w:type="dxa" w:w="60"/>
+              <w:right w:type="dxa" w:w="100"/>
+            </w:tcMar>
+          </w:tcPr>
+          <w:p>
+            <w:r>
+              <w:rPr>
+                <w:rFonts w:ascii="Malgun Gothic" w:cs="Malgun Gothic" w:eastAsia="Malgun Gothic" w:hAnsi="Malgun Gothic"/>
+                <w:b w:val="false"/>
+                <w:bCs w:val="false"/>
+                <w:sz w:val="18"/>
+                <w:szCs w:val="18"/>
+              </w:rPr>
+              <w:t xml:space="preserve">수정</w:t>
+            </w:r>
+          </w:p>
+        </w:tc>
+        <w:tc>
+          <w:tcPr>
+            <w:tcW w:type="dxa" w:w="5960"/>
+            <w:tcBorders>
+              <w:top w:val="single" w:color="D0D5DD" w:sz="4"/>
+              <w:left w:val="single" w:color="D0D5DD" w:sz="4"/>
+              <w:bottom w:val="single" w:color="D0D5DD" w:sz="4"/>
+              <w:right w:val="single" w:color="D0D5DD" w:sz="4"/>
+            </w:tcBorders>
+            <w:tcMar>
+              <w:top w:type="dxa" w:w="60"/>
+              <w:left w:type="dxa" w:w="100"/>
+              <w:bottom w:type="dxa" w:w="60"/>
+              <w:right w:type="dxa" w:w="100"/>
+            </w:tcMar>
+          </w:tcPr>
+          <w:p>
+            <w:r>
+              <w:rPr>
+                <w:rFonts w:ascii="Malgun Gothic" w:cs="Malgun Gothic" w:eastAsia="Malgun Gothic" w:hAnsi="Malgun Gothic"/>
+                <w:b w:val="false"/>
+                <w:bCs w:val="false"/>
+                <w:sz w:val="18"/>
+                <w:szCs w:val="18"/>
+              </w:rPr>
+              <w:t xml:space="preserve">드롭다운 화살표용 Chevron 아이콘 추가</w:t>
+            </w:r>
+          </w:p>
+        </w:tc>
+      </w:tr>
+      <w:tr>
+        <w:tc>
+          <w:tcPr>
+            <w:tcW w:type="dxa" w:w="2100"/>
+            <w:tcBorders>
+              <w:top w:val="single" w:color="D0D5DD" w:sz="4"/>
+              <w:left w:val="single" w:color="D0D5DD" w:sz="4"/>
+              <w:bottom w:val="single" w:color="D0D5DD" w:sz="4"/>
+              <w:right w:val="single" w:color="D0D5DD" w:sz="4"/>
+            </w:tcBorders>
+            <w:tcMar>
+              <w:top w:type="dxa" w:w="60"/>
+              <w:left w:type="dxa" w:w="100"/>
+              <w:bottom w:type="dxa" w:w="60"/>
+              <w:right w:type="dxa" w:w="100"/>
+            </w:tcMar>
+          </w:tcPr>
+          <w:p>
+            <w:r>
+              <w:rPr>
+                <w:rFonts w:ascii="Consolas" w:cs="Consolas" w:eastAsia="Consolas" w:hAnsi="Consolas"/>
+                <w:b w:val="false"/>
+                <w:bCs w:val="false"/>
+                <w:sz w:val="18"/>
+                <w:szCs w:val="18"/>
+              </w:rPr>
               <w:t xml:space="preserve">css/app.css</w:t>
             </w:r>
           </w:p>
@@ -620,7 +709,7 @@
                 <w:sz w:val="18"/>
                 <w:szCs w:val="18"/>
               </w:rPr>
-              <w:t xml:space="preserve">셀렉트 박스·지역 안내 배너 스타일 추가</w:t>
+              <w:t xml:space="preserve">커스텀 드롭다운·지역 안내 배너 스타일 추가</w:t>
             </w:r>
           </w:p>
         </w:tc>
@@ -1768,7 +1857,7 @@
           <w:sz w:val="18"/>
           <w:szCs w:val="18"/>
         </w:rPr>
-        <w:t xml:space="preserve">  수정 15곳</w:t>
+        <w:t xml:space="preserve">  수정 19곳</w:t>
       </w:r>
     </w:p>
     <w:tbl>
@@ -2418,7 +2507,7 @@
                 <w:sz w:val="18"/>
                 <w:szCs w:val="18"/>
               </w:rPr>
-              <w:t xml:space="preserve">712~735행 openApplicantModal</w:t>
+              <w:t xml:space="preserve">711~784행 buildDropdown()</w:t>
             </w:r>
           </w:p>
         </w:tc>
@@ -2447,7 +2536,7 @@
                 <w:sz w:val="18"/>
                 <w:szCs w:val="18"/>
               </w:rPr>
-              <w:t xml:space="preserve">부서·직책 자유입력 &lt;input&gt; 삭제 → 회사 &lt;select&gt;(늘푸른바다/고래사) + 부서 &lt;select&gt;(리테일채널 영업팀 외 6개) 추가. 저장 조건이 성함·연락처 2개 → 회사·부서·성함·연락처 4개 필수로 강화. 저장 데이터가 {name, contact, dept, position} → {company, dept, name, contact}로 변경</w:t>
+              <w:t xml:space="preserve">커스텀 드롭다운 컴포넌트 신규. 시트 본문이 스크롤 영역이라 떠 있는 목록은 잘리므로, 열리면 아래 내용을 밀어내는 인라인 확장 방식으로 구현. 바깥 영역 클릭 시 닫힘, 동시에 하나만 열림, 위·아래 화살표키 이동과 Esc 닫기 지원(Esc가 시트까지 닫지 않도록 처리)</w:t>
             </w:r>
           </w:p>
         </w:tc>
@@ -2478,7 +2567,7 @@
                 <w:sz w:val="18"/>
                 <w:szCs w:val="18"/>
               </w:rPr>
-              <w:t xml:space="preserve">760행 buildOrderScreen · 상품 항목</w:t>
+              <w:t xml:space="preserve">786~810행 openApplicantModal</w:t>
             </w:r>
           </w:p>
         </w:tc>
@@ -2507,7 +2596,7 @@
                 <w:sz w:val="18"/>
                 <w:szCs w:val="18"/>
               </w:rPr>
-              <w:t xml:space="preserve">「2. 상품 분류 및 이름」을 직접 입력에서 선택형으로 전환 (select: true). 누르면 상품목록 화면으로 이동하며, 상품 선택 시 자동으로 주문서에 채워짐</w:t>
+              <w:t xml:space="preserve">부서·직책 자유입력 &lt;input&gt; 삭제 → 회사·부서 커스텀 드롭다운으로 교체(늘푸른바다/고래사, 리테일채널 영업팀 외 6개). 저장 조건이 성함·연락처 2개 → 회사·부서·성함·연락처 4개 필수로 강화. 저장 데이터가 {name, contact, dept, position} → {company, dept, name, contact}로 변경</w:t>
             </w:r>
           </w:p>
         </w:tc>
@@ -2538,7 +2627,7 @@
                 <w:sz w:val="18"/>
                 <w:szCs w:val="18"/>
               </w:rPr>
-              <w:t xml:space="preserve">765행 buildOrderScreen · 신청사유</w:t>
+              <w:t xml:space="preserve">760행 buildOrderScreen · 상품 항목</w:t>
             </w:r>
           </w:p>
         </w:tc>
@@ -2567,7 +2656,7 @@
                 <w:sz w:val="18"/>
                 <w:szCs w:val="18"/>
               </w:rPr>
-              <w:t xml:space="preserve">입력 항목 배열에 「7. 신청사유」(여러 줄) 추가 — 항목 번호·진행바 자동 반영</w:t>
+              <w:t xml:space="preserve">「2. 상품 분류 및 이름」을 직접 입력에서 선택형으로 전환 (select: true). 누르면 상품목록 화면으로 이동하며, 상품 선택 시 자동으로 주문서에 채워짐</w:t>
             </w:r>
           </w:p>
         </w:tc>
@@ -2598,7 +2687,7 @@
                 <w:sz w:val="18"/>
                 <w:szCs w:val="18"/>
               </w:rPr>
-              <w:t xml:space="preserve">812~822·843~857행 buildOrderScreen</w:t>
+              <w:t xml:space="preserve">765행 buildOrderScreen · 신청사유</w:t>
             </w:r>
           </w:p>
         </w:tc>
@@ -2627,7 +2716,7 @@
                 <w:sz w:val="18"/>
                 <w:szCs w:val="18"/>
               </w:rPr>
-              <w:t xml:space="preserve">선택형 항목 렌더링 분기 추가 — 입력창 대신 화살표가 달린 선택 버튼(.field.selectable / .field-trigger) 생성. setFieldValue()가 입력창과 선택 버튼 표시값을 모두 갱신하도록 확장</w:t>
+              <w:t xml:space="preserve">입력 항목 배열에 「7. 신청사유」(여러 줄) 추가 — 항목 번호·진행바 자동 반영</w:t>
             </w:r>
           </w:p>
         </w:tc>
@@ -2658,7 +2747,7 @@
                 <w:sz w:val="18"/>
                 <w:szCs w:val="18"/>
               </w:rPr>
-              <w:t xml:space="preserve">823·862·864~876행 buildOrderScreen</w:t>
+              <w:t xml:space="preserve">812~822·843~857행 buildOrderScreen</w:t>
             </w:r>
           </w:p>
         </w:tc>
@@ -2687,7 +2776,7 @@
                 <w:sz w:val="18"/>
                 <w:szCs w:val="18"/>
               </w:rPr>
-              <w:t xml:space="preserve">주소 입력란 바로 아래 지역 안내 배너 영역(regionNoteHost) 추가. updateRegionNote(): 주소 변경 시 matchRegionRule로 판정해 제한 지역은 파란 안내, 배송불가는 빨간 경고 배너 표시 + 신청 버튼 비활성화</w:t>
+              <w:t xml:space="preserve">선택형 항목 렌더링 분기 추가 — 입력창 대신 화살표가 달린 선택 버튼(.field.selectable / .field-trigger) 생성. setFieldValue()가 입력창과 선택 버튼 표시값을 모두 갱신하도록 확장</w:t>
             </w:r>
           </w:p>
         </w:tc>
@@ -2718,7 +2807,7 @@
                 <w:sz w:val="18"/>
                 <w:szCs w:val="18"/>
               </w:rPr>
-              <w:t xml:space="preserve">887행 send()</w:t>
+              <w:t xml:space="preserve">823·862·864~876행 buildOrderScreen</w:t>
             </w:r>
           </w:p>
         </w:tc>
@@ -2747,7 +2836,7 @@
                 <w:sz w:val="18"/>
                 <w:szCs w:val="18"/>
               </w:rPr>
-              <w:t xml:space="preserve">신청 시 배송불가 지역이면 「배송 불가 지역이라 신청할 수 없어요」 토스트 후 차단</w:t>
+              <w:t xml:space="preserve">주소 입력란 바로 아래 지역 안내 배너 영역(regionNoteHost) 추가. updateRegionNote(): 주소 변경 시 matchRegionRule로 판정해 제한 지역은 파란 안내, 배송불가는 빨간 경고 배너 표시 + 신청 버튼 비활성화</w:t>
             </w:r>
           </w:p>
         </w:tc>
@@ -2778,7 +2867,7 @@
                 <w:sz w:val="18"/>
                 <w:szCs w:val="18"/>
               </w:rPr>
-              <w:t xml:space="preserve">892~911행 handleIntake</w:t>
+              <w:t xml:space="preserve">887행 send()</w:t>
             </w:r>
           </w:p>
         </w:tc>
@@ -2807,7 +2896,7 @@
                 <w:sz w:val="18"/>
                 <w:szCs w:val="18"/>
               </w:rPr>
-              <w:t xml:space="preserve">간편접수로 불러온 주소의 지역 규칙을 상품선택 바텀시트에 전달(부고장만 적용). 배송불가 지역이면 시트 미오픈 + 차단 안내. 바텀시트 오픈을 setTimeout으로 지연 — 간편접수 시트 닫힘과 겹치며 화면 스크롤 잠금이 풀리던 버그 수정</w:t>
+              <w:t xml:space="preserve">신청 시 배송불가 지역이면 「배송 불가 지역이라 신청할 수 없어요」 토스트 후 차단</w:t>
             </w:r>
           </w:p>
         </w:tc>
@@ -2838,7 +2927,7 @@
                 <w:sz w:val="18"/>
                 <w:szCs w:val="18"/>
               </w:rPr>
-              <w:t xml:space="preserve">946~958행 go() / orderProduct()</w:t>
+              <w:t xml:space="preserve">892~911행 handleIntake</w:t>
             </w:r>
           </w:p>
         </w:tc>
@@ -2867,7 +2956,7 @@
                 <w:sz w:val="18"/>
                 <w:szCs w:val="18"/>
               </w:rPr>
-              <w:t xml:space="preserve">화면 이동 시 상품목록을 벗어나면 선택 모드 해제. 상품 선택 결과를 S.orderForm.product에 저장 후 주문서로 복귀</w:t>
+              <w:t xml:space="preserve">간편접수로 불러온 주소의 지역 규칙을 상품선택 바텀시트에 전달(부고장만 적용). 배송불가 지역이면 시트 미오픈 + 차단 안내. 바텀시트 오픈을 setTimeout으로 지연 — 간편접수 시트 닫힘과 겹치며 화면 스크롤 잠금이 풀리던 버그 수정</w:t>
             </w:r>
           </w:p>
         </w:tc>
@@ -2898,6 +2987,66 @@
                 <w:sz w:val="18"/>
                 <w:szCs w:val="18"/>
               </w:rPr>
+              <w:t xml:space="preserve">946~958행 go() / orderProduct()</w:t>
+            </w:r>
+          </w:p>
+        </w:tc>
+        <w:tc>
+          <w:tcPr>
+            <w:tcW w:type="dxa" w:w="6760"/>
+            <w:tcBorders>
+              <w:top w:val="single" w:color="D0D5DD" w:sz="4"/>
+              <w:left w:val="single" w:color="D0D5DD" w:sz="4"/>
+              <w:bottom w:val="single" w:color="D0D5DD" w:sz="4"/>
+              <w:right w:val="single" w:color="D0D5DD" w:sz="4"/>
+            </w:tcBorders>
+            <w:tcMar>
+              <w:top w:type="dxa" w:w="60"/>
+              <w:left w:type="dxa" w:w="100"/>
+              <w:bottom w:type="dxa" w:w="60"/>
+              <w:right w:type="dxa" w:w="100"/>
+            </w:tcMar>
+          </w:tcPr>
+          <w:p>
+            <w:r>
+              <w:rPr>
+                <w:rFonts w:ascii="Malgun Gothic" w:cs="Malgun Gothic" w:eastAsia="Malgun Gothic" w:hAnsi="Malgun Gothic"/>
+                <w:b w:val="false"/>
+                <w:bCs w:val="false"/>
+                <w:sz w:val="18"/>
+                <w:szCs w:val="18"/>
+              </w:rPr>
+              <w:t xml:space="preserve">화면 이동 시 상품목록을 벗어나면 선택 모드 해제. 상품 선택 결과를 S.orderForm.product에 저장 후 주문서로 복귀</w:t>
+            </w:r>
+          </w:p>
+        </w:tc>
+      </w:tr>
+      <w:tr>
+        <w:tc>
+          <w:tcPr>
+            <w:tcW w:type="dxa" w:w="2600"/>
+            <w:tcBorders>
+              <w:top w:val="single" w:color="D0D5DD" w:sz="4"/>
+              <w:left w:val="single" w:color="D0D5DD" w:sz="4"/>
+              <w:bottom w:val="single" w:color="D0D5DD" w:sz="4"/>
+              <w:right w:val="single" w:color="D0D5DD" w:sz="4"/>
+            </w:tcBorders>
+            <w:tcMar>
+              <w:top w:type="dxa" w:w="60"/>
+              <w:left w:type="dxa" w:w="100"/>
+              <w:bottom w:type="dxa" w:w="60"/>
+              <w:right w:type="dxa" w:w="100"/>
+            </w:tcMar>
+          </w:tcPr>
+          <w:p>
+            <w:r>
+              <w:rPr>
+                <w:rFonts w:ascii="Consolas" w:cs="Consolas" w:eastAsia="Consolas" w:hAnsi="Consolas"/>
+                <w:b w:val="false"/>
+                <w:bCs w:val="false"/>
+                <w:sz w:val="18"/>
+                <w:szCs w:val="18"/>
+              </w:rPr>
               <w:t xml:space="preserve">981·995~996행 mountSplash</w:t>
             </w:r>
           </w:p>
@@ -2928,6 +3077,174 @@
                 <w:szCs w:val="18"/>
               </w:rPr>
               <w:t xml:space="preserve">스플래시 타이틀 「늘푸른바다 (고래사) / 경조사 지원센터」 → 「EBS/GRS 거래처 / 경조사 접수센터」 (접근성 라벨 포함)</w:t>
+            </w:r>
+          </w:p>
+        </w:tc>
+      </w:tr>
+    </w:tbl>
+    <w:p>
+      <w:pPr>
+        <w:pStyle w:val="Heading2"/>
+        <w:shd w:fill="F5F5F7" w:val="clear"/>
+        <w:spacing w:after="100" w:before="280"/>
+      </w:pPr>
+      <w:r>
+        <w:rPr>
+          <w:rFonts w:ascii="Consolas" w:cs="Consolas" w:eastAsia="Consolas" w:hAnsi="Consolas"/>
+          <w:b/>
+          <w:bCs/>
+          <w:sz w:val="22"/>
+          <w:szCs w:val="22"/>
+        </w:rPr>
+        <w:t xml:space="preserve"> js/icons.js </w:t>
+      </w:r>
+      <w:r>
+        <w:rPr>
+          <w:rFonts w:ascii="Malgun Gothic" w:cs="Malgun Gothic" w:eastAsia="Malgun Gothic" w:hAnsi="Malgun Gothic"/>
+          <w:color w:val="667085"/>
+          <w:sz w:val="18"/>
+          <w:szCs w:val="18"/>
+        </w:rPr>
+        <w:t xml:space="preserve">  수정 1곳</w:t>
+      </w:r>
+    </w:p>
+    <w:tbl>
+      <w:tblPr>
+        <w:tblW w:type="dxa" w:w="9360"/>
+        <w:tblBorders>
+          <w:top w:val="single" w:color="auto" w:sz="4"/>
+          <w:left w:val="single" w:color="auto" w:sz="4"/>
+          <w:bottom w:val="single" w:color="auto" w:sz="4"/>
+          <w:right w:val="single" w:color="auto" w:sz="4"/>
+          <w:insideH w:val="single" w:color="auto" w:sz="4"/>
+          <w:insideV w:val="single" w:color="auto" w:sz="4"/>
+        </w:tblBorders>
+      </w:tblPr>
+      <w:tblGrid>
+        <w:gridCol w:w="2600"/>
+        <w:gridCol w:w="6760"/>
+      </w:tblGrid>
+      <w:tr>
+        <w:trPr>
+          <w:tblHeader/>
+        </w:trPr>
+        <w:tc>
+          <w:tcPr>
+            <w:tcW w:type="dxa" w:w="2600"/>
+            <w:tcBorders>
+              <w:top w:val="single" w:color="D0D5DD" w:sz="4"/>
+              <w:left w:val="single" w:color="D0D5DD" w:sz="4"/>
+              <w:bottom w:val="single" w:color="D0D5DD" w:sz="4"/>
+              <w:right w:val="single" w:color="D0D5DD" w:sz="4"/>
+            </w:tcBorders>
+            <w:shd w:fill="EEF2FF" w:val="clear"/>
+            <w:tcMar>
+              <w:top w:type="dxa" w:w="60"/>
+              <w:left w:type="dxa" w:w="100"/>
+              <w:bottom w:type="dxa" w:w="60"/>
+              <w:right w:type="dxa" w:w="100"/>
+            </w:tcMar>
+          </w:tcPr>
+          <w:p>
+            <w:r>
+              <w:rPr>
+                <w:rFonts w:ascii="Malgun Gothic" w:cs="Malgun Gothic" w:eastAsia="Malgun Gothic" w:hAnsi="Malgun Gothic"/>
+                <w:b/>
+                <w:bCs/>
+                <w:sz w:val="18"/>
+                <w:szCs w:val="18"/>
+              </w:rPr>
+              <w:t xml:space="preserve">위치 (라인 · 함수)</w:t>
+            </w:r>
+          </w:p>
+        </w:tc>
+        <w:tc>
+          <w:tcPr>
+            <w:tcW w:type="dxa" w:w="6760"/>
+            <w:tcBorders>
+              <w:top w:val="single" w:color="D0D5DD" w:sz="4"/>
+              <w:left w:val="single" w:color="D0D5DD" w:sz="4"/>
+              <w:bottom w:val="single" w:color="D0D5DD" w:sz="4"/>
+              <w:right w:val="single" w:color="D0D5DD" w:sz="4"/>
+            </w:tcBorders>
+            <w:shd w:fill="EEF2FF" w:val="clear"/>
+            <w:tcMar>
+              <w:top w:type="dxa" w:w="60"/>
+              <w:left w:type="dxa" w:w="100"/>
+              <w:bottom w:type="dxa" w:w="60"/>
+              <w:right w:type="dxa" w:w="100"/>
+            </w:tcMar>
+          </w:tcPr>
+          <w:p>
+            <w:r>
+              <w:rPr>
+                <w:rFonts w:ascii="Malgun Gothic" w:cs="Malgun Gothic" w:eastAsia="Malgun Gothic" w:hAnsi="Malgun Gothic"/>
+                <w:b/>
+                <w:bCs/>
+                <w:sz w:val="18"/>
+                <w:szCs w:val="18"/>
+              </w:rPr>
+              <w:t xml:space="preserve">수정 내용</w:t>
+            </w:r>
+          </w:p>
+        </w:tc>
+      </w:tr>
+      <w:tr>
+        <w:tc>
+          <w:tcPr>
+            <w:tcW w:type="dxa" w:w="2600"/>
+            <w:tcBorders>
+              <w:top w:val="single" w:color="D0D5DD" w:sz="4"/>
+              <w:left w:val="single" w:color="D0D5DD" w:sz="4"/>
+              <w:bottom w:val="single" w:color="D0D5DD" w:sz="4"/>
+              <w:right w:val="single" w:color="D0D5DD" w:sz="4"/>
+            </w:tcBorders>
+            <w:tcMar>
+              <w:top w:type="dxa" w:w="60"/>
+              <w:left w:type="dxa" w:w="100"/>
+              <w:bottom w:type="dxa" w:w="60"/>
+              <w:right w:type="dxa" w:w="100"/>
+            </w:tcMar>
+          </w:tcPr>
+          <w:p>
+            <w:r>
+              <w:rPr>
+                <w:rFonts w:ascii="Consolas" w:cs="Consolas" w:eastAsia="Consolas" w:hAnsi="Consolas"/>
+                <w:b w:val="false"/>
+                <w:bCs w:val="false"/>
+                <w:sz w:val="18"/>
+                <w:szCs w:val="18"/>
+              </w:rPr>
+              <w:t xml:space="preserve">25행 Chevron</w:t>
+            </w:r>
+          </w:p>
+        </w:tc>
+        <w:tc>
+          <w:tcPr>
+            <w:tcW w:type="dxa" w:w="6760"/>
+            <w:tcBorders>
+              <w:top w:val="single" w:color="D0D5DD" w:sz="4"/>
+              <w:left w:val="single" w:color="D0D5DD" w:sz="4"/>
+              <w:bottom w:val="single" w:color="D0D5DD" w:sz="4"/>
+              <w:right w:val="single" w:color="D0D5DD" w:sz="4"/>
+            </w:tcBorders>
+            <w:tcMar>
+              <w:top w:type="dxa" w:w="60"/>
+              <w:left w:type="dxa" w:w="100"/>
+              <w:bottom w:type="dxa" w:w="60"/>
+              <w:right w:type="dxa" w:w="100"/>
+            </w:tcMar>
+          </w:tcPr>
+          <w:p>
+            <w:r>
+              <w:rPr>
+                <w:rFonts w:ascii="Malgun Gothic" w:cs="Malgun Gothic" w:eastAsia="Malgun Gothic" w:hAnsi="Malgun Gothic"/>
+                <w:b w:val="false"/>
+                <w:bCs w:val="false"/>
+                <w:sz w:val="18"/>
+                <w:szCs w:val="18"/>
+              </w:rPr>
+              <w:t xml:space="preserve">드롭다운 화살표용 아이콘 추가 (열림 상태에서 180도 회전)</w:t>
             </w:r>
           </w:p>
         </w:tc>
@@ -3066,7 +3383,7 @@
                 <w:sz w:val="18"/>
                 <w:szCs w:val="18"/>
               </w:rPr>
-              <w:t xml:space="preserve">1528~1549행 .qi-field select</w:t>
+              <w:t xml:space="preserve">1528~1585행 .dd-*</w:t>
             </w:r>
           </w:p>
         </w:tc>
@@ -3095,7 +3412,7 @@
                 <w:sz w:val="18"/>
                 <w:szCs w:val="18"/>
               </w:rPr>
-              <w:t xml:space="preserve">신청인 모달 셀렉트 박스 스타일 신규 — 기존 input과 동일한 톤(테두리·포커스 링) + 커스텀 화살표 아이콘, 미선택 시 회색 플레이스홀더</w:t>
+              <w:t xml:space="preserve">커스텀 드롭다운 스타일 신규 — 트리거는 기존 입력창과 동일한 톤(테두리·포커스 링), 열림 시 인디고 테두리와 화살표 회전. 옵션 패널은 페이드·슬라이드 등장, 선택 항목은 인디고 굵은 글씨 + 체크 표시. 항목 7개가 스크롤 없이 모두 보이도록 높이 설정, 모션 최소화 설정 대응</w:t>
             </w:r>
           </w:p>
         </w:tc>
@@ -3126,7 +3443,7 @@
                 <w:sz w:val="18"/>
                 <w:szCs w:val="18"/>
               </w:rPr>
-              <w:t xml:space="preserve">1552~1571행 .region-note</w:t>
+              <w:t xml:space="preserve">1588~1607행 .region-note</w:t>
             </w:r>
           </w:p>
         </w:tc>
@@ -3704,7 +4021,7 @@
           <w:sz w:val="20"/>
           <w:szCs w:val="20"/>
         </w:rPr>
-        <w:t xml:space="preserve">자유 입력이던 부서·직책 필드를 제거하고, 회사 선택 후 부서를 선택하는 셀렉트 박스 방식으로 규격화했습니다. 4개 항목(회사·부서·성함·연락처)이 모두 입력되어야 저장할 수 있습니다.</w:t>
+        <w:t xml:space="preserve">자유 입력이던 부서·직책 필드를 제거하고, 회사 선택 후 부서를 선택하는 방식으로 규격화했습니다. 4개 항목(회사·부서·성함·연락처)이 모두 입력되어야 저장할 수 있습니다.</w:t>
       </w:r>
     </w:p>
     <w:p>
@@ -3777,6 +4094,107 @@
           <w:szCs w:val="20"/>
         </w:rPr>
         <w:t xml:space="preserve">홈 화면 신청인 카드에 '회사 · 부서'가 함께 표시됩니다.</w:t>
+      </w:r>
+    </w:p>
+    <w:p>
+      <w:pPr>
+        <w:pStyle w:val="Heading2"/>
+        <w:spacing w:after="120" w:before="240"/>
+      </w:pPr>
+      <w:r>
+        <w:rPr>
+          <w:rFonts w:ascii="Malgun Gothic" w:cs="Malgun Gothic" w:eastAsia="Malgun Gothic" w:hAnsi="Malgun Gothic"/>
+          <w:b/>
+          <w:bCs/>
+          <w:sz w:val="23"/>
+          <w:szCs w:val="23"/>
+        </w:rPr>
+        <w:t xml:space="preserve">3-1. 커스텀 드롭다운</w:t>
+      </w:r>
+    </w:p>
+    <w:p>
+      <w:pPr>
+        <w:spacing w:after="120"/>
+      </w:pPr>
+      <w:r>
+        <w:rPr>
+          <w:rFonts w:ascii="Malgun Gothic" w:cs="Malgun Gothic" w:eastAsia="Malgun Gothic" w:hAnsi="Malgun Gothic"/>
+          <w:sz w:val="20"/>
+          <w:szCs w:val="20"/>
+        </w:rPr>
+        <w:t xml:space="preserve">기기 기본 선택창(OS 피커) 대신 앱 디자인에 맞춘 커스텀 드롭다운으로 만들었습니다.</w:t>
+      </w:r>
+    </w:p>
+    <w:p>
+      <w:pPr>
+        <w:pStyle w:val="ListParagraph"/>
+        <w:numPr>
+          <w:ilvl w:val="0"/>
+          <w:numId w:val="2"/>
+        </w:numPr>
+        <w:spacing w:after="60"/>
+      </w:pPr>
+      <w:r>
+        <w:rPr>
+          <w:rFonts w:ascii="Malgun Gothic" w:cs="Malgun Gothic" w:eastAsia="Malgun Gothic" w:hAnsi="Malgun Gothic"/>
+          <w:sz w:val="20"/>
+          <w:szCs w:val="20"/>
+        </w:rPr>
+        <w:t xml:space="preserve">입력창과 동일한 모양의 선택 버튼을 누르면 목록이 아래로 펼쳐지고, 화살표가 함께 회전합니다.</w:t>
+      </w:r>
+    </w:p>
+    <w:p>
+      <w:pPr>
+        <w:pStyle w:val="ListParagraph"/>
+        <w:numPr>
+          <w:ilvl w:val="0"/>
+          <w:numId w:val="2"/>
+        </w:numPr>
+        <w:spacing w:after="60"/>
+      </w:pPr>
+      <w:r>
+        <w:rPr>
+          <w:rFonts w:ascii="Malgun Gothic" w:cs="Malgun Gothic" w:eastAsia="Malgun Gothic" w:hAnsi="Malgun Gothic"/>
+          <w:sz w:val="20"/>
+          <w:szCs w:val="20"/>
+        </w:rPr>
+        <w:t xml:space="preserve">선택한 항목은 인디고색 굵은 글씨와 체크 표시로 구분됩니다.</w:t>
+      </w:r>
+    </w:p>
+    <w:p>
+      <w:pPr>
+        <w:pStyle w:val="ListParagraph"/>
+        <w:numPr>
+          <w:ilvl w:val="0"/>
+          <w:numId w:val="2"/>
+        </w:numPr>
+        <w:spacing w:after="60"/>
+      </w:pPr>
+      <w:r>
+        <w:rPr>
+          <w:rFonts w:ascii="Malgun Gothic" w:cs="Malgun Gothic" w:eastAsia="Malgun Gothic" w:hAnsi="Malgun Gothic"/>
+          <w:sz w:val="20"/>
+          <w:szCs w:val="20"/>
+        </w:rPr>
+        <w:t xml:space="preserve">회사와 부서 중 하나만 열리며, 바깥을 누르면 닫힙니다. 키보드 위·아래 화살표와 Esc로도 조작할 수 있습니다.</w:t>
+      </w:r>
+    </w:p>
+    <w:p>
+      <w:pPr>
+        <w:pStyle w:val="ListParagraph"/>
+        <w:numPr>
+          <w:ilvl w:val="0"/>
+          <w:numId w:val="2"/>
+        </w:numPr>
+        <w:spacing w:after="60"/>
+      </w:pPr>
+      <w:r>
+        <w:rPr>
+          <w:rFonts w:ascii="Malgun Gothic" w:cs="Malgun Gothic" w:eastAsia="Malgun Gothic" w:hAnsi="Malgun Gothic"/>
+          <w:sz w:val="20"/>
+          <w:szCs w:val="20"/>
+        </w:rPr>
+        <w:t xml:space="preserve">부서 7개 항목이 스크롤 없이 한 번에 보이도록 높이를 맞춰, 창 안에서 또 스크롤해야 하는 불편을 없앴습니다.</w:t>
       </w:r>
     </w:p>
     <w:p>

</xml_diff>

<commit_message>
Dropdown: overlay panel + press-drag-release selection
- 목록을 시트 안 인라인 확장 → body 에 붙인 fixed 오버레이로 변경.
  시트 높이가 변하지 않고 아래 항목을 덮는다.
- 누른 채 끌어서 원하는 항목에서 떼면 선택 (끄는 동안 항목 강조, 끝에서 자동 스크롤).
  그냥 탭하면 목록이 열린 채 유지되어 탭으로도 선택 가능.
- 아래 공간이 충분하면 항상 아래로 펼침 (좁을 때만 위로), 스크롤·리사이즈 시 위치 추적
- 시트가 닫히면 떠 있는 목록도 함께 정리

Co-Authored-By: Claude Fable 5 <noreply@anthropic.com>
</commit_message>
<xml_diff>
--- a/Front_Update.docx
+++ b/Front_Update.docx
@@ -48,7 +48,7 @@
           <w:sz w:val="18"/>
           <w:szCs w:val="18"/>
         </w:rPr>
-        <w:t xml:space="preserve">작성일: 2026-08-25  ·  기준 브랜치: main  ·  커밋 57c92a0</w:t>
+        <w:t xml:space="preserve">작성일: 2026-08-25  ·  기준 브랜치: main</w:t>
       </w:r>
     </w:p>
     <w:p>
@@ -1857,7 +1857,7 @@
           <w:sz w:val="18"/>
           <w:szCs w:val="18"/>
         </w:rPr>
-        <w:t xml:space="preserve">  수정 19곳</w:t>
+        <w:t xml:space="preserve">  수정 21곳</w:t>
       </w:r>
     </w:p>
     <w:tbl>
@@ -2027,7 +2027,7 @@
                 <w:sz w:val="18"/>
                 <w:szCs w:val="18"/>
               </w:rPr>
-              <w:t xml:space="preserve">163·177행 buildAppBar / updateAppBar</w:t>
+              <w:t xml:space="preserve">133행 mountOverlay</w:t>
             </w:r>
           </w:p>
         </w:tc>
@@ -2056,7 +2056,7 @@
                 <w:sz w:val="18"/>
                 <w:szCs w:val="18"/>
               </w:rPr>
-              <w:t xml:space="preserve">상단 앱바 기본 타이틀 「경조사 지원센터」 → 「경조사 접수센터」. 상품 선택 모드일 때 상품목록 화면의 타이틀을 「상품 선택」으로, 뒤로가기를 홈이 아닌 주문서로 이동하도록 변경</w:t>
+              <w:t xml:space="preserve">시트가 닫힐 때 열려 있던 드롭다운도 함께 닫도록 처리 — 화면에 목록만 남는 것을 방지</w:t>
             </w:r>
           </w:p>
         </w:tc>
@@ -2087,7 +2087,7 @@
                 <w:sz w:val="18"/>
                 <w:szCs w:val="18"/>
               </w:rPr>
-              <w:t xml:space="preserve">210행 buildApplicantCard</w:t>
+              <w:t xml:space="preserve">164·178행 buildAppBar / updateAppBar</w:t>
             </w:r>
           </w:p>
         </w:tc>
@@ -2116,7 +2116,7 @@
                 <w:sz w:val="18"/>
                 <w:szCs w:val="18"/>
               </w:rPr>
-              <w:t xml:space="preserve">홈 신청인 카드 meta에 회사(company) 표시 추가 → 「회사 · 부서」 형식</w:t>
+              <w:t xml:space="preserve">상단 앱바 기본 타이틀 「경조사 지원센터」 → 「경조사 접수센터」. 상품 선택 모드일 때 상품목록 화면의 타이틀을 「상품 선택」으로, 뒤로가기를 홈이 아닌 주문서로 이동하도록 변경</w:t>
             </w:r>
           </w:p>
         </w:tc>
@@ -2147,7 +2147,7 @@
                 <w:sz w:val="18"/>
                 <w:szCs w:val="18"/>
               </w:rPr>
-              <w:t xml:space="preserve">260행 buildHomeScreen</w:t>
+              <w:t xml:space="preserve">211행 buildApplicantCard</w:t>
             </w:r>
           </w:p>
         </w:tc>
@@ -2176,7 +2176,7 @@
                 <w:sz w:val="18"/>
                 <w:szCs w:val="18"/>
               </w:rPr>
-              <w:t xml:space="preserve">히어로 h2 타이틀의 줄바꿈(\n)이 &lt;br&gt;로 변환되지 않던 기존 버그 수정</w:t>
+              <w:t xml:space="preserve">홈 신청인 카드 meta에 회사(company) 표시 추가 → 「회사 · 부서」 형식</w:t>
             </w:r>
           </w:p>
         </w:tc>
@@ -2207,7 +2207,7 @@
                 <w:sz w:val="18"/>
                 <w:szCs w:val="18"/>
               </w:rPr>
-              <w:t xml:space="preserve">270행 buildHomeScreen</w:t>
+              <w:t xml:space="preserve">261행 buildHomeScreen</w:t>
             </w:r>
           </w:p>
         </w:tc>
@@ -2236,7 +2236,7 @@
                 <w:sz w:val="18"/>
                 <w:szCs w:val="18"/>
               </w:rPr>
-              <w:t xml:space="preserve">홈 카테고리 상품 개수 계산에서 regionOnly(지역 한정) 섹션 제외</w:t>
+              <w:t xml:space="preserve">히어로 h2 타이틀의 줄바꿈(\n)이 &lt;br&gt;로 변환되지 않던 기존 버그 수정</w:t>
             </w:r>
           </w:p>
         </w:tc>
@@ -2267,7 +2267,7 @@
                 <w:sz w:val="18"/>
                 <w:szCs w:val="18"/>
               </w:rPr>
-              <w:t xml:space="preserve">320~334행 buildItemsScreen</w:t>
+              <w:t xml:space="preserve">271행 buildHomeScreen</w:t>
             </w:r>
           </w:p>
         </w:tc>
@@ -2296,7 +2296,7 @@
                 <w:sz w:val="18"/>
                 <w:szCs w:val="18"/>
               </w:rPr>
-              <w:t xml:space="preserve">상품목록에서 지역 한정 대체상품 숨김. 단 상품 선택 모드에서는 주문서 주소의 지역 규칙(matchRegionRule)을 근조화환에 적용해 반입 가능한 상품만 노출 — 바텀시트를 우회해 제한 상품이 선택되는 것을 방지</w:t>
+              <w:t xml:space="preserve">홈 카테고리 상품 개수 계산에서 regionOnly(지역 한정) 섹션 제외</w:t>
             </w:r>
           </w:p>
         </w:tc>
@@ -2327,7 +2327,7 @@
                 <w:sz w:val="18"/>
                 <w:szCs w:val="18"/>
               </w:rPr>
-              <w:t xml:space="preserve">343~352행 buildItemsScreen</w:t>
+              <w:t xml:space="preserve">321~335행 buildItemsScreen</w:t>
             </w:r>
           </w:p>
         </w:tc>
@@ -2356,7 +2356,7 @@
                 <w:sz w:val="18"/>
                 <w:szCs w:val="18"/>
               </w:rPr>
-              <w:t xml:space="preserve">상품 선택 모드 안내 배너 추가 — 일반 시 「주문서에 넣을 상품을 선택해주세요」, 제한 지역은 반입 안내, 배송불가 지역은 빨간 경고</w:t>
+              <w:t xml:space="preserve">상품목록에서 지역 한정 대체상품 숨김. 단 상품 선택 모드에서는 주문서 주소의 지역 규칙(matchRegionRule)을 근조화환에 적용해 반입 가능한 상품만 노출 — 바텀시트를 우회해 제한 상품이 선택되는 것을 방지</w:t>
             </w:r>
           </w:p>
         </w:tc>
@@ -2387,7 +2387,7 @@
                 <w:sz w:val="18"/>
                 <w:szCs w:val="18"/>
               </w:rPr>
-              <w:t xml:space="preserve">644행 openProductPicker</w:t>
+              <w:t xml:space="preserve">344~353행 buildItemsScreen</w:t>
             </w:r>
           </w:p>
         </w:tc>
@@ -2416,7 +2416,7 @@
                 <w:sz w:val="18"/>
                 <w:szCs w:val="18"/>
               </w:rPr>
-              <w:t xml:space="preserve">3번째 인자 opts.rule 추가. 배송불가 규칙이면 상품 대신 「배송 불가 지역이에요」 안내 표시. 제한 규칙이면 근조화환(tab5)에 한해 반입 가능 kind의 대체상품만 노출(3단 허용 지역은 일반 화환도 함께), 시트 상단에 지역 안내 배너 표시</w:t>
+              <w:t xml:space="preserve">상품 선택 모드 안내 배너 추가 — 일반 시 「주문서에 넣을 상품을 선택해주세요」, 제한 지역은 반입 안내, 배송불가 지역은 빨간 경고</w:t>
             </w:r>
           </w:p>
         </w:tc>
@@ -2447,7 +2447,7 @@
                 <w:sz w:val="18"/>
                 <w:szCs w:val="18"/>
               </w:rPr>
-              <w:t xml:space="preserve">707행 openItemSheet</w:t>
+              <w:t xml:space="preserve">645행 openProductPicker</w:t>
             </w:r>
           </w:p>
         </w:tc>
@@ -2476,7 +2476,7 @@
                 <w:sz w:val="18"/>
                 <w:szCs w:val="18"/>
               </w:rPr>
-              <w:t xml:space="preserve">상품 선택 모드일 때 하단 버튼 문구를 「이 상품으로 주문하기」 → 「이 상품으로 선택」으로 변경</w:t>
+              <w:t xml:space="preserve">3번째 인자 opts.rule 추가. 배송불가 규칙이면 상품 대신 「배송 불가 지역이에요」 안내 표시. 제한 규칙이면 근조화환(tab5)에 한해 반입 가능 kind의 대체상품만 노출(3단 허용 지역은 일반 화환도 함께), 시트 상단에 지역 안내 배너 표시</w:t>
             </w:r>
           </w:p>
         </w:tc>
@@ -2507,7 +2507,7 @@
                 <w:sz w:val="18"/>
                 <w:szCs w:val="18"/>
               </w:rPr>
-              <w:t xml:space="preserve">711~784행 buildDropdown()</w:t>
+              <w:t xml:space="preserve">708행 openItemSheet</w:t>
             </w:r>
           </w:p>
         </w:tc>
@@ -2536,7 +2536,7 @@
                 <w:sz w:val="18"/>
                 <w:szCs w:val="18"/>
               </w:rPr>
-              <w:t xml:space="preserve">커스텀 드롭다운 컴포넌트 신규. 시트 본문이 스크롤 영역이라 떠 있는 목록은 잘리므로, 열리면 아래 내용을 밀어내는 인라인 확장 방식으로 구현. 바깥 영역 클릭 시 닫힘, 동시에 하나만 열림, 위·아래 화살표키 이동과 Esc 닫기 지원(Esc가 시트까지 닫지 않도록 처리)</w:t>
+              <w:t xml:space="preserve">상품 선택 모드일 때 하단 버튼 문구를 「이 상품으로 주문하기」 → 「이 상품으로 선택」으로 변경</w:t>
             </w:r>
           </w:p>
         </w:tc>
@@ -2567,7 +2567,7 @@
                 <w:sz w:val="18"/>
                 <w:szCs w:val="18"/>
               </w:rPr>
-              <w:t xml:space="preserve">786~810행 openApplicantModal</w:t>
+              <w:t xml:space="preserve">712~854행 buildDropdown()</w:t>
             </w:r>
           </w:p>
         </w:tc>
@@ -2596,7 +2596,7 @@
                 <w:sz w:val="18"/>
                 <w:szCs w:val="18"/>
               </w:rPr>
-              <w:t xml:space="preserve">부서·직책 자유입력 &lt;input&gt; 삭제 → 회사·부서 커스텀 드롭다운으로 교체(늘푸른바다/고래사, 리테일채널 영업팀 외 6개). 저장 조건이 성함·연락처 2개 → 회사·부서·성함·연락처 4개 필수로 강화. 저장 데이터가 {name, contact, dept, position} → {company, dept, name, contact}로 변경</w:t>
+              <w:t xml:space="preserve">커스텀 드롭다운 컴포넌트 신규. 목록은 시트 크기를 바꾸지 않는 오버레이로 뜬다 — 시트 본문이 스크롤 영역이라 그 안에 두면 잘리므로 화면 최상위에 붙이고 트리거 위치에 맞춰 배치. 선택은 누른 채 끌어서 떼기(끄는 동안 손가락 아래 항목 강조, 목록 끝에 닿으면 자동 스크롤) 또는 열어 둔 뒤 탭. 바깥 클릭 닫기, 동시에 하나만 열림, 화살표키·Esc 지원</w:t>
             </w:r>
           </w:p>
         </w:tc>
@@ -2627,7 +2627,7 @@
                 <w:sz w:val="18"/>
                 <w:szCs w:val="18"/>
               </w:rPr>
-              <w:t xml:space="preserve">760행 buildOrderScreen · 상품 항목</w:t>
+              <w:t xml:space="preserve">743~761행 place()</w:t>
             </w:r>
           </w:p>
         </w:tc>
@@ -2656,7 +2656,7 @@
                 <w:sz w:val="18"/>
                 <w:szCs w:val="18"/>
               </w:rPr>
-              <w:t xml:space="preserve">「2. 상품 분류 및 이름」을 직접 입력에서 선택형으로 전환 (select: true). 누르면 상품목록 화면으로 이동하며, 상품 선택 시 자동으로 주문서에 채워짐</w:t>
+              <w:t xml:space="preserve">목록을 트리거 바로 아래에 띄우고 화면 높이에 맞춰 크기 제한. 아래 공간이 너무 좁을 때만 위로 펼침</w:t>
             </w:r>
           </w:p>
         </w:tc>
@@ -2687,7 +2687,7 @@
                 <w:sz w:val="18"/>
                 <w:szCs w:val="18"/>
               </w:rPr>
-              <w:t xml:space="preserve">765행 buildOrderScreen · 신청사유</w:t>
+              <w:t xml:space="preserve">856~892행 openApplicantModal</w:t>
             </w:r>
           </w:p>
         </w:tc>
@@ -2716,7 +2716,7 @@
                 <w:sz w:val="18"/>
                 <w:szCs w:val="18"/>
               </w:rPr>
-              <w:t xml:space="preserve">입력 항목 배열에 「7. 신청사유」(여러 줄) 추가 — 항목 번호·진행바 자동 반영</w:t>
+              <w:t xml:space="preserve">부서·직책 자유입력 &lt;input&gt; 삭제 → 회사·부서 커스텀 드롭다운으로 교체(늘푸른바다/고래사, 리테일채널 영업팀 외 6개). 저장 조건이 성함·연락처 2개 → 회사·부서·성함·연락처 4개 필수로 강화. 저장 데이터가 {name, contact, dept, position} → {company, dept, name, contact}로 변경</w:t>
             </w:r>
           </w:p>
         </w:tc>
@@ -2747,7 +2747,7 @@
                 <w:sz w:val="18"/>
                 <w:szCs w:val="18"/>
               </w:rPr>
-              <w:t xml:space="preserve">812~822·843~857행 buildOrderScreen</w:t>
+              <w:t xml:space="preserve">898행 buildOrderScreen · 상품 항목</w:t>
             </w:r>
           </w:p>
         </w:tc>
@@ -2776,7 +2776,7 @@
                 <w:sz w:val="18"/>
                 <w:szCs w:val="18"/>
               </w:rPr>
-              <w:t xml:space="preserve">선택형 항목 렌더링 분기 추가 — 입력창 대신 화살표가 달린 선택 버튼(.field.selectable / .field-trigger) 생성. setFieldValue()가 입력창과 선택 버튼 표시값을 모두 갱신하도록 확장</w:t>
+              <w:t xml:space="preserve">「2. 상품 분류 및 이름」을 직접 입력에서 선택형으로 전환 (select: true). 누르면 상품목록 화면으로 이동하며, 상품 선택 시 자동으로 주문서에 채워짐</w:t>
             </w:r>
           </w:p>
         </w:tc>
@@ -2807,7 +2807,7 @@
                 <w:sz w:val="18"/>
                 <w:szCs w:val="18"/>
               </w:rPr>
-              <w:t xml:space="preserve">823·862·864~876행 buildOrderScreen</w:t>
+              <w:t xml:space="preserve">903행 buildOrderScreen · 신청사유</w:t>
             </w:r>
           </w:p>
         </w:tc>
@@ -2836,7 +2836,7 @@
                 <w:sz w:val="18"/>
                 <w:szCs w:val="18"/>
               </w:rPr>
-              <w:t xml:space="preserve">주소 입력란 바로 아래 지역 안내 배너 영역(regionNoteHost) 추가. updateRegionNote(): 주소 변경 시 matchRegionRule로 판정해 제한 지역은 파란 안내, 배송불가는 빨간 경고 배너 표시 + 신청 버튼 비활성화</w:t>
+              <w:t xml:space="preserve">입력 항목 배열에 「7. 신청사유」(여러 줄) 추가 — 항목 번호·진행바 자동 반영</w:t>
             </w:r>
           </w:p>
         </w:tc>
@@ -2867,7 +2867,7 @@
                 <w:sz w:val="18"/>
                 <w:szCs w:val="18"/>
               </w:rPr>
-              <w:t xml:space="preserve">887행 send()</w:t>
+              <w:t xml:space="preserve">950~960·981~995행 buildOrderScreen</w:t>
             </w:r>
           </w:p>
         </w:tc>
@@ -2896,7 +2896,7 @@
                 <w:sz w:val="18"/>
                 <w:szCs w:val="18"/>
               </w:rPr>
-              <w:t xml:space="preserve">신청 시 배송불가 지역이면 「배송 불가 지역이라 신청할 수 없어요」 토스트 후 차단</w:t>
+              <w:t xml:space="preserve">선택형 항목 렌더링 분기 추가 — 입력창 대신 화살표가 달린 선택 버튼(.field.selectable / .field-trigger) 생성. setFieldValue()가 입력창과 선택 버튼 표시값을 모두 갱신하도록 확장</w:t>
             </w:r>
           </w:p>
         </w:tc>
@@ -2927,7 +2927,7 @@
                 <w:sz w:val="18"/>
                 <w:szCs w:val="18"/>
               </w:rPr>
-              <w:t xml:space="preserve">892~911행 handleIntake</w:t>
+              <w:t xml:space="preserve">961·1000·1002~1014행 buildOrderScreen</w:t>
             </w:r>
           </w:p>
         </w:tc>
@@ -2956,7 +2956,7 @@
                 <w:sz w:val="18"/>
                 <w:szCs w:val="18"/>
               </w:rPr>
-              <w:t xml:space="preserve">간편접수로 불러온 주소의 지역 규칙을 상품선택 바텀시트에 전달(부고장만 적용). 배송불가 지역이면 시트 미오픈 + 차단 안내. 바텀시트 오픈을 setTimeout으로 지연 — 간편접수 시트 닫힘과 겹치며 화면 스크롤 잠금이 풀리던 버그 수정</w:t>
+              <w:t xml:space="preserve">주소 입력란 바로 아래 지역 안내 배너 영역(regionNoteHost) 추가. updateRegionNote(): 주소 변경 시 matchRegionRule로 판정해 제한 지역은 파란 안내, 배송불가는 빨간 경고 배너 표시 + 신청 버튼 비활성화</w:t>
             </w:r>
           </w:p>
         </w:tc>
@@ -2987,7 +2987,7 @@
                 <w:sz w:val="18"/>
                 <w:szCs w:val="18"/>
               </w:rPr>
-              <w:t xml:space="preserve">946~958행 go() / orderProduct()</w:t>
+              <w:t xml:space="preserve">1025행 send()</w:t>
             </w:r>
           </w:p>
         </w:tc>
@@ -3016,7 +3016,7 @@
                 <w:sz w:val="18"/>
                 <w:szCs w:val="18"/>
               </w:rPr>
-              <w:t xml:space="preserve">화면 이동 시 상품목록을 벗어나면 선택 모드 해제. 상품 선택 결과를 S.orderForm.product에 저장 후 주문서로 복귀</w:t>
+              <w:t xml:space="preserve">신청 시 배송불가 지역이면 「배송 불가 지역이라 신청할 수 없어요」 토스트 후 차단</w:t>
             </w:r>
           </w:p>
         </w:tc>
@@ -3047,7 +3047,127 @@
                 <w:sz w:val="18"/>
                 <w:szCs w:val="18"/>
               </w:rPr>
-              <w:t xml:space="preserve">981·995~996행 mountSplash</w:t>
+              <w:t xml:space="preserve">1030~1049행 handleIntake</w:t>
+            </w:r>
+          </w:p>
+        </w:tc>
+        <w:tc>
+          <w:tcPr>
+            <w:tcW w:type="dxa" w:w="6760"/>
+            <w:tcBorders>
+              <w:top w:val="single" w:color="D0D5DD" w:sz="4"/>
+              <w:left w:val="single" w:color="D0D5DD" w:sz="4"/>
+              <w:bottom w:val="single" w:color="D0D5DD" w:sz="4"/>
+              <w:right w:val="single" w:color="D0D5DD" w:sz="4"/>
+            </w:tcBorders>
+            <w:tcMar>
+              <w:top w:type="dxa" w:w="60"/>
+              <w:left w:type="dxa" w:w="100"/>
+              <w:bottom w:type="dxa" w:w="60"/>
+              <w:right w:type="dxa" w:w="100"/>
+            </w:tcMar>
+          </w:tcPr>
+          <w:p>
+            <w:r>
+              <w:rPr>
+                <w:rFonts w:ascii="Malgun Gothic" w:cs="Malgun Gothic" w:eastAsia="Malgun Gothic" w:hAnsi="Malgun Gothic"/>
+                <w:b w:val="false"/>
+                <w:bCs w:val="false"/>
+                <w:sz w:val="18"/>
+                <w:szCs w:val="18"/>
+              </w:rPr>
+              <w:t xml:space="preserve">간편접수로 불러온 주소의 지역 규칙을 상품선택 바텀시트에 전달(부고장만 적용). 배송불가 지역이면 시트 미오픈 + 차단 안내. 바텀시트 오픈을 지연 처리 — 간편접수 시트 닫힘과 겹치며 화면 스크롤 잠금이 풀리던 버그 수정</w:t>
+            </w:r>
+          </w:p>
+        </w:tc>
+      </w:tr>
+      <w:tr>
+        <w:tc>
+          <w:tcPr>
+            <w:tcW w:type="dxa" w:w="2600"/>
+            <w:tcBorders>
+              <w:top w:val="single" w:color="D0D5DD" w:sz="4"/>
+              <w:left w:val="single" w:color="D0D5DD" w:sz="4"/>
+              <w:bottom w:val="single" w:color="D0D5DD" w:sz="4"/>
+              <w:right w:val="single" w:color="D0D5DD" w:sz="4"/>
+            </w:tcBorders>
+            <w:tcMar>
+              <w:top w:type="dxa" w:w="60"/>
+              <w:left w:type="dxa" w:w="100"/>
+              <w:bottom w:type="dxa" w:w="60"/>
+              <w:right w:type="dxa" w:w="100"/>
+            </w:tcMar>
+          </w:tcPr>
+          <w:p>
+            <w:r>
+              <w:rPr>
+                <w:rFonts w:ascii="Consolas" w:cs="Consolas" w:eastAsia="Consolas" w:hAnsi="Consolas"/>
+                <w:b w:val="false"/>
+                <w:bCs w:val="false"/>
+                <w:sz w:val="18"/>
+                <w:szCs w:val="18"/>
+              </w:rPr>
+              <w:t xml:space="preserve">1084~1096행 go() / orderProduct()</w:t>
+            </w:r>
+          </w:p>
+        </w:tc>
+        <w:tc>
+          <w:tcPr>
+            <w:tcW w:type="dxa" w:w="6760"/>
+            <w:tcBorders>
+              <w:top w:val="single" w:color="D0D5DD" w:sz="4"/>
+              <w:left w:val="single" w:color="D0D5DD" w:sz="4"/>
+              <w:bottom w:val="single" w:color="D0D5DD" w:sz="4"/>
+              <w:right w:val="single" w:color="D0D5DD" w:sz="4"/>
+            </w:tcBorders>
+            <w:tcMar>
+              <w:top w:type="dxa" w:w="60"/>
+              <w:left w:type="dxa" w:w="100"/>
+              <w:bottom w:type="dxa" w:w="60"/>
+              <w:right w:type="dxa" w:w="100"/>
+            </w:tcMar>
+          </w:tcPr>
+          <w:p>
+            <w:r>
+              <w:rPr>
+                <w:rFonts w:ascii="Malgun Gothic" w:cs="Malgun Gothic" w:eastAsia="Malgun Gothic" w:hAnsi="Malgun Gothic"/>
+                <w:b w:val="false"/>
+                <w:bCs w:val="false"/>
+                <w:sz w:val="18"/>
+                <w:szCs w:val="18"/>
+              </w:rPr>
+              <w:t xml:space="preserve">화면 이동 시 상품목록을 벗어나면 선택 모드 해제. 상품 선택 결과를 S.orderForm.product에 저장 후 주문서로 복귀</w:t>
+            </w:r>
+          </w:p>
+        </w:tc>
+      </w:tr>
+      <w:tr>
+        <w:tc>
+          <w:tcPr>
+            <w:tcW w:type="dxa" w:w="2600"/>
+            <w:tcBorders>
+              <w:top w:val="single" w:color="D0D5DD" w:sz="4"/>
+              <w:left w:val="single" w:color="D0D5DD" w:sz="4"/>
+              <w:bottom w:val="single" w:color="D0D5DD" w:sz="4"/>
+              <w:right w:val="single" w:color="D0D5DD" w:sz="4"/>
+            </w:tcBorders>
+            <w:tcMar>
+              <w:top w:type="dxa" w:w="60"/>
+              <w:left w:type="dxa" w:w="100"/>
+              <w:bottom w:type="dxa" w:w="60"/>
+              <w:right w:type="dxa" w:w="100"/>
+            </w:tcMar>
+          </w:tcPr>
+          <w:p>
+            <w:r>
+              <w:rPr>
+                <w:rFonts w:ascii="Consolas" w:cs="Consolas" w:eastAsia="Consolas" w:hAnsi="Consolas"/>
+                <w:b w:val="false"/>
+                <w:bCs w:val="false"/>
+                <w:sz w:val="18"/>
+                <w:szCs w:val="18"/>
+              </w:rPr>
+              <w:t xml:space="preserve">1119·1133~1134행 mountSplash</w:t>
             </w:r>
           </w:p>
         </w:tc>
@@ -3383,7 +3503,7 @@
                 <w:sz w:val="18"/>
                 <w:szCs w:val="18"/>
               </w:rPr>
-              <w:t xml:space="preserve">1528~1585행 .dd-*</w:t>
+              <w:t xml:space="preserve">1528~1592행 .dd-*</w:t>
             </w:r>
           </w:p>
         </w:tc>
@@ -3412,7 +3532,7 @@
                 <w:sz w:val="18"/>
                 <w:szCs w:val="18"/>
               </w:rPr>
-              <w:t xml:space="preserve">커스텀 드롭다운 스타일 신규 — 트리거는 기존 입력창과 동일한 톤(테두리·포커스 링), 열림 시 인디고 테두리와 화살표 회전. 옵션 패널은 페이드·슬라이드 등장, 선택 항목은 인디고 굵은 글씨 + 체크 표시. 항목 7개가 스크롤 없이 모두 보이도록 높이 설정, 모션 최소화 설정 대응</w:t>
+              <w:t xml:space="preserve">커스텀 드롭다운 스타일 신규 — 트리거는 기존 입력창과 동일한 톤(테두리·포커스 링), 열림 시 인디고 테두리와 화살표 회전. 목록은 화면에 떠서 아래 항목을 덮으며 그림자로 층을 구분. 선택 항목은 인디고 굵은 글씨 + 체크, 끌고 지나가는 항목은 연한 인디고로 강조. 끌어서 선택하는 동안 화면 스크롤·텍스트 선택이 끼어들지 않도록 처리</w:t>
             </w:r>
           </w:p>
         </w:tc>
@@ -3443,7 +3563,7 @@
                 <w:sz w:val="18"/>
                 <w:szCs w:val="18"/>
               </w:rPr>
-              <w:t xml:space="preserve">1588~1607행 .region-note</w:t>
+              <w:t xml:space="preserve">1595~1614행 .region-note</w:t>
             </w:r>
           </w:p>
         </w:tc>
@@ -4140,7 +4260,43 @@
           <w:sz w:val="20"/>
           <w:szCs w:val="20"/>
         </w:rPr>
-        <w:t xml:space="preserve">입력창과 동일한 모양의 선택 버튼을 누르면 목록이 아래로 펼쳐지고, 화살표가 함께 회전합니다.</w:t>
+        <w:t xml:space="preserve">목록이 열려도 창(바텀시트) 크기는 그대로입니다. 목록이 아래 항목 위로 떠서 덮는 방식이라 화면이 밀리거나 늘어나지 않습니다.</w:t>
+      </w:r>
+    </w:p>
+    <w:p>
+      <w:pPr>
+        <w:pStyle w:val="ListParagraph"/>
+        <w:numPr>
+          <w:ilvl w:val="0"/>
+          <w:numId w:val="2"/>
+        </w:numPr>
+        <w:spacing w:after="60"/>
+      </w:pPr>
+      <w:r>
+        <w:rPr>
+          <w:rFonts w:ascii="Malgun Gothic" w:cs="Malgun Gothic" w:eastAsia="Malgun Gothic" w:hAnsi="Malgun Gothic"/>
+          <w:sz w:val="20"/>
+          <w:szCs w:val="20"/>
+        </w:rPr>
+        <w:t xml:space="preserve">선택 방법 ① 끌어서 선택 — 선택 버튼을 누른 채 손을 떼지 않고 아래로 끌면 지나가는 항목이 강조되고, 원하는 항목에서 손을 떼면 선택됩니다. 목록 끝까지 끌면 자동으로 스크롤됩니다.</w:t>
+      </w:r>
+    </w:p>
+    <w:p>
+      <w:pPr>
+        <w:pStyle w:val="ListParagraph"/>
+        <w:numPr>
+          <w:ilvl w:val="0"/>
+          <w:numId w:val="2"/>
+        </w:numPr>
+        <w:spacing w:after="60"/>
+      </w:pPr>
+      <w:r>
+        <w:rPr>
+          <w:rFonts w:ascii="Malgun Gothic" w:cs="Malgun Gothic" w:eastAsia="Malgun Gothic" w:hAnsi="Malgun Gothic"/>
+          <w:sz w:val="20"/>
+          <w:szCs w:val="20"/>
+        </w:rPr>
+        <w:t xml:space="preserve">선택 방법 ② 탭해서 선택 — 그냥 눌렀다 떼면 목록이 열린 채 유지되고, 이후 원하는 항목을 눌러 선택합니다.</w:t>
       </w:r>
     </w:p>
     <w:p>
@@ -4177,24 +4333,6 @@
           <w:szCs w:val="20"/>
         </w:rPr>
         <w:t xml:space="preserve">회사와 부서 중 하나만 열리며, 바깥을 누르면 닫힙니다. 키보드 위·아래 화살표와 Esc로도 조작할 수 있습니다.</w:t>
-      </w:r>
-    </w:p>
-    <w:p>
-      <w:pPr>
-        <w:pStyle w:val="ListParagraph"/>
-        <w:numPr>
-          <w:ilvl w:val="0"/>
-          <w:numId w:val="2"/>
-        </w:numPr>
-        <w:spacing w:after="60"/>
-      </w:pPr>
-      <w:r>
-        <w:rPr>
-          <w:rFonts w:ascii="Malgun Gothic" w:cs="Malgun Gothic" w:eastAsia="Malgun Gothic" w:hAnsi="Malgun Gothic"/>
-          <w:sz w:val="20"/>
-          <w:szCs w:val="20"/>
-        </w:rPr>
-        <w:t xml:space="preserve">부서 7개 항목이 스크롤 없이 한 번에 보이도록 높이를 맞춰, 창 안에서 또 스크롤해야 하는 불편을 없앴습니다.</w:t>
       </w:r>
     </w:p>
     <w:p>

</xml_diff>

<commit_message>
Fix dropdown list scrolling snapping back to top
두 가지 원인:
- place() 가 매 호출마다 maxHeight 를 none 으로 풀어 다시 측정 → 그 순간
  스크롤 컨테이너가 사라져 scrollTop 이 0 으로 초기화. 목록 안에서 스크롤할
  때마다 place() 가 불려 계속 맨 위로 튕김.
  → 전체 높이는 열 때 한 번만 measure() 하고, place() 는 배치만 담당.
  → 목록 자신의 scroll 이벤트는 재배치 대상에서 제외.
- .dd-opt 의 touch-action:none 이 목록 안 손가락 스크롤까지 막고 있었음.
  끌어서 선택 중에는 포인터가 트리거에 캡처되므로 불필요 → 제거.

Co-Authored-By: Claude Fable 5 <noreply@anthropic.com>
</commit_message>
<xml_diff>
--- a/Front_Update.docx
+++ b/Front_Update.docx
@@ -2567,7 +2567,7 @@
                 <w:sz w:val="18"/>
                 <w:szCs w:val="18"/>
               </w:rPr>
-              <w:t xml:space="preserve">712~854행 buildDropdown()</w:t>
+              <w:t xml:space="preserve">712~863행 buildDropdown()</w:t>
             </w:r>
           </w:p>
         </w:tc>
@@ -2627,7 +2627,7 @@
                 <w:sz w:val="18"/>
                 <w:szCs w:val="18"/>
               </w:rPr>
-              <w:t xml:space="preserve">743~761행 place()</w:t>
+              <w:t xml:space="preserve">746~769행 measure() / place() / onScroll()</w:t>
             </w:r>
           </w:p>
         </w:tc>
@@ -2656,7 +2656,7 @@
                 <w:sz w:val="18"/>
                 <w:szCs w:val="18"/>
               </w:rPr>
-              <w:t xml:space="preserve">목록을 트리거 바로 아래에 띄우고 화면 높이에 맞춰 크기 제한. 아래 공간이 너무 좁을 때만 위로 펼침</w:t>
+              <w:t xml:space="preserve">목록 전체 높이는 열 때 한 번만 재고(measure), 배치(place)와 분리. 배치할 때마다 높이 제한을 풀어 다시 재면 목록의 스크롤 위치가 맨 위로 초기화되기 때문. 목록 안에서의 스크롤은 재배치 대상에서 제외해 스크롤이 끊기지 않도록 처리. 목록은 트리거 바로 아래에 띄우되 아래 공간이 너무 좁을 때만 위로 펼침</w:t>
             </w:r>
           </w:p>
         </w:tc>
@@ -2687,7 +2687,7 @@
                 <w:sz w:val="18"/>
                 <w:szCs w:val="18"/>
               </w:rPr>
-              <w:t xml:space="preserve">856~892행 openApplicantModal</w:t>
+              <w:t xml:space="preserve">865~901행 openApplicantModal</w:t>
             </w:r>
           </w:p>
         </w:tc>
@@ -2747,7 +2747,7 @@
                 <w:sz w:val="18"/>
                 <w:szCs w:val="18"/>
               </w:rPr>
-              <w:t xml:space="preserve">898행 buildOrderScreen · 상품 항목</w:t>
+              <w:t xml:space="preserve">907행 buildOrderScreen · 상품 항목</w:t>
             </w:r>
           </w:p>
         </w:tc>
@@ -2807,7 +2807,7 @@
                 <w:sz w:val="18"/>
                 <w:szCs w:val="18"/>
               </w:rPr>
-              <w:t xml:space="preserve">903행 buildOrderScreen · 신청사유</w:t>
+              <w:t xml:space="preserve">912행 buildOrderScreen · 신청사유</w:t>
             </w:r>
           </w:p>
         </w:tc>
@@ -2867,7 +2867,7 @@
                 <w:sz w:val="18"/>
                 <w:szCs w:val="18"/>
               </w:rPr>
-              <w:t xml:space="preserve">950~960·981~995행 buildOrderScreen</w:t>
+              <w:t xml:space="preserve">959~969·990~1004행 buildOrderScreen</w:t>
             </w:r>
           </w:p>
         </w:tc>
@@ -2927,7 +2927,7 @@
                 <w:sz w:val="18"/>
                 <w:szCs w:val="18"/>
               </w:rPr>
-              <w:t xml:space="preserve">961·1000·1002~1014행 buildOrderScreen</w:t>
+              <w:t xml:space="preserve">970·1009·1011~1023행 buildOrderScreen</w:t>
             </w:r>
           </w:p>
         </w:tc>
@@ -2987,7 +2987,7 @@
                 <w:sz w:val="18"/>
                 <w:szCs w:val="18"/>
               </w:rPr>
-              <w:t xml:space="preserve">1025행 send()</w:t>
+              <w:t xml:space="preserve">1034행 send()</w:t>
             </w:r>
           </w:p>
         </w:tc>
@@ -3047,7 +3047,7 @@
                 <w:sz w:val="18"/>
                 <w:szCs w:val="18"/>
               </w:rPr>
-              <w:t xml:space="preserve">1030~1049행 handleIntake</w:t>
+              <w:t xml:space="preserve">1039~1058행 handleIntake</w:t>
             </w:r>
           </w:p>
         </w:tc>
@@ -3107,7 +3107,7 @@
                 <w:sz w:val="18"/>
                 <w:szCs w:val="18"/>
               </w:rPr>
-              <w:t xml:space="preserve">1084~1096행 go() / orderProduct()</w:t>
+              <w:t xml:space="preserve">1093~1105행 go() / orderProduct()</w:t>
             </w:r>
           </w:p>
         </w:tc>
@@ -3167,7 +3167,7 @@
                 <w:sz w:val="18"/>
                 <w:szCs w:val="18"/>
               </w:rPr>
-              <w:t xml:space="preserve">1119·1133~1134행 mountSplash</w:t>
+              <w:t xml:space="preserve">1128·1142~1143행 mountSplash</w:t>
             </w:r>
           </w:p>
         </w:tc>
@@ -3503,7 +3503,7 @@
                 <w:sz w:val="18"/>
                 <w:szCs w:val="18"/>
               </w:rPr>
-              <w:t xml:space="preserve">1528~1592행 .dd-*</w:t>
+              <w:t xml:space="preserve">1528~1594행 .dd-*</w:t>
             </w:r>
           </w:p>
         </w:tc>
@@ -4333,6 +4333,24 @@
           <w:szCs w:val="20"/>
         </w:rPr>
         <w:t xml:space="preserve">회사와 부서 중 하나만 열리며, 바깥을 누르면 닫힙니다. 키보드 위·아래 화살표와 Esc로도 조작할 수 있습니다.</w:t>
+      </w:r>
+    </w:p>
+    <w:p>
+      <w:pPr>
+        <w:pStyle w:val="ListParagraph"/>
+        <w:numPr>
+          <w:ilvl w:val="0"/>
+          <w:numId w:val="2"/>
+        </w:numPr>
+        <w:spacing w:after="60"/>
+      </w:pPr>
+      <w:r>
+        <w:rPr>
+          <w:rFonts w:ascii="Malgun Gothic" w:cs="Malgun Gothic" w:eastAsia="Malgun Gothic" w:hAnsi="Malgun Gothic"/>
+          <w:sz w:val="20"/>
+          <w:szCs w:val="20"/>
+        </w:rPr>
+        <w:t xml:space="preserve">항목이 많아 화면에 다 들어가지 않으면 목록 안에서 스크롤해 나머지 항목(부서의 경우 구매팀까지)을 볼 수 있습니다.</w:t>
       </w:r>
     </w:p>
     <w:p>

</xml_diff>

<commit_message>
Add quick-intake buttons to the home screen
- 홈에 「부고장·청첩장을 받으셨나요?」 섹션 추가 (주문서 상단과 동일한 버튼)
- S.pendingIntake 로 결과를 주문서에 전달 → buildOrderScreen 이 기존
  handleIntake 로직을 그대로 이어받아 처리 (중복 구현 없음)

Co-Authored-By: Claude Fable 5 <noreply@anthropic.com>
</commit_message>
<xml_diff>
--- a/Front_Update.docx
+++ b/Front_Update.docx
@@ -1857,7 +1857,7 @@
           <w:sz w:val="18"/>
           <w:szCs w:val="18"/>
         </w:rPr>
-        <w:t xml:space="preserve">  수정 21곳</w:t>
+        <w:t xml:space="preserve">  수정 25곳</w:t>
       </w:r>
     </w:p>
     <w:tbl>
@@ -1937,6 +1937,246 @@
                 <w:szCs w:val="18"/>
               </w:rPr>
               <w:t xml:space="preserve">수정 내용</w:t>
+            </w:r>
+          </w:p>
+        </w:tc>
+      </w:tr>
+      <w:tr>
+        <w:tc>
+          <w:tcPr>
+            <w:tcW w:type="dxa" w:w="2600"/>
+            <w:tcBorders>
+              <w:top w:val="single" w:color="D0D5DD" w:sz="4"/>
+              <w:left w:val="single" w:color="D0D5DD" w:sz="4"/>
+              <w:bottom w:val="single" w:color="D0D5DD" w:sz="4"/>
+              <w:right w:val="single" w:color="D0D5DD" w:sz="4"/>
+            </w:tcBorders>
+            <w:tcMar>
+              <w:top w:type="dxa" w:w="60"/>
+              <w:left w:type="dxa" w:w="100"/>
+              <w:bottom w:type="dxa" w:w="60"/>
+              <w:right w:type="dxa" w:w="100"/>
+            </w:tcMar>
+          </w:tcPr>
+          <w:p>
+            <w:r>
+              <w:rPr>
+                <w:rFonts w:ascii="Consolas" w:cs="Consolas" w:eastAsia="Consolas" w:hAnsi="Consolas"/>
+                <w:b w:val="false"/>
+                <w:bCs w:val="false"/>
+                <w:sz w:val="18"/>
+                <w:szCs w:val="18"/>
+              </w:rPr>
+              <w:t xml:space="preserve">106행 앱 상태 S</w:t>
+            </w:r>
+          </w:p>
+        </w:tc>
+        <w:tc>
+          <w:tcPr>
+            <w:tcW w:type="dxa" w:w="6760"/>
+            <w:tcBorders>
+              <w:top w:val="single" w:color="D0D5DD" w:sz="4"/>
+              <w:left w:val="single" w:color="D0D5DD" w:sz="4"/>
+              <w:bottom w:val="single" w:color="D0D5DD" w:sz="4"/>
+              <w:right w:val="single" w:color="D0D5DD" w:sz="4"/>
+            </w:tcBorders>
+            <w:tcMar>
+              <w:top w:type="dxa" w:w="60"/>
+              <w:left w:type="dxa" w:w="100"/>
+              <w:bottom w:type="dxa" w:w="60"/>
+              <w:right w:type="dxa" w:w="100"/>
+            </w:tcMar>
+          </w:tcPr>
+          <w:p>
+            <w:r>
+              <w:rPr>
+                <w:rFonts w:ascii="Malgun Gothic" w:cs="Malgun Gothic" w:eastAsia="Malgun Gothic" w:hAnsi="Malgun Gothic"/>
+                <w:b w:val="false"/>
+                <w:bCs w:val="false"/>
+                <w:sz w:val="18"/>
+                <w:szCs w:val="18"/>
+              </w:rPr>
+              <w:t xml:space="preserve">홈에서 간편접수한 결과를 주문서로 넘기기 위한 S.pendingIntake 추가</w:t>
+            </w:r>
+          </w:p>
+        </w:tc>
+      </w:tr>
+      <w:tr>
+        <w:tc>
+          <w:tcPr>
+            <w:tcW w:type="dxa" w:w="2600"/>
+            <w:tcBorders>
+              <w:top w:val="single" w:color="D0D5DD" w:sz="4"/>
+              <w:left w:val="single" w:color="D0D5DD" w:sz="4"/>
+              <w:bottom w:val="single" w:color="D0D5DD" w:sz="4"/>
+              <w:right w:val="single" w:color="D0D5DD" w:sz="4"/>
+            </w:tcBorders>
+            <w:tcMar>
+              <w:top w:type="dxa" w:w="60"/>
+              <w:left w:type="dxa" w:w="100"/>
+              <w:bottom w:type="dxa" w:w="60"/>
+              <w:right w:type="dxa" w:w="100"/>
+            </w:tcMar>
+          </w:tcPr>
+          <w:p>
+            <w:r>
+              <w:rPr>
+                <w:rFonts w:ascii="Consolas" w:cs="Consolas" w:eastAsia="Consolas" w:hAnsi="Consolas"/>
+                <w:b w:val="false"/>
+                <w:bCs w:val="false"/>
+                <w:sz w:val="18"/>
+                <w:szCs w:val="18"/>
+              </w:rPr>
+              <w:t xml:space="preserve">306~314행 buildHomeScreen</w:t>
+            </w:r>
+          </w:p>
+        </w:tc>
+        <w:tc>
+          <w:tcPr>
+            <w:tcW w:type="dxa" w:w="6760"/>
+            <w:tcBorders>
+              <w:top w:val="single" w:color="D0D5DD" w:sz="4"/>
+              <w:left w:val="single" w:color="D0D5DD" w:sz="4"/>
+              <w:bottom w:val="single" w:color="D0D5DD" w:sz="4"/>
+              <w:right w:val="single" w:color="D0D5DD" w:sz="4"/>
+            </w:tcBorders>
+            <w:tcMar>
+              <w:top w:type="dxa" w:w="60"/>
+              <w:left w:type="dxa" w:w="100"/>
+              <w:bottom w:type="dxa" w:w="60"/>
+              <w:right w:type="dxa" w:w="100"/>
+            </w:tcMar>
+          </w:tcPr>
+          <w:p>
+            <w:r>
+              <w:rPr>
+                <w:rFonts w:ascii="Malgun Gothic" w:cs="Malgun Gothic" w:eastAsia="Malgun Gothic" w:hAnsi="Malgun Gothic"/>
+                <w:b w:val="false"/>
+                <w:bCs w:val="false"/>
+                <w:sz w:val="18"/>
+                <w:szCs w:val="18"/>
+              </w:rPr>
+              <w:t xml:space="preserve">홈에 「부고장·청첩장을 받으셨나요?」 섹션 추가 — 주문서 상단과 동일한 부고장·청첩장 간편접수 버튼 배치</w:t>
+            </w:r>
+          </w:p>
+        </w:tc>
+      </w:tr>
+      <w:tr>
+        <w:tc>
+          <w:tcPr>
+            <w:tcW w:type="dxa" w:w="2600"/>
+            <w:tcBorders>
+              <w:top w:val="single" w:color="D0D5DD" w:sz="4"/>
+              <w:left w:val="single" w:color="D0D5DD" w:sz="4"/>
+              <w:bottom w:val="single" w:color="D0D5DD" w:sz="4"/>
+              <w:right w:val="single" w:color="D0D5DD" w:sz="4"/>
+            </w:tcBorders>
+            <w:tcMar>
+              <w:top w:type="dxa" w:w="60"/>
+              <w:left w:type="dxa" w:w="100"/>
+              <w:bottom w:type="dxa" w:w="60"/>
+              <w:right w:type="dxa" w:w="100"/>
+            </w:tcMar>
+          </w:tcPr>
+          <w:p>
+            <w:r>
+              <w:rPr>
+                <w:rFonts w:ascii="Consolas" w:cs="Consolas" w:eastAsia="Consolas" w:hAnsi="Consolas"/>
+                <w:b w:val="false"/>
+                <w:bCs w:val="false"/>
+                <w:sz w:val="18"/>
+                <w:szCs w:val="18"/>
+              </w:rPr>
+              <w:t xml:space="preserve">1073~1078행 buildOrderScreen</w:t>
+            </w:r>
+          </w:p>
+        </w:tc>
+        <w:tc>
+          <w:tcPr>
+            <w:tcW w:type="dxa" w:w="6760"/>
+            <w:tcBorders>
+              <w:top w:val="single" w:color="D0D5DD" w:sz="4"/>
+              <w:left w:val="single" w:color="D0D5DD" w:sz="4"/>
+              <w:bottom w:val="single" w:color="D0D5DD" w:sz="4"/>
+              <w:right w:val="single" w:color="D0D5DD" w:sz="4"/>
+            </w:tcBorders>
+            <w:tcMar>
+              <w:top w:type="dxa" w:w="60"/>
+              <w:left w:type="dxa" w:w="100"/>
+              <w:bottom w:type="dxa" w:w="60"/>
+              <w:right w:type="dxa" w:w="100"/>
+            </w:tcMar>
+          </w:tcPr>
+          <w:p>
+            <w:r>
+              <w:rPr>
+                <w:rFonts w:ascii="Malgun Gothic" w:cs="Malgun Gothic" w:eastAsia="Malgun Gothic" w:hAnsi="Malgun Gothic"/>
+                <w:b w:val="false"/>
+                <w:bCs w:val="false"/>
+                <w:sz w:val="18"/>
+                <w:szCs w:val="18"/>
+              </w:rPr>
+              <w:t xml:space="preserve">홈에서 간편접수하고 넘어온 경우 화면이 붙은 뒤 이어서 처리 — 주소·받는분·배송일시 자동 입력 및 상품 선택 시트 열기</w:t>
+            </w:r>
+          </w:p>
+        </w:tc>
+      </w:tr>
+      <w:tr>
+        <w:tc>
+          <w:tcPr>
+            <w:tcW w:type="dxa" w:w="2600"/>
+            <w:tcBorders>
+              <w:top w:val="single" w:color="D0D5DD" w:sz="4"/>
+              <w:left w:val="single" w:color="D0D5DD" w:sz="4"/>
+              <w:bottom w:val="single" w:color="D0D5DD" w:sz="4"/>
+              <w:right w:val="single" w:color="D0D5DD" w:sz="4"/>
+            </w:tcBorders>
+            <w:tcMar>
+              <w:top w:type="dxa" w:w="60"/>
+              <w:left w:type="dxa" w:w="100"/>
+              <w:bottom w:type="dxa" w:w="60"/>
+              <w:right w:type="dxa" w:w="100"/>
+            </w:tcMar>
+          </w:tcPr>
+          <w:p>
+            <w:r>
+              <w:rPr>
+                <w:rFonts w:ascii="Consolas" w:cs="Consolas" w:eastAsia="Consolas" w:hAnsi="Consolas"/>
+                <w:b w:val="false"/>
+                <w:bCs w:val="false"/>
+                <w:sz w:val="18"/>
+                <w:szCs w:val="18"/>
+              </w:rPr>
+              <w:t xml:space="preserve">1123~1125행 startIntake()</w:t>
+            </w:r>
+          </w:p>
+        </w:tc>
+        <w:tc>
+          <w:tcPr>
+            <w:tcW w:type="dxa" w:w="6760"/>
+            <w:tcBorders>
+              <w:top w:val="single" w:color="D0D5DD" w:sz="4"/>
+              <w:left w:val="single" w:color="D0D5DD" w:sz="4"/>
+              <w:bottom w:val="single" w:color="D0D5DD" w:sz="4"/>
+              <w:right w:val="single" w:color="D0D5DD" w:sz="4"/>
+            </w:tcBorders>
+            <w:tcMar>
+              <w:top w:type="dxa" w:w="60"/>
+              <w:left w:type="dxa" w:w="100"/>
+              <w:bottom w:type="dxa" w:w="60"/>
+              <w:right w:type="dxa" w:w="100"/>
+            </w:tcMar>
+          </w:tcPr>
+          <w:p>
+            <w:r>
+              <w:rPr>
+                <w:rFonts w:ascii="Malgun Gothic" w:cs="Malgun Gothic" w:eastAsia="Malgun Gothic" w:hAnsi="Malgun Gothic"/>
+                <w:b w:val="false"/>
+                <w:bCs w:val="false"/>
+                <w:sz w:val="18"/>
+                <w:szCs w:val="18"/>
+              </w:rPr>
+              <w:t xml:space="preserve">홈 전용 간편접수 진입점. 결과를 들고 주문서로 이동하며, 이후 흐름은 주문서의 기존 처리 로직을 그대로 재사용</w:t>
             </w:r>
           </w:p>
         </w:tc>
@@ -8324,6 +8564,24 @@
           <w:sz w:val="20"/>
           <w:szCs w:val="20"/>
         </w:rPr>
+        <w:t xml:space="preserve">간편접수 버튼을 홈 화면에도 배치했습니다(「부고장·청첩장을 받으셨나요?」 영역). 홈에서 바로 링크를 넣으면 신청하기 화면으로 이동하면서 내용이 자동으로 채워지고 상품 선택까지 이어집니다. 기존 신청하기 탭 상단의 버튼도 그대로 유지됩니다.</w:t>
+      </w:r>
+    </w:p>
+    <w:p>
+      <w:pPr>
+        <w:pStyle w:val="ListParagraph"/>
+        <w:numPr>
+          <w:ilvl w:val="0"/>
+          <w:numId w:val="2"/>
+        </w:numPr>
+        <w:spacing w:after="60"/>
+      </w:pPr>
+      <w:r>
+        <w:rPr>
+          <w:rFonts w:ascii="Malgun Gothic" w:cs="Malgun Gothic" w:eastAsia="Malgun Gothic" w:hAnsi="Malgun Gothic"/>
+          <w:sz w:val="20"/>
+          <w:szCs w:val="20"/>
+        </w:rPr>
         <w:t xml:space="preserve">부고장 간편접수: 주소 불러오기 → 근조화환 선택 바텀시트 자동 오픈. 주소가 반입 제한 지역이면 해당 지역에서 반입 가능한 대체상품만 노출되며, 시트 상단에 지역 안내 문구가 표시됩니다.</w:t>
       </w:r>
     </w:p>

</xml_diff>

<commit_message>
Front_Update.docx: add [백엔드 영역 참고자료] section
신청인 정보 스키마 변경, 신청사유 필드 추가, 전송 미구현 및 상품 ID 전달 권장,
신규 상품 목록, 지역 제한 서버 재검증 권장, 그 밖의 확인 사항을 정리.
간편접수(AI)는 백엔드에 이미 적용되어 있어 제외.

Co-Authored-By: Claude Fable 5 <noreply@anthropic.com>
</commit_message>
<xml_diff>
--- a/Front_Update.docx
+++ b/Front_Update.docx
@@ -8639,6 +8639,2764 @@
         <w:t xml:space="preserve">부수 수정: 간편접수 시트가 닫히면서 바텀시트가 겹쳐 열릴 때 화면 스크롤 잠금이 풀리던 버그 수정.</w:t>
       </w:r>
     </w:p>
+    <w:p>
+      <w:r>
+        <w:br w:type="page"/>
+      </w:r>
+    </w:p>
+    <w:p>
+      <w:pPr>
+        <w:pBdr>
+          <w:bottom w:val="single" w:color="4F46E5" w:sz="6"/>
+        </w:pBdr>
+        <w:spacing w:after="60" w:before="100"/>
+      </w:pPr>
+      <w:r>
+        <w:rPr>
+          <w:rFonts w:ascii="Malgun Gothic" w:cs="Malgun Gothic" w:eastAsia="Malgun Gothic" w:hAnsi="Malgun Gothic"/>
+          <w:b/>
+          <w:bCs/>
+          <w:color w:val="4F46E5"/>
+          <w:sz w:val="30"/>
+          <w:szCs w:val="30"/>
+        </w:rPr>
+        <w:t xml:space="preserve">[백엔드 영역 참고자료]</w:t>
+      </w:r>
+    </w:p>
+    <w:p>
+      <w:pPr>
+        <w:spacing w:after="120"/>
+      </w:pPr>
+      <w:r>
+        <w:rPr>
+          <w:rFonts w:ascii="Malgun Gothic" w:cs="Malgun Gothic" w:eastAsia="Malgun Gothic" w:hAnsi="Malgun Gothic"/>
+          <w:color w:val="667085"/>
+          <w:sz w:val="20"/>
+          <w:szCs w:val="20"/>
+        </w:rPr>
+        <w:t xml:space="preserve">이번 프론트 변경사항 중 백엔드 연동에 영향을 주는 부분만 따로 모았습니다. 각 항목의 코드 위치는 앞의 「2. 파일별 상세 수정 내역」을 참고해주세요.</w:t>
+      </w:r>
+    </w:p>
+    <w:p>
+      <w:pPr>
+        <w:pStyle w:val="Heading2"/>
+        <w:spacing w:after="120" w:before="240"/>
+      </w:pPr>
+      <w:r>
+        <w:rPr>
+          <w:rFonts w:ascii="Malgun Gothic" w:cs="Malgun Gothic" w:eastAsia="Malgun Gothic" w:hAnsi="Malgun Gothic"/>
+          <w:b/>
+          <w:bCs/>
+          <w:sz w:val="23"/>
+          <w:szCs w:val="23"/>
+        </w:rPr>
+        <w:t xml:space="preserve">B-1. 신청인 정보 데이터 구조 변경</w:t>
+      </w:r>
+    </w:p>
+    <w:p>
+      <w:pPr>
+        <w:spacing w:after="120"/>
+      </w:pPr>
+      <w:r>
+        <w:rPr>
+          <w:rFonts w:ascii="Malgun Gothic" w:cs="Malgun Gothic" w:eastAsia="Malgun Gothic" w:hAnsi="Malgun Gothic"/>
+          <w:sz w:val="20"/>
+          <w:szCs w:val="20"/>
+        </w:rPr>
+        <w:t xml:space="preserve">신청 건과 함께 전송되는 신청인 정보의 항목이 바뀌었습니다. 기존 스키마를 쓰고 있다면 조정이 필요합니다.</w:t>
+      </w:r>
+    </w:p>
+    <w:tbl>
+      <w:tblPr>
+        <w:tblW w:type="dxa" w:w="9360"/>
+        <w:tblBorders>
+          <w:top w:val="single" w:color="auto" w:sz="4"/>
+          <w:left w:val="single" w:color="auto" w:sz="4"/>
+          <w:bottom w:val="single" w:color="auto" w:sz="4"/>
+          <w:right w:val="single" w:color="auto" w:sz="4"/>
+          <w:insideH w:val="single" w:color="auto" w:sz="4"/>
+          <w:insideV w:val="single" w:color="auto" w:sz="4"/>
+        </w:tblBorders>
+      </w:tblPr>
+      <w:tblGrid>
+        <w:gridCol w:w="1700"/>
+        <w:gridCol w:w="2100"/>
+        <w:gridCol w:w="2400"/>
+        <w:gridCol w:w="3160"/>
+      </w:tblGrid>
+      <w:tr>
+        <w:trPr>
+          <w:tblHeader/>
+        </w:trPr>
+        <w:tc>
+          <w:tcPr>
+            <w:tcW w:type="dxa" w:w="1700"/>
+            <w:tcBorders>
+              <w:top w:val="single" w:color="D0D5DD" w:sz="4"/>
+              <w:left w:val="single" w:color="D0D5DD" w:sz="4"/>
+              <w:bottom w:val="single" w:color="D0D5DD" w:sz="4"/>
+              <w:right w:val="single" w:color="D0D5DD" w:sz="4"/>
+            </w:tcBorders>
+            <w:shd w:fill="EEF2FF" w:val="clear"/>
+            <w:tcMar>
+              <w:top w:type="dxa" w:w="60"/>
+              <w:left w:type="dxa" w:w="100"/>
+              <w:bottom w:type="dxa" w:w="60"/>
+              <w:right w:type="dxa" w:w="100"/>
+            </w:tcMar>
+          </w:tcPr>
+          <w:p>
+            <w:r>
+              <w:rPr>
+                <w:rFonts w:ascii="Malgun Gothic" w:cs="Malgun Gothic" w:eastAsia="Malgun Gothic" w:hAnsi="Malgun Gothic"/>
+                <w:b/>
+                <w:bCs/>
+                <w:sz w:val="18"/>
+                <w:szCs w:val="18"/>
+              </w:rPr>
+              <w:t xml:space="preserve">항목</w:t>
+            </w:r>
+          </w:p>
+        </w:tc>
+        <w:tc>
+          <w:tcPr>
+            <w:tcW w:type="dxa" w:w="2100"/>
+            <w:tcBorders>
+              <w:top w:val="single" w:color="D0D5DD" w:sz="4"/>
+              <w:left w:val="single" w:color="D0D5DD" w:sz="4"/>
+              <w:bottom w:val="single" w:color="D0D5DD" w:sz="4"/>
+              <w:right w:val="single" w:color="D0D5DD" w:sz="4"/>
+            </w:tcBorders>
+            <w:shd w:fill="EEF2FF" w:val="clear"/>
+            <w:tcMar>
+              <w:top w:type="dxa" w:w="60"/>
+              <w:left w:type="dxa" w:w="100"/>
+              <w:bottom w:type="dxa" w:w="60"/>
+              <w:right w:type="dxa" w:w="100"/>
+            </w:tcMar>
+          </w:tcPr>
+          <w:p>
+            <w:r>
+              <w:rPr>
+                <w:rFonts w:ascii="Malgun Gothic" w:cs="Malgun Gothic" w:eastAsia="Malgun Gothic" w:hAnsi="Malgun Gothic"/>
+                <w:b/>
+                <w:bCs/>
+                <w:sz w:val="18"/>
+                <w:szCs w:val="18"/>
+              </w:rPr>
+              <w:t xml:space="preserve">이전</w:t>
+            </w:r>
+          </w:p>
+        </w:tc>
+        <w:tc>
+          <w:tcPr>
+            <w:tcW w:type="dxa" w:w="2400"/>
+            <w:tcBorders>
+              <w:top w:val="single" w:color="D0D5DD" w:sz="4"/>
+              <w:left w:val="single" w:color="D0D5DD" w:sz="4"/>
+              <w:bottom w:val="single" w:color="D0D5DD" w:sz="4"/>
+              <w:right w:val="single" w:color="D0D5DD" w:sz="4"/>
+            </w:tcBorders>
+            <w:shd w:fill="EEF2FF" w:val="clear"/>
+            <w:tcMar>
+              <w:top w:type="dxa" w:w="60"/>
+              <w:left w:type="dxa" w:w="100"/>
+              <w:bottom w:type="dxa" w:w="60"/>
+              <w:right w:type="dxa" w:w="100"/>
+            </w:tcMar>
+          </w:tcPr>
+          <w:p>
+            <w:r>
+              <w:rPr>
+                <w:rFonts w:ascii="Malgun Gothic" w:cs="Malgun Gothic" w:eastAsia="Malgun Gothic" w:hAnsi="Malgun Gothic"/>
+                <w:b/>
+                <w:bCs/>
+                <w:sz w:val="18"/>
+                <w:szCs w:val="18"/>
+              </w:rPr>
+              <w:t xml:space="preserve">현재</w:t>
+            </w:r>
+          </w:p>
+        </w:tc>
+        <w:tc>
+          <w:tcPr>
+            <w:tcW w:type="dxa" w:w="3160"/>
+            <w:tcBorders>
+              <w:top w:val="single" w:color="D0D5DD" w:sz="4"/>
+              <w:left w:val="single" w:color="D0D5DD" w:sz="4"/>
+              <w:bottom w:val="single" w:color="D0D5DD" w:sz="4"/>
+              <w:right w:val="single" w:color="D0D5DD" w:sz="4"/>
+            </w:tcBorders>
+            <w:shd w:fill="EEF2FF" w:val="clear"/>
+            <w:tcMar>
+              <w:top w:type="dxa" w:w="60"/>
+              <w:left w:type="dxa" w:w="100"/>
+              <w:bottom w:type="dxa" w:w="60"/>
+              <w:right w:type="dxa" w:w="100"/>
+            </w:tcMar>
+          </w:tcPr>
+          <w:p>
+            <w:r>
+              <w:rPr>
+                <w:rFonts w:ascii="Malgun Gothic" w:cs="Malgun Gothic" w:eastAsia="Malgun Gothic" w:hAnsi="Malgun Gothic"/>
+                <w:b/>
+                <w:bCs/>
+                <w:sz w:val="18"/>
+                <w:szCs w:val="18"/>
+              </w:rPr>
+              <w:t xml:space="preserve">비고</w:t>
+            </w:r>
+          </w:p>
+        </w:tc>
+      </w:tr>
+      <w:tr>
+        <w:tc>
+          <w:tcPr>
+            <w:tcW w:type="dxa" w:w="1700"/>
+            <w:tcBorders>
+              <w:top w:val="single" w:color="D0D5DD" w:sz="4"/>
+              <w:left w:val="single" w:color="D0D5DD" w:sz="4"/>
+              <w:bottom w:val="single" w:color="D0D5DD" w:sz="4"/>
+              <w:right w:val="single" w:color="D0D5DD" w:sz="4"/>
+            </w:tcBorders>
+            <w:tcMar>
+              <w:top w:type="dxa" w:w="60"/>
+              <w:left w:type="dxa" w:w="100"/>
+              <w:bottom w:type="dxa" w:w="60"/>
+              <w:right w:type="dxa" w:w="100"/>
+            </w:tcMar>
+          </w:tcPr>
+          <w:p>
+            <w:r>
+              <w:rPr>
+                <w:rFonts w:ascii="Malgun Gothic" w:cs="Malgun Gothic" w:eastAsia="Malgun Gothic" w:hAnsi="Malgun Gothic"/>
+                <w:b w:val="false"/>
+                <w:bCs w:val="false"/>
+                <w:sz w:val="18"/>
+                <w:szCs w:val="18"/>
+              </w:rPr>
+              <w:t xml:space="preserve">회사 (company)</w:t>
+            </w:r>
+          </w:p>
+        </w:tc>
+        <w:tc>
+          <w:tcPr>
+            <w:tcW w:type="dxa" w:w="2100"/>
+            <w:tcBorders>
+              <w:top w:val="single" w:color="D0D5DD" w:sz="4"/>
+              <w:left w:val="single" w:color="D0D5DD" w:sz="4"/>
+              <w:bottom w:val="single" w:color="D0D5DD" w:sz="4"/>
+              <w:right w:val="single" w:color="D0D5DD" w:sz="4"/>
+            </w:tcBorders>
+            <w:tcMar>
+              <w:top w:type="dxa" w:w="60"/>
+              <w:left w:type="dxa" w:w="100"/>
+              <w:bottom w:type="dxa" w:w="60"/>
+              <w:right w:type="dxa" w:w="100"/>
+            </w:tcMar>
+          </w:tcPr>
+          <w:p>
+            <w:r>
+              <w:rPr>
+                <w:rFonts w:ascii="Malgun Gothic" w:cs="Malgun Gothic" w:eastAsia="Malgun Gothic" w:hAnsi="Malgun Gothic"/>
+                <w:b w:val="false"/>
+                <w:bCs w:val="false"/>
+                <w:sz w:val="18"/>
+                <w:szCs w:val="18"/>
+              </w:rPr>
+              <w:t xml:space="preserve">없음</w:t>
+            </w:r>
+          </w:p>
+        </w:tc>
+        <w:tc>
+          <w:tcPr>
+            <w:tcW w:type="dxa" w:w="2400"/>
+            <w:tcBorders>
+              <w:top w:val="single" w:color="D0D5DD" w:sz="4"/>
+              <w:left w:val="single" w:color="D0D5DD" w:sz="4"/>
+              <w:bottom w:val="single" w:color="D0D5DD" w:sz="4"/>
+              <w:right w:val="single" w:color="D0D5DD" w:sz="4"/>
+            </w:tcBorders>
+            <w:tcMar>
+              <w:top w:type="dxa" w:w="60"/>
+              <w:left w:type="dxa" w:w="100"/>
+              <w:bottom w:type="dxa" w:w="60"/>
+              <w:right w:type="dxa" w:w="100"/>
+            </w:tcMar>
+          </w:tcPr>
+          <w:p>
+            <w:r>
+              <w:rPr>
+                <w:rFonts w:ascii="Malgun Gothic" w:cs="Malgun Gothic" w:eastAsia="Malgun Gothic" w:hAnsi="Malgun Gothic"/>
+                <w:b w:val="false"/>
+                <w:bCs w:val="false"/>
+                <w:sz w:val="18"/>
+                <w:szCs w:val="18"/>
+              </w:rPr>
+              <w:t xml:space="preserve">신규 추가 · 필수</w:t>
+            </w:r>
+          </w:p>
+        </w:tc>
+        <w:tc>
+          <w:tcPr>
+            <w:tcW w:type="dxa" w:w="3160"/>
+            <w:tcBorders>
+              <w:top w:val="single" w:color="D0D5DD" w:sz="4"/>
+              <w:left w:val="single" w:color="D0D5DD" w:sz="4"/>
+              <w:bottom w:val="single" w:color="D0D5DD" w:sz="4"/>
+              <w:right w:val="single" w:color="D0D5DD" w:sz="4"/>
+            </w:tcBorders>
+            <w:tcMar>
+              <w:top w:type="dxa" w:w="60"/>
+              <w:left w:type="dxa" w:w="100"/>
+              <w:bottom w:type="dxa" w:w="60"/>
+              <w:right w:type="dxa" w:w="100"/>
+            </w:tcMar>
+          </w:tcPr>
+          <w:p>
+            <w:r>
+              <w:rPr>
+                <w:rFonts w:ascii="Malgun Gothic" w:cs="Malgun Gothic" w:eastAsia="Malgun Gothic" w:hAnsi="Malgun Gothic"/>
+                <w:b w:val="false"/>
+                <w:bCs w:val="false"/>
+                <w:sz w:val="18"/>
+                <w:szCs w:val="18"/>
+              </w:rPr>
+              <w:t xml:space="preserve">늘푸른바다 / 고래사 두 값 중 하나만 들어옵니다</w:t>
+            </w:r>
+          </w:p>
+        </w:tc>
+      </w:tr>
+      <w:tr>
+        <w:tc>
+          <w:tcPr>
+            <w:tcW w:type="dxa" w:w="1700"/>
+            <w:tcBorders>
+              <w:top w:val="single" w:color="D0D5DD" w:sz="4"/>
+              <w:left w:val="single" w:color="D0D5DD" w:sz="4"/>
+              <w:bottom w:val="single" w:color="D0D5DD" w:sz="4"/>
+              <w:right w:val="single" w:color="D0D5DD" w:sz="4"/>
+            </w:tcBorders>
+            <w:tcMar>
+              <w:top w:type="dxa" w:w="60"/>
+              <w:left w:type="dxa" w:w="100"/>
+              <w:bottom w:type="dxa" w:w="60"/>
+              <w:right w:type="dxa" w:w="100"/>
+            </w:tcMar>
+          </w:tcPr>
+          <w:p>
+            <w:r>
+              <w:rPr>
+                <w:rFonts w:ascii="Malgun Gothic" w:cs="Malgun Gothic" w:eastAsia="Malgun Gothic" w:hAnsi="Malgun Gothic"/>
+                <w:b w:val="false"/>
+                <w:bCs w:val="false"/>
+                <w:sz w:val="18"/>
+                <w:szCs w:val="18"/>
+              </w:rPr>
+              <w:t xml:space="preserve">부서 (dept)</w:t>
+            </w:r>
+          </w:p>
+        </w:tc>
+        <w:tc>
+          <w:tcPr>
+            <w:tcW w:type="dxa" w:w="2100"/>
+            <w:tcBorders>
+              <w:top w:val="single" w:color="D0D5DD" w:sz="4"/>
+              <w:left w:val="single" w:color="D0D5DD" w:sz="4"/>
+              <w:bottom w:val="single" w:color="D0D5DD" w:sz="4"/>
+              <w:right w:val="single" w:color="D0D5DD" w:sz="4"/>
+            </w:tcBorders>
+            <w:tcMar>
+              <w:top w:type="dxa" w:w="60"/>
+              <w:left w:type="dxa" w:w="100"/>
+              <w:bottom w:type="dxa" w:w="60"/>
+              <w:right w:type="dxa" w:w="100"/>
+            </w:tcMar>
+          </w:tcPr>
+          <w:p>
+            <w:r>
+              <w:rPr>
+                <w:rFonts w:ascii="Malgun Gothic" w:cs="Malgun Gothic" w:eastAsia="Malgun Gothic" w:hAnsi="Malgun Gothic"/>
+                <w:b w:val="false"/>
+                <w:bCs w:val="false"/>
+                <w:sz w:val="18"/>
+                <w:szCs w:val="18"/>
+              </w:rPr>
+              <w:t xml:space="preserve">자유 입력</w:t>
+            </w:r>
+          </w:p>
+        </w:tc>
+        <w:tc>
+          <w:tcPr>
+            <w:tcW w:type="dxa" w:w="2400"/>
+            <w:tcBorders>
+              <w:top w:val="single" w:color="D0D5DD" w:sz="4"/>
+              <w:left w:val="single" w:color="D0D5DD" w:sz="4"/>
+              <w:bottom w:val="single" w:color="D0D5DD" w:sz="4"/>
+              <w:right w:val="single" w:color="D0D5DD" w:sz="4"/>
+            </w:tcBorders>
+            <w:tcMar>
+              <w:top w:type="dxa" w:w="60"/>
+              <w:left w:type="dxa" w:w="100"/>
+              <w:bottom w:type="dxa" w:w="60"/>
+              <w:right w:type="dxa" w:w="100"/>
+            </w:tcMar>
+          </w:tcPr>
+          <w:p>
+            <w:r>
+              <w:rPr>
+                <w:rFonts w:ascii="Malgun Gothic" w:cs="Malgun Gothic" w:eastAsia="Malgun Gothic" w:hAnsi="Malgun Gothic"/>
+                <w:b w:val="false"/>
+                <w:bCs w:val="false"/>
+                <w:sz w:val="18"/>
+                <w:szCs w:val="18"/>
+              </w:rPr>
+              <w:t xml:space="preserve">고정 목록 중 택1 · 필수</w:t>
+            </w:r>
+          </w:p>
+        </w:tc>
+        <w:tc>
+          <w:tcPr>
+            <w:tcW w:type="dxa" w:w="3160"/>
+            <w:tcBorders>
+              <w:top w:val="single" w:color="D0D5DD" w:sz="4"/>
+              <w:left w:val="single" w:color="D0D5DD" w:sz="4"/>
+              <w:bottom w:val="single" w:color="D0D5DD" w:sz="4"/>
+              <w:right w:val="single" w:color="D0D5DD" w:sz="4"/>
+            </w:tcBorders>
+            <w:tcMar>
+              <w:top w:type="dxa" w:w="60"/>
+              <w:left w:type="dxa" w:w="100"/>
+              <w:bottom w:type="dxa" w:w="60"/>
+              <w:right w:type="dxa" w:w="100"/>
+            </w:tcMar>
+          </w:tcPr>
+          <w:p>
+            <w:r>
+              <w:rPr>
+                <w:rFonts w:ascii="Malgun Gothic" w:cs="Malgun Gothic" w:eastAsia="Malgun Gothic" w:hAnsi="Malgun Gothic"/>
+                <w:b w:val="false"/>
+                <w:bCs w:val="false"/>
+                <w:sz w:val="18"/>
+                <w:szCs w:val="18"/>
+              </w:rPr>
+              <w:t xml:space="preserve">리테일채널 영업팀, 온라인채널 영업팀, GA팀, SCM팀, 해외영업팀, 대외협력팀, 구매팀</w:t>
+            </w:r>
+          </w:p>
+        </w:tc>
+      </w:tr>
+      <w:tr>
+        <w:tc>
+          <w:tcPr>
+            <w:tcW w:type="dxa" w:w="1700"/>
+            <w:tcBorders>
+              <w:top w:val="single" w:color="D0D5DD" w:sz="4"/>
+              <w:left w:val="single" w:color="D0D5DD" w:sz="4"/>
+              <w:bottom w:val="single" w:color="D0D5DD" w:sz="4"/>
+              <w:right w:val="single" w:color="D0D5DD" w:sz="4"/>
+            </w:tcBorders>
+            <w:tcMar>
+              <w:top w:type="dxa" w:w="60"/>
+              <w:left w:type="dxa" w:w="100"/>
+              <w:bottom w:type="dxa" w:w="60"/>
+              <w:right w:type="dxa" w:w="100"/>
+            </w:tcMar>
+          </w:tcPr>
+          <w:p>
+            <w:r>
+              <w:rPr>
+                <w:rFonts w:ascii="Malgun Gothic" w:cs="Malgun Gothic" w:eastAsia="Malgun Gothic" w:hAnsi="Malgun Gothic"/>
+                <w:b w:val="false"/>
+                <w:bCs w:val="false"/>
+                <w:sz w:val="18"/>
+                <w:szCs w:val="18"/>
+              </w:rPr>
+              <w:t xml:space="preserve">직책 (position)</w:t>
+            </w:r>
+          </w:p>
+        </w:tc>
+        <w:tc>
+          <w:tcPr>
+            <w:tcW w:type="dxa" w:w="2100"/>
+            <w:tcBorders>
+              <w:top w:val="single" w:color="D0D5DD" w:sz="4"/>
+              <w:left w:val="single" w:color="D0D5DD" w:sz="4"/>
+              <w:bottom w:val="single" w:color="D0D5DD" w:sz="4"/>
+              <w:right w:val="single" w:color="D0D5DD" w:sz="4"/>
+            </w:tcBorders>
+            <w:tcMar>
+              <w:top w:type="dxa" w:w="60"/>
+              <w:left w:type="dxa" w:w="100"/>
+              <w:bottom w:type="dxa" w:w="60"/>
+              <w:right w:type="dxa" w:w="100"/>
+            </w:tcMar>
+          </w:tcPr>
+          <w:p>
+            <w:r>
+              <w:rPr>
+                <w:rFonts w:ascii="Malgun Gothic" w:cs="Malgun Gothic" w:eastAsia="Malgun Gothic" w:hAnsi="Malgun Gothic"/>
+                <w:b w:val="false"/>
+                <w:bCs w:val="false"/>
+                <w:sz w:val="18"/>
+                <w:szCs w:val="18"/>
+              </w:rPr>
+              <w:t xml:space="preserve">자유 입력</w:t>
+            </w:r>
+          </w:p>
+        </w:tc>
+        <w:tc>
+          <w:tcPr>
+            <w:tcW w:type="dxa" w:w="2400"/>
+            <w:tcBorders>
+              <w:top w:val="single" w:color="D0D5DD" w:sz="4"/>
+              <w:left w:val="single" w:color="D0D5DD" w:sz="4"/>
+              <w:bottom w:val="single" w:color="D0D5DD" w:sz="4"/>
+              <w:right w:val="single" w:color="D0D5DD" w:sz="4"/>
+            </w:tcBorders>
+            <w:tcMar>
+              <w:top w:type="dxa" w:w="60"/>
+              <w:left w:type="dxa" w:w="100"/>
+              <w:bottom w:type="dxa" w:w="60"/>
+              <w:right w:type="dxa" w:w="100"/>
+            </w:tcMar>
+          </w:tcPr>
+          <w:p>
+            <w:r>
+              <w:rPr>
+                <w:rFonts w:ascii="Malgun Gothic" w:cs="Malgun Gothic" w:eastAsia="Malgun Gothic" w:hAnsi="Malgun Gothic"/>
+                <w:b w:val="false"/>
+                <w:bCs w:val="false"/>
+                <w:sz w:val="18"/>
+                <w:szCs w:val="18"/>
+              </w:rPr>
+              <w:t xml:space="preserve">삭제됨</w:t>
+            </w:r>
+          </w:p>
+        </w:tc>
+        <w:tc>
+          <w:tcPr>
+            <w:tcW w:type="dxa" w:w="3160"/>
+            <w:tcBorders>
+              <w:top w:val="single" w:color="D0D5DD" w:sz="4"/>
+              <w:left w:val="single" w:color="D0D5DD" w:sz="4"/>
+              <w:bottom w:val="single" w:color="D0D5DD" w:sz="4"/>
+              <w:right w:val="single" w:color="D0D5DD" w:sz="4"/>
+            </w:tcBorders>
+            <w:tcMar>
+              <w:top w:type="dxa" w:w="60"/>
+              <w:left w:type="dxa" w:w="100"/>
+              <w:bottom w:type="dxa" w:w="60"/>
+              <w:right w:type="dxa" w:w="100"/>
+            </w:tcMar>
+          </w:tcPr>
+          <w:p>
+            <w:r>
+              <w:rPr>
+                <w:rFonts w:ascii="Malgun Gothic" w:cs="Malgun Gothic" w:eastAsia="Malgun Gothic" w:hAnsi="Malgun Gothic"/>
+                <w:b w:val="false"/>
+                <w:bCs w:val="false"/>
+                <w:sz w:val="18"/>
+                <w:szCs w:val="18"/>
+              </w:rPr>
+              <w:t xml:space="preserve">더 이상 수집하지 않습니다. DB 컬럼이 있다면 미사용 처리</w:t>
+            </w:r>
+          </w:p>
+        </w:tc>
+      </w:tr>
+      <w:tr>
+        <w:tc>
+          <w:tcPr>
+            <w:tcW w:type="dxa" w:w="1700"/>
+            <w:tcBorders>
+              <w:top w:val="single" w:color="D0D5DD" w:sz="4"/>
+              <w:left w:val="single" w:color="D0D5DD" w:sz="4"/>
+              <w:bottom w:val="single" w:color="D0D5DD" w:sz="4"/>
+              <w:right w:val="single" w:color="D0D5DD" w:sz="4"/>
+            </w:tcBorders>
+            <w:tcMar>
+              <w:top w:type="dxa" w:w="60"/>
+              <w:left w:type="dxa" w:w="100"/>
+              <w:bottom w:type="dxa" w:w="60"/>
+              <w:right w:type="dxa" w:w="100"/>
+            </w:tcMar>
+          </w:tcPr>
+          <w:p>
+            <w:r>
+              <w:rPr>
+                <w:rFonts w:ascii="Malgun Gothic" w:cs="Malgun Gothic" w:eastAsia="Malgun Gothic" w:hAnsi="Malgun Gothic"/>
+                <w:b w:val="false"/>
+                <w:bCs w:val="false"/>
+                <w:sz w:val="18"/>
+                <w:szCs w:val="18"/>
+              </w:rPr>
+              <w:t xml:space="preserve">성함 (name)</w:t>
+            </w:r>
+          </w:p>
+        </w:tc>
+        <w:tc>
+          <w:tcPr>
+            <w:tcW w:type="dxa" w:w="2100"/>
+            <w:tcBorders>
+              <w:top w:val="single" w:color="D0D5DD" w:sz="4"/>
+              <w:left w:val="single" w:color="D0D5DD" w:sz="4"/>
+              <w:bottom w:val="single" w:color="D0D5DD" w:sz="4"/>
+              <w:right w:val="single" w:color="D0D5DD" w:sz="4"/>
+            </w:tcBorders>
+            <w:tcMar>
+              <w:top w:type="dxa" w:w="60"/>
+              <w:left w:type="dxa" w:w="100"/>
+              <w:bottom w:type="dxa" w:w="60"/>
+              <w:right w:type="dxa" w:w="100"/>
+            </w:tcMar>
+          </w:tcPr>
+          <w:p>
+            <w:r>
+              <w:rPr>
+                <w:rFonts w:ascii="Malgun Gothic" w:cs="Malgun Gothic" w:eastAsia="Malgun Gothic" w:hAnsi="Malgun Gothic"/>
+                <w:b w:val="false"/>
+                <w:bCs w:val="false"/>
+                <w:sz w:val="18"/>
+                <w:szCs w:val="18"/>
+              </w:rPr>
+              <w:t xml:space="preserve">필수</w:t>
+            </w:r>
+          </w:p>
+        </w:tc>
+        <w:tc>
+          <w:tcPr>
+            <w:tcW w:type="dxa" w:w="2400"/>
+            <w:tcBorders>
+              <w:top w:val="single" w:color="D0D5DD" w:sz="4"/>
+              <w:left w:val="single" w:color="D0D5DD" w:sz="4"/>
+              <w:bottom w:val="single" w:color="D0D5DD" w:sz="4"/>
+              <w:right w:val="single" w:color="D0D5DD" w:sz="4"/>
+            </w:tcBorders>
+            <w:tcMar>
+              <w:top w:type="dxa" w:w="60"/>
+              <w:left w:type="dxa" w:w="100"/>
+              <w:bottom w:type="dxa" w:w="60"/>
+              <w:right w:type="dxa" w:w="100"/>
+            </w:tcMar>
+          </w:tcPr>
+          <w:p>
+            <w:r>
+              <w:rPr>
+                <w:rFonts w:ascii="Malgun Gothic" w:cs="Malgun Gothic" w:eastAsia="Malgun Gothic" w:hAnsi="Malgun Gothic"/>
+                <w:b w:val="false"/>
+                <w:bCs w:val="false"/>
+                <w:sz w:val="18"/>
+                <w:szCs w:val="18"/>
+              </w:rPr>
+              <w:t xml:space="preserve">필수</w:t>
+            </w:r>
+          </w:p>
+        </w:tc>
+        <w:tc>
+          <w:tcPr>
+            <w:tcW w:type="dxa" w:w="3160"/>
+            <w:tcBorders>
+              <w:top w:val="single" w:color="D0D5DD" w:sz="4"/>
+              <w:left w:val="single" w:color="D0D5DD" w:sz="4"/>
+              <w:bottom w:val="single" w:color="D0D5DD" w:sz="4"/>
+              <w:right w:val="single" w:color="D0D5DD" w:sz="4"/>
+            </w:tcBorders>
+            <w:tcMar>
+              <w:top w:type="dxa" w:w="60"/>
+              <w:left w:type="dxa" w:w="100"/>
+              <w:bottom w:type="dxa" w:w="60"/>
+              <w:right w:type="dxa" w:w="100"/>
+            </w:tcMar>
+          </w:tcPr>
+          <w:p>
+            <w:r>
+              <w:rPr>
+                <w:rFonts w:ascii="Malgun Gothic" w:cs="Malgun Gothic" w:eastAsia="Malgun Gothic" w:hAnsi="Malgun Gothic"/>
+                <w:b w:val="false"/>
+                <w:bCs w:val="false"/>
+                <w:sz w:val="18"/>
+                <w:szCs w:val="18"/>
+              </w:rPr>
+              <w:t xml:space="preserve">변경 없음</w:t>
+            </w:r>
+          </w:p>
+        </w:tc>
+      </w:tr>
+      <w:tr>
+        <w:tc>
+          <w:tcPr>
+            <w:tcW w:type="dxa" w:w="1700"/>
+            <w:tcBorders>
+              <w:top w:val="single" w:color="D0D5DD" w:sz="4"/>
+              <w:left w:val="single" w:color="D0D5DD" w:sz="4"/>
+              <w:bottom w:val="single" w:color="D0D5DD" w:sz="4"/>
+              <w:right w:val="single" w:color="D0D5DD" w:sz="4"/>
+            </w:tcBorders>
+            <w:tcMar>
+              <w:top w:type="dxa" w:w="60"/>
+              <w:left w:type="dxa" w:w="100"/>
+              <w:bottom w:type="dxa" w:w="60"/>
+              <w:right w:type="dxa" w:w="100"/>
+            </w:tcMar>
+          </w:tcPr>
+          <w:p>
+            <w:r>
+              <w:rPr>
+                <w:rFonts w:ascii="Malgun Gothic" w:cs="Malgun Gothic" w:eastAsia="Malgun Gothic" w:hAnsi="Malgun Gothic"/>
+                <w:b w:val="false"/>
+                <w:bCs w:val="false"/>
+                <w:sz w:val="18"/>
+                <w:szCs w:val="18"/>
+              </w:rPr>
+              <w:t xml:space="preserve">연락처 (contact)</w:t>
+            </w:r>
+          </w:p>
+        </w:tc>
+        <w:tc>
+          <w:tcPr>
+            <w:tcW w:type="dxa" w:w="2100"/>
+            <w:tcBorders>
+              <w:top w:val="single" w:color="D0D5DD" w:sz="4"/>
+              <w:left w:val="single" w:color="D0D5DD" w:sz="4"/>
+              <w:bottom w:val="single" w:color="D0D5DD" w:sz="4"/>
+              <w:right w:val="single" w:color="D0D5DD" w:sz="4"/>
+            </w:tcBorders>
+            <w:tcMar>
+              <w:top w:type="dxa" w:w="60"/>
+              <w:left w:type="dxa" w:w="100"/>
+              <w:bottom w:type="dxa" w:w="60"/>
+              <w:right w:type="dxa" w:w="100"/>
+            </w:tcMar>
+          </w:tcPr>
+          <w:p>
+            <w:r>
+              <w:rPr>
+                <w:rFonts w:ascii="Malgun Gothic" w:cs="Malgun Gothic" w:eastAsia="Malgun Gothic" w:hAnsi="Malgun Gothic"/>
+                <w:b w:val="false"/>
+                <w:bCs w:val="false"/>
+                <w:sz w:val="18"/>
+                <w:szCs w:val="18"/>
+              </w:rPr>
+              <w:t xml:space="preserve">필수</w:t>
+            </w:r>
+          </w:p>
+        </w:tc>
+        <w:tc>
+          <w:tcPr>
+            <w:tcW w:type="dxa" w:w="2400"/>
+            <w:tcBorders>
+              <w:top w:val="single" w:color="D0D5DD" w:sz="4"/>
+              <w:left w:val="single" w:color="D0D5DD" w:sz="4"/>
+              <w:bottom w:val="single" w:color="D0D5DD" w:sz="4"/>
+              <w:right w:val="single" w:color="D0D5DD" w:sz="4"/>
+            </w:tcBorders>
+            <w:tcMar>
+              <w:top w:type="dxa" w:w="60"/>
+              <w:left w:type="dxa" w:w="100"/>
+              <w:bottom w:type="dxa" w:w="60"/>
+              <w:right w:type="dxa" w:w="100"/>
+            </w:tcMar>
+          </w:tcPr>
+          <w:p>
+            <w:r>
+              <w:rPr>
+                <w:rFonts w:ascii="Malgun Gothic" w:cs="Malgun Gothic" w:eastAsia="Malgun Gothic" w:hAnsi="Malgun Gothic"/>
+                <w:b w:val="false"/>
+                <w:bCs w:val="false"/>
+                <w:sz w:val="18"/>
+                <w:szCs w:val="18"/>
+              </w:rPr>
+              <w:t xml:space="preserve">필수</w:t>
+            </w:r>
+          </w:p>
+        </w:tc>
+        <w:tc>
+          <w:tcPr>
+            <w:tcW w:type="dxa" w:w="3160"/>
+            <w:tcBorders>
+              <w:top w:val="single" w:color="D0D5DD" w:sz="4"/>
+              <w:left w:val="single" w:color="D0D5DD" w:sz="4"/>
+              <w:bottom w:val="single" w:color="D0D5DD" w:sz="4"/>
+              <w:right w:val="single" w:color="D0D5DD" w:sz="4"/>
+            </w:tcBorders>
+            <w:tcMar>
+              <w:top w:type="dxa" w:w="60"/>
+              <w:left w:type="dxa" w:w="100"/>
+              <w:bottom w:type="dxa" w:w="60"/>
+              <w:right w:type="dxa" w:w="100"/>
+            </w:tcMar>
+          </w:tcPr>
+          <w:p>
+            <w:r>
+              <w:rPr>
+                <w:rFonts w:ascii="Malgun Gothic" w:cs="Malgun Gothic" w:eastAsia="Malgun Gothic" w:hAnsi="Malgun Gothic"/>
+                <w:b w:val="false"/>
+                <w:bCs w:val="false"/>
+                <w:sz w:val="18"/>
+                <w:szCs w:val="18"/>
+              </w:rPr>
+              <w:t xml:space="preserve">변경 없음</w:t>
+            </w:r>
+          </w:p>
+        </w:tc>
+      </w:tr>
+    </w:tbl>
+    <w:p>
+      <w:pPr>
+        <w:pStyle w:val="ListParagraph"/>
+        <w:numPr>
+          <w:ilvl w:val="0"/>
+          <w:numId w:val="2"/>
+        </w:numPr>
+        <w:spacing w:after="60"/>
+      </w:pPr>
+      <w:r>
+        <w:rPr>
+          <w:rFonts w:ascii="Malgun Gothic" w:cs="Malgun Gothic" w:eastAsia="Malgun Gothic" w:hAnsi="Malgun Gothic"/>
+          <w:sz w:val="20"/>
+          <w:szCs w:val="20"/>
+        </w:rPr>
+        <w:t xml:space="preserve">신청인 정보는 브라우저에 30일간 보관되며(localStorage · goraesa_applicant), 만료되면 다시 입력받습니다.</w:t>
+      </w:r>
+    </w:p>
+    <w:p>
+      <w:pPr>
+        <w:pStyle w:val="ListParagraph"/>
+        <w:numPr>
+          <w:ilvl w:val="0"/>
+          <w:numId w:val="2"/>
+        </w:numPr>
+        <w:spacing w:after="60"/>
+      </w:pPr>
+      <w:r>
+        <w:rPr>
+          <w:rFonts w:ascii="Malgun Gothic" w:cs="Malgun Gothic" w:eastAsia="Malgun Gothic" w:hAnsi="Malgun Gothic"/>
+          <w:sz w:val="20"/>
+          <w:szCs w:val="20"/>
+        </w:rPr>
+        <w:t xml:space="preserve">변경 전에 저장된 정보는 회사 값이 없을 수 있습니다. 수신 시 회사 항목을 비어 있는 값으로도 허용해 주세요.</w:t>
+      </w:r>
+    </w:p>
+    <w:p>
+      <w:pPr>
+        <w:pStyle w:val="Heading2"/>
+        <w:spacing w:after="120" w:before="240"/>
+      </w:pPr>
+      <w:r>
+        <w:rPr>
+          <w:rFonts w:ascii="Malgun Gothic" w:cs="Malgun Gothic" w:eastAsia="Malgun Gothic" w:hAnsi="Malgun Gothic"/>
+          <w:b/>
+          <w:bCs/>
+          <w:sz w:val="23"/>
+          <w:szCs w:val="23"/>
+        </w:rPr>
+        <w:t xml:space="preserve">B-2. 신청 폼 항목 — 신청사유 추가</w:t>
+      </w:r>
+    </w:p>
+    <w:p>
+      <w:pPr>
+        <w:spacing w:after="120"/>
+      </w:pPr>
+      <w:r>
+        <w:rPr>
+          <w:rFonts w:ascii="Malgun Gothic" w:cs="Malgun Gothic" w:eastAsia="Malgun Gothic" w:hAnsi="Malgun Gothic"/>
+          <w:sz w:val="20"/>
+          <w:szCs w:val="20"/>
+        </w:rPr>
+        <w:t xml:space="preserve">신청하기 화면에서 수집하는 항목입니다. 7번 신청사유가 이번에 추가되었습니다.</w:t>
+      </w:r>
+    </w:p>
+    <w:tbl>
+      <w:tblPr>
+        <w:tblW w:type="dxa" w:w="9360"/>
+        <w:tblBorders>
+          <w:top w:val="single" w:color="auto" w:sz="4"/>
+          <w:left w:val="single" w:color="auto" w:sz="4"/>
+          <w:bottom w:val="single" w:color="auto" w:sz="4"/>
+          <w:right w:val="single" w:color="auto" w:sz="4"/>
+          <w:insideH w:val="single" w:color="auto" w:sz="4"/>
+          <w:insideV w:val="single" w:color="auto" w:sz="4"/>
+        </w:tblBorders>
+      </w:tblPr>
+      <w:tblGrid>
+        <w:gridCol w:w="700"/>
+        <w:gridCol w:w="3200"/>
+        <w:gridCol w:w="2300"/>
+        <w:gridCol w:w="3160"/>
+      </w:tblGrid>
+      <w:tr>
+        <w:trPr>
+          <w:tblHeader/>
+        </w:trPr>
+        <w:tc>
+          <w:tcPr>
+            <w:tcW w:type="dxa" w:w="700"/>
+            <w:tcBorders>
+              <w:top w:val="single" w:color="D0D5DD" w:sz="4"/>
+              <w:left w:val="single" w:color="D0D5DD" w:sz="4"/>
+              <w:bottom w:val="single" w:color="D0D5DD" w:sz="4"/>
+              <w:right w:val="single" w:color="D0D5DD" w:sz="4"/>
+            </w:tcBorders>
+            <w:shd w:fill="EEF2FF" w:val="clear"/>
+            <w:tcMar>
+              <w:top w:type="dxa" w:w="60"/>
+              <w:left w:type="dxa" w:w="100"/>
+              <w:bottom w:type="dxa" w:w="60"/>
+              <w:right w:type="dxa" w:w="100"/>
+            </w:tcMar>
+          </w:tcPr>
+          <w:p>
+            <w:r>
+              <w:rPr>
+                <w:rFonts w:ascii="Malgun Gothic" w:cs="Malgun Gothic" w:eastAsia="Malgun Gothic" w:hAnsi="Malgun Gothic"/>
+                <w:b/>
+                <w:bCs/>
+                <w:sz w:val="18"/>
+                <w:szCs w:val="18"/>
+              </w:rPr>
+              <w:t xml:space="preserve">번호</w:t>
+            </w:r>
+          </w:p>
+        </w:tc>
+        <w:tc>
+          <w:tcPr>
+            <w:tcW w:type="dxa" w:w="3200"/>
+            <w:tcBorders>
+              <w:top w:val="single" w:color="D0D5DD" w:sz="4"/>
+              <w:left w:val="single" w:color="D0D5DD" w:sz="4"/>
+              <w:bottom w:val="single" w:color="D0D5DD" w:sz="4"/>
+              <w:right w:val="single" w:color="D0D5DD" w:sz="4"/>
+            </w:tcBorders>
+            <w:shd w:fill="EEF2FF" w:val="clear"/>
+            <w:tcMar>
+              <w:top w:type="dxa" w:w="60"/>
+              <w:left w:type="dxa" w:w="100"/>
+              <w:bottom w:type="dxa" w:w="60"/>
+              <w:right w:type="dxa" w:w="100"/>
+            </w:tcMar>
+          </w:tcPr>
+          <w:p>
+            <w:r>
+              <w:rPr>
+                <w:rFonts w:ascii="Malgun Gothic" w:cs="Malgun Gothic" w:eastAsia="Malgun Gothic" w:hAnsi="Malgun Gothic"/>
+                <w:b/>
+                <w:bCs/>
+                <w:sz w:val="18"/>
+                <w:szCs w:val="18"/>
+              </w:rPr>
+              <w:t xml:space="preserve">화면 항목</w:t>
+            </w:r>
+          </w:p>
+        </w:tc>
+        <w:tc>
+          <w:tcPr>
+            <w:tcW w:type="dxa" w:w="2300"/>
+            <w:tcBorders>
+              <w:top w:val="single" w:color="D0D5DD" w:sz="4"/>
+              <w:left w:val="single" w:color="D0D5DD" w:sz="4"/>
+              <w:bottom w:val="single" w:color="D0D5DD" w:sz="4"/>
+              <w:right w:val="single" w:color="D0D5DD" w:sz="4"/>
+            </w:tcBorders>
+            <w:shd w:fill="EEF2FF" w:val="clear"/>
+            <w:tcMar>
+              <w:top w:type="dxa" w:w="60"/>
+              <w:left w:type="dxa" w:w="100"/>
+              <w:bottom w:type="dxa" w:w="60"/>
+              <w:right w:type="dxa" w:w="100"/>
+            </w:tcMar>
+          </w:tcPr>
+          <w:p>
+            <w:r>
+              <w:rPr>
+                <w:rFonts w:ascii="Malgun Gothic" w:cs="Malgun Gothic" w:eastAsia="Malgun Gothic" w:hAnsi="Malgun Gothic"/>
+                <w:b/>
+                <w:bCs/>
+                <w:sz w:val="18"/>
+                <w:szCs w:val="18"/>
+              </w:rPr>
+              <w:t xml:space="preserve">필드명</w:t>
+            </w:r>
+          </w:p>
+        </w:tc>
+        <w:tc>
+          <w:tcPr>
+            <w:tcW w:type="dxa" w:w="3160"/>
+            <w:tcBorders>
+              <w:top w:val="single" w:color="D0D5DD" w:sz="4"/>
+              <w:left w:val="single" w:color="D0D5DD" w:sz="4"/>
+              <w:bottom w:val="single" w:color="D0D5DD" w:sz="4"/>
+              <w:right w:val="single" w:color="D0D5DD" w:sz="4"/>
+            </w:tcBorders>
+            <w:shd w:fill="EEF2FF" w:val="clear"/>
+            <w:tcMar>
+              <w:top w:type="dxa" w:w="60"/>
+              <w:left w:type="dxa" w:w="100"/>
+              <w:bottom w:type="dxa" w:w="60"/>
+              <w:right w:type="dxa" w:w="100"/>
+            </w:tcMar>
+          </w:tcPr>
+          <w:p>
+            <w:r>
+              <w:rPr>
+                <w:rFonts w:ascii="Malgun Gothic" w:cs="Malgun Gothic" w:eastAsia="Malgun Gothic" w:hAnsi="Malgun Gothic"/>
+                <w:b/>
+                <w:bCs/>
+                <w:sz w:val="18"/>
+                <w:szCs w:val="18"/>
+              </w:rPr>
+              <w:t xml:space="preserve">형식 / 비고</w:t>
+            </w:r>
+          </w:p>
+        </w:tc>
+      </w:tr>
+      <w:tr>
+        <w:tc>
+          <w:tcPr>
+            <w:tcW w:type="dxa" w:w="700"/>
+            <w:tcBorders>
+              <w:top w:val="single" w:color="D0D5DD" w:sz="4"/>
+              <w:left w:val="single" w:color="D0D5DD" w:sz="4"/>
+              <w:bottom w:val="single" w:color="D0D5DD" w:sz="4"/>
+              <w:right w:val="single" w:color="D0D5DD" w:sz="4"/>
+            </w:tcBorders>
+            <w:tcMar>
+              <w:top w:type="dxa" w:w="60"/>
+              <w:left w:type="dxa" w:w="100"/>
+              <w:bottom w:type="dxa" w:w="60"/>
+              <w:right w:type="dxa" w:w="100"/>
+            </w:tcMar>
+          </w:tcPr>
+          <w:p>
+            <w:r>
+              <w:rPr>
+                <w:rFonts w:ascii="Malgun Gothic" w:cs="Malgun Gothic" w:eastAsia="Malgun Gothic" w:hAnsi="Malgun Gothic"/>
+                <w:b w:val="false"/>
+                <w:bCs w:val="false"/>
+                <w:sz w:val="18"/>
+                <w:szCs w:val="18"/>
+              </w:rPr>
+              <w:t xml:space="preserve">1</w:t>
+            </w:r>
+          </w:p>
+        </w:tc>
+        <w:tc>
+          <w:tcPr>
+            <w:tcW w:type="dxa" w:w="3200"/>
+            <w:tcBorders>
+              <w:top w:val="single" w:color="D0D5DD" w:sz="4"/>
+              <w:left w:val="single" w:color="D0D5DD" w:sz="4"/>
+              <w:bottom w:val="single" w:color="D0D5DD" w:sz="4"/>
+              <w:right w:val="single" w:color="D0D5DD" w:sz="4"/>
+            </w:tcBorders>
+            <w:tcMar>
+              <w:top w:type="dxa" w:w="60"/>
+              <w:left w:type="dxa" w:w="100"/>
+              <w:bottom w:type="dxa" w:w="60"/>
+              <w:right w:type="dxa" w:w="100"/>
+            </w:tcMar>
+          </w:tcPr>
+          <w:p>
+            <w:r>
+              <w:rPr>
+                <w:rFonts w:ascii="Malgun Gothic" w:cs="Malgun Gothic" w:eastAsia="Malgun Gothic" w:hAnsi="Malgun Gothic"/>
+                <w:b w:val="false"/>
+                <w:bCs w:val="false"/>
+                <w:sz w:val="18"/>
+                <w:szCs w:val="18"/>
+              </w:rPr>
+              <w:t xml:space="preserve">희망 배송일시</w:t>
+            </w:r>
+          </w:p>
+        </w:tc>
+        <w:tc>
+          <w:tcPr>
+            <w:tcW w:type="dxa" w:w="2300"/>
+            <w:tcBorders>
+              <w:top w:val="single" w:color="D0D5DD" w:sz="4"/>
+              <w:left w:val="single" w:color="D0D5DD" w:sz="4"/>
+              <w:bottom w:val="single" w:color="D0D5DD" w:sz="4"/>
+              <w:right w:val="single" w:color="D0D5DD" w:sz="4"/>
+            </w:tcBorders>
+            <w:tcMar>
+              <w:top w:type="dxa" w:w="60"/>
+              <w:left w:type="dxa" w:w="100"/>
+              <w:bottom w:type="dxa" w:w="60"/>
+              <w:right w:type="dxa" w:w="100"/>
+            </w:tcMar>
+          </w:tcPr>
+          <w:p>
+            <w:r>
+              <w:rPr>
+                <w:rFonts w:ascii="Malgun Gothic" w:cs="Malgun Gothic" w:eastAsia="Malgun Gothic" w:hAnsi="Malgun Gothic"/>
+                <w:b w:val="false"/>
+                <w:bCs w:val="false"/>
+                <w:sz w:val="18"/>
+                <w:szCs w:val="18"/>
+              </w:rPr>
+              <w:t xml:space="preserve">deliveryDate · deliveryTime</w:t>
+            </w:r>
+          </w:p>
+        </w:tc>
+        <w:tc>
+          <w:tcPr>
+            <w:tcW w:type="dxa" w:w="3160"/>
+            <w:tcBorders>
+              <w:top w:val="single" w:color="D0D5DD" w:sz="4"/>
+              <w:left w:val="single" w:color="D0D5DD" w:sz="4"/>
+              <w:bottom w:val="single" w:color="D0D5DD" w:sz="4"/>
+              <w:right w:val="single" w:color="D0D5DD" w:sz="4"/>
+            </w:tcBorders>
+            <w:tcMar>
+              <w:top w:type="dxa" w:w="60"/>
+              <w:left w:type="dxa" w:w="100"/>
+              <w:bottom w:type="dxa" w:w="60"/>
+              <w:right w:type="dxa" w:w="100"/>
+            </w:tcMar>
+          </w:tcPr>
+          <w:p>
+            <w:r>
+              <w:rPr>
+                <w:rFonts w:ascii="Malgun Gothic" w:cs="Malgun Gothic" w:eastAsia="Malgun Gothic" w:hAnsi="Malgun Gothic"/>
+                <w:b w:val="false"/>
+                <w:bCs w:val="false"/>
+                <w:sz w:val="18"/>
+                <w:szCs w:val="18"/>
+              </w:rPr>
+              <w:t xml:space="preserve">날짜 YYYY-MM-DD, 시간 HH:MM (09:00~18:30, 30분 단위)</w:t>
+            </w:r>
+          </w:p>
+        </w:tc>
+      </w:tr>
+      <w:tr>
+        <w:tc>
+          <w:tcPr>
+            <w:tcW w:type="dxa" w:w="700"/>
+            <w:tcBorders>
+              <w:top w:val="single" w:color="D0D5DD" w:sz="4"/>
+              <w:left w:val="single" w:color="D0D5DD" w:sz="4"/>
+              <w:bottom w:val="single" w:color="D0D5DD" w:sz="4"/>
+              <w:right w:val="single" w:color="D0D5DD" w:sz="4"/>
+            </w:tcBorders>
+            <w:tcMar>
+              <w:top w:type="dxa" w:w="60"/>
+              <w:left w:type="dxa" w:w="100"/>
+              <w:bottom w:type="dxa" w:w="60"/>
+              <w:right w:type="dxa" w:w="100"/>
+            </w:tcMar>
+          </w:tcPr>
+          <w:p>
+            <w:r>
+              <w:rPr>
+                <w:rFonts w:ascii="Malgun Gothic" w:cs="Malgun Gothic" w:eastAsia="Malgun Gothic" w:hAnsi="Malgun Gothic"/>
+                <w:b w:val="false"/>
+                <w:bCs w:val="false"/>
+                <w:sz w:val="18"/>
+                <w:szCs w:val="18"/>
+              </w:rPr>
+              <w:t xml:space="preserve">2</w:t>
+            </w:r>
+          </w:p>
+        </w:tc>
+        <w:tc>
+          <w:tcPr>
+            <w:tcW w:type="dxa" w:w="3200"/>
+            <w:tcBorders>
+              <w:top w:val="single" w:color="D0D5DD" w:sz="4"/>
+              <w:left w:val="single" w:color="D0D5DD" w:sz="4"/>
+              <w:bottom w:val="single" w:color="D0D5DD" w:sz="4"/>
+              <w:right w:val="single" w:color="D0D5DD" w:sz="4"/>
+            </w:tcBorders>
+            <w:tcMar>
+              <w:top w:type="dxa" w:w="60"/>
+              <w:left w:type="dxa" w:w="100"/>
+              <w:bottom w:type="dxa" w:w="60"/>
+              <w:right w:type="dxa" w:w="100"/>
+            </w:tcMar>
+          </w:tcPr>
+          <w:p>
+            <w:r>
+              <w:rPr>
+                <w:rFonts w:ascii="Malgun Gothic" w:cs="Malgun Gothic" w:eastAsia="Malgun Gothic" w:hAnsi="Malgun Gothic"/>
+                <w:b w:val="false"/>
+                <w:bCs w:val="false"/>
+                <w:sz w:val="18"/>
+                <w:szCs w:val="18"/>
+              </w:rPr>
+              <w:t xml:space="preserve">상품 분류 및 이름</w:t>
+            </w:r>
+          </w:p>
+        </w:tc>
+        <w:tc>
+          <w:tcPr>
+            <w:tcW w:type="dxa" w:w="2300"/>
+            <w:tcBorders>
+              <w:top w:val="single" w:color="D0D5DD" w:sz="4"/>
+              <w:left w:val="single" w:color="D0D5DD" w:sz="4"/>
+              <w:bottom w:val="single" w:color="D0D5DD" w:sz="4"/>
+              <w:right w:val="single" w:color="D0D5DD" w:sz="4"/>
+            </w:tcBorders>
+            <w:tcMar>
+              <w:top w:type="dxa" w:w="60"/>
+              <w:left w:type="dxa" w:w="100"/>
+              <w:bottom w:type="dxa" w:w="60"/>
+              <w:right w:type="dxa" w:w="100"/>
+            </w:tcMar>
+          </w:tcPr>
+          <w:p>
+            <w:r>
+              <w:rPr>
+                <w:rFonts w:ascii="Malgun Gothic" w:cs="Malgun Gothic" w:eastAsia="Malgun Gothic" w:hAnsi="Malgun Gothic"/>
+                <w:b w:val="false"/>
+                <w:bCs w:val="false"/>
+                <w:sz w:val="18"/>
+                <w:szCs w:val="18"/>
+              </w:rPr>
+              <w:t xml:space="preserve">product</w:t>
+            </w:r>
+          </w:p>
+        </w:tc>
+        <w:tc>
+          <w:tcPr>
+            <w:tcW w:type="dxa" w:w="3160"/>
+            <w:tcBorders>
+              <w:top w:val="single" w:color="D0D5DD" w:sz="4"/>
+              <w:left w:val="single" w:color="D0D5DD" w:sz="4"/>
+              <w:bottom w:val="single" w:color="D0D5DD" w:sz="4"/>
+              <w:right w:val="single" w:color="D0D5DD" w:sz="4"/>
+            </w:tcBorders>
+            <w:tcMar>
+              <w:top w:type="dxa" w:w="60"/>
+              <w:left w:type="dxa" w:w="100"/>
+              <w:bottom w:type="dxa" w:w="60"/>
+              <w:right w:type="dxa" w:w="100"/>
+            </w:tcMar>
+          </w:tcPr>
+          <w:p>
+            <w:r>
+              <w:rPr>
+                <w:rFonts w:ascii="Malgun Gothic" w:cs="Malgun Gothic" w:eastAsia="Malgun Gothic" w:hAnsi="Malgun Gothic"/>
+                <w:b w:val="false"/>
+                <w:bCs w:val="false"/>
+                <w:sz w:val="18"/>
+                <w:szCs w:val="18"/>
+              </w:rPr>
+              <w:t xml:space="preserve">현재는 「근조 쌀화환 (75,000원)」 형태의 표시용 문자열 (B-3 참고)</w:t>
+            </w:r>
+          </w:p>
+        </w:tc>
+      </w:tr>
+      <w:tr>
+        <w:tc>
+          <w:tcPr>
+            <w:tcW w:type="dxa" w:w="700"/>
+            <w:tcBorders>
+              <w:top w:val="single" w:color="D0D5DD" w:sz="4"/>
+              <w:left w:val="single" w:color="D0D5DD" w:sz="4"/>
+              <w:bottom w:val="single" w:color="D0D5DD" w:sz="4"/>
+              <w:right w:val="single" w:color="D0D5DD" w:sz="4"/>
+            </w:tcBorders>
+            <w:tcMar>
+              <w:top w:type="dxa" w:w="60"/>
+              <w:left w:type="dxa" w:w="100"/>
+              <w:bottom w:type="dxa" w:w="60"/>
+              <w:right w:type="dxa" w:w="100"/>
+            </w:tcMar>
+          </w:tcPr>
+          <w:p>
+            <w:r>
+              <w:rPr>
+                <w:rFonts w:ascii="Malgun Gothic" w:cs="Malgun Gothic" w:eastAsia="Malgun Gothic" w:hAnsi="Malgun Gothic"/>
+                <w:b w:val="false"/>
+                <w:bCs w:val="false"/>
+                <w:sz w:val="18"/>
+                <w:szCs w:val="18"/>
+              </w:rPr>
+              <w:t xml:space="preserve">3</w:t>
+            </w:r>
+          </w:p>
+        </w:tc>
+        <w:tc>
+          <w:tcPr>
+            <w:tcW w:type="dxa" w:w="3200"/>
+            <w:tcBorders>
+              <w:top w:val="single" w:color="D0D5DD" w:sz="4"/>
+              <w:left w:val="single" w:color="D0D5DD" w:sz="4"/>
+              <w:bottom w:val="single" w:color="D0D5DD" w:sz="4"/>
+              <w:right w:val="single" w:color="D0D5DD" w:sz="4"/>
+            </w:tcBorders>
+            <w:tcMar>
+              <w:top w:type="dxa" w:w="60"/>
+              <w:left w:type="dxa" w:w="100"/>
+              <w:bottom w:type="dxa" w:w="60"/>
+              <w:right w:type="dxa" w:w="100"/>
+            </w:tcMar>
+          </w:tcPr>
+          <w:p>
+            <w:r>
+              <w:rPr>
+                <w:rFonts w:ascii="Malgun Gothic" w:cs="Malgun Gothic" w:eastAsia="Malgun Gothic" w:hAnsi="Malgun Gothic"/>
+                <w:b w:val="false"/>
+                <w:bCs w:val="false"/>
+                <w:sz w:val="18"/>
+                <w:szCs w:val="18"/>
+              </w:rPr>
+              <w:t xml:space="preserve">보내는 장소(상세주소)</w:t>
+            </w:r>
+          </w:p>
+        </w:tc>
+        <w:tc>
+          <w:tcPr>
+            <w:tcW w:type="dxa" w:w="2300"/>
+            <w:tcBorders>
+              <w:top w:val="single" w:color="D0D5DD" w:sz="4"/>
+              <w:left w:val="single" w:color="D0D5DD" w:sz="4"/>
+              <w:bottom w:val="single" w:color="D0D5DD" w:sz="4"/>
+              <w:right w:val="single" w:color="D0D5DD" w:sz="4"/>
+            </w:tcBorders>
+            <w:tcMar>
+              <w:top w:type="dxa" w:w="60"/>
+              <w:left w:type="dxa" w:w="100"/>
+              <w:bottom w:type="dxa" w:w="60"/>
+              <w:right w:type="dxa" w:w="100"/>
+            </w:tcMar>
+          </w:tcPr>
+          <w:p>
+            <w:r>
+              <w:rPr>
+                <w:rFonts w:ascii="Malgun Gothic" w:cs="Malgun Gothic" w:eastAsia="Malgun Gothic" w:hAnsi="Malgun Gothic"/>
+                <w:b w:val="false"/>
+                <w:bCs w:val="false"/>
+                <w:sz w:val="18"/>
+                <w:szCs w:val="18"/>
+              </w:rPr>
+              <w:t xml:space="preserve">address</w:t>
+            </w:r>
+          </w:p>
+        </w:tc>
+        <w:tc>
+          <w:tcPr>
+            <w:tcW w:type="dxa" w:w="3160"/>
+            <w:tcBorders>
+              <w:top w:val="single" w:color="D0D5DD" w:sz="4"/>
+              <w:left w:val="single" w:color="D0D5DD" w:sz="4"/>
+              <w:bottom w:val="single" w:color="D0D5DD" w:sz="4"/>
+              <w:right w:val="single" w:color="D0D5DD" w:sz="4"/>
+            </w:tcBorders>
+            <w:tcMar>
+              <w:top w:type="dxa" w:w="60"/>
+              <w:left w:type="dxa" w:w="100"/>
+              <w:bottom w:type="dxa" w:w="60"/>
+              <w:right w:type="dxa" w:w="100"/>
+            </w:tcMar>
+          </w:tcPr>
+          <w:p>
+            <w:r>
+              <w:rPr>
+                <w:rFonts w:ascii="Malgun Gothic" w:cs="Malgun Gothic" w:eastAsia="Malgun Gothic" w:hAnsi="Malgun Gothic"/>
+                <w:b w:val="false"/>
+                <w:bCs w:val="false"/>
+                <w:sz w:val="18"/>
+                <w:szCs w:val="18"/>
+              </w:rPr>
+              <w:t xml:space="preserve">여러 줄 입력 가능</w:t>
+            </w:r>
+          </w:p>
+        </w:tc>
+      </w:tr>
+      <w:tr>
+        <w:tc>
+          <w:tcPr>
+            <w:tcW w:type="dxa" w:w="700"/>
+            <w:tcBorders>
+              <w:top w:val="single" w:color="D0D5DD" w:sz="4"/>
+              <w:left w:val="single" w:color="D0D5DD" w:sz="4"/>
+              <w:bottom w:val="single" w:color="D0D5DD" w:sz="4"/>
+              <w:right w:val="single" w:color="D0D5DD" w:sz="4"/>
+            </w:tcBorders>
+            <w:tcMar>
+              <w:top w:type="dxa" w:w="60"/>
+              <w:left w:type="dxa" w:w="100"/>
+              <w:bottom w:type="dxa" w:w="60"/>
+              <w:right w:type="dxa" w:w="100"/>
+            </w:tcMar>
+          </w:tcPr>
+          <w:p>
+            <w:r>
+              <w:rPr>
+                <w:rFonts w:ascii="Malgun Gothic" w:cs="Malgun Gothic" w:eastAsia="Malgun Gothic" w:hAnsi="Malgun Gothic"/>
+                <w:b w:val="false"/>
+                <w:bCs w:val="false"/>
+                <w:sz w:val="18"/>
+                <w:szCs w:val="18"/>
+              </w:rPr>
+              <w:t xml:space="preserve">4</w:t>
+            </w:r>
+          </w:p>
+        </w:tc>
+        <w:tc>
+          <w:tcPr>
+            <w:tcW w:type="dxa" w:w="3200"/>
+            <w:tcBorders>
+              <w:top w:val="single" w:color="D0D5DD" w:sz="4"/>
+              <w:left w:val="single" w:color="D0D5DD" w:sz="4"/>
+              <w:bottom w:val="single" w:color="D0D5DD" w:sz="4"/>
+              <w:right w:val="single" w:color="D0D5DD" w:sz="4"/>
+            </w:tcBorders>
+            <w:tcMar>
+              <w:top w:type="dxa" w:w="60"/>
+              <w:left w:type="dxa" w:w="100"/>
+              <w:bottom w:type="dxa" w:w="60"/>
+              <w:right w:type="dxa" w:w="100"/>
+            </w:tcMar>
+          </w:tcPr>
+          <w:p>
+            <w:r>
+              <w:rPr>
+                <w:rFonts w:ascii="Malgun Gothic" w:cs="Malgun Gothic" w:eastAsia="Malgun Gothic" w:hAnsi="Malgun Gothic"/>
+                <w:b w:val="false"/>
+                <w:bCs w:val="false"/>
+                <w:sz w:val="18"/>
+                <w:szCs w:val="18"/>
+              </w:rPr>
+              <w:t xml:space="preserve">받는 분 정보(성함, 연락처)</w:t>
+            </w:r>
+          </w:p>
+        </w:tc>
+        <w:tc>
+          <w:tcPr>
+            <w:tcW w:type="dxa" w:w="2300"/>
+            <w:tcBorders>
+              <w:top w:val="single" w:color="D0D5DD" w:sz="4"/>
+              <w:left w:val="single" w:color="D0D5DD" w:sz="4"/>
+              <w:bottom w:val="single" w:color="D0D5DD" w:sz="4"/>
+              <w:right w:val="single" w:color="D0D5DD" w:sz="4"/>
+            </w:tcBorders>
+            <w:tcMar>
+              <w:top w:type="dxa" w:w="60"/>
+              <w:left w:type="dxa" w:w="100"/>
+              <w:bottom w:type="dxa" w:w="60"/>
+              <w:right w:type="dxa" w:w="100"/>
+            </w:tcMar>
+          </w:tcPr>
+          <w:p>
+            <w:r>
+              <w:rPr>
+                <w:rFonts w:ascii="Malgun Gothic" w:cs="Malgun Gothic" w:eastAsia="Malgun Gothic" w:hAnsi="Malgun Gothic"/>
+                <w:b w:val="false"/>
+                <w:bCs w:val="false"/>
+                <w:sz w:val="18"/>
+                <w:szCs w:val="18"/>
+              </w:rPr>
+              <w:t xml:space="preserve">recipient</w:t>
+            </w:r>
+          </w:p>
+        </w:tc>
+        <w:tc>
+          <w:tcPr>
+            <w:tcW w:type="dxa" w:w="3160"/>
+            <w:tcBorders>
+              <w:top w:val="single" w:color="D0D5DD" w:sz="4"/>
+              <w:left w:val="single" w:color="D0D5DD" w:sz="4"/>
+              <w:bottom w:val="single" w:color="D0D5DD" w:sz="4"/>
+              <w:right w:val="single" w:color="D0D5DD" w:sz="4"/>
+            </w:tcBorders>
+            <w:tcMar>
+              <w:top w:type="dxa" w:w="60"/>
+              <w:left w:type="dxa" w:w="100"/>
+              <w:bottom w:type="dxa" w:w="60"/>
+              <w:right w:type="dxa" w:w="100"/>
+            </w:tcMar>
+          </w:tcPr>
+          <w:p>
+            <w:r>
+              <w:rPr>
+                <w:rFonts w:ascii="Malgun Gothic" w:cs="Malgun Gothic" w:eastAsia="Malgun Gothic" w:hAnsi="Malgun Gothic"/>
+                <w:b w:val="false"/>
+                <w:bCs w:val="false"/>
+                <w:sz w:val="18"/>
+                <w:szCs w:val="18"/>
+              </w:rPr>
+              <w:t xml:space="preserve">한 줄 문자열</w:t>
+            </w:r>
+          </w:p>
+        </w:tc>
+      </w:tr>
+      <w:tr>
+        <w:tc>
+          <w:tcPr>
+            <w:tcW w:type="dxa" w:w="700"/>
+            <w:tcBorders>
+              <w:top w:val="single" w:color="D0D5DD" w:sz="4"/>
+              <w:left w:val="single" w:color="D0D5DD" w:sz="4"/>
+              <w:bottom w:val="single" w:color="D0D5DD" w:sz="4"/>
+              <w:right w:val="single" w:color="D0D5DD" w:sz="4"/>
+            </w:tcBorders>
+            <w:tcMar>
+              <w:top w:type="dxa" w:w="60"/>
+              <w:left w:type="dxa" w:w="100"/>
+              <w:bottom w:type="dxa" w:w="60"/>
+              <w:right w:type="dxa" w:w="100"/>
+            </w:tcMar>
+          </w:tcPr>
+          <w:p>
+            <w:r>
+              <w:rPr>
+                <w:rFonts w:ascii="Malgun Gothic" w:cs="Malgun Gothic" w:eastAsia="Malgun Gothic" w:hAnsi="Malgun Gothic"/>
+                <w:b w:val="false"/>
+                <w:bCs w:val="false"/>
+                <w:sz w:val="18"/>
+                <w:szCs w:val="18"/>
+              </w:rPr>
+              <w:t xml:space="preserve">5</w:t>
+            </w:r>
+          </w:p>
+        </w:tc>
+        <w:tc>
+          <w:tcPr>
+            <w:tcW w:type="dxa" w:w="3200"/>
+            <w:tcBorders>
+              <w:top w:val="single" w:color="D0D5DD" w:sz="4"/>
+              <w:left w:val="single" w:color="D0D5DD" w:sz="4"/>
+              <w:bottom w:val="single" w:color="D0D5DD" w:sz="4"/>
+              <w:right w:val="single" w:color="D0D5DD" w:sz="4"/>
+            </w:tcBorders>
+            <w:tcMar>
+              <w:top w:type="dxa" w:w="60"/>
+              <w:left w:type="dxa" w:w="100"/>
+              <w:bottom w:type="dxa" w:w="60"/>
+              <w:right w:type="dxa" w:w="100"/>
+            </w:tcMar>
+          </w:tcPr>
+          <w:p>
+            <w:r>
+              <w:rPr>
+                <w:rFonts w:ascii="Malgun Gothic" w:cs="Malgun Gothic" w:eastAsia="Malgun Gothic" w:hAnsi="Malgun Gothic"/>
+                <w:b w:val="false"/>
+                <w:bCs w:val="false"/>
+                <w:sz w:val="18"/>
+                <w:szCs w:val="18"/>
+              </w:rPr>
+              <w:t xml:space="preserve">리본문구 좌측(보내는분)</w:t>
+            </w:r>
+          </w:p>
+        </w:tc>
+        <w:tc>
+          <w:tcPr>
+            <w:tcW w:type="dxa" w:w="2300"/>
+            <w:tcBorders>
+              <w:top w:val="single" w:color="D0D5DD" w:sz="4"/>
+              <w:left w:val="single" w:color="D0D5DD" w:sz="4"/>
+              <w:bottom w:val="single" w:color="D0D5DD" w:sz="4"/>
+              <w:right w:val="single" w:color="D0D5DD" w:sz="4"/>
+            </w:tcBorders>
+            <w:tcMar>
+              <w:top w:type="dxa" w:w="60"/>
+              <w:left w:type="dxa" w:w="100"/>
+              <w:bottom w:type="dxa" w:w="60"/>
+              <w:right w:type="dxa" w:w="100"/>
+            </w:tcMar>
+          </w:tcPr>
+          <w:p>
+            <w:r>
+              <w:rPr>
+                <w:rFonts w:ascii="Malgun Gothic" w:cs="Malgun Gothic" w:eastAsia="Malgun Gothic" w:hAnsi="Malgun Gothic"/>
+                <w:b w:val="false"/>
+                <w:bCs w:val="false"/>
+                <w:sz w:val="18"/>
+                <w:szCs w:val="18"/>
+              </w:rPr>
+              <w:t xml:space="preserve">sender</w:t>
+            </w:r>
+          </w:p>
+        </w:tc>
+        <w:tc>
+          <w:tcPr>
+            <w:tcW w:type="dxa" w:w="3160"/>
+            <w:tcBorders>
+              <w:top w:val="single" w:color="D0D5DD" w:sz="4"/>
+              <w:left w:val="single" w:color="D0D5DD" w:sz="4"/>
+              <w:bottom w:val="single" w:color="D0D5DD" w:sz="4"/>
+              <w:right w:val="single" w:color="D0D5DD" w:sz="4"/>
+            </w:tcBorders>
+            <w:tcMar>
+              <w:top w:type="dxa" w:w="60"/>
+              <w:left w:type="dxa" w:w="100"/>
+              <w:bottom w:type="dxa" w:w="60"/>
+              <w:right w:type="dxa" w:w="100"/>
+            </w:tcMar>
+          </w:tcPr>
+          <w:p>
+            <w:r>
+              <w:rPr>
+                <w:rFonts w:ascii="Malgun Gothic" w:cs="Malgun Gothic" w:eastAsia="Malgun Gothic" w:hAnsi="Malgun Gothic"/>
+                <w:b w:val="false"/>
+                <w:bCs w:val="false"/>
+                <w:sz w:val="18"/>
+                <w:szCs w:val="18"/>
+              </w:rPr>
+              <w:t xml:space="preserve">한 줄 문자열</w:t>
+            </w:r>
+          </w:p>
+        </w:tc>
+      </w:tr>
+      <w:tr>
+        <w:tc>
+          <w:tcPr>
+            <w:tcW w:type="dxa" w:w="700"/>
+            <w:tcBorders>
+              <w:top w:val="single" w:color="D0D5DD" w:sz="4"/>
+              <w:left w:val="single" w:color="D0D5DD" w:sz="4"/>
+              <w:bottom w:val="single" w:color="D0D5DD" w:sz="4"/>
+              <w:right w:val="single" w:color="D0D5DD" w:sz="4"/>
+            </w:tcBorders>
+            <w:tcMar>
+              <w:top w:type="dxa" w:w="60"/>
+              <w:left w:type="dxa" w:w="100"/>
+              <w:bottom w:type="dxa" w:w="60"/>
+              <w:right w:type="dxa" w:w="100"/>
+            </w:tcMar>
+          </w:tcPr>
+          <w:p>
+            <w:r>
+              <w:rPr>
+                <w:rFonts w:ascii="Malgun Gothic" w:cs="Malgun Gothic" w:eastAsia="Malgun Gothic" w:hAnsi="Malgun Gothic"/>
+                <w:b w:val="false"/>
+                <w:bCs w:val="false"/>
+                <w:sz w:val="18"/>
+                <w:szCs w:val="18"/>
+              </w:rPr>
+              <w:t xml:space="preserve">6</w:t>
+            </w:r>
+          </w:p>
+        </w:tc>
+        <w:tc>
+          <w:tcPr>
+            <w:tcW w:type="dxa" w:w="3200"/>
+            <w:tcBorders>
+              <w:top w:val="single" w:color="D0D5DD" w:sz="4"/>
+              <w:left w:val="single" w:color="D0D5DD" w:sz="4"/>
+              <w:bottom w:val="single" w:color="D0D5DD" w:sz="4"/>
+              <w:right w:val="single" w:color="D0D5DD" w:sz="4"/>
+            </w:tcBorders>
+            <w:tcMar>
+              <w:top w:type="dxa" w:w="60"/>
+              <w:left w:type="dxa" w:w="100"/>
+              <w:bottom w:type="dxa" w:w="60"/>
+              <w:right w:type="dxa" w:w="100"/>
+            </w:tcMar>
+          </w:tcPr>
+          <w:p>
+            <w:r>
+              <w:rPr>
+                <w:rFonts w:ascii="Malgun Gothic" w:cs="Malgun Gothic" w:eastAsia="Malgun Gothic" w:hAnsi="Malgun Gothic"/>
+                <w:b w:val="false"/>
+                <w:bCs w:val="false"/>
+                <w:sz w:val="18"/>
+                <w:szCs w:val="18"/>
+              </w:rPr>
+              <w:t xml:space="preserve">리본문구 우측(경조사어)</w:t>
+            </w:r>
+          </w:p>
+        </w:tc>
+        <w:tc>
+          <w:tcPr>
+            <w:tcW w:type="dxa" w:w="2300"/>
+            <w:tcBorders>
+              <w:top w:val="single" w:color="D0D5DD" w:sz="4"/>
+              <w:left w:val="single" w:color="D0D5DD" w:sz="4"/>
+              <w:bottom w:val="single" w:color="D0D5DD" w:sz="4"/>
+              <w:right w:val="single" w:color="D0D5DD" w:sz="4"/>
+            </w:tcBorders>
+            <w:tcMar>
+              <w:top w:type="dxa" w:w="60"/>
+              <w:left w:type="dxa" w:w="100"/>
+              <w:bottom w:type="dxa" w:w="60"/>
+              <w:right w:type="dxa" w:w="100"/>
+            </w:tcMar>
+          </w:tcPr>
+          <w:p>
+            <w:r>
+              <w:rPr>
+                <w:rFonts w:ascii="Malgun Gothic" w:cs="Malgun Gothic" w:eastAsia="Malgun Gothic" w:hAnsi="Malgun Gothic"/>
+                <w:b w:val="false"/>
+                <w:bCs w:val="false"/>
+                <w:sz w:val="18"/>
+                <w:szCs w:val="18"/>
+              </w:rPr>
+              <w:t xml:space="preserve">message</w:t>
+            </w:r>
+          </w:p>
+        </w:tc>
+        <w:tc>
+          <w:tcPr>
+            <w:tcW w:type="dxa" w:w="3160"/>
+            <w:tcBorders>
+              <w:top w:val="single" w:color="D0D5DD" w:sz="4"/>
+              <w:left w:val="single" w:color="D0D5DD" w:sz="4"/>
+              <w:bottom w:val="single" w:color="D0D5DD" w:sz="4"/>
+              <w:right w:val="single" w:color="D0D5DD" w:sz="4"/>
+            </w:tcBorders>
+            <w:tcMar>
+              <w:top w:type="dxa" w:w="60"/>
+              <w:left w:type="dxa" w:w="100"/>
+              <w:bottom w:type="dxa" w:w="60"/>
+              <w:right w:type="dxa" w:w="100"/>
+            </w:tcMar>
+          </w:tcPr>
+          <w:p>
+            <w:r>
+              <w:rPr>
+                <w:rFonts w:ascii="Malgun Gothic" w:cs="Malgun Gothic" w:eastAsia="Malgun Gothic" w:hAnsi="Malgun Gothic"/>
+                <w:b w:val="false"/>
+                <w:bCs w:val="false"/>
+                <w:sz w:val="18"/>
+                <w:szCs w:val="18"/>
+              </w:rPr>
+              <w:t xml:space="preserve">한 줄 문자열</w:t>
+            </w:r>
+          </w:p>
+        </w:tc>
+      </w:tr>
+      <w:tr>
+        <w:tc>
+          <w:tcPr>
+            <w:tcW w:type="dxa" w:w="700"/>
+            <w:tcBorders>
+              <w:top w:val="single" w:color="D0D5DD" w:sz="4"/>
+              <w:left w:val="single" w:color="D0D5DD" w:sz="4"/>
+              <w:bottom w:val="single" w:color="D0D5DD" w:sz="4"/>
+              <w:right w:val="single" w:color="D0D5DD" w:sz="4"/>
+            </w:tcBorders>
+            <w:tcMar>
+              <w:top w:type="dxa" w:w="60"/>
+              <w:left w:type="dxa" w:w="100"/>
+              <w:bottom w:type="dxa" w:w="60"/>
+              <w:right w:type="dxa" w:w="100"/>
+            </w:tcMar>
+          </w:tcPr>
+          <w:p>
+            <w:r>
+              <w:rPr>
+                <w:rFonts w:ascii="Malgun Gothic" w:cs="Malgun Gothic" w:eastAsia="Malgun Gothic" w:hAnsi="Malgun Gothic"/>
+                <w:b w:val="false"/>
+                <w:bCs w:val="false"/>
+                <w:sz w:val="18"/>
+                <w:szCs w:val="18"/>
+              </w:rPr>
+              <w:t xml:space="preserve">7</w:t>
+            </w:r>
+          </w:p>
+        </w:tc>
+        <w:tc>
+          <w:tcPr>
+            <w:tcW w:type="dxa" w:w="3200"/>
+            <w:tcBorders>
+              <w:top w:val="single" w:color="D0D5DD" w:sz="4"/>
+              <w:left w:val="single" w:color="D0D5DD" w:sz="4"/>
+              <w:bottom w:val="single" w:color="D0D5DD" w:sz="4"/>
+              <w:right w:val="single" w:color="D0D5DD" w:sz="4"/>
+            </w:tcBorders>
+            <w:tcMar>
+              <w:top w:type="dxa" w:w="60"/>
+              <w:left w:type="dxa" w:w="100"/>
+              <w:bottom w:type="dxa" w:w="60"/>
+              <w:right w:type="dxa" w:w="100"/>
+            </w:tcMar>
+          </w:tcPr>
+          <w:p>
+            <w:r>
+              <w:rPr>
+                <w:rFonts w:ascii="Malgun Gothic" w:cs="Malgun Gothic" w:eastAsia="Malgun Gothic" w:hAnsi="Malgun Gothic"/>
+                <w:b w:val="false"/>
+                <w:bCs w:val="false"/>
+                <w:sz w:val="18"/>
+                <w:szCs w:val="18"/>
+              </w:rPr>
+              <w:t xml:space="preserve">신청사유</w:t>
+            </w:r>
+          </w:p>
+        </w:tc>
+        <w:tc>
+          <w:tcPr>
+            <w:tcW w:type="dxa" w:w="2300"/>
+            <w:tcBorders>
+              <w:top w:val="single" w:color="D0D5DD" w:sz="4"/>
+              <w:left w:val="single" w:color="D0D5DD" w:sz="4"/>
+              <w:bottom w:val="single" w:color="D0D5DD" w:sz="4"/>
+              <w:right w:val="single" w:color="D0D5DD" w:sz="4"/>
+            </w:tcBorders>
+            <w:tcMar>
+              <w:top w:type="dxa" w:w="60"/>
+              <w:left w:type="dxa" w:w="100"/>
+              <w:bottom w:type="dxa" w:w="60"/>
+              <w:right w:type="dxa" w:w="100"/>
+            </w:tcMar>
+          </w:tcPr>
+          <w:p>
+            <w:r>
+              <w:rPr>
+                <w:rFonts w:ascii="Malgun Gothic" w:cs="Malgun Gothic" w:eastAsia="Malgun Gothic" w:hAnsi="Malgun Gothic"/>
+                <w:b w:val="false"/>
+                <w:bCs w:val="false"/>
+                <w:sz w:val="18"/>
+                <w:szCs w:val="18"/>
+              </w:rPr>
+              <w:t xml:space="preserve">reason</w:t>
+            </w:r>
+          </w:p>
+        </w:tc>
+        <w:tc>
+          <w:tcPr>
+            <w:tcW w:type="dxa" w:w="3160"/>
+            <w:tcBorders>
+              <w:top w:val="single" w:color="D0D5DD" w:sz="4"/>
+              <w:left w:val="single" w:color="D0D5DD" w:sz="4"/>
+              <w:bottom w:val="single" w:color="D0D5DD" w:sz="4"/>
+              <w:right w:val="single" w:color="D0D5DD" w:sz="4"/>
+            </w:tcBorders>
+            <w:tcMar>
+              <w:top w:type="dxa" w:w="60"/>
+              <w:left w:type="dxa" w:w="100"/>
+              <w:bottom w:type="dxa" w:w="60"/>
+              <w:right w:type="dxa" w:w="100"/>
+            </w:tcMar>
+          </w:tcPr>
+          <w:p>
+            <w:r>
+              <w:rPr>
+                <w:rFonts w:ascii="Malgun Gothic" w:cs="Malgun Gothic" w:eastAsia="Malgun Gothic" w:hAnsi="Malgun Gothic"/>
+                <w:b w:val="false"/>
+                <w:bCs w:val="false"/>
+                <w:sz w:val="18"/>
+                <w:szCs w:val="18"/>
+              </w:rPr>
+              <w:t xml:space="preserve">여러 줄 입력 가능 · 이번 추가 항목</w:t>
+            </w:r>
+          </w:p>
+        </w:tc>
+      </w:tr>
+    </w:tbl>
+    <w:p>
+      <w:pPr>
+        <w:pStyle w:val="Heading2"/>
+        <w:spacing w:after="120" w:before="240"/>
+      </w:pPr>
+      <w:r>
+        <w:rPr>
+          <w:rFonts w:ascii="Malgun Gothic" w:cs="Malgun Gothic" w:eastAsia="Malgun Gothic" w:hAnsi="Malgun Gothic"/>
+          <w:b/>
+          <w:bCs/>
+          <w:sz w:val="23"/>
+          <w:szCs w:val="23"/>
+        </w:rPr>
+        <w:t xml:space="preserve">B-3. 신청 전송 기능은 아직 구현되지 않았습니다</w:t>
+      </w:r>
+    </w:p>
+    <w:p>
+      <w:pPr>
+        <w:spacing w:after="120"/>
+      </w:pPr>
+      <w:r>
+        <w:rPr>
+          <w:rFonts w:ascii="Malgun Gothic" w:cs="Malgun Gothic" w:eastAsia="Malgun Gothic" w:hAnsi="Malgun Gothic"/>
+          <w:sz w:val="20"/>
+          <w:szCs w:val="20"/>
+        </w:rPr>
+        <w:t xml:space="preserve">현재 「작성한 내용으로 신청」 버튼을 누르면 안내 문구만 표시되고 서버로 전송하지 않습니다. 백엔드 연동 시 아래 내용을 함께 묶어 보내는 부분을 새로 구현해야 합니다.</w:t>
+      </w:r>
+    </w:p>
+    <w:p>
+      <w:pPr>
+        <w:pStyle w:val="ListParagraph"/>
+        <w:numPr>
+          <w:ilvl w:val="0"/>
+          <w:numId w:val="2"/>
+        </w:numPr>
+        <w:spacing w:after="60"/>
+      </w:pPr>
+      <w:r>
+        <w:rPr>
+          <w:rFonts w:ascii="Malgun Gothic" w:cs="Malgun Gothic" w:eastAsia="Malgun Gothic" w:hAnsi="Malgun Gothic"/>
+          <w:sz w:val="20"/>
+          <w:szCs w:val="20"/>
+        </w:rPr>
+        <w:t xml:space="preserve">전송 대상: 신청인 정보(B-1) + 신청 폼 항목(B-2)</w:t>
+      </w:r>
+    </w:p>
+    <w:p>
+      <w:pPr>
+        <w:pStyle w:val="ListParagraph"/>
+        <w:numPr>
+          <w:ilvl w:val="0"/>
+          <w:numId w:val="2"/>
+        </w:numPr>
+        <w:spacing w:after="60"/>
+      </w:pPr>
+      <w:r>
+        <w:rPr>
+          <w:rFonts w:ascii="Malgun Gothic" w:cs="Malgun Gothic" w:eastAsia="Malgun Gothic" w:hAnsi="Malgun Gothic"/>
+          <w:sz w:val="20"/>
+          <w:szCs w:val="20"/>
+        </w:rPr>
+        <w:t xml:space="preserve">권장 사항 — 상품은 표시용 문자열 대신 상품 ID를 함께 보내는 것이 좋습니다. 현재 구조로는 상품 식별과 금액 검증이 어렵습니다. 상품 ID 체계는 B-4를 참고해주세요.</w:t>
+      </w:r>
+    </w:p>
+    <w:p>
+      <w:pPr>
+        <w:pStyle w:val="ListParagraph"/>
+        <w:numPr>
+          <w:ilvl w:val="0"/>
+          <w:numId w:val="2"/>
+        </w:numPr>
+        <w:spacing w:after="60"/>
+      </w:pPr>
+      <w:r>
+        <w:rPr>
+          <w:rFonts w:ascii="Malgun Gothic" w:cs="Malgun Gothic" w:eastAsia="Malgun Gothic" w:hAnsi="Malgun Gothic"/>
+          <w:sz w:val="20"/>
+          <w:szCs w:val="20"/>
+        </w:rPr>
+        <w:t xml:space="preserve">배송 불가 지역이면 버튼이 비활성화되지만, 서버에서도 한 번 더 확인해주세요 (B-5).</w:t>
+      </w:r>
+    </w:p>
+    <w:p>
+      <w:pPr>
+        <w:pStyle w:val="Heading2"/>
+        <w:spacing w:after="120" w:before="240"/>
+      </w:pPr>
+      <w:r>
+        <w:rPr>
+          <w:rFonts w:ascii="Malgun Gothic" w:cs="Malgun Gothic" w:eastAsia="Malgun Gothic" w:hAnsi="Malgun Gothic"/>
+          <w:b/>
+          <w:bCs/>
+          <w:sz w:val="23"/>
+          <w:szCs w:val="23"/>
+        </w:rPr>
+        <w:t xml:space="preserve">B-4. 상품 카탈로그 확장 (근조화환 4종 추가)</w:t>
+      </w:r>
+    </w:p>
+    <w:p>
+      <w:pPr>
+        <w:spacing w:after="120"/>
+      </w:pPr>
+      <w:r>
+        <w:rPr>
+          <w:rFonts w:ascii="Malgun Gothic" w:cs="Malgun Gothic" w:eastAsia="Malgun Gothic" w:hAnsi="Malgun Gothic"/>
+          <w:sz w:val="20"/>
+          <w:szCs w:val="20"/>
+        </w:rPr>
+        <w:t xml:space="preserve">상품 정보는 DB 연동 대상이 아닌 프론트 정적 데이터입니다. 다만 신청 내용에 상품명과 금액이 포함되므로 목록을 공유합니다.</w:t>
+      </w:r>
+    </w:p>
+    <w:tbl>
+      <w:tblPr>
+        <w:tblW w:type="dxa" w:w="9360"/>
+        <w:tblBorders>
+          <w:top w:val="single" w:color="auto" w:sz="4"/>
+          <w:left w:val="single" w:color="auto" w:sz="4"/>
+          <w:bottom w:val="single" w:color="auto" w:sz="4"/>
+          <w:right w:val="single" w:color="auto" w:sz="4"/>
+          <w:insideH w:val="single" w:color="auto" w:sz="4"/>
+          <w:insideV w:val="single" w:color="auto" w:sz="4"/>
+        </w:tblBorders>
+      </w:tblPr>
+      <w:tblGrid>
+        <w:gridCol w:w="2200"/>
+        <w:gridCol w:w="3200"/>
+        <w:gridCol w:w="1800"/>
+        <w:gridCol w:w="2160"/>
+      </w:tblGrid>
+      <w:tr>
+        <w:trPr>
+          <w:tblHeader/>
+        </w:trPr>
+        <w:tc>
+          <w:tcPr>
+            <w:tcW w:type="dxa" w:w="2200"/>
+            <w:tcBorders>
+              <w:top w:val="single" w:color="D0D5DD" w:sz="4"/>
+              <w:left w:val="single" w:color="D0D5DD" w:sz="4"/>
+              <w:bottom w:val="single" w:color="D0D5DD" w:sz="4"/>
+              <w:right w:val="single" w:color="D0D5DD" w:sz="4"/>
+            </w:tcBorders>
+            <w:shd w:fill="EEF2FF" w:val="clear"/>
+            <w:tcMar>
+              <w:top w:type="dxa" w:w="60"/>
+              <w:left w:type="dxa" w:w="100"/>
+              <w:bottom w:type="dxa" w:w="60"/>
+              <w:right w:type="dxa" w:w="100"/>
+            </w:tcMar>
+          </w:tcPr>
+          <w:p>
+            <w:r>
+              <w:rPr>
+                <w:rFonts w:ascii="Malgun Gothic" w:cs="Malgun Gothic" w:eastAsia="Malgun Gothic" w:hAnsi="Malgun Gothic"/>
+                <w:b/>
+                <w:bCs/>
+                <w:sz w:val="18"/>
+                <w:szCs w:val="18"/>
+              </w:rPr>
+              <w:t xml:space="preserve">상품 ID</w:t>
+            </w:r>
+          </w:p>
+        </w:tc>
+        <w:tc>
+          <w:tcPr>
+            <w:tcW w:type="dxa" w:w="3200"/>
+            <w:tcBorders>
+              <w:top w:val="single" w:color="D0D5DD" w:sz="4"/>
+              <w:left w:val="single" w:color="D0D5DD" w:sz="4"/>
+              <w:bottom w:val="single" w:color="D0D5DD" w:sz="4"/>
+              <w:right w:val="single" w:color="D0D5DD" w:sz="4"/>
+            </w:tcBorders>
+            <w:shd w:fill="EEF2FF" w:val="clear"/>
+            <w:tcMar>
+              <w:top w:type="dxa" w:w="60"/>
+              <w:left w:type="dxa" w:w="100"/>
+              <w:bottom w:type="dxa" w:w="60"/>
+              <w:right w:type="dxa" w:w="100"/>
+            </w:tcMar>
+          </w:tcPr>
+          <w:p>
+            <w:r>
+              <w:rPr>
+                <w:rFonts w:ascii="Malgun Gothic" w:cs="Malgun Gothic" w:eastAsia="Malgun Gothic" w:hAnsi="Malgun Gothic"/>
+                <w:b/>
+                <w:bCs/>
+                <w:sz w:val="18"/>
+                <w:szCs w:val="18"/>
+              </w:rPr>
+              <w:t xml:space="preserve">상품명</w:t>
+            </w:r>
+          </w:p>
+        </w:tc>
+        <w:tc>
+          <w:tcPr>
+            <w:tcW w:type="dxa" w:w="1800"/>
+            <w:tcBorders>
+              <w:top w:val="single" w:color="D0D5DD" w:sz="4"/>
+              <w:left w:val="single" w:color="D0D5DD" w:sz="4"/>
+              <w:bottom w:val="single" w:color="D0D5DD" w:sz="4"/>
+              <w:right w:val="single" w:color="D0D5DD" w:sz="4"/>
+            </w:tcBorders>
+            <w:shd w:fill="EEF2FF" w:val="clear"/>
+            <w:tcMar>
+              <w:top w:type="dxa" w:w="60"/>
+              <w:left w:type="dxa" w:w="100"/>
+              <w:bottom w:type="dxa" w:w="60"/>
+              <w:right w:type="dxa" w:w="100"/>
+            </w:tcMar>
+          </w:tcPr>
+          <w:p>
+            <w:r>
+              <w:rPr>
+                <w:rFonts w:ascii="Malgun Gothic" w:cs="Malgun Gothic" w:eastAsia="Malgun Gothic" w:hAnsi="Malgun Gothic"/>
+                <w:b/>
+                <w:bCs/>
+                <w:sz w:val="18"/>
+                <w:szCs w:val="18"/>
+              </w:rPr>
+              <w:t xml:space="preserve">가격</w:t>
+            </w:r>
+          </w:p>
+        </w:tc>
+        <w:tc>
+          <w:tcPr>
+            <w:tcW w:type="dxa" w:w="2160"/>
+            <w:tcBorders>
+              <w:top w:val="single" w:color="D0D5DD" w:sz="4"/>
+              <w:left w:val="single" w:color="D0D5DD" w:sz="4"/>
+              <w:bottom w:val="single" w:color="D0D5DD" w:sz="4"/>
+              <w:right w:val="single" w:color="D0D5DD" w:sz="4"/>
+            </w:tcBorders>
+            <w:shd w:fill="EEF2FF" w:val="clear"/>
+            <w:tcMar>
+              <w:top w:type="dxa" w:w="60"/>
+              <w:left w:type="dxa" w:w="100"/>
+              <w:bottom w:type="dxa" w:w="60"/>
+              <w:right w:type="dxa" w:w="100"/>
+            </w:tcMar>
+          </w:tcPr>
+          <w:p>
+            <w:r>
+              <w:rPr>
+                <w:rFonts w:ascii="Malgun Gothic" w:cs="Malgun Gothic" w:eastAsia="Malgun Gothic" w:hAnsi="Malgun Gothic"/>
+                <w:b/>
+                <w:bCs/>
+                <w:sz w:val="18"/>
+                <w:szCs w:val="18"/>
+              </w:rPr>
+              <w:t xml:space="preserve">구분</w:t>
+            </w:r>
+          </w:p>
+        </w:tc>
+      </w:tr>
+      <w:tr>
+        <w:tc>
+          <w:tcPr>
+            <w:tcW w:type="dxa" w:w="2200"/>
+            <w:tcBorders>
+              <w:top w:val="single" w:color="D0D5DD" w:sz="4"/>
+              <w:left w:val="single" w:color="D0D5DD" w:sz="4"/>
+              <w:bottom w:val="single" w:color="D0D5DD" w:sz="4"/>
+              <w:right w:val="single" w:color="D0D5DD" w:sz="4"/>
+            </w:tcBorders>
+            <w:tcMar>
+              <w:top w:type="dxa" w:w="60"/>
+              <w:left w:type="dxa" w:w="100"/>
+              <w:bottom w:type="dxa" w:w="60"/>
+              <w:right w:type="dxa" w:w="100"/>
+            </w:tcMar>
+          </w:tcPr>
+          <w:p>
+            <w:r>
+              <w:rPr>
+                <w:rFonts w:ascii="Consolas" w:cs="Consolas" w:eastAsia="Consolas" w:hAnsi="Consolas"/>
+                <w:b w:val="false"/>
+                <w:bCs w:val="false"/>
+                <w:sz w:val="18"/>
+                <w:szCs w:val="18"/>
+              </w:rPr>
+              <w:t xml:space="preserve">tab5-s4-1</w:t>
+            </w:r>
+          </w:p>
+        </w:tc>
+        <w:tc>
+          <w:tcPr>
+            <w:tcW w:type="dxa" w:w="3200"/>
+            <w:tcBorders>
+              <w:top w:val="single" w:color="D0D5DD" w:sz="4"/>
+              <w:left w:val="single" w:color="D0D5DD" w:sz="4"/>
+              <w:bottom w:val="single" w:color="D0D5DD" w:sz="4"/>
+              <w:right w:val="single" w:color="D0D5DD" w:sz="4"/>
+            </w:tcBorders>
+            <w:tcMar>
+              <w:top w:type="dxa" w:w="60"/>
+              <w:left w:type="dxa" w:w="100"/>
+              <w:bottom w:type="dxa" w:w="60"/>
+              <w:right w:type="dxa" w:w="100"/>
+            </w:tcMar>
+          </w:tcPr>
+          <w:p>
+            <w:r>
+              <w:rPr>
+                <w:rFonts w:ascii="Malgun Gothic" w:cs="Malgun Gothic" w:eastAsia="Malgun Gothic" w:hAnsi="Malgun Gothic"/>
+                <w:b w:val="false"/>
+                <w:bCs w:val="false"/>
+                <w:sz w:val="18"/>
+                <w:szCs w:val="18"/>
+              </w:rPr>
+              <w:t xml:space="preserve">근조바구니</w:t>
+            </w:r>
+          </w:p>
+        </w:tc>
+        <w:tc>
+          <w:tcPr>
+            <w:tcW w:type="dxa" w:w="1800"/>
+            <w:tcBorders>
+              <w:top w:val="single" w:color="D0D5DD" w:sz="4"/>
+              <w:left w:val="single" w:color="D0D5DD" w:sz="4"/>
+              <w:bottom w:val="single" w:color="D0D5DD" w:sz="4"/>
+              <w:right w:val="single" w:color="D0D5DD" w:sz="4"/>
+            </w:tcBorders>
+            <w:tcMar>
+              <w:top w:type="dxa" w:w="60"/>
+              <w:left w:type="dxa" w:w="100"/>
+              <w:bottom w:type="dxa" w:w="60"/>
+              <w:right w:type="dxa" w:w="100"/>
+            </w:tcMar>
+          </w:tcPr>
+          <w:p>
+            <w:r>
+              <w:rPr>
+                <w:rFonts w:ascii="Malgun Gothic" w:cs="Malgun Gothic" w:eastAsia="Malgun Gothic" w:hAnsi="Malgun Gothic"/>
+                <w:b w:val="false"/>
+                <w:bCs w:val="false"/>
+                <w:sz w:val="18"/>
+                <w:szCs w:val="18"/>
+              </w:rPr>
+              <w:t xml:space="preserve">50,000원</w:t>
+            </w:r>
+          </w:p>
+        </w:tc>
+        <w:tc>
+          <w:tcPr>
+            <w:tcW w:type="dxa" w:w="2160"/>
+            <w:tcBorders>
+              <w:top w:val="single" w:color="D0D5DD" w:sz="4"/>
+              <w:left w:val="single" w:color="D0D5DD" w:sz="4"/>
+              <w:bottom w:val="single" w:color="D0D5DD" w:sz="4"/>
+              <w:right w:val="single" w:color="D0D5DD" w:sz="4"/>
+            </w:tcBorders>
+            <w:tcMar>
+              <w:top w:type="dxa" w:w="60"/>
+              <w:left w:type="dxa" w:w="100"/>
+              <w:bottom w:type="dxa" w:w="60"/>
+              <w:right w:type="dxa" w:w="100"/>
+            </w:tcMar>
+          </w:tcPr>
+          <w:p>
+            <w:r>
+              <w:rPr>
+                <w:rFonts w:ascii="Malgun Gothic" w:cs="Malgun Gothic" w:eastAsia="Malgun Gothic" w:hAnsi="Malgun Gothic"/>
+                <w:b w:val="false"/>
+                <w:bCs w:val="false"/>
+                <w:sz w:val="18"/>
+                <w:szCs w:val="18"/>
+              </w:rPr>
+              <w:t xml:space="preserve">대체상품 (신규)</w:t>
+            </w:r>
+          </w:p>
+        </w:tc>
+      </w:tr>
+      <w:tr>
+        <w:tc>
+          <w:tcPr>
+            <w:tcW w:type="dxa" w:w="2200"/>
+            <w:tcBorders>
+              <w:top w:val="single" w:color="D0D5DD" w:sz="4"/>
+              <w:left w:val="single" w:color="D0D5DD" w:sz="4"/>
+              <w:bottom w:val="single" w:color="D0D5DD" w:sz="4"/>
+              <w:right w:val="single" w:color="D0D5DD" w:sz="4"/>
+            </w:tcBorders>
+            <w:tcMar>
+              <w:top w:type="dxa" w:w="60"/>
+              <w:left w:type="dxa" w:w="100"/>
+              <w:bottom w:type="dxa" w:w="60"/>
+              <w:right w:type="dxa" w:w="100"/>
+            </w:tcMar>
+          </w:tcPr>
+          <w:p>
+            <w:r>
+              <w:rPr>
+                <w:rFonts w:ascii="Consolas" w:cs="Consolas" w:eastAsia="Consolas" w:hAnsi="Consolas"/>
+                <w:b w:val="false"/>
+                <w:bCs w:val="false"/>
+                <w:sz w:val="18"/>
+                <w:szCs w:val="18"/>
+              </w:rPr>
+              <w:t xml:space="preserve">tab5-s4-2</w:t>
+            </w:r>
+          </w:p>
+        </w:tc>
+        <w:tc>
+          <w:tcPr>
+            <w:tcW w:type="dxa" w:w="3200"/>
+            <w:tcBorders>
+              <w:top w:val="single" w:color="D0D5DD" w:sz="4"/>
+              <w:left w:val="single" w:color="D0D5DD" w:sz="4"/>
+              <w:bottom w:val="single" w:color="D0D5DD" w:sz="4"/>
+              <w:right w:val="single" w:color="D0D5DD" w:sz="4"/>
+            </w:tcBorders>
+            <w:tcMar>
+              <w:top w:type="dxa" w:w="60"/>
+              <w:left w:type="dxa" w:w="100"/>
+              <w:bottom w:type="dxa" w:w="60"/>
+              <w:right w:type="dxa" w:w="100"/>
+            </w:tcMar>
+          </w:tcPr>
+          <w:p>
+            <w:r>
+              <w:rPr>
+                <w:rFonts w:ascii="Malgun Gothic" w:cs="Malgun Gothic" w:eastAsia="Malgun Gothic" w:hAnsi="Malgun Gothic"/>
+                <w:b w:val="false"/>
+                <w:bCs w:val="false"/>
+                <w:sz w:val="18"/>
+                <w:szCs w:val="18"/>
+              </w:rPr>
+              <w:t xml:space="preserve">근조 쌀화환</w:t>
+            </w:r>
+          </w:p>
+        </w:tc>
+        <w:tc>
+          <w:tcPr>
+            <w:tcW w:type="dxa" w:w="1800"/>
+            <w:tcBorders>
+              <w:top w:val="single" w:color="D0D5DD" w:sz="4"/>
+              <w:left w:val="single" w:color="D0D5DD" w:sz="4"/>
+              <w:bottom w:val="single" w:color="D0D5DD" w:sz="4"/>
+              <w:right w:val="single" w:color="D0D5DD" w:sz="4"/>
+            </w:tcBorders>
+            <w:tcMar>
+              <w:top w:type="dxa" w:w="60"/>
+              <w:left w:type="dxa" w:w="100"/>
+              <w:bottom w:type="dxa" w:w="60"/>
+              <w:right w:type="dxa" w:w="100"/>
+            </w:tcMar>
+          </w:tcPr>
+          <w:p>
+            <w:r>
+              <w:rPr>
+                <w:rFonts w:ascii="Malgun Gothic" w:cs="Malgun Gothic" w:eastAsia="Malgun Gothic" w:hAnsi="Malgun Gothic"/>
+                <w:b w:val="false"/>
+                <w:bCs w:val="false"/>
+                <w:sz w:val="18"/>
+                <w:szCs w:val="18"/>
+              </w:rPr>
+              <w:t xml:space="preserve">75,000원</w:t>
+            </w:r>
+          </w:p>
+        </w:tc>
+        <w:tc>
+          <w:tcPr>
+            <w:tcW w:type="dxa" w:w="2160"/>
+            <w:tcBorders>
+              <w:top w:val="single" w:color="D0D5DD" w:sz="4"/>
+              <w:left w:val="single" w:color="D0D5DD" w:sz="4"/>
+              <w:bottom w:val="single" w:color="D0D5DD" w:sz="4"/>
+              <w:right w:val="single" w:color="D0D5DD" w:sz="4"/>
+            </w:tcBorders>
+            <w:tcMar>
+              <w:top w:type="dxa" w:w="60"/>
+              <w:left w:type="dxa" w:w="100"/>
+              <w:bottom w:type="dxa" w:w="60"/>
+              <w:right w:type="dxa" w:w="100"/>
+            </w:tcMar>
+          </w:tcPr>
+          <w:p>
+            <w:r>
+              <w:rPr>
+                <w:rFonts w:ascii="Malgun Gothic" w:cs="Malgun Gothic" w:eastAsia="Malgun Gothic" w:hAnsi="Malgun Gothic"/>
+                <w:b w:val="false"/>
+                <w:bCs w:val="false"/>
+                <w:sz w:val="18"/>
+                <w:szCs w:val="18"/>
+              </w:rPr>
+              <w:t xml:space="preserve">대체상품 (신규)</w:t>
+            </w:r>
+          </w:p>
+        </w:tc>
+      </w:tr>
+      <w:tr>
+        <w:tc>
+          <w:tcPr>
+            <w:tcW w:type="dxa" w:w="2200"/>
+            <w:tcBorders>
+              <w:top w:val="single" w:color="D0D5DD" w:sz="4"/>
+              <w:left w:val="single" w:color="D0D5DD" w:sz="4"/>
+              <w:bottom w:val="single" w:color="D0D5DD" w:sz="4"/>
+              <w:right w:val="single" w:color="D0D5DD" w:sz="4"/>
+            </w:tcBorders>
+            <w:tcMar>
+              <w:top w:type="dxa" w:w="60"/>
+              <w:left w:type="dxa" w:w="100"/>
+              <w:bottom w:type="dxa" w:w="60"/>
+              <w:right w:type="dxa" w:w="100"/>
+            </w:tcMar>
+          </w:tcPr>
+          <w:p>
+            <w:r>
+              <w:rPr>
+                <w:rFonts w:ascii="Consolas" w:cs="Consolas" w:eastAsia="Consolas" w:hAnsi="Consolas"/>
+                <w:b w:val="false"/>
+                <w:bCs w:val="false"/>
+                <w:sz w:val="18"/>
+                <w:szCs w:val="18"/>
+              </w:rPr>
+              <w:t xml:space="preserve">tab5-s4-3</w:t>
+            </w:r>
+          </w:p>
+        </w:tc>
+        <w:tc>
+          <w:tcPr>
+            <w:tcW w:type="dxa" w:w="3200"/>
+            <w:tcBorders>
+              <w:top w:val="single" w:color="D0D5DD" w:sz="4"/>
+              <w:left w:val="single" w:color="D0D5DD" w:sz="4"/>
+              <w:bottom w:val="single" w:color="D0D5DD" w:sz="4"/>
+              <w:right w:val="single" w:color="D0D5DD" w:sz="4"/>
+            </w:tcBorders>
+            <w:tcMar>
+              <w:top w:type="dxa" w:w="60"/>
+              <w:left w:type="dxa" w:w="100"/>
+              <w:bottom w:type="dxa" w:w="60"/>
+              <w:right w:type="dxa" w:w="100"/>
+            </w:tcMar>
+          </w:tcPr>
+          <w:p>
+            <w:r>
+              <w:rPr>
+                <w:rFonts w:ascii="Malgun Gothic" w:cs="Malgun Gothic" w:eastAsia="Malgun Gothic" w:hAnsi="Malgun Gothic"/>
+                <w:b w:val="false"/>
+                <w:bCs w:val="false"/>
+                <w:sz w:val="18"/>
+                <w:szCs w:val="18"/>
+              </w:rPr>
+              <w:t xml:space="preserve">근조 오브제 1단</w:t>
+            </w:r>
+          </w:p>
+        </w:tc>
+        <w:tc>
+          <w:tcPr>
+            <w:tcW w:type="dxa" w:w="1800"/>
+            <w:tcBorders>
+              <w:top w:val="single" w:color="D0D5DD" w:sz="4"/>
+              <w:left w:val="single" w:color="D0D5DD" w:sz="4"/>
+              <w:bottom w:val="single" w:color="D0D5DD" w:sz="4"/>
+              <w:right w:val="single" w:color="D0D5DD" w:sz="4"/>
+            </w:tcBorders>
+            <w:tcMar>
+              <w:top w:type="dxa" w:w="60"/>
+              <w:left w:type="dxa" w:w="100"/>
+              <w:bottom w:type="dxa" w:w="60"/>
+              <w:right w:type="dxa" w:w="100"/>
+            </w:tcMar>
+          </w:tcPr>
+          <w:p>
+            <w:r>
+              <w:rPr>
+                <w:rFonts w:ascii="Malgun Gothic" w:cs="Malgun Gothic" w:eastAsia="Malgun Gothic" w:hAnsi="Malgun Gothic"/>
+                <w:b w:val="false"/>
+                <w:bCs w:val="false"/>
+                <w:sz w:val="18"/>
+                <w:szCs w:val="18"/>
+              </w:rPr>
+              <w:t xml:space="preserve">50,000원</w:t>
+            </w:r>
+          </w:p>
+        </w:tc>
+        <w:tc>
+          <w:tcPr>
+            <w:tcW w:type="dxa" w:w="2160"/>
+            <w:tcBorders>
+              <w:top w:val="single" w:color="D0D5DD" w:sz="4"/>
+              <w:left w:val="single" w:color="D0D5DD" w:sz="4"/>
+              <w:bottom w:val="single" w:color="D0D5DD" w:sz="4"/>
+              <w:right w:val="single" w:color="D0D5DD" w:sz="4"/>
+            </w:tcBorders>
+            <w:tcMar>
+              <w:top w:type="dxa" w:w="60"/>
+              <w:left w:type="dxa" w:w="100"/>
+              <w:bottom w:type="dxa" w:w="60"/>
+              <w:right w:type="dxa" w:w="100"/>
+            </w:tcMar>
+          </w:tcPr>
+          <w:p>
+            <w:r>
+              <w:rPr>
+                <w:rFonts w:ascii="Malgun Gothic" w:cs="Malgun Gothic" w:eastAsia="Malgun Gothic" w:hAnsi="Malgun Gothic"/>
+                <w:b w:val="false"/>
+                <w:bCs w:val="false"/>
+                <w:sz w:val="18"/>
+                <w:szCs w:val="18"/>
+              </w:rPr>
+              <w:t xml:space="preserve">대체상품 (신규)</w:t>
+            </w:r>
+          </w:p>
+        </w:tc>
+      </w:tr>
+      <w:tr>
+        <w:tc>
+          <w:tcPr>
+            <w:tcW w:type="dxa" w:w="2200"/>
+            <w:tcBorders>
+              <w:top w:val="single" w:color="D0D5DD" w:sz="4"/>
+              <w:left w:val="single" w:color="D0D5DD" w:sz="4"/>
+              <w:bottom w:val="single" w:color="D0D5DD" w:sz="4"/>
+              <w:right w:val="single" w:color="D0D5DD" w:sz="4"/>
+            </w:tcBorders>
+            <w:tcMar>
+              <w:top w:type="dxa" w:w="60"/>
+              <w:left w:type="dxa" w:w="100"/>
+              <w:bottom w:type="dxa" w:w="60"/>
+              <w:right w:type="dxa" w:w="100"/>
+            </w:tcMar>
+          </w:tcPr>
+          <w:p>
+            <w:r>
+              <w:rPr>
+                <w:rFonts w:ascii="Consolas" w:cs="Consolas" w:eastAsia="Consolas" w:hAnsi="Consolas"/>
+                <w:b w:val="false"/>
+                <w:bCs w:val="false"/>
+                <w:sz w:val="18"/>
+                <w:szCs w:val="18"/>
+              </w:rPr>
+              <w:t xml:space="preserve">tab5-s4-4</w:t>
+            </w:r>
+          </w:p>
+        </w:tc>
+        <w:tc>
+          <w:tcPr>
+            <w:tcW w:type="dxa" w:w="3200"/>
+            <w:tcBorders>
+              <w:top w:val="single" w:color="D0D5DD" w:sz="4"/>
+              <w:left w:val="single" w:color="D0D5DD" w:sz="4"/>
+              <w:bottom w:val="single" w:color="D0D5DD" w:sz="4"/>
+              <w:right w:val="single" w:color="D0D5DD" w:sz="4"/>
+            </w:tcBorders>
+            <w:tcMar>
+              <w:top w:type="dxa" w:w="60"/>
+              <w:left w:type="dxa" w:w="100"/>
+              <w:bottom w:type="dxa" w:w="60"/>
+              <w:right w:type="dxa" w:w="100"/>
+            </w:tcMar>
+          </w:tcPr>
+          <w:p>
+            <w:r>
+              <w:rPr>
+                <w:rFonts w:ascii="Malgun Gothic" w:cs="Malgun Gothic" w:eastAsia="Malgun Gothic" w:hAnsi="Malgun Gothic"/>
+                <w:b w:val="false"/>
+                <w:bCs w:val="false"/>
+                <w:sz w:val="18"/>
+                <w:szCs w:val="18"/>
+              </w:rPr>
+              <w:t xml:space="preserve">근조 오브제 2단</w:t>
+            </w:r>
+          </w:p>
+        </w:tc>
+        <w:tc>
+          <w:tcPr>
+            <w:tcW w:type="dxa" w:w="1800"/>
+            <w:tcBorders>
+              <w:top w:val="single" w:color="D0D5DD" w:sz="4"/>
+              <w:left w:val="single" w:color="D0D5DD" w:sz="4"/>
+              <w:bottom w:val="single" w:color="D0D5DD" w:sz="4"/>
+              <w:right w:val="single" w:color="D0D5DD" w:sz="4"/>
+            </w:tcBorders>
+            <w:tcMar>
+              <w:top w:type="dxa" w:w="60"/>
+              <w:left w:type="dxa" w:w="100"/>
+              <w:bottom w:type="dxa" w:w="60"/>
+              <w:right w:type="dxa" w:w="100"/>
+            </w:tcMar>
+          </w:tcPr>
+          <w:p>
+            <w:r>
+              <w:rPr>
+                <w:rFonts w:ascii="Malgun Gothic" w:cs="Malgun Gothic" w:eastAsia="Malgun Gothic" w:hAnsi="Malgun Gothic"/>
+                <w:b w:val="false"/>
+                <w:bCs w:val="false"/>
+                <w:sz w:val="18"/>
+                <w:szCs w:val="18"/>
+              </w:rPr>
+              <w:t xml:space="preserve">75,000원</w:t>
+            </w:r>
+          </w:p>
+        </w:tc>
+        <w:tc>
+          <w:tcPr>
+            <w:tcW w:type="dxa" w:w="2160"/>
+            <w:tcBorders>
+              <w:top w:val="single" w:color="D0D5DD" w:sz="4"/>
+              <w:left w:val="single" w:color="D0D5DD" w:sz="4"/>
+              <w:bottom w:val="single" w:color="D0D5DD" w:sz="4"/>
+              <w:right w:val="single" w:color="D0D5DD" w:sz="4"/>
+            </w:tcBorders>
+            <w:tcMar>
+              <w:top w:type="dxa" w:w="60"/>
+              <w:left w:type="dxa" w:w="100"/>
+              <w:bottom w:type="dxa" w:w="60"/>
+              <w:right w:type="dxa" w:w="100"/>
+            </w:tcMar>
+          </w:tcPr>
+          <w:p>
+            <w:r>
+              <w:rPr>
+                <w:rFonts w:ascii="Malgun Gothic" w:cs="Malgun Gothic" w:eastAsia="Malgun Gothic" w:hAnsi="Malgun Gothic"/>
+                <w:b w:val="false"/>
+                <w:bCs w:val="false"/>
+                <w:sz w:val="18"/>
+                <w:szCs w:val="18"/>
+              </w:rPr>
+              <w:t xml:space="preserve">대체상품 (신규)</w:t>
+            </w:r>
+          </w:p>
+        </w:tc>
+      </w:tr>
+    </w:tbl>
+    <w:p>
+      <w:pPr>
+        <w:pStyle w:val="ListParagraph"/>
+        <w:numPr>
+          <w:ilvl w:val="0"/>
+          <w:numId w:val="2"/>
+        </w:numPr>
+        <w:spacing w:after="60"/>
+      </w:pPr>
+      <w:r>
+        <w:rPr>
+          <w:rFonts w:ascii="Malgun Gothic" w:cs="Malgun Gothic" w:eastAsia="Malgun Gothic" w:hAnsi="Malgun Gothic"/>
+          <w:sz w:val="20"/>
+          <w:szCs w:val="20"/>
+        </w:rPr>
+        <w:t xml:space="preserve">기존 근조화환 6종은 변경 없습니다. 근조화환 카테고리는 총 10종이 되었습니다.</w:t>
+      </w:r>
+    </w:p>
+    <w:p>
+      <w:pPr>
+        <w:pStyle w:val="Heading2"/>
+        <w:spacing w:after="120" w:before="240"/>
+      </w:pPr>
+      <w:r>
+        <w:rPr>
+          <w:rFonts w:ascii="Malgun Gothic" w:cs="Malgun Gothic" w:eastAsia="Malgun Gothic" w:hAnsi="Malgun Gothic"/>
+          <w:b/>
+          <w:bCs/>
+          <w:sz w:val="23"/>
+          <w:szCs w:val="23"/>
+        </w:rPr>
+        <w:t xml:space="preserve">B-5. 지역별 반입 제한 — 서버 재검증 권장</w:t>
+      </w:r>
+    </w:p>
+    <w:p>
+      <w:pPr>
+        <w:pStyle w:val="ListParagraph"/>
+        <w:numPr>
+          <w:ilvl w:val="0"/>
+          <w:numId w:val="2"/>
+        </w:numPr>
+        <w:spacing w:after="60"/>
+      </w:pPr>
+      <w:r>
+        <w:rPr>
+          <w:rFonts w:ascii="Malgun Gothic" w:cs="Malgun Gothic" w:eastAsia="Malgun Gothic" w:hAnsi="Malgun Gothic"/>
+          <w:sz w:val="20"/>
+          <w:szCs w:val="20"/>
+        </w:rPr>
+        <w:t xml:space="preserve">반입 제한과 배송 불가 판정은 현재 프론트에서만 이루어집니다. 화면상의 제한이라 우회가 가능하므로, 서버에서도 동일하게 확인해주시길 권합니다.</w:t>
+      </w:r>
+    </w:p>
+    <w:p>
+      <w:pPr>
+        <w:pStyle w:val="ListParagraph"/>
+        <w:numPr>
+          <w:ilvl w:val="0"/>
+          <w:numId w:val="2"/>
+        </w:numPr>
+        <w:spacing w:after="60"/>
+      </w:pPr>
+      <w:r>
+        <w:rPr>
+          <w:rFonts w:ascii="Malgun Gothic" w:cs="Malgun Gothic" w:eastAsia="Malgun Gothic" w:hAnsi="Malgun Gothic"/>
+          <w:sz w:val="20"/>
+          <w:szCs w:val="20"/>
+        </w:rPr>
+        <w:t xml:space="preserve">특히 배송 불가 지역(충남 계룡시, 전남 신안군)은 신청 자체를 차단하고 있어, 서버 검증이 없으면 접수될 수 있습니다.</w:t>
+      </w:r>
+    </w:p>
+    <w:p>
+      <w:pPr>
+        <w:pStyle w:val="ListParagraph"/>
+        <w:numPr>
+          <w:ilvl w:val="0"/>
+          <w:numId w:val="2"/>
+        </w:numPr>
+        <w:spacing w:after="60"/>
+      </w:pPr>
+      <w:r>
+        <w:rPr>
+          <w:rFonts w:ascii="Malgun Gothic" w:cs="Malgun Gothic" w:eastAsia="Malgun Gothic" w:hAnsi="Malgun Gothic"/>
+          <w:sz w:val="20"/>
+          <w:szCs w:val="20"/>
+        </w:rPr>
+        <w:t xml:space="preserve">판정 규칙은 프론트 파일에 고정되어 있어, 규칙이 바뀌면 재배포가 필요합니다. 운영 중 변경이 잦을 것으로 예상되면 백엔드에서 관리하고 API로 내려주는 구조를 검토해주세요.</w:t>
+      </w:r>
+    </w:p>
+    <w:p>
+      <w:pPr>
+        <w:pStyle w:val="ListParagraph"/>
+        <w:numPr>
+          <w:ilvl w:val="0"/>
+          <w:numId w:val="2"/>
+        </w:numPr>
+        <w:spacing w:after="60"/>
+      </w:pPr>
+      <w:r>
+        <w:rPr>
+          <w:rFonts w:ascii="Malgun Gothic" w:cs="Malgun Gothic" w:eastAsia="Malgun Gothic" w:hAnsi="Malgun Gothic"/>
+          <w:sz w:val="20"/>
+          <w:szCs w:val="20"/>
+        </w:rPr>
+        <w:t xml:space="preserve">적용 중인 규칙 전체는 「5-2. 지역별 반입 가이드」 표를 참고해주세요.</w:t>
+      </w:r>
+    </w:p>
+    <w:p>
+      <w:pPr>
+        <w:pStyle w:val="Heading2"/>
+        <w:spacing w:after="120" w:before="240"/>
+      </w:pPr>
+      <w:r>
+        <w:rPr>
+          <w:rFonts w:ascii="Malgun Gothic" w:cs="Malgun Gothic" w:eastAsia="Malgun Gothic" w:hAnsi="Malgun Gothic"/>
+          <w:b/>
+          <w:bCs/>
+          <w:sz w:val="23"/>
+          <w:szCs w:val="23"/>
+        </w:rPr>
+        <w:t xml:space="preserve">B-6. 그 밖에 확인이 필요한 사항</w:t>
+      </w:r>
+    </w:p>
+    <w:p>
+      <w:pPr>
+        <w:pStyle w:val="ListParagraph"/>
+        <w:numPr>
+          <w:ilvl w:val="0"/>
+          <w:numId w:val="2"/>
+        </w:numPr>
+        <w:spacing w:after="60"/>
+      </w:pPr>
+      <w:r>
+        <w:rPr>
+          <w:rFonts w:ascii="Malgun Gothic" w:cs="Malgun Gothic" w:eastAsia="Malgun Gothic" w:hAnsi="Malgun Gothic"/>
+          <w:sz w:val="20"/>
+          <w:szCs w:val="20"/>
+        </w:rPr>
+        <w:t xml:space="preserve">서비스명이 바뀌었습니다. 알림톡 문구, 발신 명의, 안내 메일 등에 옛 명칭(늘푸른바다 경조사 지원센터)이 들어가 있다면 「EBS/GRS 거래처 경조사 접수센터」로 교체가 필요합니다.</w:t>
+      </w:r>
+    </w:p>
+    <w:p>
+      <w:pPr>
+        <w:pStyle w:val="ListParagraph"/>
+        <w:numPr>
+          <w:ilvl w:val="0"/>
+          <w:numId w:val="2"/>
+        </w:numPr>
+        <w:spacing w:after="60"/>
+      </w:pPr>
+      <w:r>
+        <w:rPr>
+          <w:rFonts w:ascii="Malgun Gothic" w:cs="Malgun Gothic" w:eastAsia="Malgun Gothic" w:hAnsi="Malgun Gothic"/>
+          <w:sz w:val="20"/>
+          <w:szCs w:val="20"/>
+        </w:rPr>
+        <w:t xml:space="preserve">신청내역 화면은 아직 예시 데이터로 동작합니다. 현재 표시 항목에 신청사유는 포함되어 있지 않으니, 노출 여부를 협의해주세요.</w:t>
+      </w:r>
+    </w:p>
+    <w:p>
+      <w:pPr>
+        <w:pStyle w:val="ListParagraph"/>
+        <w:numPr>
+          <w:ilvl w:val="0"/>
+          <w:numId w:val="2"/>
+        </w:numPr>
+        <w:spacing w:after="60"/>
+      </w:pPr>
+      <w:r>
+        <w:rPr>
+          <w:rFonts w:ascii="Malgun Gothic" w:cs="Malgun Gothic" w:eastAsia="Malgun Gothic" w:hAnsi="Malgun Gothic"/>
+          <w:sz w:val="20"/>
+          <w:szCs w:val="20"/>
+        </w:rPr>
+        <w:t xml:space="preserve">간편접수(AI 자동입력)는 백엔드에 이미 적용되어 있어, 이번 변경으로 추가 작업이 발생하지 않습니다.</w:t>
+      </w:r>
+    </w:p>
+    <w:p>
+      <w:pPr>
+        <w:pStyle w:val="ListParagraph"/>
+        <w:numPr>
+          <w:ilvl w:val="0"/>
+          <w:numId w:val="2"/>
+        </w:numPr>
+        <w:spacing w:after="60"/>
+      </w:pPr>
+      <w:r>
+        <w:rPr>
+          <w:rFonts w:ascii="Malgun Gothic" w:cs="Malgun Gothic" w:eastAsia="Malgun Gothic" w:hAnsi="Malgun Gothic"/>
+          <w:sz w:val="20"/>
+          <w:szCs w:val="20"/>
+        </w:rPr>
+        <w:t xml:space="preserve">기존 백엔드 인수인계 문서(backend-handoff.docx, 2026-06-04)는 React 기반으로 작성되어 있습니다. 현재는 순수 JavaScript로 전환된 상태라 해당 문서의 구조 설명은 갱신이 필요합니다.</w:t>
+      </w:r>
+    </w:p>
     <w:sectPr>
       <w:pgSz w:w="11906" w:h="16838" w:orient="portrait"/>
       <w:pgMar w:top="1200" w:right="1300" w:bottom="1200" w:left="1300" w:header="708" w:footer="708" w:gutter="0"/>

</xml_diff>

<commit_message>
Auto-fill condolence message for memorial flows
근조화환 상품 선택 시, 그리고 부고장 간편접수로 정보를 불러올 때
경조사어를 「삼가 故人의 冥福을 빕니다」로 미리 채운다.
(리본문구 작성가이드 첫 항목과 동일 문구)

- 이미 입력된 문구가 있으면 덮어쓰지 않음
- 축하화환 / 청첩장에는 적용하지 않음

Co-Authored-By: Claude Fable 5 <noreply@anthropic.com>
</commit_message>
<xml_diff>
--- a/Front_Update.docx
+++ b/Front_Update.docx
@@ -2267,7 +2267,7 @@
                 <w:sz w:val="18"/>
                 <w:szCs w:val="18"/>
               </w:rPr>
-              <w:t xml:space="preserve">133행 mountOverlay</w:t>
+              <w:t xml:space="preserve">16~18행 상수</w:t>
             </w:r>
           </w:p>
         </w:tc>
@@ -2296,7 +2296,7 @@
                 <w:sz w:val="18"/>
                 <w:szCs w:val="18"/>
               </w:rPr>
-              <w:t xml:space="preserve">시트가 닫힐 때 열려 있던 드롭다운도 함께 닫도록 처리 — 화면에 목록만 남는 것을 방지</w:t>
+              <w:t xml:space="preserve">근조 상황의 기본 경조사어(「삼가 故人의 冥福을 빕니다」)와 근조화환 판별 함수 추가</w:t>
             </w:r>
           </w:p>
         </w:tc>
@@ -2327,7 +2327,7 @@
                 <w:sz w:val="18"/>
                 <w:szCs w:val="18"/>
               </w:rPr>
-              <w:t xml:space="preserve">164·178행 buildAppBar / updateAppBar</w:t>
+              <w:t xml:space="preserve">133행 mountOverlay</w:t>
             </w:r>
           </w:p>
         </w:tc>
@@ -2356,7 +2356,7 @@
                 <w:sz w:val="18"/>
                 <w:szCs w:val="18"/>
               </w:rPr>
-              <w:t xml:space="preserve">상단 앱바 기본 타이틀 「경조사 지원센터」 → 「경조사 접수센터」. 상품 선택 모드일 때 상품목록 화면의 타이틀을 「상품 선택」으로, 뒤로가기를 홈이 아닌 주문서로 이동하도록 변경</w:t>
+              <w:t xml:space="preserve">시트가 닫힐 때 열려 있던 드롭다운도 함께 닫도록 처리 — 화면에 목록만 남는 것을 방지</w:t>
             </w:r>
           </w:p>
         </w:tc>
@@ -2387,7 +2387,7 @@
                 <w:sz w:val="18"/>
                 <w:szCs w:val="18"/>
               </w:rPr>
-              <w:t xml:space="preserve">211행 buildApplicantCard</w:t>
+              <w:t xml:space="preserve">164·178행 buildAppBar / updateAppBar</w:t>
             </w:r>
           </w:p>
         </w:tc>
@@ -2416,7 +2416,7 @@
                 <w:sz w:val="18"/>
                 <w:szCs w:val="18"/>
               </w:rPr>
-              <w:t xml:space="preserve">홈 신청인 카드 meta에 회사(company) 표시 추가 → 「회사 · 부서」 형식</w:t>
+              <w:t xml:space="preserve">상단 앱바 기본 타이틀 「경조사 지원센터」 → 「경조사 접수센터」. 상품 선택 모드일 때 상품목록 화면의 타이틀을 「상품 선택」으로, 뒤로가기를 홈이 아닌 주문서로 이동하도록 변경</w:t>
             </w:r>
           </w:p>
         </w:tc>
@@ -2447,7 +2447,7 @@
                 <w:sz w:val="18"/>
                 <w:szCs w:val="18"/>
               </w:rPr>
-              <w:t xml:space="preserve">261행 buildHomeScreen</w:t>
+              <w:t xml:space="preserve">211행 buildApplicantCard</w:t>
             </w:r>
           </w:p>
         </w:tc>
@@ -2476,7 +2476,7 @@
                 <w:sz w:val="18"/>
                 <w:szCs w:val="18"/>
               </w:rPr>
-              <w:t xml:space="preserve">히어로 h2 타이틀의 줄바꿈(\n)이 &lt;br&gt;로 변환되지 않던 기존 버그 수정</w:t>
+              <w:t xml:space="preserve">홈 신청인 카드 meta에 회사(company) 표시 추가 → 「회사 · 부서」 형식</w:t>
             </w:r>
           </w:p>
         </w:tc>
@@ -2507,7 +2507,7 @@
                 <w:sz w:val="18"/>
                 <w:szCs w:val="18"/>
               </w:rPr>
-              <w:t xml:space="preserve">272행 buildHomeScreen</w:t>
+              <w:t xml:space="preserve">261행 buildHomeScreen</w:t>
             </w:r>
           </w:p>
         </w:tc>
@@ -2536,7 +2536,7 @@
                 <w:sz w:val="18"/>
                 <w:szCs w:val="18"/>
               </w:rPr>
-              <w:t xml:space="preserve">홈 카테고리 상품 개수에 대체상품 포함 — 근조화환 6개 → 10개</w:t>
+              <w:t xml:space="preserve">히어로 h2 타이틀의 줄바꿈(\n)이 &lt;br&gt;로 변환되지 않던 기존 버그 수정</w:t>
             </w:r>
           </w:p>
         </w:tc>
@@ -2567,7 +2567,7 @@
                 <w:sz w:val="18"/>
                 <w:szCs w:val="18"/>
               </w:rPr>
-              <w:t xml:space="preserve">331~343행 buildItemsScreen</w:t>
+              <w:t xml:space="preserve">272행 buildHomeScreen</w:t>
             </w:r>
           </w:p>
         </w:tc>
@@ -2596,7 +2596,7 @@
                 <w:sz w:val="18"/>
                 <w:szCs w:val="18"/>
               </w:rPr>
-              <w:t xml:space="preserve">상품목록 근조화환 탭에 대체상품 4종을 상시 노출. 단 상품 선택 모드에서는 주문서 주소의 지역 규칙(matchRegionRule)을 적용해 반입 가능한 상품만 노출 — 제한 지역에서 반입 불가 상품이 선택되는 것을 방지</w:t>
+              <w:t xml:space="preserve">홈 카테고리 상품 개수에 대체상품 포함 — 근조화환 6개 → 10개</w:t>
             </w:r>
           </w:p>
         </w:tc>
@@ -2627,7 +2627,7 @@
                 <w:sz w:val="18"/>
                 <w:szCs w:val="18"/>
               </w:rPr>
-              <w:t xml:space="preserve">344~353행 buildItemsScreen</w:t>
+              <w:t xml:space="preserve">331~343행 buildItemsScreen</w:t>
             </w:r>
           </w:p>
         </w:tc>
@@ -2656,7 +2656,7 @@
                 <w:sz w:val="18"/>
                 <w:szCs w:val="18"/>
               </w:rPr>
-              <w:t xml:space="preserve">상품 선택 모드 안내 배너 추가 — 일반 시 「주문서에 넣을 상품을 선택해주세요」, 제한 지역은 반입 안내, 배송불가 지역은 빨간 경고</w:t>
+              <w:t xml:space="preserve">상품목록 근조화환 탭에 대체상품 4종을 상시 노출. 단 상품 선택 모드에서는 주문서 주소의 지역 규칙(matchRegionRule)을 적용해 반입 가능한 상품만 노출 — 제한 지역에서 반입 불가 상품이 선택되는 것을 방지</w:t>
             </w:r>
           </w:p>
         </w:tc>
@@ -2687,7 +2687,7 @@
                 <w:sz w:val="18"/>
                 <w:szCs w:val="18"/>
               </w:rPr>
-              <w:t xml:space="preserve">645행 openProductPicker</w:t>
+              <w:t xml:space="preserve">344~353행 buildItemsScreen</w:t>
             </w:r>
           </w:p>
         </w:tc>
@@ -2716,7 +2716,7 @@
                 <w:sz w:val="18"/>
                 <w:szCs w:val="18"/>
               </w:rPr>
-              <w:t xml:space="preserve">3번째 인자 opts.rule 추가. 배송불가 규칙이면 상품 대신 「배송 불가 지역이에요」 안내 표시. 제한 규칙이면 근조화환(tab5)에 한해 반입 가능한 상품만 노출(3단 허용 지역은 일반 화환도 함께), 시트 상단에 지역 안내 배너 표시. 규칙이 없으면 대체상품 포함 전체 노출</w:t>
+              <w:t xml:space="preserve">상품 선택 모드 안내 배너 추가 — 일반 시 「주문서에 넣을 상품을 선택해주세요」, 제한 지역은 반입 안내, 배송불가 지역은 빨간 경고</w:t>
             </w:r>
           </w:p>
         </w:tc>
@@ -2747,7 +2747,7 @@
                 <w:sz w:val="18"/>
                 <w:szCs w:val="18"/>
               </w:rPr>
-              <w:t xml:space="preserve">708행 openItemSheet</w:t>
+              <w:t xml:space="preserve">645행 openProductPicker</w:t>
             </w:r>
           </w:p>
         </w:tc>
@@ -2776,7 +2776,7 @@
                 <w:sz w:val="18"/>
                 <w:szCs w:val="18"/>
               </w:rPr>
-              <w:t xml:space="preserve">상품 선택 모드일 때 하단 버튼 문구를 「이 상품으로 주문하기」 → 「이 상품으로 선택」으로 변경</w:t>
+              <w:t xml:space="preserve">3번째 인자 opts.rule 추가. 배송불가 규칙이면 상품 대신 「배송 불가 지역이에요」 안내 표시. 제한 규칙이면 근조화환(tab5)에 한해 반입 가능한 상품만 노출(3단 허용 지역은 일반 화환도 함께), 시트 상단에 지역 안내 배너 표시. 규칙이 없으면 대체상품 포함 전체 노출</w:t>
             </w:r>
           </w:p>
         </w:tc>
@@ -2807,7 +2807,7 @@
                 <w:sz w:val="18"/>
                 <w:szCs w:val="18"/>
               </w:rPr>
-              <w:t xml:space="preserve">712~863행 buildDropdown()</w:t>
+              <w:t xml:space="preserve">708행 openItemSheet</w:t>
             </w:r>
           </w:p>
         </w:tc>
@@ -2836,7 +2836,7 @@
                 <w:sz w:val="18"/>
                 <w:szCs w:val="18"/>
               </w:rPr>
-              <w:t xml:space="preserve">커스텀 드롭다운 컴포넌트 신규. 목록은 시트 크기를 바꾸지 않는 오버레이로 뜬다 — 시트 본문이 스크롤 영역이라 그 안에 두면 잘리므로 화면 최상위에 붙이고 트리거 위치에 맞춰 배치. 선택은 누른 채 끌어서 떼기(끄는 동안 손가락 아래 항목 강조, 목록 끝에 닿으면 자동 스크롤) 또는 열어 둔 뒤 탭. 바깥 클릭 닫기, 동시에 하나만 열림, 화살표키·Esc 지원</w:t>
+              <w:t xml:space="preserve">상품 선택 모드일 때 하단 버튼 문구를 「이 상품으로 주문하기」 → 「이 상품으로 선택」으로 변경</w:t>
             </w:r>
           </w:p>
         </w:tc>
@@ -2867,7 +2867,7 @@
                 <w:sz w:val="18"/>
                 <w:szCs w:val="18"/>
               </w:rPr>
-              <w:t xml:space="preserve">746~769행 measure() / place() / onScroll()</w:t>
+              <w:t xml:space="preserve">712~863행 buildDropdown()</w:t>
             </w:r>
           </w:p>
         </w:tc>
@@ -2896,7 +2896,7 @@
                 <w:sz w:val="18"/>
                 <w:szCs w:val="18"/>
               </w:rPr>
-              <w:t xml:space="preserve">목록 전체 높이는 열 때 한 번만 재고(measure), 배치(place)와 분리. 배치할 때마다 높이 제한을 풀어 다시 재면 목록의 스크롤 위치가 맨 위로 초기화되기 때문. 목록 안에서의 스크롤은 재배치 대상에서 제외해 스크롤이 끊기지 않도록 처리. 목록은 트리거 바로 아래에 띄우되 아래 공간이 너무 좁을 때만 위로 펼침</w:t>
+              <w:t xml:space="preserve">커스텀 드롭다운 컴포넌트 신규. 목록은 시트 크기를 바꾸지 않는 오버레이로 뜬다 — 시트 본문이 스크롤 영역이라 그 안에 두면 잘리므로 화면 최상위에 붙이고 트리거 위치에 맞춰 배치. 선택은 누른 채 끌어서 떼기(끄는 동안 손가락 아래 항목 강조, 목록 끝에 닿으면 자동 스크롤) 또는 열어 둔 뒤 탭. 바깥 클릭 닫기, 동시에 하나만 열림, 화살표키·Esc 지원</w:t>
             </w:r>
           </w:p>
         </w:tc>
@@ -2927,7 +2927,7 @@
                 <w:sz w:val="18"/>
                 <w:szCs w:val="18"/>
               </w:rPr>
-              <w:t xml:space="preserve">865~901행 openApplicantModal</w:t>
+              <w:t xml:space="preserve">746~769행 measure() / place() / onScroll()</w:t>
             </w:r>
           </w:p>
         </w:tc>
@@ -2956,7 +2956,7 @@
                 <w:sz w:val="18"/>
                 <w:szCs w:val="18"/>
               </w:rPr>
-              <w:t xml:space="preserve">부서·직책 자유입력 &lt;input&gt; 삭제 → 회사·부서 커스텀 드롭다운으로 교체(늘푸른바다/고래사, 리테일채널 영업팀 외 6개). 저장 조건이 성함·연락처 2개 → 회사·부서·성함·연락처 4개 필수로 강화. 저장 데이터가 {name, contact, dept, position} → {company, dept, name, contact}로 변경</w:t>
+              <w:t xml:space="preserve">목록 전체 높이는 열 때 한 번만 재고(measure), 배치(place)와 분리. 배치할 때마다 높이 제한을 풀어 다시 재면 목록의 스크롤 위치가 맨 위로 초기화되기 때문. 목록 안에서의 스크롤은 재배치 대상에서 제외해 스크롤이 끊기지 않도록 처리. 목록은 트리거 바로 아래에 띄우되 아래 공간이 너무 좁을 때만 위로 펼침</w:t>
             </w:r>
           </w:p>
         </w:tc>
@@ -2987,7 +2987,7 @@
                 <w:sz w:val="18"/>
                 <w:szCs w:val="18"/>
               </w:rPr>
-              <w:t xml:space="preserve">907행 buildOrderScreen · 상품 항목</w:t>
+              <w:t xml:space="preserve">865~901행 openApplicantModal</w:t>
             </w:r>
           </w:p>
         </w:tc>
@@ -3016,7 +3016,7 @@
                 <w:sz w:val="18"/>
                 <w:szCs w:val="18"/>
               </w:rPr>
-              <w:t xml:space="preserve">「2. 상품 분류 및 이름」을 직접 입력에서 선택형으로 전환 (select: true). 누르면 상품목록 화면으로 이동하며, 상품 선택 시 자동으로 주문서에 채워짐</w:t>
+              <w:t xml:space="preserve">부서·직책 자유입력 &lt;input&gt; 삭제 → 회사·부서 커스텀 드롭다운으로 교체(늘푸른바다/고래사, 리테일채널 영업팀 외 6개). 저장 조건이 성함·연락처 2개 → 회사·부서·성함·연락처 4개 필수로 강화. 저장 데이터가 {name, contact, dept, position} → {company, dept, name, contact}로 변경</w:t>
             </w:r>
           </w:p>
         </w:tc>
@@ -3047,7 +3047,7 @@
                 <w:sz w:val="18"/>
                 <w:szCs w:val="18"/>
               </w:rPr>
-              <w:t xml:space="preserve">912행 buildOrderScreen · 신청사유</w:t>
+              <w:t xml:space="preserve">907행 buildOrderScreen · 상품 항목</w:t>
             </w:r>
           </w:p>
         </w:tc>
@@ -3076,7 +3076,7 @@
                 <w:sz w:val="18"/>
                 <w:szCs w:val="18"/>
               </w:rPr>
-              <w:t xml:space="preserve">입력 항목 배열에 「7. 신청사유」(여러 줄) 추가 — 항목 번호·진행바 자동 반영</w:t>
+              <w:t xml:space="preserve">「2. 상품 분류 및 이름」을 직접 입력에서 선택형으로 전환 (select: true). 누르면 상품목록 화면으로 이동하며, 상품 선택 시 자동으로 주문서에 채워짐</w:t>
             </w:r>
           </w:p>
         </w:tc>
@@ -3107,7 +3107,7 @@
                 <w:sz w:val="18"/>
                 <w:szCs w:val="18"/>
               </w:rPr>
-              <w:t xml:space="preserve">959~969·990~1004행 buildOrderScreen</w:t>
+              <w:t xml:space="preserve">912행 buildOrderScreen · 신청사유</w:t>
             </w:r>
           </w:p>
         </w:tc>
@@ -3136,7 +3136,7 @@
                 <w:sz w:val="18"/>
                 <w:szCs w:val="18"/>
               </w:rPr>
-              <w:t xml:space="preserve">선택형 항목 렌더링 분기 추가 — 입력창 대신 화살표가 달린 선택 버튼(.field.selectable / .field-trigger) 생성. setFieldValue()가 입력창과 선택 버튼 표시값을 모두 갱신하도록 확장</w:t>
+              <w:t xml:space="preserve">입력 항목 배열에 「7. 신청사유」(여러 줄) 추가 — 항목 번호·진행바 자동 반영</w:t>
             </w:r>
           </w:p>
         </w:tc>
@@ -3167,7 +3167,7 @@
                 <w:sz w:val="18"/>
                 <w:szCs w:val="18"/>
               </w:rPr>
-              <w:t xml:space="preserve">970·1009·1011~1023행 buildOrderScreen</w:t>
+              <w:t xml:space="preserve">959~969·990~1004행 buildOrderScreen</w:t>
             </w:r>
           </w:p>
         </w:tc>
@@ -3196,7 +3196,7 @@
                 <w:sz w:val="18"/>
                 <w:szCs w:val="18"/>
               </w:rPr>
-              <w:t xml:space="preserve">주소 입력란 바로 아래 지역 안내 배너 영역(regionNoteHost) 추가. updateRegionNote(): 주소 변경 시 matchRegionRule로 판정해 제한 지역은 파란 안내, 배송불가는 빨간 경고 배너 표시 + 신청 버튼 비활성화</w:t>
+              <w:t xml:space="preserve">선택형 항목 렌더링 분기 추가 — 입력창 대신 화살표가 달린 선택 버튼(.field.selectable / .field-trigger) 생성. setFieldValue()가 입력창과 선택 버튼 표시값을 모두 갱신하도록 확장</w:t>
             </w:r>
           </w:p>
         </w:tc>
@@ -3227,7 +3227,7 @@
                 <w:sz w:val="18"/>
                 <w:szCs w:val="18"/>
               </w:rPr>
-              <w:t xml:space="preserve">1034행 send()</w:t>
+              <w:t xml:space="preserve">970·1009·1011~1023행 buildOrderScreen</w:t>
             </w:r>
           </w:p>
         </w:tc>
@@ -3256,7 +3256,7 @@
                 <w:sz w:val="18"/>
                 <w:szCs w:val="18"/>
               </w:rPr>
-              <w:t xml:space="preserve">신청 시 배송불가 지역이면 「배송 불가 지역이라 신청할 수 없어요」 토스트 후 차단</w:t>
+              <w:t xml:space="preserve">주소 입력란 바로 아래 지역 안내 배너 영역(regionNoteHost) 추가. updateRegionNote(): 주소 변경 시 matchRegionRule로 판정해 제한 지역은 파란 안내, 배송불가는 빨간 경고 배너 표시 + 신청 버튼 비활성화</w:t>
             </w:r>
           </w:p>
         </w:tc>
@@ -3287,7 +3287,7 @@
                 <w:sz w:val="18"/>
                 <w:szCs w:val="18"/>
               </w:rPr>
-              <w:t xml:space="preserve">1039~1058행 handleIntake</w:t>
+              <w:t xml:space="preserve">1034행 send()</w:t>
             </w:r>
           </w:p>
         </w:tc>
@@ -3316,7 +3316,7 @@
                 <w:sz w:val="18"/>
                 <w:szCs w:val="18"/>
               </w:rPr>
-              <w:t xml:space="preserve">간편접수로 불러온 주소의 지역 규칙을 상품선택 바텀시트에 전달(부고장만 적용). 배송불가 지역이면 시트 미오픈 + 차단 안내. 바텀시트 오픈을 지연 처리 — 간편접수 시트 닫힘과 겹치며 화면 스크롤 잠금이 풀리던 버그 수정</w:t>
+              <w:t xml:space="preserve">신청 시 배송불가 지역이면 「배송 불가 지역이라 신청할 수 없어요」 토스트 후 차단</w:t>
             </w:r>
           </w:p>
         </w:tc>
@@ -3347,7 +3347,7 @@
                 <w:sz w:val="18"/>
                 <w:szCs w:val="18"/>
               </w:rPr>
-              <w:t xml:space="preserve">1093~1105행 go() / orderProduct()</w:t>
+              <w:t xml:space="preserve">1039~1058행 handleIntake</w:t>
             </w:r>
           </w:p>
         </w:tc>
@@ -3376,7 +3376,67 @@
                 <w:sz w:val="18"/>
                 <w:szCs w:val="18"/>
               </w:rPr>
-              <w:t xml:space="preserve">화면 이동 시 상품목록을 벗어나면 선택 모드 해제. 상품 선택 결과를 S.orderForm.product에 저장 후 주문서로 복귀</w:t>
+              <w:t xml:space="preserve">부고장이면 경조사어를 기본 문구로 미리 채움(이미 입력된 문구가 있으면 유지). 간편접수로 불러온 주소의 지역 규칙을 상품선택 바텀시트에 전달(부고장만 적용). 배송불가 지역이면 시트 미오픈 + 차단 안내. 바텀시트 오픈을 지연 처리 — 간편접수 시트 닫힘과 겹치며 화면 스크롤 잠금이 풀리던 버그 수정</w:t>
+            </w:r>
+          </w:p>
+        </w:tc>
+      </w:tr>
+      <w:tr>
+        <w:tc>
+          <w:tcPr>
+            <w:tcW w:type="dxa" w:w="2600"/>
+            <w:tcBorders>
+              <w:top w:val="single" w:color="D0D5DD" w:sz="4"/>
+              <w:left w:val="single" w:color="D0D5DD" w:sz="4"/>
+              <w:bottom w:val="single" w:color="D0D5DD" w:sz="4"/>
+              <w:right w:val="single" w:color="D0D5DD" w:sz="4"/>
+            </w:tcBorders>
+            <w:tcMar>
+              <w:top w:type="dxa" w:w="60"/>
+              <w:left w:type="dxa" w:w="100"/>
+              <w:bottom w:type="dxa" w:w="60"/>
+              <w:right w:type="dxa" w:w="100"/>
+            </w:tcMar>
+          </w:tcPr>
+          <w:p>
+            <w:r>
+              <w:rPr>
+                <w:rFonts w:ascii="Consolas" w:cs="Consolas" w:eastAsia="Consolas" w:hAnsi="Consolas"/>
+                <w:b w:val="false"/>
+                <w:bCs w:val="false"/>
+                <w:sz w:val="18"/>
+                <w:szCs w:val="18"/>
+              </w:rPr>
+              <w:t xml:space="preserve">1128~1133행 orderProduct()</w:t>
+            </w:r>
+          </w:p>
+        </w:tc>
+        <w:tc>
+          <w:tcPr>
+            <w:tcW w:type="dxa" w:w="6760"/>
+            <w:tcBorders>
+              <w:top w:val="single" w:color="D0D5DD" w:sz="4"/>
+              <w:left w:val="single" w:color="D0D5DD" w:sz="4"/>
+              <w:bottom w:val="single" w:color="D0D5DD" w:sz="4"/>
+              <w:right w:val="single" w:color="D0D5DD" w:sz="4"/>
+            </w:tcBorders>
+            <w:tcMar>
+              <w:top w:type="dxa" w:w="60"/>
+              <w:left w:type="dxa" w:w="100"/>
+              <w:bottom w:type="dxa" w:w="60"/>
+              <w:right w:type="dxa" w:w="100"/>
+            </w:tcMar>
+          </w:tcPr>
+          <w:p>
+            <w:r>
+              <w:rPr>
+                <w:rFonts w:ascii="Malgun Gothic" w:cs="Malgun Gothic" w:eastAsia="Malgun Gothic" w:hAnsi="Malgun Gothic"/>
+                <w:b w:val="false"/>
+                <w:bCs w:val="false"/>
+                <w:sz w:val="18"/>
+                <w:szCs w:val="18"/>
+              </w:rPr>
+              <w:t xml:space="preserve">상품 선택 결과를 S.orderForm.product에 저장 후 주문서로 복귀. 근조화환을 선택한 경우 경조사어를 기본 문구로 미리 채움(이미 입력된 문구가 있으면 유지). 화면 이동 시 상품목록을 벗어나면 선택 모드 해제</w:t>
             </w:r>
           </w:p>
         </w:tc>
@@ -8503,7 +8563,90 @@
           <w:sz w:val="23"/>
           <w:szCs w:val="23"/>
         </w:rPr>
-        <w:t xml:space="preserve">6-3. '7. 신청사유' 신규 추가</w:t>
+        <w:t xml:space="preserve">6-3. 경조사어 자동 입력</w:t>
+      </w:r>
+    </w:p>
+    <w:p>
+      <w:pPr>
+        <w:spacing w:after="120"/>
+      </w:pPr>
+      <w:r>
+        <w:rPr>
+          <w:rFonts w:ascii="Malgun Gothic" w:cs="Malgun Gothic" w:eastAsia="Malgun Gothic" w:hAnsi="Malgun Gothic"/>
+          <w:sz w:val="20"/>
+          <w:szCs w:val="20"/>
+        </w:rPr>
+        <w:t xml:space="preserve">근조 상황에서는 리본문구 우측(경조사어)에 「삼가 故人의 冥福을 빕니다」가 자동으로 채워집니다.</w:t>
+      </w:r>
+    </w:p>
+    <w:p>
+      <w:pPr>
+        <w:pStyle w:val="ListParagraph"/>
+        <w:numPr>
+          <w:ilvl w:val="0"/>
+          <w:numId w:val="2"/>
+        </w:numPr>
+        <w:spacing w:after="60"/>
+      </w:pPr>
+      <w:r>
+        <w:rPr>
+          <w:rFonts w:ascii="Malgun Gothic" w:cs="Malgun Gothic" w:eastAsia="Malgun Gothic" w:hAnsi="Malgun Gothic"/>
+          <w:sz w:val="20"/>
+          <w:szCs w:val="20"/>
+        </w:rPr>
+        <w:t xml:space="preserve">적용 시점 — ① 상품목록에서 근조화환 상품을 선택했을 때, ② 부고장 간편접수로 정보를 불러왔을 때</w:t>
+      </w:r>
+    </w:p>
+    <w:p>
+      <w:pPr>
+        <w:pStyle w:val="ListParagraph"/>
+        <w:numPr>
+          <w:ilvl w:val="0"/>
+          <w:numId w:val="2"/>
+        </w:numPr>
+        <w:spacing w:after="60"/>
+      </w:pPr>
+      <w:r>
+        <w:rPr>
+          <w:rFonts w:ascii="Malgun Gothic" w:cs="Malgun Gothic" w:eastAsia="Malgun Gothic" w:hAnsi="Malgun Gothic"/>
+          <w:sz w:val="20"/>
+          <w:szCs w:val="20"/>
+        </w:rPr>
+        <w:t xml:space="preserve">이미 입력해 둔 문구가 있으면 덮어쓰지 않습니다. 다른 문구를 원하면 「간편선택」으로 바꾸거나 직접 수정할 수 있습니다.</w:t>
+      </w:r>
+    </w:p>
+    <w:p>
+      <w:pPr>
+        <w:pStyle w:val="ListParagraph"/>
+        <w:numPr>
+          <w:ilvl w:val="0"/>
+          <w:numId w:val="2"/>
+        </w:numPr>
+        <w:spacing w:after="60"/>
+      </w:pPr>
+      <w:r>
+        <w:rPr>
+          <w:rFonts w:ascii="Malgun Gothic" w:cs="Malgun Gothic" w:eastAsia="Malgun Gothic" w:hAnsi="Malgun Gothic"/>
+          <w:sz w:val="20"/>
+          <w:szCs w:val="20"/>
+        </w:rPr>
+        <w:t xml:space="preserve">축하화환 선택이나 청첩장 간편접수에는 적용되지 않습니다.</w:t>
+      </w:r>
+    </w:p>
+    <w:p>
+      <w:pPr>
+        <w:pStyle w:val="Heading2"/>
+        <w:spacing w:after="120" w:before="240"/>
+      </w:pPr>
+      <w:r>
+        <w:rPr>
+          <w:rFonts w:ascii="Malgun Gothic" w:cs="Malgun Gothic" w:eastAsia="Malgun Gothic" w:hAnsi="Malgun Gothic"/>
+          <w:b/>
+          <w:bCs/>
+          <w:sz w:val="23"/>
+          <w:szCs w:val="23"/>
+        </w:rPr>
+        <w:t xml:space="preserve">6-4. '7. 신청사유' 신규 추가</w:t>
       </w:r>
     </w:p>
     <w:p>
@@ -10351,7 +10494,7 @@
                 <w:sz w:val="18"/>
                 <w:szCs w:val="18"/>
               </w:rPr>
-              <w:t xml:space="preserve">한 줄 문자열</w:t>
+              <w:t xml:space="preserve">한 줄 문자열 · 근조 상황에서는 기본 문구가 미리 채워져 전송될 수 있음</w:t>
             </w:r>
           </w:p>
         </w:tc>

</xml_diff>

<commit_message>
Let users pick the recipient from intake results
간편접수로 불러온 받는 분 정보를 사람 단위로 나눠 선택 목록으로 제공.
부고장은 고인·상주, 청첩장은 신랑·신부·혼주 등이 각각 항목으로 표시된다.

- parseRecipientOptions(): 구분자로 나누고, 따로 떨어진 연락처를 각 사람에 부착
- openChoiceSheet(): 목록 선택 공용 시트 신설, 기존 최근작성 시트도 이걸로 정리
- 후보가 1명이면 시트 없이 바로 입력, 시트를 닫으면 원문 그대로 입력
- 선택 후 상품 선택 시트로 이어짐
- showToast: 시트가 열려 있으면 위쪽에 표시 (선택 항목을 가리던 문제)
- dev-mock: 혼주 포함 샘플 추가

Co-Authored-By: Claude Fable 5 <noreply@anthropic.com>
</commit_message>
<xml_diff>
--- a/Front_Update.docx
+++ b/Front_Update.docx
@@ -1857,7 +1857,7 @@
           <w:sz w:val="18"/>
           <w:szCs w:val="18"/>
         </w:rPr>
-        <w:t xml:space="preserve">  수정 25곳</w:t>
+        <w:t xml:space="preserve">  수정 29곳</w:t>
       </w:r>
     </w:p>
     <w:tbl>
@@ -2087,7 +2087,7 @@
                 <w:sz w:val="18"/>
                 <w:szCs w:val="18"/>
               </w:rPr>
-              <w:t xml:space="preserve">1073~1078행 buildOrderScreen</w:t>
+              <w:t xml:space="preserve">1132~1137행 buildOrderScreen</w:t>
             </w:r>
           </w:p>
         </w:tc>
@@ -2327,7 +2327,7 @@
                 <w:sz w:val="18"/>
                 <w:szCs w:val="18"/>
               </w:rPr>
-              <w:t xml:space="preserve">133행 mountOverlay</w:t>
+              <w:t xml:space="preserve">18~37행 받는 분 파싱</w:t>
             </w:r>
           </w:p>
         </w:tc>
@@ -2356,7 +2356,7 @@
                 <w:sz w:val="18"/>
                 <w:szCs w:val="18"/>
               </w:rPr>
-              <w:t xml:space="preserve">시트가 닫힐 때 열려 있던 드롭다운도 함께 닫도록 처리 — 화면에 목록만 남는 것을 방지</w:t>
+              <w:t xml:space="preserve">간편접수로 불러온 받는 분 문자열을 사람 단위로 분리하는 함수 추가. 구분자(/ · , 줄바꿈)로 나누고, 따로 떨어진 연락처는 연락처가 없는 사람에게 붙여준다</w:t>
             </w:r>
           </w:p>
         </w:tc>
@@ -2387,7 +2387,7 @@
                 <w:sz w:val="18"/>
                 <w:szCs w:val="18"/>
               </w:rPr>
-              <w:t xml:space="preserve">164·178행 buildAppBar / updateAppBar</w:t>
+              <w:t xml:space="preserve">133행 mountOverlay</w:t>
             </w:r>
           </w:p>
         </w:tc>
@@ -2416,7 +2416,7 @@
                 <w:sz w:val="18"/>
                 <w:szCs w:val="18"/>
               </w:rPr>
-              <w:t xml:space="preserve">상단 앱바 기본 타이틀 「경조사 지원센터」 → 「경조사 접수센터」. 상품 선택 모드일 때 상품목록 화면의 타이틀을 「상품 선택」으로, 뒤로가기를 홈이 아닌 주문서로 이동하도록 변경</w:t>
+              <w:t xml:space="preserve">시트가 닫힐 때 열려 있던 드롭다운도 함께 닫도록 처리 — 화면에 목록만 남는 것을 방지</w:t>
             </w:r>
           </w:p>
         </w:tc>
@@ -2447,7 +2447,7 @@
                 <w:sz w:val="18"/>
                 <w:szCs w:val="18"/>
               </w:rPr>
-              <w:t xml:space="preserve">211행 buildApplicantCard</w:t>
+              <w:t xml:space="preserve">164·178행 buildAppBar / updateAppBar</w:t>
             </w:r>
           </w:p>
         </w:tc>
@@ -2476,7 +2476,7 @@
                 <w:sz w:val="18"/>
                 <w:szCs w:val="18"/>
               </w:rPr>
-              <w:t xml:space="preserve">홈 신청인 카드 meta에 회사(company) 표시 추가 → 「회사 · 부서」 형식</w:t>
+              <w:t xml:space="preserve">상단 앱바 기본 타이틀 「경조사 지원센터」 → 「경조사 접수센터」. 상품 선택 모드일 때 상품목록 화면의 타이틀을 「상품 선택」으로, 뒤로가기를 홈이 아닌 주문서로 이동하도록 변경</w:t>
             </w:r>
           </w:p>
         </w:tc>
@@ -2507,7 +2507,7 @@
                 <w:sz w:val="18"/>
                 <w:szCs w:val="18"/>
               </w:rPr>
-              <w:t xml:space="preserve">261행 buildHomeScreen</w:t>
+              <w:t xml:space="preserve">211행 buildApplicantCard</w:t>
             </w:r>
           </w:p>
         </w:tc>
@@ -2536,7 +2536,7 @@
                 <w:sz w:val="18"/>
                 <w:szCs w:val="18"/>
               </w:rPr>
-              <w:t xml:space="preserve">히어로 h2 타이틀의 줄바꿈(\n)이 &lt;br&gt;로 변환되지 않던 기존 버그 수정</w:t>
+              <w:t xml:space="preserve">홈 신청인 카드 meta에 회사(company) 표시 추가 → 「회사 · 부서」 형식</w:t>
             </w:r>
           </w:p>
         </w:tc>
@@ -2567,7 +2567,7 @@
                 <w:sz w:val="18"/>
                 <w:szCs w:val="18"/>
               </w:rPr>
-              <w:t xml:space="preserve">272행 buildHomeScreen</w:t>
+              <w:t xml:space="preserve">261행 buildHomeScreen</w:t>
             </w:r>
           </w:p>
         </w:tc>
@@ -2596,7 +2596,7 @@
                 <w:sz w:val="18"/>
                 <w:szCs w:val="18"/>
               </w:rPr>
-              <w:t xml:space="preserve">홈 카테고리 상품 개수에 대체상품 포함 — 근조화환 6개 → 10개</w:t>
+              <w:t xml:space="preserve">히어로 h2 타이틀의 줄바꿈(\n)이 &lt;br&gt;로 변환되지 않던 기존 버그 수정</w:t>
             </w:r>
           </w:p>
         </w:tc>
@@ -2627,7 +2627,7 @@
                 <w:sz w:val="18"/>
                 <w:szCs w:val="18"/>
               </w:rPr>
-              <w:t xml:space="preserve">331~343행 buildItemsScreen</w:t>
+              <w:t xml:space="preserve">272행 buildHomeScreen</w:t>
             </w:r>
           </w:p>
         </w:tc>
@@ -2656,7 +2656,7 @@
                 <w:sz w:val="18"/>
                 <w:szCs w:val="18"/>
               </w:rPr>
-              <w:t xml:space="preserve">상품목록 근조화환 탭에 대체상품 4종을 상시 노출. 단 상품 선택 모드에서는 주문서 주소의 지역 규칙(matchRegionRule)을 적용해 반입 가능한 상품만 노출 — 제한 지역에서 반입 불가 상품이 선택되는 것을 방지</w:t>
+              <w:t xml:space="preserve">홈 카테고리 상품 개수에 대체상품 포함 — 근조화환 6개 → 10개</w:t>
             </w:r>
           </w:p>
         </w:tc>
@@ -2687,7 +2687,7 @@
                 <w:sz w:val="18"/>
                 <w:szCs w:val="18"/>
               </w:rPr>
-              <w:t xml:space="preserve">344~353행 buildItemsScreen</w:t>
+              <w:t xml:space="preserve">331~343행 buildItemsScreen</w:t>
             </w:r>
           </w:p>
         </w:tc>
@@ -2716,7 +2716,7 @@
                 <w:sz w:val="18"/>
                 <w:szCs w:val="18"/>
               </w:rPr>
-              <w:t xml:space="preserve">상품 선택 모드 안내 배너 추가 — 일반 시 「주문서에 넣을 상품을 선택해주세요」, 제한 지역은 반입 안내, 배송불가 지역은 빨간 경고</w:t>
+              <w:t xml:space="preserve">상품목록 근조화환 탭에 대체상품 4종을 상시 노출. 단 상품 선택 모드에서는 주문서 주소의 지역 규칙(matchRegionRule)을 적용해 반입 가능한 상품만 노출 — 제한 지역에서 반입 불가 상품이 선택되는 것을 방지</w:t>
             </w:r>
           </w:p>
         </w:tc>
@@ -2747,7 +2747,7 @@
                 <w:sz w:val="18"/>
                 <w:szCs w:val="18"/>
               </w:rPr>
-              <w:t xml:space="preserve">645행 openProductPicker</w:t>
+              <w:t xml:space="preserve">344~353행 buildItemsScreen</w:t>
             </w:r>
           </w:p>
         </w:tc>
@@ -2776,7 +2776,7 @@
                 <w:sz w:val="18"/>
                 <w:szCs w:val="18"/>
               </w:rPr>
-              <w:t xml:space="preserve">3번째 인자 opts.rule 추가. 배송불가 규칙이면 상품 대신 「배송 불가 지역이에요」 안내 표시. 제한 규칙이면 근조화환(tab5)에 한해 반입 가능한 상품만 노출(3단 허용 지역은 일반 화환도 함께), 시트 상단에 지역 안내 배너 표시. 규칙이 없으면 대체상품 포함 전체 노출</w:t>
+              <w:t xml:space="preserve">상품 선택 모드 안내 배너 추가 — 일반 시 「주문서에 넣을 상품을 선택해주세요」, 제한 지역은 반입 안내, 배송불가 지역은 빨간 경고</w:t>
             </w:r>
           </w:p>
         </w:tc>
@@ -2807,7 +2807,7 @@
                 <w:sz w:val="18"/>
                 <w:szCs w:val="18"/>
               </w:rPr>
-              <w:t xml:space="preserve">708행 openItemSheet</w:t>
+              <w:t xml:space="preserve">518~552행 openChoiceSheet() / openRecentSenders()</w:t>
             </w:r>
           </w:p>
         </w:tc>
@@ -2836,7 +2836,7 @@
                 <w:sz w:val="18"/>
                 <w:szCs w:val="18"/>
               </w:rPr>
-              <w:t xml:space="preserve">상품 선택 모드일 때 하단 버튼 문구를 「이 상품으로 주문하기」 → 「이 상품으로 선택」으로 변경</w:t>
+              <w:t xml:space="preserve">목록에서 하나 고르는 공용 시트 추가. 기존 「최근작성 보내는분」 시트를 이 공용 함수로 정리하고, 간편접수의 받는 분 선택에도 같은 시트를 사용</w:t>
             </w:r>
           </w:p>
         </w:tc>
@@ -2867,7 +2867,7 @@
                 <w:sz w:val="18"/>
                 <w:szCs w:val="18"/>
               </w:rPr>
-              <w:t xml:space="preserve">712~863행 buildDropdown()</w:t>
+              <w:t xml:space="preserve">645행 openProductPicker</w:t>
             </w:r>
           </w:p>
         </w:tc>
@@ -2896,7 +2896,7 @@
                 <w:sz w:val="18"/>
                 <w:szCs w:val="18"/>
               </w:rPr>
-              <w:t xml:space="preserve">커스텀 드롭다운 컴포넌트 신규. 목록은 시트 크기를 바꾸지 않는 오버레이로 뜬다 — 시트 본문이 스크롤 영역이라 그 안에 두면 잘리므로 화면 최상위에 붙이고 트리거 위치에 맞춰 배치. 선택은 누른 채 끌어서 떼기(끄는 동안 손가락 아래 항목 강조, 목록 끝에 닿으면 자동 스크롤) 또는 열어 둔 뒤 탭. 바깥 클릭 닫기, 동시에 하나만 열림, 화살표키·Esc 지원</w:t>
+              <w:t xml:space="preserve">3번째 인자 opts.rule 추가. 배송불가 규칙이면 상품 대신 「배송 불가 지역이에요」 안내 표시. 제한 규칙이면 근조화환(tab5)에 한해 반입 가능한 상품만 노출(3단 허용 지역은 일반 화환도 함께), 시트 상단에 지역 안내 배너 표시. 규칙이 없으면 대체상품 포함 전체 노출</w:t>
             </w:r>
           </w:p>
         </w:tc>
@@ -2927,7 +2927,7 @@
                 <w:sz w:val="18"/>
                 <w:szCs w:val="18"/>
               </w:rPr>
-              <w:t xml:space="preserve">746~769행 measure() / place() / onScroll()</w:t>
+              <w:t xml:space="preserve">708행 openItemSheet</w:t>
             </w:r>
           </w:p>
         </w:tc>
@@ -2956,7 +2956,7 @@
                 <w:sz w:val="18"/>
                 <w:szCs w:val="18"/>
               </w:rPr>
-              <w:t xml:space="preserve">목록 전체 높이는 열 때 한 번만 재고(measure), 배치(place)와 분리. 배치할 때마다 높이 제한을 풀어 다시 재면 목록의 스크롤 위치가 맨 위로 초기화되기 때문. 목록 안에서의 스크롤은 재배치 대상에서 제외해 스크롤이 끊기지 않도록 처리. 목록은 트리거 바로 아래에 띄우되 아래 공간이 너무 좁을 때만 위로 펼침</w:t>
+              <w:t xml:space="preserve">상품 선택 모드일 때 하단 버튼 문구를 「이 상품으로 주문하기」 → 「이 상품으로 선택」으로 변경</w:t>
             </w:r>
           </w:p>
         </w:tc>
@@ -2987,7 +2987,7 @@
                 <w:sz w:val="18"/>
                 <w:szCs w:val="18"/>
               </w:rPr>
-              <w:t xml:space="preserve">865~901행 openApplicantModal</w:t>
+              <w:t xml:space="preserve">712~863행 buildDropdown()</w:t>
             </w:r>
           </w:p>
         </w:tc>
@@ -3016,7 +3016,7 @@
                 <w:sz w:val="18"/>
                 <w:szCs w:val="18"/>
               </w:rPr>
-              <w:t xml:space="preserve">부서·직책 자유입력 &lt;input&gt; 삭제 → 회사·부서 커스텀 드롭다운으로 교체(늘푸른바다/고래사, 리테일채널 영업팀 외 6개). 저장 조건이 성함·연락처 2개 → 회사·부서·성함·연락처 4개 필수로 강화. 저장 데이터가 {name, contact, dept, position} → {company, dept, name, contact}로 변경</w:t>
+              <w:t xml:space="preserve">커스텀 드롭다운 컴포넌트 신규. 목록은 시트 크기를 바꾸지 않는 오버레이로 뜬다 — 시트 본문이 스크롤 영역이라 그 안에 두면 잘리므로 화면 최상위에 붙이고 트리거 위치에 맞춰 배치. 선택은 누른 채 끌어서 떼기(끄는 동안 손가락 아래 항목 강조, 목록 끝에 닿으면 자동 스크롤) 또는 열어 둔 뒤 탭. 바깥 클릭 닫기, 동시에 하나만 열림, 화살표키·Esc 지원</w:t>
             </w:r>
           </w:p>
         </w:tc>
@@ -3047,7 +3047,7 @@
                 <w:sz w:val="18"/>
                 <w:szCs w:val="18"/>
               </w:rPr>
-              <w:t xml:space="preserve">907행 buildOrderScreen · 상품 항목</w:t>
+              <w:t xml:space="preserve">746~769행 measure() / place() / onScroll()</w:t>
             </w:r>
           </w:p>
         </w:tc>
@@ -3076,7 +3076,7 @@
                 <w:sz w:val="18"/>
                 <w:szCs w:val="18"/>
               </w:rPr>
-              <w:t xml:space="preserve">「2. 상품 분류 및 이름」을 직접 입력에서 선택형으로 전환 (select: true). 누르면 상품목록 화면으로 이동하며, 상품 선택 시 자동으로 주문서에 채워짐</w:t>
+              <w:t xml:space="preserve">목록 전체 높이는 열 때 한 번만 재고(measure), 배치(place)와 분리. 배치할 때마다 높이 제한을 풀어 다시 재면 목록의 스크롤 위치가 맨 위로 초기화되기 때문. 목록 안에서의 스크롤은 재배치 대상에서 제외해 스크롤이 끊기지 않도록 처리. 목록은 트리거 바로 아래에 띄우되 아래 공간이 너무 좁을 때만 위로 펼침</w:t>
             </w:r>
           </w:p>
         </w:tc>
@@ -3107,7 +3107,7 @@
                 <w:sz w:val="18"/>
                 <w:szCs w:val="18"/>
               </w:rPr>
-              <w:t xml:space="preserve">912행 buildOrderScreen · 신청사유</w:t>
+              <w:t xml:space="preserve">910~946행 openApplicantModal</w:t>
             </w:r>
           </w:p>
         </w:tc>
@@ -3136,7 +3136,7 @@
                 <w:sz w:val="18"/>
                 <w:szCs w:val="18"/>
               </w:rPr>
-              <w:t xml:space="preserve">입력 항목 배열에 「7. 신청사유」(여러 줄) 추가 — 항목 번호·진행바 자동 반영</w:t>
+              <w:t xml:space="preserve">부서·직책 자유입력 &lt;input&gt; 삭제 → 회사·부서 커스텀 드롭다운으로 교체(늘푸른바다/고래사, 리테일채널 영업팀 외 6개). 저장 조건이 성함·연락처 2개 → 회사·부서·성함·연락처 4개 필수로 강화. 저장 데이터가 {name, contact, dept, position} → {company, dept, name, contact}로 변경</w:t>
             </w:r>
           </w:p>
         </w:tc>
@@ -3167,7 +3167,7 @@
                 <w:sz w:val="18"/>
                 <w:szCs w:val="18"/>
               </w:rPr>
-              <w:t xml:space="preserve">959~969·990~1004행 buildOrderScreen</w:t>
+              <w:t xml:space="preserve">952행 buildOrderScreen · 상품 항목</w:t>
             </w:r>
           </w:p>
         </w:tc>
@@ -3196,7 +3196,7 @@
                 <w:sz w:val="18"/>
                 <w:szCs w:val="18"/>
               </w:rPr>
-              <w:t xml:space="preserve">선택형 항목 렌더링 분기 추가 — 입력창 대신 화살표가 달린 선택 버튼(.field.selectable / .field-trigger) 생성. setFieldValue()가 입력창과 선택 버튼 표시값을 모두 갱신하도록 확장</w:t>
+              <w:t xml:space="preserve">「2. 상품 분류 및 이름」을 직접 입력에서 선택형으로 전환 (select: true). 누르면 상품목록 화면으로 이동하며, 상품 선택 시 자동으로 주문서에 채워짐</w:t>
             </w:r>
           </w:p>
         </w:tc>
@@ -3227,7 +3227,7 @@
                 <w:sz w:val="18"/>
                 <w:szCs w:val="18"/>
               </w:rPr>
-              <w:t xml:space="preserve">970·1009·1011~1023행 buildOrderScreen</w:t>
+              <w:t xml:space="preserve">957행 buildOrderScreen · 신청사유</w:t>
             </w:r>
           </w:p>
         </w:tc>
@@ -3256,7 +3256,7 @@
                 <w:sz w:val="18"/>
                 <w:szCs w:val="18"/>
               </w:rPr>
-              <w:t xml:space="preserve">주소 입력란 바로 아래 지역 안내 배너 영역(regionNoteHost) 추가. updateRegionNote(): 주소 변경 시 matchRegionRule로 판정해 제한 지역은 파란 안내, 배송불가는 빨간 경고 배너 표시 + 신청 버튼 비활성화</w:t>
+              <w:t xml:space="preserve">입력 항목 배열에 「7. 신청사유」(여러 줄) 추가 — 항목 번호·진행바 자동 반영</w:t>
             </w:r>
           </w:p>
         </w:tc>
@@ -3287,7 +3287,7 @@
                 <w:sz w:val="18"/>
                 <w:szCs w:val="18"/>
               </w:rPr>
-              <w:t xml:space="preserve">1034행 send()</w:t>
+              <w:t xml:space="preserve">1006~1016·1037~1051행 buildOrderScreen</w:t>
             </w:r>
           </w:p>
         </w:tc>
@@ -3316,7 +3316,7 @@
                 <w:sz w:val="18"/>
                 <w:szCs w:val="18"/>
               </w:rPr>
-              <w:t xml:space="preserve">신청 시 배송불가 지역이면 「배송 불가 지역이라 신청할 수 없어요」 토스트 후 차단</w:t>
+              <w:t xml:space="preserve">선택형 항목 렌더링 분기 추가 — 입력창 대신 화살표가 달린 선택 버튼(.field.selectable / .field-trigger) 생성. setFieldValue()가 입력창과 선택 버튼 표시값을 모두 갱신하도록 확장</w:t>
             </w:r>
           </w:p>
         </w:tc>
@@ -3347,7 +3347,7 @@
                 <w:sz w:val="18"/>
                 <w:szCs w:val="18"/>
               </w:rPr>
-              <w:t xml:space="preserve">1039~1058행 handleIntake</w:t>
+              <w:t xml:space="preserve">1017·1056·1058~1070행 buildOrderScreen</w:t>
             </w:r>
           </w:p>
         </w:tc>
@@ -3376,7 +3376,7 @@
                 <w:sz w:val="18"/>
                 <w:szCs w:val="18"/>
               </w:rPr>
-              <w:t xml:space="preserve">부고장이면 경조사어를 기본 문구로 미리 채움(이미 입력된 문구가 있으면 유지). 간편접수로 불러온 주소의 지역 규칙을 상품선택 바텀시트에 전달(부고장만 적용). 배송불가 지역이면 시트 미오픈 + 차단 안내. 바텀시트 오픈을 지연 처리 — 간편접수 시트 닫힘과 겹치며 화면 스크롤 잠금이 풀리던 버그 수정</w:t>
+              <w:t xml:space="preserve">주소 입력란 바로 아래 지역 안내 배너 영역(regionNoteHost) 추가. updateRegionNote(): 주소 변경 시 matchRegionRule로 판정해 제한 지역은 파란 안내, 배송불가는 빨간 경고 배너 표시 + 신청 버튼 비활성화</w:t>
             </w:r>
           </w:p>
         </w:tc>
@@ -3407,7 +3407,7 @@
                 <w:sz w:val="18"/>
                 <w:szCs w:val="18"/>
               </w:rPr>
-              <w:t xml:space="preserve">1128~1133행 orderProduct()</w:t>
+              <w:t xml:space="preserve">966~972행 showToast()</w:t>
             </w:r>
           </w:p>
         </w:tc>
@@ -3436,7 +3436,7 @@
                 <w:sz w:val="18"/>
                 <w:szCs w:val="18"/>
               </w:rPr>
-              <w:t xml:space="preserve">상품 선택 결과를 S.orderForm.product에 저장 후 주문서로 복귀. 근조화환을 선택한 경우 경조사어를 기본 문구로 미리 채움(이미 입력된 문구가 있으면 유지). 화면 이동 시 상품목록을 벗어나면 선택 모드 해제</w:t>
+              <w:t xml:space="preserve">바텀시트가 열려 있으면 안내 문구를 화면 위쪽에 띄우도록 변경 — 시트의 선택 항목을 가리던 문제 수정</w:t>
             </w:r>
           </w:p>
         </w:tc>
@@ -3467,7 +3467,187 @@
                 <w:sz w:val="18"/>
                 <w:szCs w:val="18"/>
               </w:rPr>
-              <w:t xml:space="preserve">1128·1142~1143행 mountSplash</w:t>
+              <w:t xml:space="preserve">1081행 send()</w:t>
+            </w:r>
+          </w:p>
+        </w:tc>
+        <w:tc>
+          <w:tcPr>
+            <w:tcW w:type="dxa" w:w="6760"/>
+            <w:tcBorders>
+              <w:top w:val="single" w:color="D0D5DD" w:sz="4"/>
+              <w:left w:val="single" w:color="D0D5DD" w:sz="4"/>
+              <w:bottom w:val="single" w:color="D0D5DD" w:sz="4"/>
+              <w:right w:val="single" w:color="D0D5DD" w:sz="4"/>
+            </w:tcBorders>
+            <w:tcMar>
+              <w:top w:type="dxa" w:w="60"/>
+              <w:left w:type="dxa" w:w="100"/>
+              <w:bottom w:type="dxa" w:w="60"/>
+              <w:right w:type="dxa" w:w="100"/>
+            </w:tcMar>
+          </w:tcPr>
+          <w:p>
+            <w:r>
+              <w:rPr>
+                <w:rFonts w:ascii="Malgun Gothic" w:cs="Malgun Gothic" w:eastAsia="Malgun Gothic" w:hAnsi="Malgun Gothic"/>
+                <w:b w:val="false"/>
+                <w:bCs w:val="false"/>
+                <w:sz w:val="18"/>
+                <w:szCs w:val="18"/>
+              </w:rPr>
+              <w:t xml:space="preserve">신청 시 배송불가 지역이면 「배송 불가 지역이라 신청할 수 없어요」 토스트 후 차단</w:t>
+            </w:r>
+          </w:p>
+        </w:tc>
+      </w:tr>
+      <w:tr>
+        <w:tc>
+          <w:tcPr>
+            <w:tcW w:type="dxa" w:w="2600"/>
+            <w:tcBorders>
+              <w:top w:val="single" w:color="D0D5DD" w:sz="4"/>
+              <w:left w:val="single" w:color="D0D5DD" w:sz="4"/>
+              <w:bottom w:val="single" w:color="D0D5DD" w:sz="4"/>
+              <w:right w:val="single" w:color="D0D5DD" w:sz="4"/>
+            </w:tcBorders>
+            <w:tcMar>
+              <w:top w:type="dxa" w:w="60"/>
+              <w:left w:type="dxa" w:w="100"/>
+              <w:bottom w:type="dxa" w:w="60"/>
+              <w:right w:type="dxa" w:w="100"/>
+            </w:tcMar>
+          </w:tcPr>
+          <w:p>
+            <w:r>
+              <w:rPr>
+                <w:rFonts w:ascii="Consolas" w:cs="Consolas" w:eastAsia="Consolas" w:hAnsi="Consolas"/>
+                <w:b w:val="false"/>
+                <w:bCs w:val="false"/>
+                <w:sz w:val="18"/>
+                <w:szCs w:val="18"/>
+              </w:rPr>
+              <w:t xml:space="preserve">1086~1123행 handleIntake</w:t>
+            </w:r>
+          </w:p>
+        </w:tc>
+        <w:tc>
+          <w:tcPr>
+            <w:tcW w:type="dxa" w:w="6760"/>
+            <w:tcBorders>
+              <w:top w:val="single" w:color="D0D5DD" w:sz="4"/>
+              <w:left w:val="single" w:color="D0D5DD" w:sz="4"/>
+              <w:bottom w:val="single" w:color="D0D5DD" w:sz="4"/>
+              <w:right w:val="single" w:color="D0D5DD" w:sz="4"/>
+            </w:tcBorders>
+            <w:tcMar>
+              <w:top w:type="dxa" w:w="60"/>
+              <w:left w:type="dxa" w:w="100"/>
+              <w:bottom w:type="dxa" w:w="60"/>
+              <w:right w:type="dxa" w:w="100"/>
+            </w:tcMar>
+          </w:tcPr>
+          <w:p>
+            <w:r>
+              <w:rPr>
+                <w:rFonts w:ascii="Malgun Gothic" w:cs="Malgun Gothic" w:eastAsia="Malgun Gothic" w:hAnsi="Malgun Gothic"/>
+                <w:b w:val="false"/>
+                <w:bCs w:val="false"/>
+                <w:sz w:val="18"/>
+                <w:szCs w:val="18"/>
+              </w:rPr>
+              <w:t xml:space="preserve">불러온 받는 분이 여러 명이면 선택 시트를 먼저 띄우고, 고른 뒤 상품 선택으로 이어짐(한 명이면 바로 입력). 부고장이면 경조사어를 기본 문구로 미리 채움(이미 입력된 문구가 있으면 유지). 불러온 주소의 지역 규칙을 상품선택 바텀시트에 전달(부고장만 적용). 배송불가 지역이면 시트 미오픈 + 차단 안내. 바텀시트 오픈을 지연 처리 — 간편접수 시트 닫힘과 겹치며 화면 스크롤 잠금이 풀리던 버그 수정</w:t>
+            </w:r>
+          </w:p>
+        </w:tc>
+      </w:tr>
+      <w:tr>
+        <w:tc>
+          <w:tcPr>
+            <w:tcW w:type="dxa" w:w="2600"/>
+            <w:tcBorders>
+              <w:top w:val="single" w:color="D0D5DD" w:sz="4"/>
+              <w:left w:val="single" w:color="D0D5DD" w:sz="4"/>
+              <w:bottom w:val="single" w:color="D0D5DD" w:sz="4"/>
+              <w:right w:val="single" w:color="D0D5DD" w:sz="4"/>
+            </w:tcBorders>
+            <w:tcMar>
+              <w:top w:type="dxa" w:w="60"/>
+              <w:left w:type="dxa" w:w="100"/>
+              <w:bottom w:type="dxa" w:w="60"/>
+              <w:right w:type="dxa" w:w="100"/>
+            </w:tcMar>
+          </w:tcPr>
+          <w:p>
+            <w:r>
+              <w:rPr>
+                <w:rFonts w:ascii="Consolas" w:cs="Consolas" w:eastAsia="Consolas" w:hAnsi="Consolas"/>
+                <w:b w:val="false"/>
+                <w:bCs w:val="false"/>
+                <w:sz w:val="18"/>
+                <w:szCs w:val="18"/>
+              </w:rPr>
+              <w:t xml:space="preserve">1185~1190행 orderProduct()</w:t>
+            </w:r>
+          </w:p>
+        </w:tc>
+        <w:tc>
+          <w:tcPr>
+            <w:tcW w:type="dxa" w:w="6760"/>
+            <w:tcBorders>
+              <w:top w:val="single" w:color="D0D5DD" w:sz="4"/>
+              <w:left w:val="single" w:color="D0D5DD" w:sz="4"/>
+              <w:bottom w:val="single" w:color="D0D5DD" w:sz="4"/>
+              <w:right w:val="single" w:color="D0D5DD" w:sz="4"/>
+            </w:tcBorders>
+            <w:tcMar>
+              <w:top w:type="dxa" w:w="60"/>
+              <w:left w:type="dxa" w:w="100"/>
+              <w:bottom w:type="dxa" w:w="60"/>
+              <w:right w:type="dxa" w:w="100"/>
+            </w:tcMar>
+          </w:tcPr>
+          <w:p>
+            <w:r>
+              <w:rPr>
+                <w:rFonts w:ascii="Malgun Gothic" w:cs="Malgun Gothic" w:eastAsia="Malgun Gothic" w:hAnsi="Malgun Gothic"/>
+                <w:b w:val="false"/>
+                <w:bCs w:val="false"/>
+                <w:sz w:val="18"/>
+                <w:szCs w:val="18"/>
+              </w:rPr>
+              <w:t xml:space="preserve">상품 선택 결과를 S.orderForm.product에 저장 후 주문서로 복귀. 근조화환을 선택한 경우 경조사어를 기본 문구로 미리 채움(이미 입력된 문구가 있으면 유지). 화면 이동 시 상품목록을 벗어나면 선택 모드 해제</w:t>
+            </w:r>
+          </w:p>
+        </w:tc>
+      </w:tr>
+      <w:tr>
+        <w:tc>
+          <w:tcPr>
+            <w:tcW w:type="dxa" w:w="2600"/>
+            <w:tcBorders>
+              <w:top w:val="single" w:color="D0D5DD" w:sz="4"/>
+              <w:left w:val="single" w:color="D0D5DD" w:sz="4"/>
+              <w:bottom w:val="single" w:color="D0D5DD" w:sz="4"/>
+              <w:right w:val="single" w:color="D0D5DD" w:sz="4"/>
+            </w:tcBorders>
+            <w:tcMar>
+              <w:top w:type="dxa" w:w="60"/>
+              <w:left w:type="dxa" w:w="100"/>
+              <w:bottom w:type="dxa" w:w="60"/>
+              <w:right w:type="dxa" w:w="100"/>
+            </w:tcMar>
+          </w:tcPr>
+          <w:p>
+            <w:r>
+              <w:rPr>
+                <w:rFonts w:ascii="Consolas" w:cs="Consolas" w:eastAsia="Consolas" w:hAnsi="Consolas"/>
+                <w:b w:val="false"/>
+                <w:bCs w:val="false"/>
+                <w:sz w:val="18"/>
+                <w:szCs w:val="18"/>
+              </w:rPr>
+              <w:t xml:space="preserve">1213·1227~1228행 mountSplash</w:t>
             </w:r>
           </w:p>
         </w:tc>
@@ -3693,7 +3873,7 @@
           <w:sz w:val="18"/>
           <w:szCs w:val="18"/>
         </w:rPr>
-        <w:t xml:space="preserve">  수정 2곳</w:t>
+        <w:t xml:space="preserve">  수정 3곳</w:t>
       </w:r>
     </w:p>
     <w:tbl>
@@ -3833,6 +4013,66 @@
                 <w:szCs w:val="18"/>
               </w:rPr>
               <w:t xml:space="preserve">커스텀 드롭다운 스타일 신규 — 트리거는 기존 입력창과 동일한 톤(테두리·포커스 링), 열림 시 인디고 테두리와 화살표 회전. 목록은 화면에 떠서 아래 항목을 덮으며 그림자로 층을 구분. 선택 항목은 인디고 굵은 글씨 + 체크, 끌고 지나가는 항목은 연한 인디고로 강조. 끌어서 선택하는 동안 화면 스크롤·텍스트 선택이 끼어들지 않도록 처리</w:t>
+            </w:r>
+          </w:p>
+        </w:tc>
+      </w:tr>
+      <w:tr>
+        <w:tc>
+          <w:tcPr>
+            <w:tcW w:type="dxa" w:w="2600"/>
+            <w:tcBorders>
+              <w:top w:val="single" w:color="D0D5DD" w:sz="4"/>
+              <w:left w:val="single" w:color="D0D5DD" w:sz="4"/>
+              <w:bottom w:val="single" w:color="D0D5DD" w:sz="4"/>
+              <w:right w:val="single" w:color="D0D5DD" w:sz="4"/>
+            </w:tcBorders>
+            <w:tcMar>
+              <w:top w:type="dxa" w:w="60"/>
+              <w:left w:type="dxa" w:w="100"/>
+              <w:bottom w:type="dxa" w:w="60"/>
+              <w:right w:type="dxa" w:w="100"/>
+            </w:tcMar>
+          </w:tcPr>
+          <w:p>
+            <w:r>
+              <w:rPr>
+                <w:rFonts w:ascii="Consolas" w:cs="Consolas" w:eastAsia="Consolas" w:hAnsi="Consolas"/>
+                <w:b w:val="false"/>
+                <w:bCs w:val="false"/>
+                <w:sz w:val="18"/>
+                <w:szCs w:val="18"/>
+              </w:rPr>
+              <w:t xml:space="preserve">1334행 .toast.toast-top</w:t>
+            </w:r>
+          </w:p>
+        </w:tc>
+        <w:tc>
+          <w:tcPr>
+            <w:tcW w:type="dxa" w:w="6760"/>
+            <w:tcBorders>
+              <w:top w:val="single" w:color="D0D5DD" w:sz="4"/>
+              <w:left w:val="single" w:color="D0D5DD" w:sz="4"/>
+              <w:bottom w:val="single" w:color="D0D5DD" w:sz="4"/>
+              <w:right w:val="single" w:color="D0D5DD" w:sz="4"/>
+            </w:tcBorders>
+            <w:tcMar>
+              <w:top w:type="dxa" w:w="60"/>
+              <w:left w:type="dxa" w:w="100"/>
+              <w:bottom w:type="dxa" w:w="60"/>
+              <w:right w:type="dxa" w:w="100"/>
+            </w:tcMar>
+          </w:tcPr>
+          <w:p>
+            <w:r>
+              <w:rPr>
+                <w:rFonts w:ascii="Malgun Gothic" w:cs="Malgun Gothic" w:eastAsia="Malgun Gothic" w:hAnsi="Malgun Gothic"/>
+                <w:b w:val="false"/>
+                <w:bCs w:val="false"/>
+                <w:sz w:val="18"/>
+                <w:szCs w:val="18"/>
+              </w:rPr>
+              <w:t xml:space="preserve">바텀시트 위에 뜨는 안내 문구 위치 스타일 추가</w:t>
             </w:r>
           </w:p>
         </w:tc>
@@ -8744,6 +8984,42 @@
           <w:szCs w:val="20"/>
         </w:rPr>
         <w:t xml:space="preserve">청첩장 간편접수: 주소 불러오기 → 축하화환 선택 바텀시트 자동 오픈 (기존 흐름 유지).</w:t>
+      </w:r>
+    </w:p>
+    <w:p>
+      <w:pPr>
+        <w:pStyle w:val="ListParagraph"/>
+        <w:numPr>
+          <w:ilvl w:val="0"/>
+          <w:numId w:val="2"/>
+        </w:numPr>
+        <w:spacing w:after="60"/>
+      </w:pPr>
+      <w:r>
+        <w:rPr>
+          <w:rFonts w:ascii="Malgun Gothic" w:cs="Malgun Gothic" w:eastAsia="Malgun Gothic" w:hAnsi="Malgun Gothic"/>
+          <w:sz w:val="20"/>
+          <w:szCs w:val="20"/>
+        </w:rPr>
+        <w:t xml:space="preserve">받는 분이 여러 명이면 선택 목록을 먼저 보여줍니다. 부고장은 고인·상주, 청첩장은 신랑·신부·혼주처럼 불러온 사람이 각각 항목으로 표시되며, 한 분을 고르면 연락처와 함께 「받는 분 정보」에 입력되고 이어서 상품 선택으로 넘어갑니다.</w:t>
+      </w:r>
+    </w:p>
+    <w:p>
+      <w:pPr>
+        <w:pStyle w:val="ListParagraph"/>
+        <w:numPr>
+          <w:ilvl w:val="0"/>
+          <w:numId w:val="2"/>
+        </w:numPr>
+        <w:spacing w:after="60"/>
+      </w:pPr>
+      <w:r>
+        <w:rPr>
+          <w:rFonts w:ascii="Malgun Gothic" w:cs="Malgun Gothic" w:eastAsia="Malgun Gothic" w:hAnsi="Malgun Gothic"/>
+          <w:sz w:val="20"/>
+          <w:szCs w:val="20"/>
+        </w:rPr>
+        <w:t xml:space="preserve">불러온 사람이 한 명뿐이면 선택 과정 없이 바로 입력됩니다. 선택 목록을 그냥 닫으면 불러온 내용이 그대로 입력됩니다.</w:t>
       </w:r>
     </w:p>
     <w:p>

</xml_diff>

<commit_message>
Document recipient string parsing; make mock samples phone-less
연락처 없는 부고장/청첩장이 더 흔하다는 점 반영.

- dev-mock: 6건 중 5건을 연락처 없는 샘플로 교체 (이름만 자동 기입되는지 확인용)
- app.js: 파서 주석을 연락처 없는 경우 중심으로 정리 (동작 변경 없음)
- Front_Update.docx: [백엔드 영역 참고자료] 에 B-6 신설 —
  받는 분 문자열의 구분자 규칙, 연락처 선택 사항, 동작 예시 표.
  구분자 없이 이어 붙으면 한 사람으로 인식되므로 백엔드 확인 요청 기재.

Co-Authored-By: Claude Fable 5 <noreply@anthropic.com>
</commit_message>
<xml_diff>
--- a/Front_Update.docx
+++ b/Front_Update.docx
@@ -9001,7 +9001,7 @@
           <w:sz w:val="20"/>
           <w:szCs w:val="20"/>
         </w:rPr>
-        <w:t xml:space="preserve">받는 분이 여러 명이면 선택 목록을 먼저 보여줍니다. 부고장은 고인·상주, 청첩장은 신랑·신부·혼주처럼 불러온 사람이 각각 항목으로 표시되며, 한 분을 고르면 연락처와 함께 「받는 분 정보」에 입력되고 이어서 상품 선택으로 넘어갑니다.</w:t>
+        <w:t xml:space="preserve">받는 분이 여러 명이면 선택 목록을 먼저 보여줍니다. 부고장은 고인·상주, 청첩장은 신랑·신부·혼주처럼 불러온 사람이 각각 항목으로 표시되며, 한 분을 고르면 「받는 분 정보」에 입력되고 이어서 상품 선택으로 넘어갑니다. 연락처는 있을 때만 함께 붙고, 없으면 「상주 이지훈」처럼 이름만 입력됩니다.</w:t>
       </w:r>
     </w:p>
     <w:p>
@@ -11741,7 +11741,866 @@
           <w:sz w:val="23"/>
           <w:szCs w:val="23"/>
         </w:rPr>
-        <w:t xml:space="preserve">B-6. 그 밖에 확인이 필요한 사항</w:t>
+        <w:t xml:space="preserve">B-6. 간편접수 '받는 분' 문자열 — 구분자 확인 요청</w:t>
+      </w:r>
+    </w:p>
+    <w:p>
+      <w:pPr>
+        <w:spacing w:after="120"/>
+      </w:pPr>
+      <w:r>
+        <w:rPr>
+          <w:rFonts w:ascii="Malgun Gothic" w:cs="Malgun Gothic" w:eastAsia="Malgun Gothic" w:hAnsi="Malgun Gothic"/>
+          <w:sz w:val="20"/>
+          <w:szCs w:val="20"/>
+        </w:rPr>
+        <w:t xml:space="preserve">간편접수 응답의 받는 분(recipient)은 여러 사람이 한 줄 문자열로 내려옵니다. 프런트는 이 문자열을 사람 단위로 나눠 선택 목록으로 보여주므로, 응답 형식이 아래 규칙에서 벗어나면 사람이 제대로 분리되지 않습니다. 백엔드에서 다양한 부고장·청첩장으로 이 부분을 확인해주시길 요청드립니다.</w:t>
+      </w:r>
+    </w:p>
+    <w:p>
+      <w:pPr>
+        <w:spacing w:after="120"/>
+      </w:pPr>
+      <w:r>
+        <w:rPr>
+          <w:rFonts w:ascii="Malgun Gothic" w:cs="Malgun Gothic" w:eastAsia="Malgun Gothic" w:hAnsi="Malgun Gothic"/>
+          <w:b/>
+          <w:bCs/>
+          <w:sz w:val="20"/>
+          <w:szCs w:val="20"/>
+        </w:rPr>
+        <w:t xml:space="preserve">프런트가 해석하는 규칙</w:t>
+      </w:r>
+    </w:p>
+    <w:tbl>
+      <w:tblPr>
+        <w:tblW w:type="dxa" w:w="9360"/>
+        <w:tblBorders>
+          <w:top w:val="single" w:color="auto" w:sz="4"/>
+          <w:left w:val="single" w:color="auto" w:sz="4"/>
+          <w:bottom w:val="single" w:color="auto" w:sz="4"/>
+          <w:right w:val="single" w:color="auto" w:sz="4"/>
+          <w:insideH w:val="single" w:color="auto" w:sz="4"/>
+          <w:insideV w:val="single" w:color="auto" w:sz="4"/>
+        </w:tblBorders>
+      </w:tblPr>
+      <w:tblGrid>
+        <w:gridCol w:w="2300"/>
+        <w:gridCol w:w="7060"/>
+      </w:tblGrid>
+      <w:tr>
+        <w:trPr>
+          <w:tblHeader/>
+        </w:trPr>
+        <w:tc>
+          <w:tcPr>
+            <w:tcW w:type="dxa" w:w="2300"/>
+            <w:tcBorders>
+              <w:top w:val="single" w:color="D0D5DD" w:sz="4"/>
+              <w:left w:val="single" w:color="D0D5DD" w:sz="4"/>
+              <w:bottom w:val="single" w:color="D0D5DD" w:sz="4"/>
+              <w:right w:val="single" w:color="D0D5DD" w:sz="4"/>
+            </w:tcBorders>
+            <w:shd w:fill="EEF2FF" w:val="clear"/>
+            <w:tcMar>
+              <w:top w:type="dxa" w:w="60"/>
+              <w:left w:type="dxa" w:w="100"/>
+              <w:bottom w:type="dxa" w:w="60"/>
+              <w:right w:type="dxa" w:w="100"/>
+            </w:tcMar>
+          </w:tcPr>
+          <w:p>
+            <w:r>
+              <w:rPr>
+                <w:rFonts w:ascii="Malgun Gothic" w:cs="Malgun Gothic" w:eastAsia="Malgun Gothic" w:hAnsi="Malgun Gothic"/>
+                <w:b/>
+                <w:bCs/>
+                <w:sz w:val="18"/>
+                <w:szCs w:val="18"/>
+              </w:rPr>
+              <w:t xml:space="preserve">구분</w:t>
+            </w:r>
+          </w:p>
+        </w:tc>
+        <w:tc>
+          <w:tcPr>
+            <w:tcW w:type="dxa" w:w="7060"/>
+            <w:tcBorders>
+              <w:top w:val="single" w:color="D0D5DD" w:sz="4"/>
+              <w:left w:val="single" w:color="D0D5DD" w:sz="4"/>
+              <w:bottom w:val="single" w:color="D0D5DD" w:sz="4"/>
+              <w:right w:val="single" w:color="D0D5DD" w:sz="4"/>
+            </w:tcBorders>
+            <w:shd w:fill="EEF2FF" w:val="clear"/>
+            <w:tcMar>
+              <w:top w:type="dxa" w:w="60"/>
+              <w:left w:type="dxa" w:w="100"/>
+              <w:bottom w:type="dxa" w:w="60"/>
+              <w:right w:type="dxa" w:w="100"/>
+            </w:tcMar>
+          </w:tcPr>
+          <w:p>
+            <w:r>
+              <w:rPr>
+                <w:rFonts w:ascii="Malgun Gothic" w:cs="Malgun Gothic" w:eastAsia="Malgun Gothic" w:hAnsi="Malgun Gothic"/>
+                <w:b/>
+                <w:bCs/>
+                <w:sz w:val="18"/>
+                <w:szCs w:val="18"/>
+              </w:rPr>
+              <w:t xml:space="preserve">내용</w:t>
+            </w:r>
+          </w:p>
+        </w:tc>
+      </w:tr>
+      <w:tr>
+        <w:tc>
+          <w:tcPr>
+            <w:tcW w:type="dxa" w:w="2300"/>
+            <w:tcBorders>
+              <w:top w:val="single" w:color="D0D5DD" w:sz="4"/>
+              <w:left w:val="single" w:color="D0D5DD" w:sz="4"/>
+              <w:bottom w:val="single" w:color="D0D5DD" w:sz="4"/>
+              <w:right w:val="single" w:color="D0D5DD" w:sz="4"/>
+            </w:tcBorders>
+            <w:tcMar>
+              <w:top w:type="dxa" w:w="60"/>
+              <w:left w:type="dxa" w:w="100"/>
+              <w:bottom w:type="dxa" w:w="60"/>
+              <w:right w:type="dxa" w:w="100"/>
+            </w:tcMar>
+          </w:tcPr>
+          <w:p>
+            <w:r>
+              <w:rPr>
+                <w:rFonts w:ascii="Malgun Gothic" w:cs="Malgun Gothic" w:eastAsia="Malgun Gothic" w:hAnsi="Malgun Gothic"/>
+                <w:b w:val="false"/>
+                <w:bCs w:val="false"/>
+                <w:sz w:val="18"/>
+                <w:szCs w:val="18"/>
+              </w:rPr>
+              <w:t xml:space="preserve">사람 구분자</w:t>
+            </w:r>
+          </w:p>
+        </w:tc>
+        <w:tc>
+          <w:tcPr>
+            <w:tcW w:type="dxa" w:w="7060"/>
+            <w:tcBorders>
+              <w:top w:val="single" w:color="D0D5DD" w:sz="4"/>
+              <w:left w:val="single" w:color="D0D5DD" w:sz="4"/>
+              <w:bottom w:val="single" w:color="D0D5DD" w:sz="4"/>
+              <w:right w:val="single" w:color="D0D5DD" w:sz="4"/>
+            </w:tcBorders>
+            <w:tcMar>
+              <w:top w:type="dxa" w:w="60"/>
+              <w:left w:type="dxa" w:w="100"/>
+              <w:bottom w:type="dxa" w:w="60"/>
+              <w:right w:type="dxa" w:w="100"/>
+            </w:tcMar>
+          </w:tcPr>
+          <w:p>
+            <w:r>
+              <w:rPr>
+                <w:rFonts w:ascii="Malgun Gothic" w:cs="Malgun Gothic" w:eastAsia="Malgun Gothic" w:hAnsi="Malgun Gothic"/>
+                <w:b w:val="false"/>
+                <w:bCs w:val="false"/>
+                <w:sz w:val="18"/>
+                <w:szCs w:val="18"/>
+              </w:rPr>
+              <w:t xml:space="preserve">슬래시( / ) · 가운뎃점( · ) · 쉼표( , ) · 파이프( | ) · 줄바꿈 — 이 중 무엇으로 구분해도 사람 단위로 나뉩니다</w:t>
+            </w:r>
+          </w:p>
+        </w:tc>
+      </w:tr>
+      <w:tr>
+        <w:tc>
+          <w:tcPr>
+            <w:tcW w:type="dxa" w:w="2300"/>
+            <w:tcBorders>
+              <w:top w:val="single" w:color="D0D5DD" w:sz="4"/>
+              <w:left w:val="single" w:color="D0D5DD" w:sz="4"/>
+              <w:bottom w:val="single" w:color="D0D5DD" w:sz="4"/>
+              <w:right w:val="single" w:color="D0D5DD" w:sz="4"/>
+            </w:tcBorders>
+            <w:tcMar>
+              <w:top w:type="dxa" w:w="60"/>
+              <w:left w:type="dxa" w:w="100"/>
+              <w:bottom w:type="dxa" w:w="60"/>
+              <w:right w:type="dxa" w:w="100"/>
+            </w:tcMar>
+          </w:tcPr>
+          <w:p>
+            <w:r>
+              <w:rPr>
+                <w:rFonts w:ascii="Malgun Gothic" w:cs="Malgun Gothic" w:eastAsia="Malgun Gothic" w:hAnsi="Malgun Gothic"/>
+                <w:b w:val="false"/>
+                <w:bCs w:val="false"/>
+                <w:sz w:val="18"/>
+                <w:szCs w:val="18"/>
+              </w:rPr>
+              <w:t xml:space="preserve">연락처</w:t>
+            </w:r>
+          </w:p>
+        </w:tc>
+        <w:tc>
+          <w:tcPr>
+            <w:tcW w:type="dxa" w:w="7060"/>
+            <w:tcBorders>
+              <w:top w:val="single" w:color="D0D5DD" w:sz="4"/>
+              <w:left w:val="single" w:color="D0D5DD" w:sz="4"/>
+              <w:bottom w:val="single" w:color="D0D5DD" w:sz="4"/>
+              <w:right w:val="single" w:color="D0D5DD" w:sz="4"/>
+            </w:tcBorders>
+            <w:tcMar>
+              <w:top w:type="dxa" w:w="60"/>
+              <w:left w:type="dxa" w:w="100"/>
+              <w:bottom w:type="dxa" w:w="60"/>
+              <w:right w:type="dxa" w:w="100"/>
+            </w:tcMar>
+          </w:tcPr>
+          <w:p>
+            <w:r>
+              <w:rPr>
+                <w:rFonts w:ascii="Malgun Gothic" w:cs="Malgun Gothic" w:eastAsia="Malgun Gothic" w:hAnsi="Malgun Gothic"/>
+                <w:b w:val="false"/>
+                <w:bCs w:val="false"/>
+                <w:sz w:val="18"/>
+                <w:szCs w:val="18"/>
+              </w:rPr>
+              <w:t xml:space="preserve">필수가 아닙니다. 없으면 이름만 그대로 사용합니다 (예: 「상주 이지훈」, 「신랑 박현수」)</w:t>
+            </w:r>
+          </w:p>
+        </w:tc>
+      </w:tr>
+      <w:tr>
+        <w:tc>
+          <w:tcPr>
+            <w:tcW w:type="dxa" w:w="2300"/>
+            <w:tcBorders>
+              <w:top w:val="single" w:color="D0D5DD" w:sz="4"/>
+              <w:left w:val="single" w:color="D0D5DD" w:sz="4"/>
+              <w:bottom w:val="single" w:color="D0D5DD" w:sz="4"/>
+              <w:right w:val="single" w:color="D0D5DD" w:sz="4"/>
+            </w:tcBorders>
+            <w:tcMar>
+              <w:top w:type="dxa" w:w="60"/>
+              <w:left w:type="dxa" w:w="100"/>
+              <w:bottom w:type="dxa" w:w="60"/>
+              <w:right w:type="dxa" w:w="100"/>
+            </w:tcMar>
+          </w:tcPr>
+          <w:p>
+            <w:r>
+              <w:rPr>
+                <w:rFonts w:ascii="Malgun Gothic" w:cs="Malgun Gothic" w:eastAsia="Malgun Gothic" w:hAnsi="Malgun Gothic"/>
+                <w:b w:val="false"/>
+                <w:bCs w:val="false"/>
+                <w:sz w:val="18"/>
+                <w:szCs w:val="18"/>
+              </w:rPr>
+              <w:t xml:space="preserve">연락처가 있을 때</w:t>
+            </w:r>
+          </w:p>
+        </w:tc>
+        <w:tc>
+          <w:tcPr>
+            <w:tcW w:type="dxa" w:w="7060"/>
+            <w:tcBorders>
+              <w:top w:val="single" w:color="D0D5DD" w:sz="4"/>
+              <w:left w:val="single" w:color="D0D5DD" w:sz="4"/>
+              <w:bottom w:val="single" w:color="D0D5DD" w:sz="4"/>
+              <w:right w:val="single" w:color="D0D5DD" w:sz="4"/>
+            </w:tcBorders>
+            <w:tcMar>
+              <w:top w:type="dxa" w:w="60"/>
+              <w:left w:type="dxa" w:w="100"/>
+              <w:bottom w:type="dxa" w:w="60"/>
+              <w:right w:type="dxa" w:w="100"/>
+            </w:tcMar>
+          </w:tcPr>
+          <w:p>
+            <w:r>
+              <w:rPr>
+                <w:rFonts w:ascii="Malgun Gothic" w:cs="Malgun Gothic" w:eastAsia="Malgun Gothic" w:hAnsi="Malgun Gothic"/>
+                <w:b w:val="false"/>
+                <w:bCs w:val="false"/>
+                <w:sz w:val="18"/>
+                <w:szCs w:val="18"/>
+              </w:rPr>
+              <w:t xml:space="preserve">연락처만 따로 떨어져 있으면 공통 연락처로 보고, 연락처가 없는 사람들 뒤에 붙여줍니다</w:t>
+            </w:r>
+          </w:p>
+        </w:tc>
+      </w:tr>
+      <w:tr>
+        <w:tc>
+          <w:tcPr>
+            <w:tcW w:type="dxa" w:w="2300"/>
+            <w:tcBorders>
+              <w:top w:val="single" w:color="D0D5DD" w:sz="4"/>
+              <w:left w:val="single" w:color="D0D5DD" w:sz="4"/>
+              <w:bottom w:val="single" w:color="D0D5DD" w:sz="4"/>
+              <w:right w:val="single" w:color="D0D5DD" w:sz="4"/>
+            </w:tcBorders>
+            <w:tcMar>
+              <w:top w:type="dxa" w:w="60"/>
+              <w:left w:type="dxa" w:w="100"/>
+              <w:bottom w:type="dxa" w:w="60"/>
+              <w:right w:type="dxa" w:w="100"/>
+            </w:tcMar>
+          </w:tcPr>
+          <w:p>
+            <w:r>
+              <w:rPr>
+                <w:rFonts w:ascii="Malgun Gothic" w:cs="Malgun Gothic" w:eastAsia="Malgun Gothic" w:hAnsi="Malgun Gothic"/>
+                <w:b w:val="false"/>
+                <w:bCs w:val="false"/>
+                <w:sz w:val="18"/>
+                <w:szCs w:val="18"/>
+              </w:rPr>
+              <w:t xml:space="preserve">사람이 한 명일 때</w:t>
+            </w:r>
+          </w:p>
+        </w:tc>
+        <w:tc>
+          <w:tcPr>
+            <w:tcW w:type="dxa" w:w="7060"/>
+            <w:tcBorders>
+              <w:top w:val="single" w:color="D0D5DD" w:sz="4"/>
+              <w:left w:val="single" w:color="D0D5DD" w:sz="4"/>
+              <w:bottom w:val="single" w:color="D0D5DD" w:sz="4"/>
+              <w:right w:val="single" w:color="D0D5DD" w:sz="4"/>
+            </w:tcBorders>
+            <w:tcMar>
+              <w:top w:type="dxa" w:w="60"/>
+              <w:left w:type="dxa" w:w="100"/>
+              <w:bottom w:type="dxa" w:w="60"/>
+              <w:right w:type="dxa" w:w="100"/>
+            </w:tcMar>
+          </w:tcPr>
+          <w:p>
+            <w:r>
+              <w:rPr>
+                <w:rFonts w:ascii="Malgun Gothic" w:cs="Malgun Gothic" w:eastAsia="Malgun Gothic" w:hAnsi="Malgun Gothic"/>
+                <w:b w:val="false"/>
+                <w:bCs w:val="false"/>
+                <w:sz w:val="18"/>
+                <w:szCs w:val="18"/>
+              </w:rPr>
+              <w:t xml:space="preserve">선택 목록 없이 그대로 입력됩니다</w:t>
+            </w:r>
+          </w:p>
+        </w:tc>
+      </w:tr>
+      <w:tr>
+        <w:tc>
+          <w:tcPr>
+            <w:tcW w:type="dxa" w:w="2300"/>
+            <w:tcBorders>
+              <w:top w:val="single" w:color="D0D5DD" w:sz="4"/>
+              <w:left w:val="single" w:color="D0D5DD" w:sz="4"/>
+              <w:bottom w:val="single" w:color="D0D5DD" w:sz="4"/>
+              <w:right w:val="single" w:color="D0D5DD" w:sz="4"/>
+            </w:tcBorders>
+            <w:tcMar>
+              <w:top w:type="dxa" w:w="60"/>
+              <w:left w:type="dxa" w:w="100"/>
+              <w:bottom w:type="dxa" w:w="60"/>
+              <w:right w:type="dxa" w:w="100"/>
+            </w:tcMar>
+          </w:tcPr>
+          <w:p>
+            <w:r>
+              <w:rPr>
+                <w:rFonts w:ascii="Malgun Gothic" w:cs="Malgun Gothic" w:eastAsia="Malgun Gothic" w:hAnsi="Malgun Gothic"/>
+                <w:b w:val="false"/>
+                <w:bCs w:val="false"/>
+                <w:sz w:val="18"/>
+                <w:szCs w:val="18"/>
+              </w:rPr>
+              <w:t xml:space="preserve">값이 없을 때</w:t>
+            </w:r>
+          </w:p>
+        </w:tc>
+        <w:tc>
+          <w:tcPr>
+            <w:tcW w:type="dxa" w:w="7060"/>
+            <w:tcBorders>
+              <w:top w:val="single" w:color="D0D5DD" w:sz="4"/>
+              <w:left w:val="single" w:color="D0D5DD" w:sz="4"/>
+              <w:bottom w:val="single" w:color="D0D5DD" w:sz="4"/>
+              <w:right w:val="single" w:color="D0D5DD" w:sz="4"/>
+            </w:tcBorders>
+            <w:tcMar>
+              <w:top w:type="dxa" w:w="60"/>
+              <w:left w:type="dxa" w:w="100"/>
+              <w:bottom w:type="dxa" w:w="60"/>
+              <w:right w:type="dxa" w:w="100"/>
+            </w:tcMar>
+          </w:tcPr>
+          <w:p>
+            <w:r>
+              <w:rPr>
+                <w:rFonts w:ascii="Malgun Gothic" w:cs="Malgun Gothic" w:eastAsia="Malgun Gothic" w:hAnsi="Malgun Gothic"/>
+                <w:b w:val="false"/>
+                <w:bCs w:val="false"/>
+                <w:sz w:val="18"/>
+                <w:szCs w:val="18"/>
+              </w:rPr>
+              <w:t xml:space="preserve">빈 문자열로 내려주시면 됩니다 (받는 분 항목이 비워집니다)</w:t>
+            </w:r>
+          </w:p>
+        </w:tc>
+      </w:tr>
+    </w:tbl>
+    <w:p>
+      <w:pPr>
+        <w:spacing w:after="120"/>
+      </w:pPr>
+      <w:r>
+        <w:rPr>
+          <w:rFonts w:ascii="Malgun Gothic" w:cs="Malgun Gothic" w:eastAsia="Malgun Gothic" w:hAnsi="Malgun Gothic"/>
+          <w:b/>
+          <w:bCs/>
+          <w:sz w:val="20"/>
+          <w:szCs w:val="20"/>
+        </w:rPr>
+        <w:t xml:space="preserve">동작 예시</w:t>
+      </w:r>
+    </w:p>
+    <w:tbl>
+      <w:tblPr>
+        <w:tblW w:type="dxa" w:w="9360"/>
+        <w:tblBorders>
+          <w:top w:val="single" w:color="auto" w:sz="4"/>
+          <w:left w:val="single" w:color="auto" w:sz="4"/>
+          <w:bottom w:val="single" w:color="auto" w:sz="4"/>
+          <w:right w:val="single" w:color="auto" w:sz="4"/>
+          <w:insideH w:val="single" w:color="auto" w:sz="4"/>
+          <w:insideV w:val="single" w:color="auto" w:sz="4"/>
+        </w:tblBorders>
+      </w:tblPr>
+      <w:tblGrid>
+        <w:gridCol w:w="4400"/>
+        <w:gridCol w:w="4960"/>
+      </w:tblGrid>
+      <w:tr>
+        <w:trPr>
+          <w:tblHeader/>
+        </w:trPr>
+        <w:tc>
+          <w:tcPr>
+            <w:tcW w:type="dxa" w:w="4400"/>
+            <w:tcBorders>
+              <w:top w:val="single" w:color="D0D5DD" w:sz="4"/>
+              <w:left w:val="single" w:color="D0D5DD" w:sz="4"/>
+              <w:bottom w:val="single" w:color="D0D5DD" w:sz="4"/>
+              <w:right w:val="single" w:color="D0D5DD" w:sz="4"/>
+            </w:tcBorders>
+            <w:shd w:fill="EEF2FF" w:val="clear"/>
+            <w:tcMar>
+              <w:top w:type="dxa" w:w="60"/>
+              <w:left w:type="dxa" w:w="100"/>
+              <w:bottom w:type="dxa" w:w="60"/>
+              <w:right w:type="dxa" w:w="100"/>
+            </w:tcMar>
+          </w:tcPr>
+          <w:p>
+            <w:r>
+              <w:rPr>
+                <w:rFonts w:ascii="Malgun Gothic" w:cs="Malgun Gothic" w:eastAsia="Malgun Gothic" w:hAnsi="Malgun Gothic"/>
+                <w:b/>
+                <w:bCs/>
+                <w:sz w:val="18"/>
+                <w:szCs w:val="18"/>
+              </w:rPr>
+              <w:t xml:space="preserve">내려온 값</w:t>
+            </w:r>
+          </w:p>
+        </w:tc>
+        <w:tc>
+          <w:tcPr>
+            <w:tcW w:type="dxa" w:w="4960"/>
+            <w:tcBorders>
+              <w:top w:val="single" w:color="D0D5DD" w:sz="4"/>
+              <w:left w:val="single" w:color="D0D5DD" w:sz="4"/>
+              <w:bottom w:val="single" w:color="D0D5DD" w:sz="4"/>
+              <w:right w:val="single" w:color="D0D5DD" w:sz="4"/>
+            </w:tcBorders>
+            <w:shd w:fill="EEF2FF" w:val="clear"/>
+            <w:tcMar>
+              <w:top w:type="dxa" w:w="60"/>
+              <w:left w:type="dxa" w:w="100"/>
+              <w:bottom w:type="dxa" w:w="60"/>
+              <w:right w:type="dxa" w:w="100"/>
+            </w:tcMar>
+          </w:tcPr>
+          <w:p>
+            <w:r>
+              <w:rPr>
+                <w:rFonts w:ascii="Malgun Gothic" w:cs="Malgun Gothic" w:eastAsia="Malgun Gothic" w:hAnsi="Malgun Gothic"/>
+                <w:b/>
+                <w:bCs/>
+                <w:sz w:val="18"/>
+                <w:szCs w:val="18"/>
+              </w:rPr>
+              <w:t xml:space="preserve">선택 목록으로 표시되는 항목</w:t>
+            </w:r>
+          </w:p>
+        </w:tc>
+      </w:tr>
+      <w:tr>
+        <w:tc>
+          <w:tcPr>
+            <w:tcW w:type="dxa" w:w="4400"/>
+            <w:tcBorders>
+              <w:top w:val="single" w:color="D0D5DD" w:sz="4"/>
+              <w:left w:val="single" w:color="D0D5DD" w:sz="4"/>
+              <w:bottom w:val="single" w:color="D0D5DD" w:sz="4"/>
+              <w:right w:val="single" w:color="D0D5DD" w:sz="4"/>
+            </w:tcBorders>
+            <w:tcMar>
+              <w:top w:type="dxa" w:w="60"/>
+              <w:left w:type="dxa" w:w="100"/>
+              <w:bottom w:type="dxa" w:w="60"/>
+              <w:right w:type="dxa" w:w="100"/>
+            </w:tcMar>
+          </w:tcPr>
+          <w:p>
+            <w:r>
+              <w:rPr>
+                <w:rFonts w:ascii="Malgun Gothic" w:cs="Malgun Gothic" w:eastAsia="Malgun Gothic" w:hAnsi="Malgun Gothic"/>
+                <w:b w:val="false"/>
+                <w:bCs w:val="false"/>
+                <w:sz w:val="18"/>
+                <w:szCs w:val="18"/>
+              </w:rPr>
+              <w:t xml:space="preserve">故 김철수 / 상주 김영민</w:t>
+            </w:r>
+          </w:p>
+        </w:tc>
+        <w:tc>
+          <w:tcPr>
+            <w:tcW w:type="dxa" w:w="4960"/>
+            <w:tcBorders>
+              <w:top w:val="single" w:color="D0D5DD" w:sz="4"/>
+              <w:left w:val="single" w:color="D0D5DD" w:sz="4"/>
+              <w:bottom w:val="single" w:color="D0D5DD" w:sz="4"/>
+              <w:right w:val="single" w:color="D0D5DD" w:sz="4"/>
+            </w:tcBorders>
+            <w:tcMar>
+              <w:top w:type="dxa" w:w="60"/>
+              <w:left w:type="dxa" w:w="100"/>
+              <w:bottom w:type="dxa" w:w="60"/>
+              <w:right w:type="dxa" w:w="100"/>
+            </w:tcMar>
+          </w:tcPr>
+          <w:p>
+            <w:r>
+              <w:rPr>
+                <w:rFonts w:ascii="Malgun Gothic" w:cs="Malgun Gothic" w:eastAsia="Malgun Gothic" w:hAnsi="Malgun Gothic"/>
+                <w:b w:val="false"/>
+                <w:bCs w:val="false"/>
+                <w:sz w:val="18"/>
+                <w:szCs w:val="18"/>
+              </w:rPr>
+              <w:t xml:space="preserve">故 김철수  ·  상주 김영민</w:t>
+            </w:r>
+          </w:p>
+        </w:tc>
+      </w:tr>
+      <w:tr>
+        <w:tc>
+          <w:tcPr>
+            <w:tcW w:type="dxa" w:w="4400"/>
+            <w:tcBorders>
+              <w:top w:val="single" w:color="D0D5DD" w:sz="4"/>
+              <w:left w:val="single" w:color="D0D5DD" w:sz="4"/>
+              <w:bottom w:val="single" w:color="D0D5DD" w:sz="4"/>
+              <w:right w:val="single" w:color="D0D5DD" w:sz="4"/>
+            </w:tcBorders>
+            <w:tcMar>
+              <w:top w:type="dxa" w:w="60"/>
+              <w:left w:type="dxa" w:w="100"/>
+              <w:bottom w:type="dxa" w:w="60"/>
+              <w:right w:type="dxa" w:w="100"/>
+            </w:tcMar>
+          </w:tcPr>
+          <w:p>
+            <w:r>
+              <w:rPr>
+                <w:rFonts w:ascii="Malgun Gothic" w:cs="Malgun Gothic" w:eastAsia="Malgun Gothic" w:hAnsi="Malgun Gothic"/>
+                <w:b w:val="false"/>
+                <w:bCs w:val="false"/>
+                <w:sz w:val="18"/>
+                <w:szCs w:val="18"/>
+              </w:rPr>
+              <w:t xml:space="preserve">신랑 박현수 · 신부 이서연</w:t>
+            </w:r>
+          </w:p>
+        </w:tc>
+        <w:tc>
+          <w:tcPr>
+            <w:tcW w:type="dxa" w:w="4960"/>
+            <w:tcBorders>
+              <w:top w:val="single" w:color="D0D5DD" w:sz="4"/>
+              <w:left w:val="single" w:color="D0D5DD" w:sz="4"/>
+              <w:bottom w:val="single" w:color="D0D5DD" w:sz="4"/>
+              <w:right w:val="single" w:color="D0D5DD" w:sz="4"/>
+            </w:tcBorders>
+            <w:tcMar>
+              <w:top w:type="dxa" w:w="60"/>
+              <w:left w:type="dxa" w:w="100"/>
+              <w:bottom w:type="dxa" w:w="60"/>
+              <w:right w:type="dxa" w:w="100"/>
+            </w:tcMar>
+          </w:tcPr>
+          <w:p>
+            <w:r>
+              <w:rPr>
+                <w:rFonts w:ascii="Malgun Gothic" w:cs="Malgun Gothic" w:eastAsia="Malgun Gothic" w:hAnsi="Malgun Gothic"/>
+                <w:b w:val="false"/>
+                <w:bCs w:val="false"/>
+                <w:sz w:val="18"/>
+                <w:szCs w:val="18"/>
+              </w:rPr>
+              <w:t xml:space="preserve">신랑 박현수  ·  신부 이서연</w:t>
+            </w:r>
+          </w:p>
+        </w:tc>
+      </w:tr>
+      <w:tr>
+        <w:tc>
+          <w:tcPr>
+            <w:tcW w:type="dxa" w:w="4400"/>
+            <w:tcBorders>
+              <w:top w:val="single" w:color="D0D5DD" w:sz="4"/>
+              <w:left w:val="single" w:color="D0D5DD" w:sz="4"/>
+              <w:bottom w:val="single" w:color="D0D5DD" w:sz="4"/>
+              <w:right w:val="single" w:color="D0D5DD" w:sz="4"/>
+            </w:tcBorders>
+            <w:tcMar>
+              <w:top w:type="dxa" w:w="60"/>
+              <w:left w:type="dxa" w:w="100"/>
+              <w:bottom w:type="dxa" w:w="60"/>
+              <w:right w:type="dxa" w:w="100"/>
+            </w:tcMar>
+          </w:tcPr>
+          <w:p>
+            <w:r>
+              <w:rPr>
+                <w:rFonts w:ascii="Malgun Gothic" w:cs="Malgun Gothic" w:eastAsia="Malgun Gothic" w:hAnsi="Malgun Gothic"/>
+                <w:b w:val="false"/>
+                <w:bCs w:val="false"/>
+                <w:sz w:val="18"/>
+                <w:szCs w:val="18"/>
+              </w:rPr>
+              <w:t xml:space="preserve">신랑 김도윤 · 신부 정하은 · 혼주 김성태 · 혼주 정미숙</w:t>
+            </w:r>
+          </w:p>
+        </w:tc>
+        <w:tc>
+          <w:tcPr>
+            <w:tcW w:type="dxa" w:w="4960"/>
+            <w:tcBorders>
+              <w:top w:val="single" w:color="D0D5DD" w:sz="4"/>
+              <w:left w:val="single" w:color="D0D5DD" w:sz="4"/>
+              <w:bottom w:val="single" w:color="D0D5DD" w:sz="4"/>
+              <w:right w:val="single" w:color="D0D5DD" w:sz="4"/>
+            </w:tcBorders>
+            <w:tcMar>
+              <w:top w:type="dxa" w:w="60"/>
+              <w:left w:type="dxa" w:w="100"/>
+              <w:bottom w:type="dxa" w:w="60"/>
+              <w:right w:type="dxa" w:w="100"/>
+            </w:tcMar>
+          </w:tcPr>
+          <w:p>
+            <w:r>
+              <w:rPr>
+                <w:rFonts w:ascii="Malgun Gothic" w:cs="Malgun Gothic" w:eastAsia="Malgun Gothic" w:hAnsi="Malgun Gothic"/>
+                <w:b w:val="false"/>
+                <w:bCs w:val="false"/>
+                <w:sz w:val="18"/>
+                <w:szCs w:val="18"/>
+              </w:rPr>
+              <w:t xml:space="preserve">네 사람이 각각 항목으로</w:t>
+            </w:r>
+          </w:p>
+        </w:tc>
+      </w:tr>
+      <w:tr>
+        <w:tc>
+          <w:tcPr>
+            <w:tcW w:type="dxa" w:w="4400"/>
+            <w:tcBorders>
+              <w:top w:val="single" w:color="D0D5DD" w:sz="4"/>
+              <w:left w:val="single" w:color="D0D5DD" w:sz="4"/>
+              <w:bottom w:val="single" w:color="D0D5DD" w:sz="4"/>
+              <w:right w:val="single" w:color="D0D5DD" w:sz="4"/>
+            </w:tcBorders>
+            <w:tcMar>
+              <w:top w:type="dxa" w:w="60"/>
+              <w:left w:type="dxa" w:w="100"/>
+              <w:bottom w:type="dxa" w:w="60"/>
+              <w:right w:type="dxa" w:w="100"/>
+            </w:tcMar>
+          </w:tcPr>
+          <w:p>
+            <w:r>
+              <w:rPr>
+                <w:rFonts w:ascii="Malgun Gothic" w:cs="Malgun Gothic" w:eastAsia="Malgun Gothic" w:hAnsi="Malgun Gothic"/>
+                <w:b w:val="false"/>
+                <w:bCs w:val="false"/>
+                <w:sz w:val="18"/>
+                <w:szCs w:val="18"/>
+              </w:rPr>
+              <w:t xml:space="preserve">상주 이지훈</w:t>
+            </w:r>
+          </w:p>
+        </w:tc>
+        <w:tc>
+          <w:tcPr>
+            <w:tcW w:type="dxa" w:w="4960"/>
+            <w:tcBorders>
+              <w:top w:val="single" w:color="D0D5DD" w:sz="4"/>
+              <w:left w:val="single" w:color="D0D5DD" w:sz="4"/>
+              <w:bottom w:val="single" w:color="D0D5DD" w:sz="4"/>
+              <w:right w:val="single" w:color="D0D5DD" w:sz="4"/>
+            </w:tcBorders>
+            <w:tcMar>
+              <w:top w:type="dxa" w:w="60"/>
+              <w:left w:type="dxa" w:w="100"/>
+              <w:bottom w:type="dxa" w:w="60"/>
+              <w:right w:type="dxa" w:w="100"/>
+            </w:tcMar>
+          </w:tcPr>
+          <w:p>
+            <w:r>
+              <w:rPr>
+                <w:rFonts w:ascii="Malgun Gothic" w:cs="Malgun Gothic" w:eastAsia="Malgun Gothic" w:hAnsi="Malgun Gothic"/>
+                <w:b w:val="false"/>
+                <w:bCs w:val="false"/>
+                <w:sz w:val="18"/>
+                <w:szCs w:val="18"/>
+              </w:rPr>
+              <w:t xml:space="preserve">선택 없이 바로 입력</w:t>
+            </w:r>
+          </w:p>
+        </w:tc>
+      </w:tr>
+      <w:tr>
+        <w:tc>
+          <w:tcPr>
+            <w:tcW w:type="dxa" w:w="4400"/>
+            <w:tcBorders>
+              <w:top w:val="single" w:color="D0D5DD" w:sz="4"/>
+              <w:left w:val="single" w:color="D0D5DD" w:sz="4"/>
+              <w:bottom w:val="single" w:color="D0D5DD" w:sz="4"/>
+              <w:right w:val="single" w:color="D0D5DD" w:sz="4"/>
+            </w:tcBorders>
+            <w:tcMar>
+              <w:top w:type="dxa" w:w="60"/>
+              <w:left w:type="dxa" w:w="100"/>
+              <w:bottom w:type="dxa" w:w="60"/>
+              <w:right w:type="dxa" w:w="100"/>
+            </w:tcMar>
+          </w:tcPr>
+          <w:p>
+            <w:r>
+              <w:rPr>
+                <w:rFonts w:ascii="Malgun Gothic" w:cs="Malgun Gothic" w:eastAsia="Malgun Gothic" w:hAnsi="Malgun Gothic"/>
+                <w:b w:val="false"/>
+                <w:bCs w:val="false"/>
+                <w:sz w:val="18"/>
+                <w:szCs w:val="18"/>
+              </w:rPr>
+              <w:t xml:space="preserve">故 홍길동 / 상주 홍철수 / 010-0000-0000</w:t>
+            </w:r>
+          </w:p>
+        </w:tc>
+        <w:tc>
+          <w:tcPr>
+            <w:tcW w:type="dxa" w:w="4960"/>
+            <w:tcBorders>
+              <w:top w:val="single" w:color="D0D5DD" w:sz="4"/>
+              <w:left w:val="single" w:color="D0D5DD" w:sz="4"/>
+              <w:bottom w:val="single" w:color="D0D5DD" w:sz="4"/>
+              <w:right w:val="single" w:color="D0D5DD" w:sz="4"/>
+            </w:tcBorders>
+            <w:tcMar>
+              <w:top w:type="dxa" w:w="60"/>
+              <w:left w:type="dxa" w:w="100"/>
+              <w:bottom w:type="dxa" w:w="60"/>
+              <w:right w:type="dxa" w:w="100"/>
+            </w:tcMar>
+          </w:tcPr>
+          <w:p>
+            <w:r>
+              <w:rPr>
+                <w:rFonts w:ascii="Malgun Gothic" w:cs="Malgun Gothic" w:eastAsia="Malgun Gothic" w:hAnsi="Malgun Gothic"/>
+                <w:b w:val="false"/>
+                <w:bCs w:val="false"/>
+                <w:sz w:val="18"/>
+                <w:szCs w:val="18"/>
+              </w:rPr>
+              <w:t xml:space="preserve">故 홍길동 / 010-0000-0000  ·  상주 홍철수 / 010-0000-0000</w:t>
+            </w:r>
+          </w:p>
+        </w:tc>
+      </w:tr>
+    </w:tbl>
+    <w:p>
+      <w:pPr>
+        <w:pStyle w:val="ListParagraph"/>
+        <w:numPr>
+          <w:ilvl w:val="0"/>
+          <w:numId w:val="2"/>
+        </w:numPr>
+        <w:spacing w:after="60"/>
+      </w:pPr>
+      <w:r>
+        <w:rPr>
+          <w:rFonts w:ascii="Malgun Gothic" w:cs="Malgun Gothic" w:eastAsia="Malgun Gothic" w:hAnsi="Malgun Gothic"/>
+          <w:sz w:val="20"/>
+          <w:szCs w:val="20"/>
+        </w:rPr>
+        <w:t xml:space="preserve">주의 — 사람 사이에 구분자 없이 「故 홍길동 상주 홍철수」처럼 이어서 내려오면 한 사람으로 인식됩니다.</w:t>
+      </w:r>
+    </w:p>
+    <w:p>
+      <w:pPr>
+        <w:pStyle w:val="ListParagraph"/>
+        <w:numPr>
+          <w:ilvl w:val="0"/>
+          <w:numId w:val="2"/>
+        </w:numPr>
+        <w:spacing w:after="60"/>
+      </w:pPr>
+      <w:r>
+        <w:rPr>
+          <w:rFonts w:ascii="Malgun Gothic" w:cs="Malgun Gothic" w:eastAsia="Malgun Gothic" w:hAnsi="Malgun Gothic"/>
+          <w:sz w:val="20"/>
+          <w:szCs w:val="20"/>
+        </w:rPr>
+        <w:t xml:space="preserve">장기적으로는 문자열 대신 사람 목록(배열)으로 내려주는 편이 더 안정적입니다. 응답 형식을 바꾸실 수 있다면 협의해주세요.</w:t>
+      </w:r>
+    </w:p>
+    <w:p>
+      <w:pPr>
+        <w:pStyle w:val="Heading2"/>
+        <w:spacing w:after="120" w:before="240"/>
+      </w:pPr>
+      <w:r>
+        <w:rPr>
+          <w:rFonts w:ascii="Malgun Gothic" w:cs="Malgun Gothic" w:eastAsia="Malgun Gothic" w:hAnsi="Malgun Gothic"/>
+          <w:b/>
+          <w:bCs/>
+          <w:sz w:val="23"/>
+          <w:szCs w:val="23"/>
+        </w:rPr>
+        <w:t xml:space="preserve">B-7. 그 밖에 확인이 필요한 사항</w:t>
       </w:r>
     </w:p>
     <w:p>

</xml_diff>

<commit_message>
Auto-fill wedding ribbon phrase by recipient side
청첩장 간편접수에서 받는 분을 고르면 신랑측이면 「祝結婚 (축결혼)」,
신부측이면 「祝華婚 (축화혼)」을 경조사어에 자동 입력한다.
(리본문구 작성가이드와 동일 문구)

- 판별은 선택된 받는 분 문자열의 신랑/신부 포함 여부
- 혼주만 있어 어느 쪽인지 알 수 없으면 채우지 않음
- 이미 입력된 문구가 있으면 유지
- 여러 명일 때는 선택 후에, 한 명이면 바로 적용

Co-Authored-By: Claude Fable 5 <noreply@anthropic.com>
</commit_message>
<xml_diff>
--- a/Front_Update.docx
+++ b/Front_Update.docx
@@ -2267,7 +2267,7 @@
                 <w:sz w:val="18"/>
                 <w:szCs w:val="18"/>
               </w:rPr>
-              <w:t xml:space="preserve">16~18행 상수</w:t>
+              <w:t xml:space="preserve">15~26행 상수</w:t>
             </w:r>
           </w:p>
         </w:tc>
@@ -2296,7 +2296,7 @@
                 <w:sz w:val="18"/>
                 <w:szCs w:val="18"/>
               </w:rPr>
-              <w:t xml:space="preserve">근조 상황의 기본 경조사어(「삼가 故人의 冥福을 빕니다」)와 근조화환 판별 함수 추가</w:t>
+              <w:t xml:space="preserve">상황별 기본 경조사어 추가 — 근조는 「삼가 故人의 冥福을 빕니다」, 결혼은 신랑측 「祝結婚 (축결혼)」·신부측 「祝華婚 (축화혼)」. 받는 분 문자열에서 신랑/신부를 찾아 어느 쪽인지 판별하는 함수와 근조화환 판별 함수 포함</w:t>
             </w:r>
           </w:p>
         </w:tc>
@@ -3556,7 +3556,7 @@
                 <w:sz w:val="18"/>
                 <w:szCs w:val="18"/>
               </w:rPr>
-              <w:t xml:space="preserve">불러온 받는 분이 여러 명이면 선택 시트를 먼저 띄우고, 고른 뒤 상품 선택으로 이어짐(한 명이면 바로 입력). 부고장이면 경조사어를 기본 문구로 미리 채움(이미 입력된 문구가 있으면 유지). 불러온 주소의 지역 규칙을 상품선택 바텀시트에 전달(부고장만 적용). 배송불가 지역이면 시트 미오픈 + 차단 안내. 바텀시트 오픈을 지연 처리 — 간편접수 시트 닫힘과 겹치며 화면 스크롤 잠금이 풀리던 버그 수정</w:t>
+              <w:t xml:space="preserve">불러온 받는 분이 여러 명이면 선택 시트를 먼저 띄우고, 고른 뒤 상품 선택으로 이어짐(한 명이면 바로 입력). 경조사어는 부고장이면 근조 문구를, 청첩장이면 선택된 받는 분이 신랑측인지 신부측인지에 따라 자동 입력(이미 입력된 문구가 있으면 유지). 불러온 주소의 지역 규칙을 상품선택 바텀시트에 전달(부고장만 적용). 배송불가 지역이면 시트 미오픈 + 차단 안내. 바텀시트 오픈을 지연 처리 — 간편접수 시트 닫힘과 겹치며 화면 스크롤 잠금이 풀리던 버그 수정</w:t>
             </w:r>
           </w:p>
         </w:tc>
@@ -8816,7 +8816,405 @@
           <w:sz w:val="20"/>
           <w:szCs w:val="20"/>
         </w:rPr>
-        <w:t xml:space="preserve">근조 상황에서는 리본문구 우측(경조사어)에 「삼가 故人의 冥福을 빕니다」가 자동으로 채워집니다.</w:t>
+        <w:t xml:space="preserve">상황에 맞는 리본문구(경조사어)가 자동으로 채워집니다. 모두 리본문구 작성가이드에 있는 문구와 동일합니다.</w:t>
+      </w:r>
+    </w:p>
+    <w:tbl>
+      <w:tblPr>
+        <w:tblW w:type="dxa" w:w="9360"/>
+        <w:tblBorders>
+          <w:top w:val="single" w:color="auto" w:sz="4"/>
+          <w:left w:val="single" w:color="auto" w:sz="4"/>
+          <w:bottom w:val="single" w:color="auto" w:sz="4"/>
+          <w:right w:val="single" w:color="auto" w:sz="4"/>
+          <w:insideH w:val="single" w:color="auto" w:sz="4"/>
+          <w:insideV w:val="single" w:color="auto" w:sz="4"/>
+        </w:tblBorders>
+      </w:tblPr>
+      <w:tblGrid>
+        <w:gridCol w:w="3000"/>
+        <w:gridCol w:w="3200"/>
+        <w:gridCol w:w="3160"/>
+      </w:tblGrid>
+      <w:tr>
+        <w:trPr>
+          <w:tblHeader/>
+        </w:trPr>
+        <w:tc>
+          <w:tcPr>
+            <w:tcW w:type="dxa" w:w="3000"/>
+            <w:tcBorders>
+              <w:top w:val="single" w:color="D0D5DD" w:sz="4"/>
+              <w:left w:val="single" w:color="D0D5DD" w:sz="4"/>
+              <w:bottom w:val="single" w:color="D0D5DD" w:sz="4"/>
+              <w:right w:val="single" w:color="D0D5DD" w:sz="4"/>
+            </w:tcBorders>
+            <w:shd w:fill="EEF2FF" w:val="clear"/>
+            <w:tcMar>
+              <w:top w:type="dxa" w:w="60"/>
+              <w:left w:type="dxa" w:w="100"/>
+              <w:bottom w:type="dxa" w:w="60"/>
+              <w:right w:type="dxa" w:w="100"/>
+            </w:tcMar>
+          </w:tcPr>
+          <w:p>
+            <w:r>
+              <w:rPr>
+                <w:rFonts w:ascii="Malgun Gothic" w:cs="Malgun Gothic" w:eastAsia="Malgun Gothic" w:hAnsi="Malgun Gothic"/>
+                <w:b/>
+                <w:bCs/>
+                <w:sz w:val="18"/>
+                <w:szCs w:val="18"/>
+              </w:rPr>
+              <w:t xml:space="preserve">상황</w:t>
+            </w:r>
+          </w:p>
+        </w:tc>
+        <w:tc>
+          <w:tcPr>
+            <w:tcW w:type="dxa" w:w="3200"/>
+            <w:tcBorders>
+              <w:top w:val="single" w:color="D0D5DD" w:sz="4"/>
+              <w:left w:val="single" w:color="D0D5DD" w:sz="4"/>
+              <w:bottom w:val="single" w:color="D0D5DD" w:sz="4"/>
+              <w:right w:val="single" w:color="D0D5DD" w:sz="4"/>
+            </w:tcBorders>
+            <w:shd w:fill="EEF2FF" w:val="clear"/>
+            <w:tcMar>
+              <w:top w:type="dxa" w:w="60"/>
+              <w:left w:type="dxa" w:w="100"/>
+              <w:bottom w:type="dxa" w:w="60"/>
+              <w:right w:type="dxa" w:w="100"/>
+            </w:tcMar>
+          </w:tcPr>
+          <w:p>
+            <w:r>
+              <w:rPr>
+                <w:rFonts w:ascii="Malgun Gothic" w:cs="Malgun Gothic" w:eastAsia="Malgun Gothic" w:hAnsi="Malgun Gothic"/>
+                <w:b/>
+                <w:bCs/>
+                <w:sz w:val="18"/>
+                <w:szCs w:val="18"/>
+              </w:rPr>
+              <w:t xml:space="preserve">자동 입력되는 문구</w:t>
+            </w:r>
+          </w:p>
+        </w:tc>
+        <w:tc>
+          <w:tcPr>
+            <w:tcW w:type="dxa" w:w="3160"/>
+            <w:tcBorders>
+              <w:top w:val="single" w:color="D0D5DD" w:sz="4"/>
+              <w:left w:val="single" w:color="D0D5DD" w:sz="4"/>
+              <w:bottom w:val="single" w:color="D0D5DD" w:sz="4"/>
+              <w:right w:val="single" w:color="D0D5DD" w:sz="4"/>
+            </w:tcBorders>
+            <w:shd w:fill="EEF2FF" w:val="clear"/>
+            <w:tcMar>
+              <w:top w:type="dxa" w:w="60"/>
+              <w:left w:type="dxa" w:w="100"/>
+              <w:bottom w:type="dxa" w:w="60"/>
+              <w:right w:type="dxa" w:w="100"/>
+            </w:tcMar>
+          </w:tcPr>
+          <w:p>
+            <w:r>
+              <w:rPr>
+                <w:rFonts w:ascii="Malgun Gothic" w:cs="Malgun Gothic" w:eastAsia="Malgun Gothic" w:hAnsi="Malgun Gothic"/>
+                <w:b/>
+                <w:bCs/>
+                <w:sz w:val="18"/>
+                <w:szCs w:val="18"/>
+              </w:rPr>
+              <w:t xml:space="preserve">적용 시점</w:t>
+            </w:r>
+          </w:p>
+        </w:tc>
+      </w:tr>
+      <w:tr>
+        <w:tc>
+          <w:tcPr>
+            <w:tcW w:type="dxa" w:w="3000"/>
+            <w:tcBorders>
+              <w:top w:val="single" w:color="D0D5DD" w:sz="4"/>
+              <w:left w:val="single" w:color="D0D5DD" w:sz="4"/>
+              <w:bottom w:val="single" w:color="D0D5DD" w:sz="4"/>
+              <w:right w:val="single" w:color="D0D5DD" w:sz="4"/>
+            </w:tcBorders>
+            <w:tcMar>
+              <w:top w:type="dxa" w:w="60"/>
+              <w:left w:type="dxa" w:w="100"/>
+              <w:bottom w:type="dxa" w:w="60"/>
+              <w:right w:type="dxa" w:w="100"/>
+            </w:tcMar>
+          </w:tcPr>
+          <w:p>
+            <w:r>
+              <w:rPr>
+                <w:rFonts w:ascii="Malgun Gothic" w:cs="Malgun Gothic" w:eastAsia="Malgun Gothic" w:hAnsi="Malgun Gothic"/>
+                <w:b w:val="false"/>
+                <w:bCs w:val="false"/>
+                <w:sz w:val="18"/>
+                <w:szCs w:val="18"/>
+              </w:rPr>
+              <w:t xml:space="preserve">근조</w:t>
+            </w:r>
+          </w:p>
+        </w:tc>
+        <w:tc>
+          <w:tcPr>
+            <w:tcW w:type="dxa" w:w="3200"/>
+            <w:tcBorders>
+              <w:top w:val="single" w:color="D0D5DD" w:sz="4"/>
+              <w:left w:val="single" w:color="D0D5DD" w:sz="4"/>
+              <w:bottom w:val="single" w:color="D0D5DD" w:sz="4"/>
+              <w:right w:val="single" w:color="D0D5DD" w:sz="4"/>
+            </w:tcBorders>
+            <w:tcMar>
+              <w:top w:type="dxa" w:w="60"/>
+              <w:left w:type="dxa" w:w="100"/>
+              <w:bottom w:type="dxa" w:w="60"/>
+              <w:right w:type="dxa" w:w="100"/>
+            </w:tcMar>
+          </w:tcPr>
+          <w:p>
+            <w:r>
+              <w:rPr>
+                <w:rFonts w:ascii="Malgun Gothic" w:cs="Malgun Gothic" w:eastAsia="Malgun Gothic" w:hAnsi="Malgun Gothic"/>
+                <w:b w:val="false"/>
+                <w:bCs w:val="false"/>
+                <w:sz w:val="18"/>
+                <w:szCs w:val="18"/>
+              </w:rPr>
+              <w:t xml:space="preserve">삼가 故人의 冥福을 빕니다</w:t>
+            </w:r>
+          </w:p>
+        </w:tc>
+        <w:tc>
+          <w:tcPr>
+            <w:tcW w:type="dxa" w:w="3160"/>
+            <w:tcBorders>
+              <w:top w:val="single" w:color="D0D5DD" w:sz="4"/>
+              <w:left w:val="single" w:color="D0D5DD" w:sz="4"/>
+              <w:bottom w:val="single" w:color="D0D5DD" w:sz="4"/>
+              <w:right w:val="single" w:color="D0D5DD" w:sz="4"/>
+            </w:tcBorders>
+            <w:tcMar>
+              <w:top w:type="dxa" w:w="60"/>
+              <w:left w:type="dxa" w:w="100"/>
+              <w:bottom w:type="dxa" w:w="60"/>
+              <w:right w:type="dxa" w:w="100"/>
+            </w:tcMar>
+          </w:tcPr>
+          <w:p>
+            <w:r>
+              <w:rPr>
+                <w:rFonts w:ascii="Malgun Gothic" w:cs="Malgun Gothic" w:eastAsia="Malgun Gothic" w:hAnsi="Malgun Gothic"/>
+                <w:b w:val="false"/>
+                <w:bCs w:val="false"/>
+                <w:sz w:val="18"/>
+                <w:szCs w:val="18"/>
+              </w:rPr>
+              <w:t xml:space="preserve">상품목록에서 근조화환 선택 · 부고장 간편접수</w:t>
+            </w:r>
+          </w:p>
+        </w:tc>
+      </w:tr>
+      <w:tr>
+        <w:tc>
+          <w:tcPr>
+            <w:tcW w:type="dxa" w:w="3000"/>
+            <w:tcBorders>
+              <w:top w:val="single" w:color="D0D5DD" w:sz="4"/>
+              <w:left w:val="single" w:color="D0D5DD" w:sz="4"/>
+              <w:bottom w:val="single" w:color="D0D5DD" w:sz="4"/>
+              <w:right w:val="single" w:color="D0D5DD" w:sz="4"/>
+            </w:tcBorders>
+            <w:tcMar>
+              <w:top w:type="dxa" w:w="60"/>
+              <w:left w:type="dxa" w:w="100"/>
+              <w:bottom w:type="dxa" w:w="60"/>
+              <w:right w:type="dxa" w:w="100"/>
+            </w:tcMar>
+          </w:tcPr>
+          <w:p>
+            <w:r>
+              <w:rPr>
+                <w:rFonts w:ascii="Malgun Gothic" w:cs="Malgun Gothic" w:eastAsia="Malgun Gothic" w:hAnsi="Malgun Gothic"/>
+                <w:b w:val="false"/>
+                <w:bCs w:val="false"/>
+                <w:sz w:val="18"/>
+                <w:szCs w:val="18"/>
+              </w:rPr>
+              <w:t xml:space="preserve">결혼 — 신랑측</w:t>
+            </w:r>
+          </w:p>
+        </w:tc>
+        <w:tc>
+          <w:tcPr>
+            <w:tcW w:type="dxa" w:w="3200"/>
+            <w:tcBorders>
+              <w:top w:val="single" w:color="D0D5DD" w:sz="4"/>
+              <w:left w:val="single" w:color="D0D5DD" w:sz="4"/>
+              <w:bottom w:val="single" w:color="D0D5DD" w:sz="4"/>
+              <w:right w:val="single" w:color="D0D5DD" w:sz="4"/>
+            </w:tcBorders>
+            <w:tcMar>
+              <w:top w:type="dxa" w:w="60"/>
+              <w:left w:type="dxa" w:w="100"/>
+              <w:bottom w:type="dxa" w:w="60"/>
+              <w:right w:type="dxa" w:w="100"/>
+            </w:tcMar>
+          </w:tcPr>
+          <w:p>
+            <w:r>
+              <w:rPr>
+                <w:rFonts w:ascii="Malgun Gothic" w:cs="Malgun Gothic" w:eastAsia="Malgun Gothic" w:hAnsi="Malgun Gothic"/>
+                <w:b w:val="false"/>
+                <w:bCs w:val="false"/>
+                <w:sz w:val="18"/>
+                <w:szCs w:val="18"/>
+              </w:rPr>
+              <w:t xml:space="preserve">祝結婚 (축결혼)</w:t>
+            </w:r>
+          </w:p>
+        </w:tc>
+        <w:tc>
+          <w:tcPr>
+            <w:tcW w:type="dxa" w:w="3160"/>
+            <w:tcBorders>
+              <w:top w:val="single" w:color="D0D5DD" w:sz="4"/>
+              <w:left w:val="single" w:color="D0D5DD" w:sz="4"/>
+              <w:bottom w:val="single" w:color="D0D5DD" w:sz="4"/>
+              <w:right w:val="single" w:color="D0D5DD" w:sz="4"/>
+            </w:tcBorders>
+            <w:tcMar>
+              <w:top w:type="dxa" w:w="60"/>
+              <w:left w:type="dxa" w:w="100"/>
+              <w:bottom w:type="dxa" w:w="60"/>
+              <w:right w:type="dxa" w:w="100"/>
+            </w:tcMar>
+          </w:tcPr>
+          <w:p>
+            <w:r>
+              <w:rPr>
+                <w:rFonts w:ascii="Malgun Gothic" w:cs="Malgun Gothic" w:eastAsia="Malgun Gothic" w:hAnsi="Malgun Gothic"/>
+                <w:b w:val="false"/>
+                <w:bCs w:val="false"/>
+                <w:sz w:val="18"/>
+                <w:szCs w:val="18"/>
+              </w:rPr>
+              <w:t xml:space="preserve">청첩장 간편접수에서 신랑측(신랑 등)을 받는 분으로 선택</w:t>
+            </w:r>
+          </w:p>
+        </w:tc>
+      </w:tr>
+      <w:tr>
+        <w:tc>
+          <w:tcPr>
+            <w:tcW w:type="dxa" w:w="3000"/>
+            <w:tcBorders>
+              <w:top w:val="single" w:color="D0D5DD" w:sz="4"/>
+              <w:left w:val="single" w:color="D0D5DD" w:sz="4"/>
+              <w:bottom w:val="single" w:color="D0D5DD" w:sz="4"/>
+              <w:right w:val="single" w:color="D0D5DD" w:sz="4"/>
+            </w:tcBorders>
+            <w:tcMar>
+              <w:top w:type="dxa" w:w="60"/>
+              <w:left w:type="dxa" w:w="100"/>
+              <w:bottom w:type="dxa" w:w="60"/>
+              <w:right w:type="dxa" w:w="100"/>
+            </w:tcMar>
+          </w:tcPr>
+          <w:p>
+            <w:r>
+              <w:rPr>
+                <w:rFonts w:ascii="Malgun Gothic" w:cs="Malgun Gothic" w:eastAsia="Malgun Gothic" w:hAnsi="Malgun Gothic"/>
+                <w:b w:val="false"/>
+                <w:bCs w:val="false"/>
+                <w:sz w:val="18"/>
+                <w:szCs w:val="18"/>
+              </w:rPr>
+              <w:t xml:space="preserve">결혼 — 신부측</w:t>
+            </w:r>
+          </w:p>
+        </w:tc>
+        <w:tc>
+          <w:tcPr>
+            <w:tcW w:type="dxa" w:w="3200"/>
+            <w:tcBorders>
+              <w:top w:val="single" w:color="D0D5DD" w:sz="4"/>
+              <w:left w:val="single" w:color="D0D5DD" w:sz="4"/>
+              <w:bottom w:val="single" w:color="D0D5DD" w:sz="4"/>
+              <w:right w:val="single" w:color="D0D5DD" w:sz="4"/>
+            </w:tcBorders>
+            <w:tcMar>
+              <w:top w:type="dxa" w:w="60"/>
+              <w:left w:type="dxa" w:w="100"/>
+              <w:bottom w:type="dxa" w:w="60"/>
+              <w:right w:type="dxa" w:w="100"/>
+            </w:tcMar>
+          </w:tcPr>
+          <w:p>
+            <w:r>
+              <w:rPr>
+                <w:rFonts w:ascii="Malgun Gothic" w:cs="Malgun Gothic" w:eastAsia="Malgun Gothic" w:hAnsi="Malgun Gothic"/>
+                <w:b w:val="false"/>
+                <w:bCs w:val="false"/>
+                <w:sz w:val="18"/>
+                <w:szCs w:val="18"/>
+              </w:rPr>
+              <w:t xml:space="preserve">祝華婚 (축화혼)</w:t>
+            </w:r>
+          </w:p>
+        </w:tc>
+        <w:tc>
+          <w:tcPr>
+            <w:tcW w:type="dxa" w:w="3160"/>
+            <w:tcBorders>
+              <w:top w:val="single" w:color="D0D5DD" w:sz="4"/>
+              <w:left w:val="single" w:color="D0D5DD" w:sz="4"/>
+              <w:bottom w:val="single" w:color="D0D5DD" w:sz="4"/>
+              <w:right w:val="single" w:color="D0D5DD" w:sz="4"/>
+            </w:tcBorders>
+            <w:tcMar>
+              <w:top w:type="dxa" w:w="60"/>
+              <w:left w:type="dxa" w:w="100"/>
+              <w:bottom w:type="dxa" w:w="60"/>
+              <w:right w:type="dxa" w:w="100"/>
+            </w:tcMar>
+          </w:tcPr>
+          <w:p>
+            <w:r>
+              <w:rPr>
+                <w:rFonts w:ascii="Malgun Gothic" w:cs="Malgun Gothic" w:eastAsia="Malgun Gothic" w:hAnsi="Malgun Gothic"/>
+                <w:b w:val="false"/>
+                <w:bCs w:val="false"/>
+                <w:sz w:val="18"/>
+                <w:szCs w:val="18"/>
+              </w:rPr>
+              <w:t xml:space="preserve">청첩장 간편접수에서 신부측(신부 등)을 받는 분으로 선택</w:t>
+            </w:r>
+          </w:p>
+        </w:tc>
+      </w:tr>
+    </w:tbl>
+    <w:p>
+      <w:pPr>
+        <w:pStyle w:val="ListParagraph"/>
+        <w:numPr>
+          <w:ilvl w:val="0"/>
+          <w:numId w:val="2"/>
+        </w:numPr>
+        <w:spacing w:after="60"/>
+      </w:pPr>
+      <w:r>
+        <w:rPr>
+          <w:rFonts w:ascii="Malgun Gothic" w:cs="Malgun Gothic" w:eastAsia="Malgun Gothic" w:hAnsi="Malgun Gothic"/>
+          <w:sz w:val="20"/>
+          <w:szCs w:val="20"/>
+        </w:rPr>
+        <w:t xml:space="preserve">신랑측·신부측 구분은 선택한 받는 분에 「신랑」 또는 「신부」가 들어 있는지로 판단합니다.</w:t>
       </w:r>
     </w:p>
     <w:p>
@@ -8834,7 +9232,7 @@
           <w:sz w:val="20"/>
           <w:szCs w:val="20"/>
         </w:rPr>
-        <w:t xml:space="preserve">적용 시점 — ① 상품목록에서 근조화환 상품을 선택했을 때, ② 부고장 간편접수로 정보를 불러왔을 때</w:t>
+        <w:t xml:space="preserve">혼주만 표시되어 어느 쪽인지 알 수 없는 경우에는 채우지 않고 비워 둡니다. 「간편선택」에서 직접 고르시면 됩니다.</w:t>
       </w:r>
     </w:p>
     <w:p>
@@ -8853,24 +9251,6 @@
           <w:szCs w:val="20"/>
         </w:rPr>
         <w:t xml:space="preserve">이미 입력해 둔 문구가 있으면 덮어쓰지 않습니다. 다른 문구를 원하면 「간편선택」으로 바꾸거나 직접 수정할 수 있습니다.</w:t>
-      </w:r>
-    </w:p>
-    <w:p>
-      <w:pPr>
-        <w:pStyle w:val="ListParagraph"/>
-        <w:numPr>
-          <w:ilvl w:val="0"/>
-          <w:numId w:val="2"/>
-        </w:numPr>
-        <w:spacing w:after="60"/>
-      </w:pPr>
-      <w:r>
-        <w:rPr>
-          <w:rFonts w:ascii="Malgun Gothic" w:cs="Malgun Gothic" w:eastAsia="Malgun Gothic" w:hAnsi="Malgun Gothic"/>
-          <w:sz w:val="20"/>
-          <w:szCs w:val="20"/>
-        </w:rPr>
-        <w:t xml:space="preserve">축하화환 선택이나 청첩장 간편접수에는 적용되지 않습니다.</w:t>
       </w:r>
     </w:p>
     <w:p>

</xml_diff>